<commit_message>
Updated design of the documentation
</commit_message>
<xml_diff>
--- a/documentation/documentation.docx
+++ b/documentation/documentation.docx
@@ -2,1208 +2,561 @@
 <file path=word/document.xml><?xml version="1.0" encoding="utf-8"?>
 <w:document xmlns:wpc="http://schemas.microsoft.com/office/word/2010/wordprocessingCanvas" xmlns:cx="http://schemas.microsoft.com/office/drawing/2014/chartex" xmlns:cx1="http://schemas.microsoft.com/office/drawing/2015/9/8/chartex" xmlns:cx2="http://schemas.microsoft.com/office/drawing/2015/10/21/chartex" xmlns:cx3="http://schemas.microsoft.com/office/drawing/2016/5/9/chartex" xmlns:cx4="http://schemas.microsoft.com/office/drawing/2016/5/10/chartex" xmlns:cx5="http://schemas.microsoft.com/office/drawing/2016/5/11/chartex" xmlns:cx6="http://schemas.microsoft.com/office/drawing/2016/5/12/chartex" xmlns:cx7="http://schemas.microsoft.com/office/drawing/2016/5/13/chartex" xmlns:cx8="http://schemas.microsoft.com/office/drawing/2016/5/14/chartex" xmlns:mc="http://schemas.openxmlformats.org/markup-compatibility/2006" xmlns:aink="http://schemas.microsoft.com/office/drawing/2016/ink" xmlns:am3d="http://schemas.microsoft.com/office/drawing/2017/model3d" xmlns:o="urn:schemas-microsoft-com:office:office" xmlns:oel="http://schemas.microsoft.com/office/2019/extlst" xmlns:r="http://schemas.openxmlformats.org/officeDocument/2006/relationships" xmlns:m="http://schemas.openxmlformats.org/officeDocument/2006/math" xmlns:v="urn:schemas-microsoft-com:vml" xmlns:wp14="http://schemas.microsoft.com/office/word/2010/wordprocessingDrawing" xmlns:wp="http://schemas.openxmlformats.org/drawingml/2006/wordprocessingDrawing" xmlns:w10="urn:schemas-microsoft-com:office:word" xmlns:w="http://schemas.openxmlformats.org/wordprocessingml/2006/main" xmlns:w14="http://schemas.microsoft.com/office/word/2010/wordml" xmlns:w15="http://schemas.microsoft.com/office/word/2012/wordml" xmlns:w16cex="http://schemas.microsoft.com/office/word/2018/wordml/cex" xmlns:w16cid="http://schemas.microsoft.com/office/word/2016/wordml/cid" xmlns:w16="http://schemas.microsoft.com/office/word/2018/wordml" xmlns:w16du="http://schemas.microsoft.com/office/word/2023/wordml/word16du" xmlns:w16sdtdh="http://schemas.microsoft.com/office/word/2020/wordml/sdtdatahash" xmlns:w16sdtfl="http://schemas.microsoft.com/office/word/2024/wordml/sdtformatlock" xmlns:w16se="http://schemas.microsoft.com/office/word/2015/wordml/symex" xmlns:wpg="http://schemas.microsoft.com/office/word/2010/wordprocessingGroup" xmlns:wpi="http://schemas.microsoft.com/office/word/2010/wordprocessingInk" xmlns:wne="http://schemas.microsoft.com/office/word/2006/wordml" xmlns:wps="http://schemas.microsoft.com/office/word/2010/wordprocessingShape" mc:Ignorable="w14 w15 w16se w16cid w16 w16cex w16sdtdh w16sdtfl w16du wp14">
   <w:body>
-    <w:sdt>
-      <w:sdtPr>
+    <w:p>
+      <w:r>
         <w:rPr>
-          <w:rFonts w:asciiTheme="majorHAnsi" w:eastAsiaTheme="majorEastAsia" w:hAnsiTheme="majorHAnsi" w:cstheme="majorBidi"/>
-          <w:color w:val="0F4761" w:themeColor="accent1" w:themeShade="BF"/>
-          <w:kern w:val="2"/>
-          <w:sz w:val="2"/>
-          <w:szCs w:val="32"/>
-          <w:lang w:eastAsia="en-US"/>
-          <w14:ligatures w14:val="standardContextual"/>
+          <w:noProof/>
         </w:rPr>
-        <w:id w:val="-1297376507"/>
-        <w:docPartObj>
-          <w:docPartGallery w:val="Cover Pages"/>
-          <w:docPartUnique/>
-        </w:docPartObj>
-      </w:sdtPr>
-      <w:sdtEndPr>
+        <mc:AlternateContent>
+          <mc:Choice Requires="wps">
+            <w:drawing>
+              <wp:anchor distT="45720" distB="45720" distL="114300" distR="114300" simplePos="0" relativeHeight="251661312" behindDoc="0" locked="0" layoutInCell="1" allowOverlap="1" wp14:anchorId="5083EA60" wp14:editId="0424A8E8">
+                <wp:simplePos x="0" y="0"/>
+                <wp:positionH relativeFrom="column">
+                  <wp:posOffset>1243330</wp:posOffset>
+                </wp:positionH>
+                <wp:positionV relativeFrom="paragraph">
+                  <wp:posOffset>3462655</wp:posOffset>
+                </wp:positionV>
+                <wp:extent cx="5133975" cy="2076450"/>
+                <wp:effectExtent l="0" t="0" r="0" b="0"/>
+                <wp:wrapSquare wrapText="bothSides"/>
+                <wp:docPr id="1" name="Text Box 2"/>
+                <wp:cNvGraphicFramePr>
+                  <a:graphicFrameLocks xmlns:a="http://schemas.openxmlformats.org/drawingml/2006/main"/>
+                </wp:cNvGraphicFramePr>
+                <a:graphic xmlns:a="http://schemas.openxmlformats.org/drawingml/2006/main">
+                  <a:graphicData uri="http://schemas.microsoft.com/office/word/2010/wordprocessingShape">
+                    <wps:wsp>
+                      <wps:cNvSpPr txBox="1">
+                        <a:spLocks noChangeArrowheads="1"/>
+                      </wps:cNvSpPr>
+                      <wps:spPr bwMode="auto">
+                        <a:xfrm>
+                          <a:off x="0" y="0"/>
+                          <a:ext cx="5133975" cy="2076450"/>
+                        </a:xfrm>
+                        <a:prstGeom prst="rect">
+                          <a:avLst/>
+                        </a:prstGeom>
+                        <a:noFill/>
+                        <a:ln w="9525">
+                          <a:noFill/>
+                          <a:miter lim="800000"/>
+                          <a:headEnd/>
+                          <a:tailEnd/>
+                        </a:ln>
+                      </wps:spPr>
+                      <wps:txbx>
+                        <w:txbxContent>
+                          <w:p>
+                            <w:pPr>
+                              <w:spacing w:after="0" w:line="240" w:lineRule="auto"/>
+                              <w:jc w:val="center"/>
+                              <w:rPr>
+                                <w:rFonts w:ascii="Montserrat" w:hAnsi="Montserrat" w:cs="Arial"/>
+                                <w:b/>
+                                <w:bCs/>
+                                <w:color w:val="5D28FE"/>
+                                <w:sz w:val="96"/>
+                                <w:szCs w:val="96"/>
+                              </w:rPr>
+                            </w:pPr>
+                            <w:r>
+                              <w:rPr>
+                                <w:rFonts w:ascii="Montserrat" w:hAnsi="Montserrat" w:cs="Arial"/>
+                                <w:b/>
+                                <w:bCs/>
+                                <w:color w:val="5D28FE"/>
+                                <w:sz w:val="96"/>
+                                <w:szCs w:val="96"/>
+                              </w:rPr>
+                              <w:t>MyTunes</w:t>
+                            </w:r>
+                          </w:p>
+                          <w:p>
+                            <w:pPr>
+                              <w:spacing w:line="240" w:lineRule="auto"/>
+                              <w:contextualSpacing/>
+                              <w:jc w:val="center"/>
+                              <w:rPr>
+                                <w:rFonts w:ascii="Montserrat" w:hAnsi="Montserrat"/>
+                                <w:color w:val="000000" w:themeColor="text1"/>
+                                <w:sz w:val="96"/>
+                                <w:szCs w:val="96"/>
+                              </w:rPr>
+                            </w:pPr>
+                            <w:r>
+                              <w:rPr>
+                                <w:rFonts w:ascii="Montserrat" w:hAnsi="Montserrat" w:cs="Arial"/>
+                                <w:color w:val="000000" w:themeColor="text1"/>
+                                <w:sz w:val="96"/>
+                                <w:szCs w:val="96"/>
+                              </w:rPr>
+                              <w:t>zene-streaming</w:t>
+                            </w:r>
+                          </w:p>
+                        </w:txbxContent>
+                      </wps:txbx>
+                      <wps:bodyPr rot="0" vert="horz" wrap="square" lIns="91440" tIns="45720" rIns="91440" bIns="45720" anchor="t" anchorCtr="0">
+                        <a:noAutofit/>
+                      </wps:bodyPr>
+                    </wps:wsp>
+                  </a:graphicData>
+                </a:graphic>
+                <wp14:sizeRelH relativeFrom="margin">
+                  <wp14:pctWidth>0</wp14:pctWidth>
+                </wp14:sizeRelH>
+                <wp14:sizeRelV relativeFrom="margin">
+                  <wp14:pctHeight>0</wp14:pctHeight>
+                </wp14:sizeRelV>
+              </wp:anchor>
+            </w:drawing>
+          </mc:Choice>
+          <mc:Fallback>
+            <w:pict>
+              <v:shapetype w14:anchorId="5083EA60" id="_x0000_t202" coordsize="21600,21600" o:spt="202" path="m,l,21600r21600,l21600,xe">
+                <v:stroke joinstyle="miter"/>
+                <v:path gradientshapeok="t" o:connecttype="rect"/>
+              </v:shapetype>
+              <v:shape id="Text Box 2" o:spid="_x0000_s1026" type="#_x0000_t202" style="position:absolute;margin-left:97.9pt;margin-top:272.65pt;width:404.25pt;height:163.5pt;z-index:251661312;visibility:visible;mso-wrap-style:square;mso-width-percent:0;mso-height-percent:0;mso-wrap-distance-left:9pt;mso-wrap-distance-top:3.6pt;mso-wrap-distance-right:9pt;mso-wrap-distance-bottom:3.6pt;mso-position-horizontal:absolute;mso-position-horizontal-relative:text;mso-position-vertical:absolute;mso-position-vertical-relative:text;mso-width-percent:0;mso-height-percent:0;mso-width-relative:margin;mso-height-relative:margin;v-text-anchor:top" o:gfxdata="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" filled="f" stroked="f">
+                <v:textbox>
+                  <w:txbxContent>
+                    <w:p>
+                      <w:pPr>
+                        <w:spacing w:after="0" w:line="240" w:lineRule="auto"/>
+                        <w:jc w:val="center"/>
+                        <w:rPr>
+                          <w:rFonts w:ascii="Montserrat" w:hAnsi="Montserrat" w:cs="Arial"/>
+                          <w:b/>
+                          <w:bCs/>
+                          <w:color w:val="5D28FE"/>
+                          <w:sz w:val="96"/>
+                          <w:szCs w:val="96"/>
+                        </w:rPr>
+                      </w:pPr>
+                      <w:r>
+                        <w:rPr>
+                          <w:rFonts w:ascii="Montserrat" w:hAnsi="Montserrat" w:cs="Arial"/>
+                          <w:b/>
+                          <w:bCs/>
+                          <w:color w:val="5D28FE"/>
+                          <w:sz w:val="96"/>
+                          <w:szCs w:val="96"/>
+                        </w:rPr>
+                        <w:t>MyTunes</w:t>
+                      </w:r>
+                    </w:p>
+                    <w:p>
+                      <w:pPr>
+                        <w:spacing w:line="240" w:lineRule="auto"/>
+                        <w:contextualSpacing/>
+                        <w:jc w:val="center"/>
+                        <w:rPr>
+                          <w:rFonts w:ascii="Montserrat" w:hAnsi="Montserrat"/>
+                          <w:color w:val="000000" w:themeColor="text1"/>
+                          <w:sz w:val="96"/>
+                          <w:szCs w:val="96"/>
+                        </w:rPr>
+                      </w:pPr>
+                      <w:r>
+                        <w:rPr>
+                          <w:rFonts w:ascii="Montserrat" w:hAnsi="Montserrat" w:cs="Arial"/>
+                          <w:color w:val="000000" w:themeColor="text1"/>
+                          <w:sz w:val="96"/>
+                          <w:szCs w:val="96"/>
+                        </w:rPr>
+                        <w:t>zene-streaming</w:t>
+                      </w:r>
+                    </w:p>
+                  </w:txbxContent>
+                </v:textbox>
+                <w10:wrap type="square"/>
+              </v:shape>
+            </w:pict>
+          </mc:Fallback>
+        </mc:AlternateContent>
+      </w:r>
+      <w:r>
         <w:rPr>
-          <w:sz w:val="32"/>
+          <w:noProof/>
         </w:rPr>
-      </w:sdtEndPr>
-      <w:sdtContent>
-        <w:p>
-          <w:pPr>
-            <w:pStyle w:val="Nincstrkz"/>
-            <w:rPr>
-              <w:sz w:val="2"/>
-            </w:rPr>
-          </w:pPr>
-        </w:p>
-        <w:p>
-          <w:r>
-            <w:rPr>
-              <w:noProof/>
-            </w:rPr>
-            <mc:AlternateContent>
-              <mc:Choice Requires="wps">
-                <w:drawing>
-                  <wp:anchor distT="0" distB="0" distL="114300" distR="114300" simplePos="0" relativeHeight="251661312" behindDoc="0" locked="0" layoutInCell="1" allowOverlap="1" wp14:anchorId="51161F34" wp14:editId="58B7E09C">
-                    <wp:simplePos x="0" y="0"/>
-                    <wp:positionH relativeFrom="page">
-                      <wp:align>center</wp:align>
-                    </wp:positionH>
-                    <wp:positionV relativeFrom="margin">
-                      <wp:align>top</wp:align>
-                    </wp:positionV>
-                    <wp:extent cx="5943600" cy="914400"/>
-                    <wp:effectExtent l="0" t="0" r="0" b="3810"/>
-                    <wp:wrapNone/>
-                    <wp:docPr id="62" name="Szövegdoboz 60"/>
-                    <wp:cNvGraphicFramePr/>
-                    <a:graphic xmlns:a="http://schemas.openxmlformats.org/drawingml/2006/main">
-                      <a:graphicData uri="http://schemas.microsoft.com/office/word/2010/wordprocessingShape">
-                        <wps:wsp>
-                          <wps:cNvSpPr txBox="1"/>
-                          <wps:spPr>
-                            <a:xfrm>
-                              <a:off x="0" y="0"/>
-                              <a:ext cx="5943600" cy="914400"/>
-                            </a:xfrm>
-                            <a:prstGeom prst="rect">
-                              <a:avLst/>
-                            </a:prstGeom>
-                            <a:noFill/>
-                            <a:ln w="6350">
-                              <a:noFill/>
-                            </a:ln>
-                            <a:effectLst/>
-                          </wps:spPr>
-                          <wps:style>
-                            <a:lnRef idx="0">
-                              <a:schemeClr val="accent1"/>
-                            </a:lnRef>
-                            <a:fillRef idx="0">
-                              <a:schemeClr val="accent1"/>
-                            </a:fillRef>
-                            <a:effectRef idx="0">
-                              <a:schemeClr val="accent1"/>
-                            </a:effectRef>
-                            <a:fontRef idx="minor">
-                              <a:schemeClr val="dk1"/>
-                            </a:fontRef>
-                          </wps:style>
-                          <wps:txbx>
-                            <w:txbxContent>
-                              <w:sdt>
-                                <w:sdtPr>
-                                  <w:rPr>
-                                    <w:rFonts w:asciiTheme="majorHAnsi" w:eastAsiaTheme="majorEastAsia" w:hAnsiTheme="majorHAnsi" w:cstheme="majorBidi"/>
-                                    <w:color w:val="2C7FCE" w:themeColor="text2" w:themeTint="99"/>
-                                    <w:sz w:val="64"/>
-                                    <w:szCs w:val="64"/>
-                                  </w:rPr>
-                                  <w:alias w:val="Cím"/>
-                                  <w:tag w:val=""/>
-                                  <w:id w:val="797192764"/>
-                                  <w:dataBinding w:prefixMappings="xmlns:ns0='http://purl.org/dc/elements/1.1/' xmlns:ns1='http://schemas.openxmlformats.org/package/2006/metadata/core-properties' " w:xpath="/ns1:coreProperties[1]/ns0:title[1]" w:storeItemID="{6C3C8BC8-F283-45AE-878A-BAB7291924A1}"/>
-                                  <w:text/>
-                                </w:sdtPr>
-                                <w:sdtEndPr>
-                                  <w:rPr>
-                                    <w:sz w:val="68"/>
-                                    <w:szCs w:val="68"/>
-                                  </w:rPr>
-                                </w:sdtEndPr>
-                                <w:sdtContent>
-                                  <w:p>
-                                    <w:pPr>
-                                      <w:pStyle w:val="Nincstrkz"/>
-                                      <w:rPr>
-                                        <w:rFonts w:asciiTheme="majorHAnsi" w:eastAsiaTheme="majorEastAsia" w:hAnsiTheme="majorHAnsi" w:cstheme="majorBidi"/>
-                                        <w:caps/>
-                                        <w:color w:val="2C7FCE" w:themeColor="text2" w:themeTint="99"/>
-                                        <w:sz w:val="68"/>
-                                        <w:szCs w:val="68"/>
-                                      </w:rPr>
-                                    </w:pPr>
-                                    <w:r>
-                                      <w:rPr>
-                                        <w:rFonts w:asciiTheme="majorHAnsi" w:eastAsiaTheme="majorEastAsia" w:hAnsiTheme="majorHAnsi" w:cstheme="majorBidi"/>
-                                        <w:color w:val="2C7FCE" w:themeColor="text2" w:themeTint="99"/>
-                                        <w:sz w:val="64"/>
-                                        <w:szCs w:val="64"/>
-                                      </w:rPr>
-                                      <w:t>My</w:t>
-                                    </w:r>
-                                    <w:r>
-                                      <w:rPr>
-                                        <w:rFonts w:asciiTheme="majorHAnsi" w:eastAsiaTheme="majorEastAsia" w:hAnsiTheme="majorHAnsi" w:cstheme="majorBidi"/>
-                                        <w:color w:val="2C7FCE" w:themeColor="text2" w:themeTint="99"/>
-                                        <w:sz w:val="64"/>
-                                        <w:szCs w:val="64"/>
-                                      </w:rPr>
-                                      <w:t>T</w:t>
-                                    </w:r>
-                                    <w:r>
-                                      <w:rPr>
-                                        <w:rFonts w:asciiTheme="majorHAnsi" w:eastAsiaTheme="majorEastAsia" w:hAnsiTheme="majorHAnsi" w:cstheme="majorBidi"/>
-                                        <w:color w:val="2C7FCE" w:themeColor="text2" w:themeTint="99"/>
-                                        <w:sz w:val="64"/>
-                                        <w:szCs w:val="64"/>
-                                      </w:rPr>
-                                      <w:t>unes</w:t>
-                                    </w:r>
-                                  </w:p>
-                                </w:sdtContent>
-                              </w:sdt>
-                              <w:p>
-                                <w:pPr>
-                                  <w:pStyle w:val="Nincstrkz"/>
-                                  <w:spacing w:before="120"/>
-                                  <w:rPr>
-                                    <w:color w:val="156082" w:themeColor="accent1"/>
-                                    <w:sz w:val="36"/>
-                                    <w:szCs w:val="36"/>
-                                  </w:rPr>
-                                </w:pPr>
-                                <w:sdt>
-                                  <w:sdtPr>
-                                    <w:rPr>
-                                      <w:color w:val="156082" w:themeColor="accent1"/>
-                                      <w:sz w:val="36"/>
-                                      <w:szCs w:val="36"/>
-                                    </w:rPr>
-                                    <w:alias w:val="Alcím"/>
-                                    <w:tag w:val=""/>
-                                    <w:id w:val="2021743002"/>
-                                    <w:dataBinding w:prefixMappings="xmlns:ns0='http://purl.org/dc/elements/1.1/' xmlns:ns1='http://schemas.openxmlformats.org/package/2006/metadata/core-properties' " w:xpath="/ns1:coreProperties[1]/ns0:subject[1]" w:storeItemID="{6C3C8BC8-F283-45AE-878A-BAB7291924A1}"/>
-                                    <w:text/>
-                                  </w:sdtPr>
-                                  <w:sdtContent>
-                                    <w:r>
-                                      <w:rPr>
-                                        <w:color w:val="156082" w:themeColor="accent1"/>
-                                        <w:sz w:val="36"/>
-                                        <w:szCs w:val="36"/>
-                                      </w:rPr>
-                                      <w:t>zene streaming</w:t>
-                                    </w:r>
-                                  </w:sdtContent>
-                                </w:sdt>
-                              </w:p>
-                              <w:p/>
-                            </w:txbxContent>
-                          </wps:txbx>
-                          <wps:bodyPr rot="0" spcFirstLastPara="0" vertOverflow="overflow" horzOverflow="overflow" vert="horz" wrap="square" lIns="91440" tIns="45720" rIns="91440" bIns="45720" numCol="1" spcCol="0" rtlCol="0" fromWordArt="0" anchor="t" anchorCtr="0" forceAA="0" compatLnSpc="1">
-                            <a:prstTxWarp prst="textNoShape">
-                              <a:avLst/>
-                            </a:prstTxWarp>
-                            <a:spAutoFit/>
-                          </wps:bodyPr>
-                        </wps:wsp>
-                      </a:graphicData>
-                    </a:graphic>
-                    <wp14:sizeRelH relativeFrom="page">
-                      <wp14:pctWidth>76500</wp14:pctWidth>
-                    </wp14:sizeRelH>
-                  </wp:anchor>
-                </w:drawing>
-              </mc:Choice>
-              <mc:Fallback>
-                <w:pict>
-                  <v:shapetype w14:anchorId="51161F34" id="_x0000_t202" coordsize="21600,21600" o:spt="202" path="m,l,21600r21600,l21600,xe">
-                    <v:stroke joinstyle="miter"/>
-                    <v:path gradientshapeok="t" o:connecttype="rect"/>
-                  </v:shapetype>
-                  <v:shape id="Szövegdoboz 60" o:spid="_x0000_s1026" type="#_x0000_t202" style="position:absolute;margin-left:0;margin-top:0;width:468pt;height:1in;z-index:251661312;visibility:visible;mso-wrap-style:square;mso-width-percent:765;mso-wrap-distance-left:9pt;mso-wrap-distance-top:0;mso-wrap-distance-right:9pt;mso-wrap-distance-bottom:0;mso-position-horizontal:center;mso-position-horizontal-relative:page;mso-position-vertical:top;mso-position-vertical-relative:margin;mso-width-percent:765;mso-width-relative:page;v-text-anchor:top" o:gfxdata="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" filled="f" stroked="f" strokeweight=".5pt">
-                    <v:textbox style="mso-fit-shape-to-text:t">
-                      <w:txbxContent>
-                        <w:sdt>
-                          <w:sdtPr>
-                            <w:rPr>
-                              <w:rFonts w:asciiTheme="majorHAnsi" w:eastAsiaTheme="majorEastAsia" w:hAnsiTheme="majorHAnsi" w:cstheme="majorBidi"/>
-                              <w:color w:val="2C7FCE" w:themeColor="text2" w:themeTint="99"/>
-                              <w:sz w:val="64"/>
-                              <w:szCs w:val="64"/>
-                            </w:rPr>
-                            <w:alias w:val="Cím"/>
-                            <w:tag w:val=""/>
-                            <w:id w:val="797192764"/>
-                            <w:dataBinding w:prefixMappings="xmlns:ns0='http://purl.org/dc/elements/1.1/' xmlns:ns1='http://schemas.openxmlformats.org/package/2006/metadata/core-properties' " w:xpath="/ns1:coreProperties[1]/ns0:title[1]" w:storeItemID="{6C3C8BC8-F283-45AE-878A-BAB7291924A1}"/>
-                            <w:text/>
-                          </w:sdtPr>
-                          <w:sdtEndPr>
-                            <w:rPr>
-                              <w:sz w:val="68"/>
-                              <w:szCs w:val="68"/>
-                            </w:rPr>
-                          </w:sdtEndPr>
-                          <w:sdtContent>
-                            <w:p>
-                              <w:pPr>
-                                <w:pStyle w:val="Nincstrkz"/>
-                                <w:rPr>
-                                  <w:rFonts w:asciiTheme="majorHAnsi" w:eastAsiaTheme="majorEastAsia" w:hAnsiTheme="majorHAnsi" w:cstheme="majorBidi"/>
-                                  <w:caps/>
-                                  <w:color w:val="2C7FCE" w:themeColor="text2" w:themeTint="99"/>
-                                  <w:sz w:val="68"/>
-                                  <w:szCs w:val="68"/>
-                                </w:rPr>
-                              </w:pPr>
-                              <w:r>
-                                <w:rPr>
-                                  <w:rFonts w:asciiTheme="majorHAnsi" w:eastAsiaTheme="majorEastAsia" w:hAnsiTheme="majorHAnsi" w:cstheme="majorBidi"/>
-                                  <w:color w:val="2C7FCE" w:themeColor="text2" w:themeTint="99"/>
-                                  <w:sz w:val="64"/>
-                                  <w:szCs w:val="64"/>
-                                </w:rPr>
-                                <w:t>My</w:t>
-                              </w:r>
-                              <w:r>
-                                <w:rPr>
-                                  <w:rFonts w:asciiTheme="majorHAnsi" w:eastAsiaTheme="majorEastAsia" w:hAnsiTheme="majorHAnsi" w:cstheme="majorBidi"/>
-                                  <w:color w:val="2C7FCE" w:themeColor="text2" w:themeTint="99"/>
-                                  <w:sz w:val="64"/>
-                                  <w:szCs w:val="64"/>
-                                </w:rPr>
-                                <w:t>T</w:t>
-                              </w:r>
-                              <w:r>
-                                <w:rPr>
-                                  <w:rFonts w:asciiTheme="majorHAnsi" w:eastAsiaTheme="majorEastAsia" w:hAnsiTheme="majorHAnsi" w:cstheme="majorBidi"/>
-                                  <w:color w:val="2C7FCE" w:themeColor="text2" w:themeTint="99"/>
-                                  <w:sz w:val="64"/>
-                                  <w:szCs w:val="64"/>
-                                </w:rPr>
-                                <w:t>unes</w:t>
-                              </w:r>
-                            </w:p>
-                          </w:sdtContent>
-                        </w:sdt>
-                        <w:p>
-                          <w:pPr>
-                            <w:pStyle w:val="Nincstrkz"/>
-                            <w:spacing w:before="120"/>
-                            <w:rPr>
-                              <w:color w:val="156082" w:themeColor="accent1"/>
-                              <w:sz w:val="36"/>
-                              <w:szCs w:val="36"/>
-                            </w:rPr>
-                          </w:pPr>
-                          <w:sdt>
-                            <w:sdtPr>
+        <mc:AlternateContent>
+          <mc:Choice Requires="wps">
+            <w:drawing>
+              <wp:anchor distT="45720" distB="45720" distL="114300" distR="114300" simplePos="0" relativeHeight="251663360" behindDoc="1" locked="0" layoutInCell="1" allowOverlap="1" wp14:anchorId="3783ECA1" wp14:editId="14DB9884">
+                <wp:simplePos x="0" y="0"/>
+                <wp:positionH relativeFrom="margin">
+                  <wp:posOffset>3376930</wp:posOffset>
+                </wp:positionH>
+                <wp:positionV relativeFrom="paragraph">
+                  <wp:posOffset>5520055</wp:posOffset>
+                </wp:positionV>
+                <wp:extent cx="2924175" cy="1200150"/>
+                <wp:effectExtent l="0" t="0" r="0" b="0"/>
+                <wp:wrapNone/>
+                <wp:docPr id="2" name="Text Box 2"/>
+                <wp:cNvGraphicFramePr>
+                  <a:graphicFrameLocks xmlns:a="http://schemas.openxmlformats.org/drawingml/2006/main"/>
+                </wp:cNvGraphicFramePr>
+                <a:graphic xmlns:a="http://schemas.openxmlformats.org/drawingml/2006/main">
+                  <a:graphicData uri="http://schemas.microsoft.com/office/word/2010/wordprocessingShape">
+                    <wps:wsp>
+                      <wps:cNvSpPr txBox="1">
+                        <a:spLocks noChangeArrowheads="1"/>
+                      </wps:cNvSpPr>
+                      <wps:spPr bwMode="auto">
+                        <a:xfrm>
+                          <a:off x="0" y="0"/>
+                          <a:ext cx="2924175" cy="1200150"/>
+                        </a:xfrm>
+                        <a:prstGeom prst="rect">
+                          <a:avLst/>
+                        </a:prstGeom>
+                        <a:noFill/>
+                        <a:ln w="9525">
+                          <a:noFill/>
+                          <a:miter lim="800000"/>
+                          <a:headEnd/>
+                          <a:tailEnd/>
+                        </a:ln>
+                      </wps:spPr>
+                      <wps:txbx>
+                        <w:txbxContent>
+                          <w:p>
+                            <w:pPr>
+                              <w:jc w:val="right"/>
                               <w:rPr>
-                                <w:color w:val="156082" w:themeColor="accent1"/>
-                                <w:sz w:val="36"/>
-                                <w:szCs w:val="36"/>
+                                <w:rFonts w:ascii="Montserrat" w:hAnsi="Montserrat" w:cs="Arial"/>
+                                <w:color w:val="000000" w:themeColor="text1"/>
+                                <w:sz w:val="30"/>
+                                <w:szCs w:val="30"/>
                               </w:rPr>
-                              <w:alias w:val="Alcím"/>
-                              <w:tag w:val=""/>
-                              <w:id w:val="2021743002"/>
-                              <w:dataBinding w:prefixMappings="xmlns:ns0='http://purl.org/dc/elements/1.1/' xmlns:ns1='http://schemas.openxmlformats.org/package/2006/metadata/core-properties' " w:xpath="/ns1:coreProperties[1]/ns0:subject[1]" w:storeItemID="{6C3C8BC8-F283-45AE-878A-BAB7291924A1}"/>
-                              <w:text/>
-                            </w:sdtPr>
-                            <w:sdtContent>
-                              <w:r>
-                                <w:rPr>
-                                  <w:color w:val="156082" w:themeColor="accent1"/>
-                                  <w:sz w:val="36"/>
-                                  <w:szCs w:val="36"/>
-                                </w:rPr>
-                                <w:t>zene streaming</w:t>
-                              </w:r>
-                            </w:sdtContent>
-                          </w:sdt>
-                        </w:p>
-                        <w:p/>
-                      </w:txbxContent>
-                    </v:textbox>
-                    <w10:wrap anchorx="page" anchory="margin"/>
-                  </v:shape>
-                </w:pict>
-              </mc:Fallback>
-            </mc:AlternateContent>
-          </w:r>
-          <w:r>
-            <w:rPr>
-              <w:noProof/>
-              <w:color w:val="156082" w:themeColor="accent1"/>
-              <w:sz w:val="36"/>
-              <w:szCs w:val="36"/>
-            </w:rPr>
-            <mc:AlternateContent>
-              <mc:Choice Requires="wpg">
-                <w:drawing>
-                  <wp:anchor distT="0" distB="0" distL="114300" distR="114300" simplePos="0" relativeHeight="251660288" behindDoc="1" locked="0" layoutInCell="1" allowOverlap="1" wp14:anchorId="2130AEE5" wp14:editId="63B24215">
-                    <wp:simplePos x="0" y="0"/>
-                    <mc:AlternateContent>
-                      <mc:Choice Requires="wp14">
-                        <wp:positionH relativeFrom="page">
-                          <wp14:pctPosHOffset>22000</wp14:pctPosHOffset>
-                        </wp:positionH>
-                      </mc:Choice>
-                      <mc:Fallback>
-                        <wp:positionH relativeFrom="page">
-                          <wp:posOffset>1663065</wp:posOffset>
-                        </wp:positionH>
-                      </mc:Fallback>
-                    </mc:AlternateContent>
-                    <mc:AlternateContent>
-                      <mc:Choice Requires="wp14">
-                        <wp:positionV relativeFrom="page">
-                          <wp14:pctPosVOffset>30000</wp14:pctPosVOffset>
-                        </wp:positionV>
-                      </mc:Choice>
-                      <mc:Fallback>
-                        <wp:positionV relativeFrom="page">
-                          <wp:posOffset>3207385</wp:posOffset>
-                        </wp:positionV>
-                      </mc:Fallback>
-                    </mc:AlternateContent>
-                    <wp:extent cx="5494369" cy="5696712"/>
-                    <wp:effectExtent l="0" t="0" r="0" b="3175"/>
-                    <wp:wrapNone/>
-                    <wp:docPr id="63" name="Csoport 2"/>
-                    <wp:cNvGraphicFramePr>
-                      <a:graphicFrameLocks xmlns:a="http://schemas.openxmlformats.org/drawingml/2006/main" noChangeAspect="1"/>
-                    </wp:cNvGraphicFramePr>
-                    <a:graphic xmlns:a="http://schemas.openxmlformats.org/drawingml/2006/main">
-                      <a:graphicData uri="http://schemas.microsoft.com/office/word/2010/wordprocessingGroup">
-                        <wpg:wgp>
-                          <wpg:cNvGrpSpPr>
-                            <a:grpSpLocks noChangeAspect="1"/>
-                          </wpg:cNvGrpSpPr>
-                          <wpg:grpSpPr>
-                            <a:xfrm>
-                              <a:off x="0" y="0"/>
-                              <a:ext cx="5494369" cy="5696712"/>
-                              <a:chOff x="0" y="0"/>
-                              <a:chExt cx="4329113" cy="4491038"/>
-                            </a:xfrm>
-                            <a:solidFill>
-                              <a:schemeClr val="tx2">
-                                <a:lumMod val="60000"/>
-                                <a:lumOff val="40000"/>
-                              </a:schemeClr>
-                            </a:solidFill>
-                          </wpg:grpSpPr>
-                          <wps:wsp>
-                            <wps:cNvPr id="64" name="Szabadkézi sokszög 64"/>
-                            <wps:cNvSpPr>
-                              <a:spLocks/>
-                            </wps:cNvSpPr>
-                            <wps:spPr bwMode="auto">
-                              <a:xfrm>
-                                <a:off x="1501775" y="0"/>
-                                <a:ext cx="2827338" cy="2835275"/>
-                              </a:xfrm>
-                              <a:custGeom>
-                                <a:avLst/>
-                                <a:gdLst>
-                                  <a:gd name="T0" fmla="*/ 4 w 1781"/>
-                                  <a:gd name="T1" fmla="*/ 1786 h 1786"/>
-                                  <a:gd name="T2" fmla="*/ 0 w 1781"/>
-                                  <a:gd name="T3" fmla="*/ 1782 h 1786"/>
-                                  <a:gd name="T4" fmla="*/ 1776 w 1781"/>
-                                  <a:gd name="T5" fmla="*/ 0 h 1786"/>
-                                  <a:gd name="T6" fmla="*/ 1781 w 1781"/>
-                                  <a:gd name="T7" fmla="*/ 5 h 1786"/>
-                                  <a:gd name="T8" fmla="*/ 4 w 1781"/>
-                                  <a:gd name="T9" fmla="*/ 1786 h 1786"/>
-                                </a:gdLst>
-                                <a:ahLst/>
-                                <a:cxnLst>
-                                  <a:cxn ang="0">
-                                    <a:pos x="T0" y="T1"/>
-                                  </a:cxn>
-                                  <a:cxn ang="0">
-                                    <a:pos x="T2" y="T3"/>
-                                  </a:cxn>
-                                  <a:cxn ang="0">
-                                    <a:pos x="T4" y="T5"/>
-                                  </a:cxn>
-                                  <a:cxn ang="0">
-                                    <a:pos x="T6" y="T7"/>
-                                  </a:cxn>
-                                  <a:cxn ang="0">
-                                    <a:pos x="T8" y="T9"/>
-                                  </a:cxn>
-                                </a:cxnLst>
-                                <a:rect l="0" t="0" r="r" b="b"/>
-                                <a:pathLst>
-                                  <a:path w="1781" h="1786">
-                                    <a:moveTo>
-                                      <a:pt x="4" y="1786"/>
-                                    </a:moveTo>
-                                    <a:lnTo>
-                                      <a:pt x="0" y="1782"/>
-                                    </a:lnTo>
-                                    <a:lnTo>
-                                      <a:pt x="1776" y="0"/>
-                                    </a:lnTo>
-                                    <a:lnTo>
-                                      <a:pt x="1781" y="5"/>
-                                    </a:lnTo>
-                                    <a:lnTo>
-                                      <a:pt x="4" y="1786"/>
-                                    </a:lnTo>
-                                    <a:close/>
-                                  </a:path>
-                                </a:pathLst>
-                              </a:custGeom>
-                              <a:grpFill/>
-                              <a:ln>
-                                <a:noFill/>
-                              </a:ln>
-                              <a:extLst>
-                                <a:ext uri="{91240B29-F687-4F45-9708-019B960494DF}">
-                                  <a14:hiddenLine xmlns:a14="http://schemas.microsoft.com/office/drawing/2010/main" w="9525">
-                                    <a:solidFill>
-                                      <a:srgbClr val="000000"/>
-                                    </a:solidFill>
-                                    <a:round/>
-                                    <a:headEnd/>
-                                    <a:tailEnd/>
-                                  </a14:hiddenLine>
-                                </a:ext>
-                              </a:extLst>
-                            </wps:spPr>
-                            <wps:bodyPr vert="horz" wrap="square" lIns="91440" tIns="45720" rIns="91440" bIns="45720" numCol="1" anchor="t" anchorCtr="0" compatLnSpc="1">
-                              <a:prstTxWarp prst="textNoShape">
-                                <a:avLst/>
-                              </a:prstTxWarp>
-                            </wps:bodyPr>
-                          </wps:wsp>
-                          <wps:wsp>
-                            <wps:cNvPr id="65" name="Szabadkézi sokszög 65"/>
-                            <wps:cNvSpPr>
-                              <a:spLocks/>
-                            </wps:cNvSpPr>
-                            <wps:spPr bwMode="auto">
-                              <a:xfrm>
-                                <a:off x="782637" y="227013"/>
-                                <a:ext cx="3546475" cy="3546475"/>
-                              </a:xfrm>
-                              <a:custGeom>
-                                <a:avLst/>
-                                <a:gdLst>
-                                  <a:gd name="T0" fmla="*/ 5 w 2234"/>
-                                  <a:gd name="T1" fmla="*/ 2234 h 2234"/>
-                                  <a:gd name="T2" fmla="*/ 0 w 2234"/>
-                                  <a:gd name="T3" fmla="*/ 2229 h 2234"/>
-                                  <a:gd name="T4" fmla="*/ 2229 w 2234"/>
-                                  <a:gd name="T5" fmla="*/ 0 h 2234"/>
-                                  <a:gd name="T6" fmla="*/ 2234 w 2234"/>
-                                  <a:gd name="T7" fmla="*/ 5 h 2234"/>
-                                  <a:gd name="T8" fmla="*/ 5 w 2234"/>
-                                  <a:gd name="T9" fmla="*/ 2234 h 2234"/>
-                                </a:gdLst>
-                                <a:ahLst/>
-                                <a:cxnLst>
-                                  <a:cxn ang="0">
-                                    <a:pos x="T0" y="T1"/>
-                                  </a:cxn>
-                                  <a:cxn ang="0">
-                                    <a:pos x="T2" y="T3"/>
-                                  </a:cxn>
-                                  <a:cxn ang="0">
-                                    <a:pos x="T4" y="T5"/>
-                                  </a:cxn>
-                                  <a:cxn ang="0">
-                                    <a:pos x="T6" y="T7"/>
-                                  </a:cxn>
-                                  <a:cxn ang="0">
-                                    <a:pos x="T8" y="T9"/>
-                                  </a:cxn>
-                                </a:cxnLst>
-                                <a:rect l="0" t="0" r="r" b="b"/>
-                                <a:pathLst>
-                                  <a:path w="2234" h="2234">
-                                    <a:moveTo>
-                                      <a:pt x="5" y="2234"/>
-                                    </a:moveTo>
-                                    <a:lnTo>
-                                      <a:pt x="0" y="2229"/>
-                                    </a:lnTo>
-                                    <a:lnTo>
-                                      <a:pt x="2229" y="0"/>
-                                    </a:lnTo>
-                                    <a:lnTo>
-                                      <a:pt x="2234" y="5"/>
-                                    </a:lnTo>
-                                    <a:lnTo>
-                                      <a:pt x="5" y="2234"/>
-                                    </a:lnTo>
-                                    <a:close/>
-                                  </a:path>
-                                </a:pathLst>
-                              </a:custGeom>
-                              <a:grpFill/>
-                              <a:ln>
-                                <a:noFill/>
-                              </a:ln>
-                              <a:extLst>
-                                <a:ext uri="{91240B29-F687-4F45-9708-019B960494DF}">
-                                  <a14:hiddenLine xmlns:a14="http://schemas.microsoft.com/office/drawing/2010/main" w="9525">
-                                    <a:solidFill>
-                                      <a:srgbClr val="000000"/>
-                                    </a:solidFill>
-                                    <a:round/>
-                                    <a:headEnd/>
-                                    <a:tailEnd/>
-                                  </a14:hiddenLine>
-                                </a:ext>
-                              </a:extLst>
-                            </wps:spPr>
-                            <wps:bodyPr vert="horz" wrap="square" lIns="91440" tIns="45720" rIns="91440" bIns="45720" numCol="1" anchor="t" anchorCtr="0" compatLnSpc="1">
-                              <a:prstTxWarp prst="textNoShape">
-                                <a:avLst/>
-                              </a:prstTxWarp>
-                            </wps:bodyPr>
-                          </wps:wsp>
-                          <wps:wsp>
-                            <wps:cNvPr id="66" name="Szabadkézi sokszög 66"/>
-                            <wps:cNvSpPr>
-                              <a:spLocks/>
-                            </wps:cNvSpPr>
-                            <wps:spPr bwMode="auto">
-                              <a:xfrm>
-                                <a:off x="841375" y="109538"/>
-                                <a:ext cx="3487738" cy="3487738"/>
-                              </a:xfrm>
-                              <a:custGeom>
-                                <a:avLst/>
-                                <a:gdLst>
-                                  <a:gd name="T0" fmla="*/ 9 w 2197"/>
-                                  <a:gd name="T1" fmla="*/ 2197 h 2197"/>
-                                  <a:gd name="T2" fmla="*/ 0 w 2197"/>
-                                  <a:gd name="T3" fmla="*/ 2193 h 2197"/>
-                                  <a:gd name="T4" fmla="*/ 2188 w 2197"/>
-                                  <a:gd name="T5" fmla="*/ 0 h 2197"/>
-                                  <a:gd name="T6" fmla="*/ 2197 w 2197"/>
-                                  <a:gd name="T7" fmla="*/ 10 h 2197"/>
-                                  <a:gd name="T8" fmla="*/ 9 w 2197"/>
-                                  <a:gd name="T9" fmla="*/ 2197 h 2197"/>
-                                </a:gdLst>
-                                <a:ahLst/>
-                                <a:cxnLst>
-                                  <a:cxn ang="0">
-                                    <a:pos x="T0" y="T1"/>
-                                  </a:cxn>
-                                  <a:cxn ang="0">
-                                    <a:pos x="T2" y="T3"/>
-                                  </a:cxn>
-                                  <a:cxn ang="0">
-                                    <a:pos x="T4" y="T5"/>
-                                  </a:cxn>
-                                  <a:cxn ang="0">
-                                    <a:pos x="T6" y="T7"/>
-                                  </a:cxn>
-                                  <a:cxn ang="0">
-                                    <a:pos x="T8" y="T9"/>
-                                  </a:cxn>
-                                </a:cxnLst>
-                                <a:rect l="0" t="0" r="r" b="b"/>
-                                <a:pathLst>
-                                  <a:path w="2197" h="2197">
-                                    <a:moveTo>
-                                      <a:pt x="9" y="2197"/>
-                                    </a:moveTo>
-                                    <a:lnTo>
-                                      <a:pt x="0" y="2193"/>
-                                    </a:lnTo>
-                                    <a:lnTo>
-                                      <a:pt x="2188" y="0"/>
-                                    </a:lnTo>
-                                    <a:lnTo>
-                                      <a:pt x="2197" y="10"/>
-                                    </a:lnTo>
-                                    <a:lnTo>
-                                      <a:pt x="9" y="2197"/>
-                                    </a:lnTo>
-                                    <a:close/>
-                                  </a:path>
-                                </a:pathLst>
-                              </a:custGeom>
-                              <a:grpFill/>
-                              <a:ln>
-                                <a:noFill/>
-                              </a:ln>
-                              <a:extLst>
-                                <a:ext uri="{91240B29-F687-4F45-9708-019B960494DF}">
-                                  <a14:hiddenLine xmlns:a14="http://schemas.microsoft.com/office/drawing/2010/main" w="9525">
-                                    <a:solidFill>
-                                      <a:srgbClr val="000000"/>
-                                    </a:solidFill>
-                                    <a:round/>
-                                    <a:headEnd/>
-                                    <a:tailEnd/>
-                                  </a14:hiddenLine>
-                                </a:ext>
-                              </a:extLst>
-                            </wps:spPr>
-                            <wps:bodyPr vert="horz" wrap="square" lIns="91440" tIns="45720" rIns="91440" bIns="45720" numCol="1" anchor="t" anchorCtr="0" compatLnSpc="1">
-                              <a:prstTxWarp prst="textNoShape">
-                                <a:avLst/>
-                              </a:prstTxWarp>
-                            </wps:bodyPr>
-                          </wps:wsp>
-                          <wps:wsp>
-                            <wps:cNvPr id="67" name="Szabadkézi sokszög 67"/>
-                            <wps:cNvSpPr>
-                              <a:spLocks/>
-                            </wps:cNvSpPr>
-                            <wps:spPr bwMode="auto">
-                              <a:xfrm>
-                                <a:off x="1216025" y="498475"/>
-                                <a:ext cx="3113088" cy="3121025"/>
-                              </a:xfrm>
-                              <a:custGeom>
-                                <a:avLst/>
-                                <a:gdLst>
-                                  <a:gd name="T0" fmla="*/ 9 w 1961"/>
-                                  <a:gd name="T1" fmla="*/ 1966 h 1966"/>
-                                  <a:gd name="T2" fmla="*/ 0 w 1961"/>
-                                  <a:gd name="T3" fmla="*/ 1957 h 1966"/>
-                                  <a:gd name="T4" fmla="*/ 1952 w 1961"/>
-                                  <a:gd name="T5" fmla="*/ 0 h 1966"/>
-                                  <a:gd name="T6" fmla="*/ 1961 w 1961"/>
-                                  <a:gd name="T7" fmla="*/ 9 h 1966"/>
-                                  <a:gd name="T8" fmla="*/ 9 w 1961"/>
-                                  <a:gd name="T9" fmla="*/ 1966 h 1966"/>
-                                </a:gdLst>
-                                <a:ahLst/>
-                                <a:cxnLst>
-                                  <a:cxn ang="0">
-                                    <a:pos x="T0" y="T1"/>
-                                  </a:cxn>
-                                  <a:cxn ang="0">
-                                    <a:pos x="T2" y="T3"/>
-                                  </a:cxn>
-                                  <a:cxn ang="0">
-                                    <a:pos x="T4" y="T5"/>
-                                  </a:cxn>
-                                  <a:cxn ang="0">
-                                    <a:pos x="T6" y="T7"/>
-                                  </a:cxn>
-                                  <a:cxn ang="0">
-                                    <a:pos x="T8" y="T9"/>
-                                  </a:cxn>
-                                </a:cxnLst>
-                                <a:rect l="0" t="0" r="r" b="b"/>
-                                <a:pathLst>
-                                  <a:path w="1961" h="1966">
-                                    <a:moveTo>
-                                      <a:pt x="9" y="1966"/>
-                                    </a:moveTo>
-                                    <a:lnTo>
-                                      <a:pt x="0" y="1957"/>
-                                    </a:lnTo>
-                                    <a:lnTo>
-                                      <a:pt x="1952" y="0"/>
-                                    </a:lnTo>
-                                    <a:lnTo>
-                                      <a:pt x="1961" y="9"/>
-                                    </a:lnTo>
-                                    <a:lnTo>
-                                      <a:pt x="9" y="1966"/>
-                                    </a:lnTo>
-                                    <a:close/>
-                                  </a:path>
-                                </a:pathLst>
-                              </a:custGeom>
-                              <a:grpFill/>
-                              <a:ln>
-                                <a:noFill/>
-                              </a:ln>
-                              <a:extLst>
-                                <a:ext uri="{91240B29-F687-4F45-9708-019B960494DF}">
-                                  <a14:hiddenLine xmlns:a14="http://schemas.microsoft.com/office/drawing/2010/main" w="9525">
-                                    <a:solidFill>
-                                      <a:srgbClr val="000000"/>
-                                    </a:solidFill>
-                                    <a:round/>
-                                    <a:headEnd/>
-                                    <a:tailEnd/>
-                                  </a14:hiddenLine>
-                                </a:ext>
-                              </a:extLst>
-                            </wps:spPr>
-                            <wps:bodyPr vert="horz" wrap="square" lIns="91440" tIns="45720" rIns="91440" bIns="45720" numCol="1" anchor="t" anchorCtr="0" compatLnSpc="1">
-                              <a:prstTxWarp prst="textNoShape">
-                                <a:avLst/>
-                              </a:prstTxWarp>
-                            </wps:bodyPr>
-                          </wps:wsp>
-                          <wps:wsp>
-                            <wps:cNvPr id="68" name="Szabadkézi sokszög 68"/>
-                            <wps:cNvSpPr>
-                              <a:spLocks/>
-                            </wps:cNvSpPr>
-                            <wps:spPr bwMode="auto">
-                              <a:xfrm>
-                                <a:off x="0" y="153988"/>
-                                <a:ext cx="4329113" cy="4337050"/>
-                              </a:xfrm>
-                              <a:custGeom>
-                                <a:avLst/>
-                                <a:gdLst>
-                                  <a:gd name="T0" fmla="*/ 0 w 2727"/>
-                                  <a:gd name="T1" fmla="*/ 2732 h 2732"/>
-                                  <a:gd name="T2" fmla="*/ 0 w 2727"/>
-                                  <a:gd name="T3" fmla="*/ 2728 h 2732"/>
-                                  <a:gd name="T4" fmla="*/ 2722 w 2727"/>
-                                  <a:gd name="T5" fmla="*/ 0 h 2732"/>
-                                  <a:gd name="T6" fmla="*/ 2727 w 2727"/>
-                                  <a:gd name="T7" fmla="*/ 5 h 2732"/>
-                                  <a:gd name="T8" fmla="*/ 0 w 2727"/>
-                                  <a:gd name="T9" fmla="*/ 2732 h 2732"/>
-                                </a:gdLst>
-                                <a:ahLst/>
-                                <a:cxnLst>
-                                  <a:cxn ang="0">
-                                    <a:pos x="T0" y="T1"/>
-                                  </a:cxn>
-                                  <a:cxn ang="0">
-                                    <a:pos x="T2" y="T3"/>
-                                  </a:cxn>
-                                  <a:cxn ang="0">
-                                    <a:pos x="T4" y="T5"/>
-                                  </a:cxn>
-                                  <a:cxn ang="0">
-                                    <a:pos x="T6" y="T7"/>
-                                  </a:cxn>
-                                  <a:cxn ang="0">
-                                    <a:pos x="T8" y="T9"/>
-                                  </a:cxn>
-                                </a:cxnLst>
-                                <a:rect l="0" t="0" r="r" b="b"/>
-                                <a:pathLst>
-                                  <a:path w="2727" h="2732">
-                                    <a:moveTo>
-                                      <a:pt x="0" y="2732"/>
-                                    </a:moveTo>
-                                    <a:lnTo>
-                                      <a:pt x="0" y="2728"/>
-                                    </a:lnTo>
-                                    <a:lnTo>
-                                      <a:pt x="2722" y="0"/>
-                                    </a:lnTo>
-                                    <a:lnTo>
-                                      <a:pt x="2727" y="5"/>
-                                    </a:lnTo>
-                                    <a:lnTo>
-                                      <a:pt x="0" y="2732"/>
-                                    </a:lnTo>
-                                    <a:close/>
-                                  </a:path>
-                                </a:pathLst>
-                              </a:custGeom>
-                              <a:grpFill/>
-                              <a:ln>
-                                <a:noFill/>
-                              </a:ln>
-                              <a:extLst>
-                                <a:ext uri="{91240B29-F687-4F45-9708-019B960494DF}">
-                                  <a14:hiddenLine xmlns:a14="http://schemas.microsoft.com/office/drawing/2010/main" w="9525">
-                                    <a:solidFill>
-                                      <a:srgbClr val="000000"/>
-                                    </a:solidFill>
-                                    <a:round/>
-                                    <a:headEnd/>
-                                    <a:tailEnd/>
-                                  </a14:hiddenLine>
-                                </a:ext>
-                              </a:extLst>
-                            </wps:spPr>
-                            <wps:bodyPr vert="horz" wrap="square" lIns="91440" tIns="45720" rIns="91440" bIns="45720" numCol="1" anchor="t" anchorCtr="0" compatLnSpc="1">
-                              <a:prstTxWarp prst="textNoShape">
-                                <a:avLst/>
-                              </a:prstTxWarp>
-                            </wps:bodyPr>
-                          </wps:wsp>
-                        </wpg:wgp>
-                      </a:graphicData>
-                    </a:graphic>
-                    <wp14:sizeRelH relativeFrom="page">
-                      <wp14:pctWidth>70600</wp14:pctWidth>
-                    </wp14:sizeRelH>
-                    <wp14:sizeRelV relativeFrom="page">
-                      <wp14:pctHeight>56600</wp14:pctHeight>
-                    </wp14:sizeRelV>
-                  </wp:anchor>
-                </w:drawing>
-              </mc:Choice>
-              <mc:Fallback>
-                <w:pict>
-                  <v:group w14:anchorId="3E6C9653" id="Csoport 2" o:spid="_x0000_s1026" style="position:absolute;margin-left:0;margin-top:0;width:432.65pt;height:448.55pt;z-index:-251656192;mso-width-percent:706;mso-height-percent:566;mso-left-percent:220;mso-top-percent:300;mso-position-horizontal-relative:page;mso-position-vertical-relative:page;mso-width-percent:706;mso-height-percent:566;mso-left-percent:220;mso-top-percent:300" coordsize="43291,44910" o:gfxdata="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">
-                    <o:lock v:ext="edit" aspectratio="t"/>
-                    <v:shape id="Szabadkézi sokszög 64" o:spid="_x0000_s1027" style="position:absolute;left:15017;width:28274;height:28352;visibility:visible;mso-wrap-style:square;v-text-anchor:top" coordsize="1781,1786" o:gfxdata="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" path="m4,1786l,1782,1776,r5,5l4,1786xe" filled="f" stroked="f">
-                      <v:path arrowok="t" o:connecttype="custom" o:connectlocs="6350,2835275;0,2828925;2819400,0;2827338,7938;6350,2835275" o:connectangles="0,0,0,0,0"/>
-                    </v:shape>
-                    <v:shape id="Szabadkézi sokszög 65" o:spid="_x0000_s1028" style="position:absolute;left:7826;top:2270;width:35465;height:35464;visibility:visible;mso-wrap-style:square;v-text-anchor:top" coordsize="2234,2234" o:gfxdata="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" path="m5,2234l,2229,2229,r5,5l5,2234xe" filled="f" stroked="f">
-                      <v:path arrowok="t" o:connecttype="custom" o:connectlocs="7938,3546475;0,3538538;3538538,0;3546475,7938;7938,3546475" o:connectangles="0,0,0,0,0"/>
-                    </v:shape>
-                    <v:shape id="Szabadkézi sokszög 66" o:spid="_x0000_s1029" style="position:absolute;left:8413;top:1095;width:34878;height:34877;visibility:visible;mso-wrap-style:square;v-text-anchor:top" coordsize="2197,2197" o:gfxdata="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" path="m9,2197l,2193,2188,r9,10l9,2197xe" filled="f" stroked="f">
-                      <v:path arrowok="t" o:connecttype="custom" o:connectlocs="14288,3487738;0,3481388;3473450,0;3487738,15875;14288,3487738" o:connectangles="0,0,0,0,0"/>
-                    </v:shape>
-                    <v:shape id="Szabadkézi sokszög 67" o:spid="_x0000_s1030" style="position:absolute;left:12160;top:4984;width:31131;height:31211;visibility:visible;mso-wrap-style:square;v-text-anchor:top" coordsize="1961,1966" o:gfxdata="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" path="m9,1966l,1957,1952,r9,9l9,1966xe" filled="f" stroked="f">
-                      <v:path arrowok="t" o:connecttype="custom" o:connectlocs="14288,3121025;0,3106738;3098800,0;3113088,14288;14288,3121025" o:connectangles="0,0,0,0,0"/>
-                    </v:shape>
-                    <v:shape id="Szabadkézi sokszög 68" o:spid="_x0000_s1031" style="position:absolute;top:1539;width:43291;height:43371;visibility:visible;mso-wrap-style:square;v-text-anchor:top" coordsize="2727,2732" o:gfxdata="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" path="m,2732r,-4l2722,r5,5l,2732xe" filled="f" stroked="f">
-                      <v:path arrowok="t" o:connecttype="custom" o:connectlocs="0,4337050;0,4330700;4321175,0;4329113,7938;0,4337050" o:connectangles="0,0,0,0,0"/>
-                    </v:shape>
-                    <w10:wrap anchorx="page" anchory="page"/>
-                  </v:group>
-                </w:pict>
-              </mc:Fallback>
-            </mc:AlternateContent>
-          </w:r>
-          <w:r>
-            <w:rPr>
-              <w:noProof/>
-            </w:rPr>
-            <mc:AlternateContent>
-              <mc:Choice Requires="wps">
-                <w:drawing>
-                  <wp:anchor distT="0" distB="0" distL="114300" distR="114300" simplePos="0" relativeHeight="251659264" behindDoc="0" locked="0" layoutInCell="1" allowOverlap="1" wp14:anchorId="489E16FD" wp14:editId="73E4CF4F">
-                    <wp:simplePos x="0" y="0"/>
-                    <wp:positionH relativeFrom="page">
-                      <wp:align>center</wp:align>
-                    </wp:positionH>
-                    <wp:positionV relativeFrom="margin">
-                      <wp:align>bottom</wp:align>
-                    </wp:positionV>
-                    <wp:extent cx="5943600" cy="374904"/>
-                    <wp:effectExtent l="0" t="0" r="0" b="2540"/>
-                    <wp:wrapNone/>
-                    <wp:docPr id="69" name="Szövegdoboz 67"/>
-                    <wp:cNvGraphicFramePr/>
-                    <a:graphic xmlns:a="http://schemas.openxmlformats.org/drawingml/2006/main">
-                      <a:graphicData uri="http://schemas.microsoft.com/office/word/2010/wordprocessingShape">
-                        <wps:wsp>
-                          <wps:cNvSpPr txBox="1"/>
-                          <wps:spPr>
-                            <a:xfrm>
-                              <a:off x="0" y="0"/>
-                              <a:ext cx="5943600" cy="374904"/>
-                            </a:xfrm>
-                            <a:prstGeom prst="rect">
-                              <a:avLst/>
-                            </a:prstGeom>
-                            <a:noFill/>
-                            <a:ln w="6350">
-                              <a:noFill/>
-                            </a:ln>
-                            <a:effectLst/>
-                          </wps:spPr>
-                          <wps:style>
-                            <a:lnRef idx="0">
-                              <a:schemeClr val="accent1"/>
-                            </a:lnRef>
-                            <a:fillRef idx="0">
-                              <a:schemeClr val="accent1"/>
-                            </a:fillRef>
-                            <a:effectRef idx="0">
-                              <a:schemeClr val="accent1"/>
-                            </a:effectRef>
-                            <a:fontRef idx="minor">
-                              <a:schemeClr val="dk1"/>
-                            </a:fontRef>
-                          </wps:style>
-                          <wps:txbx>
-                            <w:txbxContent>
-                              <w:p>
-                                <w:pPr>
-                                  <w:pStyle w:val="Nincstrkz"/>
-                                  <w:jc w:val="right"/>
-                                  <w:rPr>
-                                    <w:color w:val="156082" w:themeColor="accent1"/>
-                                    <w:sz w:val="36"/>
-                                    <w:szCs w:val="36"/>
-                                  </w:rPr>
-                                </w:pPr>
-                                <w:sdt>
-                                  <w:sdtPr>
-                                    <w:rPr>
-                                      <w:color w:val="156082" w:themeColor="accent1"/>
-                                      <w:sz w:val="36"/>
-                                      <w:szCs w:val="36"/>
-                                    </w:rPr>
-                                    <w:alias w:val="Iskola"/>
-                                    <w:tag w:val="Iskola"/>
-                                    <w:id w:val="1850680582"/>
-                                    <w:dataBinding w:prefixMappings="xmlns:ns0='http://schemas.openxmlformats.org/officeDocument/2006/extended-properties' " w:xpath="/ns0:Properties[1]/ns0:Company[1]" w:storeItemID="{6668398D-A668-4E3E-A5EB-62B293D839F1}"/>
-                                    <w:text/>
-                                  </w:sdtPr>
-                                  <w:sdtContent>
-                                    <w:r>
-                                      <w:rPr>
-                                        <w:color w:val="156082" w:themeColor="accent1"/>
-                                        <w:sz w:val="36"/>
-                                        <w:szCs w:val="36"/>
-                                      </w:rPr>
-                                      <w:t xml:space="preserve">Készítette: Nagy Ákos </w:t>
-                                    </w:r>
-                                    <w:r>
-                                      <w:rPr>
-                                        <w:color w:val="156082" w:themeColor="accent1"/>
-                                        <w:sz w:val="36"/>
-                                        <w:szCs w:val="36"/>
-                                      </w:rPr>
-                                      <w:t>és</w:t>
-                                    </w:r>
-                                    <w:r>
-                                      <w:rPr>
-                                        <w:color w:val="156082" w:themeColor="accent1"/>
-                                        <w:sz w:val="36"/>
-                                        <w:szCs w:val="36"/>
-                                      </w:rPr>
-                                      <w:t xml:space="preserve"> Bernáth Ábel</w:t>
-                                    </w:r>
-                                  </w:sdtContent>
-                                </w:sdt>
-                              </w:p>
-                              <w:sdt>
-                                <w:sdtPr>
-                                  <w:rPr>
-                                    <w:color w:val="156082" w:themeColor="accent1"/>
-                                    <w:sz w:val="36"/>
-                                    <w:szCs w:val="36"/>
-                                  </w:rPr>
-                                  <w:alias w:val="Tanfolyam"/>
-                                  <w:tag w:val="Tanfolyam"/>
-                                  <w:id w:val="1717703537"/>
-                                  <w:dataBinding w:prefixMappings="xmlns:ns0='http://purl.org/dc/elements/1.1/' xmlns:ns1='http://schemas.openxmlformats.org/package/2006/metadata/core-properties' " w:xpath="/ns1:coreProperties[1]/ns1:category[1]" w:storeItemID="{6C3C8BC8-F283-45AE-878A-BAB7291924A1}"/>
-                                  <w:text/>
-                                </w:sdtPr>
-                                <w:sdtContent>
-                                  <w:p>
-                                    <w:pPr>
-                                      <w:pStyle w:val="Nincstrkz"/>
-                                      <w:jc w:val="right"/>
-                                      <w:rPr>
-                                        <w:color w:val="156082" w:themeColor="accent1"/>
-                                        <w:sz w:val="36"/>
-                                        <w:szCs w:val="36"/>
-                                      </w:rPr>
-                                    </w:pPr>
-                                    <w:r>
-                                      <w:rPr>
-                                        <w:color w:val="156082" w:themeColor="accent1"/>
-                                        <w:sz w:val="36"/>
-                                        <w:szCs w:val="36"/>
-                                      </w:rPr>
-                                      <w:t>2</w:t>
-                                    </w:r>
-                                    <w:r>
-                                      <w:rPr>
-                                        <w:color w:val="156082" w:themeColor="accent1"/>
-                                        <w:sz w:val="36"/>
-                                        <w:szCs w:val="36"/>
-                                        <w:lang w:val="en-US"/>
-                                      </w:rPr>
-                                      <w:t>025. 11. 12.</w:t>
-                                    </w:r>
-                                  </w:p>
-                                </w:sdtContent>
-                              </w:sdt>
-                            </w:txbxContent>
-                          </wps:txbx>
-                          <wps:bodyPr rot="0" spcFirstLastPara="0" vertOverflow="overflow" horzOverflow="overflow" vert="horz" wrap="square" lIns="0" tIns="0" rIns="0" bIns="0" numCol="1" spcCol="0" rtlCol="0" fromWordArt="0" anchor="b" anchorCtr="0" forceAA="0" compatLnSpc="1">
-                            <a:prstTxWarp prst="textNoShape">
-                              <a:avLst/>
-                            </a:prstTxWarp>
-                            <a:spAutoFit/>
-                          </wps:bodyPr>
-                        </wps:wsp>
-                      </a:graphicData>
-                    </a:graphic>
-                    <wp14:sizeRelH relativeFrom="page">
-                      <wp14:pctWidth>76500</wp14:pctWidth>
-                    </wp14:sizeRelH>
-                    <wp14:sizeRelV relativeFrom="margin">
-                      <wp14:pctHeight>0</wp14:pctHeight>
-                    </wp14:sizeRelV>
-                  </wp:anchor>
-                </w:drawing>
-              </mc:Choice>
-              <mc:Fallback>
-                <w:pict>
-                  <v:shape w14:anchorId="489E16FD" id="Szövegdoboz 67" o:spid="_x0000_s1027" type="#_x0000_t202" style="position:absolute;margin-left:0;margin-top:0;width:468pt;height:29.5pt;z-index:251659264;visibility:visible;mso-wrap-style:square;mso-width-percent:765;mso-height-percent:0;mso-wrap-distance-left:9pt;mso-wrap-distance-top:0;mso-wrap-distance-right:9pt;mso-wrap-distance-bottom:0;mso-position-horizontal:center;mso-position-horizontal-relative:page;mso-position-vertical:bottom;mso-position-vertical-relative:margin;mso-width-percent:765;mso-height-percent:0;mso-width-relative:page;mso-height-relative:margin;v-text-anchor:bottom" o:gfxdata="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" filled="f" stroked="f" strokeweight=".5pt">
-                    <v:textbox style="mso-fit-shape-to-text:t" inset="0,0,0,0">
-                      <w:txbxContent>
-                        <w:p>
-                          <w:pPr>
-                            <w:pStyle w:val="Nincstrkz"/>
-                            <w:jc w:val="right"/>
-                            <w:rPr>
-                              <w:color w:val="156082" w:themeColor="accent1"/>
-                              <w:sz w:val="36"/>
-                              <w:szCs w:val="36"/>
-                            </w:rPr>
-                          </w:pPr>
-                          <w:sdt>
-                            <w:sdtPr>
+                            </w:pPr>
+                            <w:r>
                               <w:rPr>
-                                <w:color w:val="156082" w:themeColor="accent1"/>
-                                <w:sz w:val="36"/>
-                                <w:szCs w:val="36"/>
+                                <w:rFonts w:ascii="Montserrat" w:hAnsi="Montserrat" w:cs="Arial"/>
+                                <w:color w:val="000000" w:themeColor="text1"/>
+                                <w:sz w:val="30"/>
+                                <w:szCs w:val="30"/>
                               </w:rPr>
-                              <w:alias w:val="Iskola"/>
-                              <w:tag w:val="Iskola"/>
-                              <w:id w:val="1850680582"/>
-                              <w:dataBinding w:prefixMappings="xmlns:ns0='http://schemas.openxmlformats.org/officeDocument/2006/extended-properties' " w:xpath="/ns0:Properties[1]/ns0:Company[1]" w:storeItemID="{6668398D-A668-4E3E-A5EB-62B293D839F1}"/>
-                              <w:text/>
-                            </w:sdtPr>
-                            <w:sdtContent>
-                              <w:r>
-                                <w:rPr>
-                                  <w:color w:val="156082" w:themeColor="accent1"/>
-                                  <w:sz w:val="36"/>
-                                  <w:szCs w:val="36"/>
-                                </w:rPr>
-                                <w:t xml:space="preserve">Készítette: Nagy Ákos </w:t>
-                              </w:r>
-                              <w:r>
-                                <w:rPr>
-                                  <w:color w:val="156082" w:themeColor="accent1"/>
-                                  <w:sz w:val="36"/>
-                                  <w:szCs w:val="36"/>
-                                </w:rPr>
-                                <w:t>és</w:t>
-                              </w:r>
-                              <w:r>
-                                <w:rPr>
-                                  <w:color w:val="156082" w:themeColor="accent1"/>
-                                  <w:sz w:val="36"/>
-                                  <w:szCs w:val="36"/>
-                                </w:rPr>
-                                <w:t xml:space="preserve"> Bernáth Ábel</w:t>
-                              </w:r>
-                            </w:sdtContent>
-                          </w:sdt>
-                        </w:p>
-                        <w:sdt>
-                          <w:sdtPr>
-                            <w:rPr>
-                              <w:color w:val="156082" w:themeColor="accent1"/>
-                              <w:sz w:val="36"/>
-                              <w:szCs w:val="36"/>
-                            </w:rPr>
-                            <w:alias w:val="Tanfolyam"/>
-                            <w:tag w:val="Tanfolyam"/>
-                            <w:id w:val="1717703537"/>
-                            <w:dataBinding w:prefixMappings="xmlns:ns0='http://purl.org/dc/elements/1.1/' xmlns:ns1='http://schemas.openxmlformats.org/package/2006/metadata/core-properties' " w:xpath="/ns1:coreProperties[1]/ns1:category[1]" w:storeItemID="{6C3C8BC8-F283-45AE-878A-BAB7291924A1}"/>
-                            <w:text/>
-                          </w:sdtPr>
-                          <w:sdtContent>
-                            <w:p>
-                              <w:pPr>
-                                <w:pStyle w:val="Nincstrkz"/>
-                                <w:jc w:val="right"/>
-                                <w:rPr>
-                                  <w:color w:val="156082" w:themeColor="accent1"/>
-                                  <w:sz w:val="36"/>
-                                  <w:szCs w:val="36"/>
-                                </w:rPr>
-                              </w:pPr>
-                              <w:r>
-                                <w:rPr>
-                                  <w:color w:val="156082" w:themeColor="accent1"/>
-                                  <w:sz w:val="36"/>
-                                  <w:szCs w:val="36"/>
-                                </w:rPr>
-                                <w:t>2</w:t>
-                              </w:r>
-                              <w:r>
-                                <w:rPr>
-                                  <w:color w:val="156082" w:themeColor="accent1"/>
-                                  <w:sz w:val="36"/>
-                                  <w:szCs w:val="36"/>
-                                  <w:lang w:val="en-US"/>
-                                </w:rPr>
-                                <w:t>025. 11. 12.</w:t>
-                              </w:r>
-                            </w:p>
-                          </w:sdtContent>
-                        </w:sdt>
-                      </w:txbxContent>
-                    </v:textbox>
-                    <w10:wrap anchorx="page" anchory="margin"/>
-                  </v:shape>
-                </w:pict>
-              </mc:Fallback>
-            </mc:AlternateContent>
-          </w:r>
-        </w:p>
-        <w:p>
-          <w:pPr>
-            <w:pStyle w:val="Cmsor1"/>
-            <w:numPr>
-              <w:ilvl w:val="0"/>
-              <w:numId w:val="1"/>
-            </w:numPr>
-          </w:pPr>
-          <w:r>
-            <w:br w:type="page"/>
-          </w:r>
-          <w:bookmarkStart w:id="0" w:name="_Toc213932579"/>
-          <w:r>
-            <w:lastRenderedPageBreak/>
-            <w:t>Bevezetés</w:t>
-          </w:r>
-          <w:bookmarkEnd w:id="0"/>
-        </w:p>
-        <w:p>
-          <w:pPr>
-            <w:pStyle w:val="Cmsor2"/>
-            <w:numPr>
-              <w:ilvl w:val="1"/>
-              <w:numId w:val="1"/>
-            </w:numPr>
-          </w:pPr>
-          <w:bookmarkStart w:id="1" w:name="_Toc213932580"/>
-          <w:r>
-            <w:t>A projekt célja</w:t>
-          </w:r>
-          <w:bookmarkEnd w:id="1"/>
-        </w:p>
-        <w:p>
-          <w:r>
-            <w:t xml:space="preserve">A MyTunes projekt célja egy olyan multiplatformos zene streaming alkalmazás létrehozása, amely a manapság divatos előfizetéses modellekkel szemben ingyen és bérmentve nyújt zenehallgatási lehetőséget </w:t>
-          </w:r>
-          <w:r>
-            <w:t>sokak</w:t>
-          </w:r>
-          <w:r>
-            <w:t xml:space="preserve"> számára. A fejlesztők célja a hosszútávú értékteremtés</w:t>
-          </w:r>
-          <w:r>
-            <w:t>,</w:t>
-          </w:r>
-          <w:r>
-            <w:t xml:space="preserve"> amely a páratlan felhasználói élménnyel társulva </w:t>
-          </w:r>
-          <w:r>
-            <w:t>garantálja a projekt sikerességét. Az ingyenes modell ezáltal a profitorientált gondolkodás mellőzése egy felhasználóbarát, a felhasználók igényeit maximálisan figyelembe vevő és az igényeket teljes mértékben kielégítő megoldás létrehozását segíti.</w:t>
-          </w:r>
-        </w:p>
-        <w:p/>
-        <w:p>
-          <w:pPr>
-            <w:pStyle w:val="Cmsor2"/>
-            <w:numPr>
-              <w:ilvl w:val="1"/>
-              <w:numId w:val="1"/>
-            </w:numPr>
-          </w:pPr>
-          <w:bookmarkStart w:id="2" w:name="_Toc213932581"/>
-          <w:r>
-            <w:t>A projek</w:t>
-          </w:r>
-          <w:r>
-            <w:t>t tervezete</w:t>
-          </w:r>
-        </w:p>
-      </w:sdtContent>
-    </w:sdt>
-    <w:bookmarkEnd w:id="2" w:displacedByCustomXml="prev"/>
+                              <w:t>Készítette: Nagy Ákos és Bernáth Ábel</w:t>
+                            </w:r>
+                          </w:p>
+                          <w:p>
+                            <w:pPr>
+                              <w:jc w:val="right"/>
+                              <w:rPr>
+                                <w:rFonts w:ascii="Montserrat" w:hAnsi="Montserrat" w:cs="Arial"/>
+                                <w:color w:val="5D28FE"/>
+                                <w:sz w:val="30"/>
+                                <w:szCs w:val="30"/>
+                              </w:rPr>
+                            </w:pPr>
+                            <w:r>
+                              <w:rPr>
+                                <w:rFonts w:ascii="Montserrat" w:hAnsi="Montserrat" w:cs="Arial"/>
+                                <w:color w:val="5D28FE"/>
+                                <w:sz w:val="30"/>
+                                <w:szCs w:val="30"/>
+                              </w:rPr>
+                              <w:t>2</w:t>
+                            </w:r>
+                            <w:r>
+                              <w:rPr>
+                                <w:rFonts w:ascii="Montserrat" w:hAnsi="Montserrat" w:cs="Arial"/>
+                                <w:color w:val="5D28FE"/>
+                                <w:sz w:val="30"/>
+                                <w:szCs w:val="30"/>
+                                <w:lang w:val="en-US"/>
+                              </w:rPr>
+                              <w:t>025</w:t>
+                            </w:r>
+                            <w:r>
+                              <w:rPr>
+                                <w:rFonts w:ascii="Montserrat" w:hAnsi="Montserrat" w:cs="Arial"/>
+                                <w:color w:val="5D28FE"/>
+                                <w:sz w:val="30"/>
+                                <w:szCs w:val="30"/>
+                              </w:rPr>
+                              <w:t>-26</w:t>
+                            </w:r>
+                          </w:p>
+                        </w:txbxContent>
+                      </wps:txbx>
+                      <wps:bodyPr rot="0" vert="horz" wrap="square" lIns="91440" tIns="45720" rIns="91440" bIns="45720" anchor="t" anchorCtr="0">
+                        <a:noAutofit/>
+                      </wps:bodyPr>
+                    </wps:wsp>
+                  </a:graphicData>
+                </a:graphic>
+                <wp14:sizeRelH relativeFrom="margin">
+                  <wp14:pctWidth>0</wp14:pctWidth>
+                </wp14:sizeRelH>
+                <wp14:sizeRelV relativeFrom="margin">
+                  <wp14:pctHeight>0</wp14:pctHeight>
+                </wp14:sizeRelV>
+              </wp:anchor>
+            </w:drawing>
+          </mc:Choice>
+          <mc:Fallback>
+            <w:pict>
+              <v:shape w14:anchorId="3783ECA1" id="_x0000_s1027" type="#_x0000_t202" style="position:absolute;margin-left:265.9pt;margin-top:434.65pt;width:230.25pt;height:94.5pt;z-index:-251653120;visibility:visible;mso-wrap-style:square;mso-width-percent:0;mso-height-percent:0;mso-wrap-distance-left:9pt;mso-wrap-distance-top:3.6pt;mso-wrap-distance-right:9pt;mso-wrap-distance-bottom:3.6pt;mso-position-horizontal:absolute;mso-position-horizontal-relative:margin;mso-position-vertical:absolute;mso-position-vertical-relative:text;mso-width-percent:0;mso-height-percent:0;mso-width-relative:margin;mso-height-relative:margin;v-text-anchor:top" o:gfxdata="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" filled="f" stroked="f">
+                <v:textbox>
+                  <w:txbxContent>
+                    <w:p>
+                      <w:pPr>
+                        <w:jc w:val="right"/>
+                        <w:rPr>
+                          <w:rFonts w:ascii="Montserrat" w:hAnsi="Montserrat" w:cs="Arial"/>
+                          <w:color w:val="000000" w:themeColor="text1"/>
+                          <w:sz w:val="30"/>
+                          <w:szCs w:val="30"/>
+                        </w:rPr>
+                      </w:pPr>
+                      <w:r>
+                        <w:rPr>
+                          <w:rFonts w:ascii="Montserrat" w:hAnsi="Montserrat" w:cs="Arial"/>
+                          <w:color w:val="000000" w:themeColor="text1"/>
+                          <w:sz w:val="30"/>
+                          <w:szCs w:val="30"/>
+                        </w:rPr>
+                        <w:t>Készítette: Nagy Ákos és Bernáth Ábel</w:t>
+                      </w:r>
+                    </w:p>
+                    <w:p>
+                      <w:pPr>
+                        <w:jc w:val="right"/>
+                        <w:rPr>
+                          <w:rFonts w:ascii="Montserrat" w:hAnsi="Montserrat" w:cs="Arial"/>
+                          <w:color w:val="5D28FE"/>
+                          <w:sz w:val="30"/>
+                          <w:szCs w:val="30"/>
+                        </w:rPr>
+                      </w:pPr>
+                      <w:r>
+                        <w:rPr>
+                          <w:rFonts w:ascii="Montserrat" w:hAnsi="Montserrat" w:cs="Arial"/>
+                          <w:color w:val="5D28FE"/>
+                          <w:sz w:val="30"/>
+                          <w:szCs w:val="30"/>
+                        </w:rPr>
+                        <w:t>2</w:t>
+                      </w:r>
+                      <w:r>
+                        <w:rPr>
+                          <w:rFonts w:ascii="Montserrat" w:hAnsi="Montserrat" w:cs="Arial"/>
+                          <w:color w:val="5D28FE"/>
+                          <w:sz w:val="30"/>
+                          <w:szCs w:val="30"/>
+                          <w:lang w:val="en-US"/>
+                        </w:rPr>
+                        <w:t>025</w:t>
+                      </w:r>
+                      <w:r>
+                        <w:rPr>
+                          <w:rFonts w:ascii="Montserrat" w:hAnsi="Montserrat" w:cs="Arial"/>
+                          <w:color w:val="5D28FE"/>
+                          <w:sz w:val="30"/>
+                          <w:szCs w:val="30"/>
+                        </w:rPr>
+                        <w:t>-26</w:t>
+                      </w:r>
+                    </w:p>
+                  </w:txbxContent>
+                </v:textbox>
+                <w10:wrap anchorx="margin"/>
+              </v:shape>
+            </w:pict>
+          </mc:Fallback>
+        </mc:AlternateContent>
+      </w:r>
+      <w:r>
+        <w:br w:type="page"/>
+      </w:r>
+      <w:r>
+        <w:rPr>
+          <w:noProof/>
+        </w:rPr>
+        <w:pict w14:anchorId="631EDDA4">
+          <v:shapetype id="_x0000_t75" coordsize="21600,21600" o:spt="75" o:preferrelative="t" path="m@4@5l@4@11@9@11@9@5xe" filled="f" stroked="f">
+            <v:stroke joinstyle="miter"/>
+            <v:formulas>
+              <v:f eqn="if lineDrawn pixelLineWidth 0"/>
+              <v:f eqn="sum @0 1 0"/>
+              <v:f eqn="sum 0 0 @1"/>
+              <v:f eqn="prod @2 1 2"/>
+              <v:f eqn="prod @3 21600 pixelWidth"/>
+              <v:f eqn="prod @3 21600 pixelHeight"/>
+              <v:f eqn="sum @0 0 1"/>
+              <v:f eqn="prod @6 1 2"/>
+              <v:f eqn="prod @7 21600 pixelWidth"/>
+              <v:f eqn="sum @8 21600 0"/>
+              <v:f eqn="prod @7 21600 pixelHeight"/>
+              <v:f eqn="sum @10 21600 0"/>
+            </v:formulas>
+            <v:path o:extrusionok="f" gradientshapeok="t" o:connecttype="rect"/>
+            <o:lock v:ext="edit" aspectratio="t"/>
+          </v:shapetype>
+          <v:shape id="_x0000_s1026" type="#_x0000_t75" style="position:absolute;margin-left:-78pt;margin-top:-77.1pt;width:598.55pt;height:845.1pt;z-index:-251657216;mso-position-horizontal-relative:text;mso-position-vertical-relative:text;mso-width-relative:page;mso-height-relative:page">
+            <v:imagedata r:id="rId6" o:title="c4-bg"/>
+          </v:shape>
+        </w:pict>
+      </w:r>
+      <w:r>
+        <w:rPr>
+          <w:noProof/>
+        </w:rPr>
+        <w:pict w14:anchorId="3229BAB0">
+          <v:shape id="_x0000_s1027" type="#_x0000_t75" style="position:absolute;margin-left:-70.5pt;margin-top:628.6pt;width:591.05pt;height:139.4pt;z-index:-251656192;mso-position-horizontal-relative:text;mso-position-vertical-relative:text;mso-width-relative:page;mso-height-relative:page">
+            <v:imagedata r:id="rId7" o:title="c4-footer"/>
+          </v:shape>
+        </w:pict>
+      </w:r>
+      <w:r>
+        <w:rPr>
+          <w:noProof/>
+        </w:rPr>
+        <mc:AlternateContent>
+          <mc:Choice Requires="wps">
+            <w:drawing>
+              <wp:anchor distT="0" distB="0" distL="114300" distR="114300" simplePos="0" relativeHeight="251665408" behindDoc="0" locked="0" layoutInCell="1" allowOverlap="1" wp14:anchorId="01BFC55C" wp14:editId="3503092E">
+                <wp:simplePos x="0" y="0"/>
+                <wp:positionH relativeFrom="column">
+                  <wp:posOffset>2266950</wp:posOffset>
+                </wp:positionH>
+                <wp:positionV relativeFrom="paragraph">
+                  <wp:posOffset>5143500</wp:posOffset>
+                </wp:positionV>
+                <wp:extent cx="3181350" cy="0"/>
+                <wp:effectExtent l="0" t="19050" r="38100" b="38100"/>
+                <wp:wrapNone/>
+                <wp:docPr id="3" name="Straight Connector 3"/>
+                <wp:cNvGraphicFramePr/>
+                <a:graphic xmlns:a="http://schemas.openxmlformats.org/drawingml/2006/main">
+                  <a:graphicData uri="http://schemas.microsoft.com/office/word/2010/wordprocessingShape">
+                    <wps:wsp>
+                      <wps:cNvCnPr/>
+                      <wps:spPr>
+                        <a:xfrm>
+                          <a:off x="0" y="0"/>
+                          <a:ext cx="3181350" cy="0"/>
+                        </a:xfrm>
+                        <a:prstGeom prst="line">
+                          <a:avLst/>
+                        </a:prstGeom>
+                        <a:ln w="57150">
+                          <a:solidFill>
+                            <a:srgbClr val="4ACBEE"/>
+                          </a:solidFill>
+                        </a:ln>
+                      </wps:spPr>
+                      <wps:style>
+                        <a:lnRef idx="1">
+                          <a:schemeClr val="accent1"/>
+                        </a:lnRef>
+                        <a:fillRef idx="0">
+                          <a:schemeClr val="accent1"/>
+                        </a:fillRef>
+                        <a:effectRef idx="0">
+                          <a:schemeClr val="accent1"/>
+                        </a:effectRef>
+                        <a:fontRef idx="minor">
+                          <a:schemeClr val="tx1"/>
+                        </a:fontRef>
+                      </wps:style>
+                      <wps:bodyPr/>
+                    </wps:wsp>
+                  </a:graphicData>
+                </a:graphic>
+              </wp:anchor>
+            </w:drawing>
+          </mc:Choice>
+          <mc:Fallback>
+            <w:pict>
+              <v:line w14:anchorId="236D9301" id="Straight Connector 3" o:spid="_x0000_s1026" style="position:absolute;z-index:251665408;visibility:visible;mso-wrap-style:square;mso-wrap-distance-left:9pt;mso-wrap-distance-top:0;mso-wrap-distance-right:9pt;mso-wrap-distance-bottom:0;mso-position-horizontal:absolute;mso-position-horizontal-relative:text;mso-position-vertical:absolute;mso-position-vertical-relative:text" from="178.5pt,405pt" to="429pt,405pt" o:gfxdata="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" strokecolor="#4acbee" strokeweight="4.5pt">
+                <v:stroke joinstyle="miter"/>
+              </v:line>
+            </w:pict>
+          </mc:Fallback>
+        </mc:AlternateContent>
+      </w:r>
+      <w:r>
+        <w:rPr>
+          <w:noProof/>
+        </w:rPr>
+        <w:pict w14:anchorId="05EBD12D">
+          <v:shape id="_x0000_s1028" type="#_x0000_t75" style="position:absolute;margin-left:177pt;margin-top:124.5pt;width:283.5pt;height:75.6pt;z-index:-251654144;mso-position-horizontal-relative:text;mso-position-vertical-relative:text;mso-width-relative:page;mso-height-relative:page">
+            <v:imagedata r:id="rId8" o:title="company logo"/>
+          </v:shape>
+        </w:pict>
+      </w:r>
+    </w:p>
     <w:p>
+      <w:pPr>
+        <w:rPr>
+          <w:rFonts w:ascii="Montserrat" w:eastAsiaTheme="majorEastAsia" w:hAnsi="Montserrat" w:cstheme="majorBidi"/>
+          <w:b/>
+          <w:color w:val="5D28FE"/>
+          <w:sz w:val="40"/>
+          <w:szCs w:val="40"/>
+        </w:rPr>
+      </w:pPr>
+    </w:p>
+    <w:p>
+      <w:pPr>
+        <w:pStyle w:val="Cmsor1"/>
+        <w:numPr>
+          <w:ilvl w:val="0"/>
+          <w:numId w:val="3"/>
+        </w:numPr>
+      </w:pPr>
+      <w:bookmarkStart w:id="0" w:name="_Toc214479967"/>
+      <w:r>
+        <w:t>Bevezetés</w:t>
+      </w:r>
+      <w:bookmarkEnd w:id="0"/>
+    </w:p>
+    <w:p>
+      <w:pPr>
+        <w:pStyle w:val="Cmsor2"/>
+        <w:numPr>
+          <w:ilvl w:val="1"/>
+          <w:numId w:val="3"/>
+        </w:numPr>
+      </w:pPr>
+      <w:bookmarkStart w:id="1" w:name="_Toc214479968"/>
+      <w:r>
+        <w:t>A projekt célja</w:t>
+      </w:r>
+      <w:bookmarkEnd w:id="1"/>
+    </w:p>
+    <w:p>
+      <w:pPr>
+        <w:pStyle w:val="Bekezdsek"/>
+      </w:pPr>
+      <w:r>
+        <w:t>A MyTunes projekt célja egy olyan multiplatformos zene streaming al-kalmazás létrehozása, amely a manapság divatos előfizetéses modellekkel szemben ingyen és bérmentve nyújt zenehallgatási lehetőséget sokak számára. A fejlesztők célja a hosszútávú értékteremtés, amely a páratlan fel-használói élménnyel társulva garantálja a projekt sikerességét. Az ingyenes modell ezáltal a profitorientált gondolkodás mellőzése egy felhasználóbarát, a felhasználók igényeit maximálisan figyelembe vevő és az igényeket teljes mértékben kielégítő megoldás létrehozását segíti.</w:t>
+      </w:r>
+    </w:p>
+    <w:p>
+      <w:pPr>
+        <w:pStyle w:val="Cmsor2"/>
+        <w:numPr>
+          <w:ilvl w:val="1"/>
+          <w:numId w:val="3"/>
+        </w:numPr>
+      </w:pPr>
+      <w:bookmarkStart w:id="2" w:name="_Toc214479969"/>
+      <w:r>
+        <w:t>A projekt tervezete</w:t>
+      </w:r>
+      <w:bookmarkEnd w:id="2"/>
+    </w:p>
+    <w:p>
+      <w:pPr>
+        <w:pStyle w:val="Bekezdsek"/>
+      </w:pPr>
       <w:r>
         <w:t>A tervezet szerint az alkalmazás rendelkezni fog egy webes, asztali és mobil felülettel amely alkalmazások felhasználói felületei ugyanazt a dizájn sémát fogják követni. A három platformot egy központi szerver fogja össze amely intézi mind a webes felület kiszolgálását a háttérszámításokat és egy adatbázis kiszolgálását is.</w:t>
       </w:r>
@@ -1217,7 +570,7 @@
           <w:numId w:val="1"/>
         </w:numPr>
       </w:pPr>
-      <w:bookmarkStart w:id="3" w:name="_Toc213932582"/>
+      <w:bookmarkStart w:id="3" w:name="_Toc214479970"/>
       <w:r>
         <w:t>Webalkalmazás</w:t>
       </w:r>
@@ -1225,13 +578,25 @@
     </w:p>
     <w:p>
       <w:r>
+        <w:rPr>
+          <w:rStyle w:val="BekezdsekChar"/>
+        </w:rPr>
         <w:t xml:space="preserve">A webes alkalmazás kliens oldali felületét a Vuejs </w:t>
       </w:r>
       <w:r>
+        <w:rPr>
+          <w:rStyle w:val="BekezdsekChar"/>
+        </w:rPr>
         <w:t>JavaScript</w:t>
       </w:r>
       <w:r>
-        <w:t xml:space="preserve"> keretrendszer felhasználásával, a szerveroldali funkcionalitást PHP-val fogjuk kivitelezni.</w:t>
+        <w:rPr>
+          <w:rStyle w:val="BekezdsekChar"/>
+        </w:rPr>
+        <w:t xml:space="preserve"> keretrendszer felhasználásával, a szerveroldali funkcionalitást PHP-val fogjuk kivitelezni</w:t>
+      </w:r>
+      <w:r>
+        <w:t>.</w:t>
       </w:r>
     </w:p>
     <w:p/>
@@ -1243,13 +608,16 @@
           <w:numId w:val="1"/>
         </w:numPr>
       </w:pPr>
-      <w:bookmarkStart w:id="4" w:name="_Toc213932583"/>
+      <w:bookmarkStart w:id="4" w:name="_Toc214479971"/>
       <w:r>
         <w:t>Asztali alkalmazás</w:t>
       </w:r>
       <w:bookmarkEnd w:id="4"/>
     </w:p>
     <w:p>
+      <w:pPr>
+        <w:pStyle w:val="Bekezdsek"/>
+      </w:pPr>
       <w:r>
         <w:t xml:space="preserve">Az asztali alkalmazáshoz a Windows Presentation Foundation (WPF) </w:t>
       </w:r>
@@ -1266,7 +634,7 @@
           <w:numId w:val="1"/>
         </w:numPr>
       </w:pPr>
-      <w:bookmarkStart w:id="5" w:name="_Toc213932584"/>
+      <w:bookmarkStart w:id="5" w:name="_Toc214479972"/>
       <w:r>
         <w:t>Mobil alkalmazás terve</w:t>
       </w:r>
@@ -1288,18 +656,30 @@
           <w:numId w:val="1"/>
         </w:numPr>
       </w:pPr>
-      <w:bookmarkStart w:id="6" w:name="_Toc213932585"/>
+      <w:bookmarkStart w:id="6" w:name="_Toc214479973"/>
       <w:r>
         <w:t>Adatbázis</w:t>
       </w:r>
       <w:bookmarkEnd w:id="6"/>
     </w:p>
     <w:p>
+      <w:pPr>
+        <w:pStyle w:val="Bekezdsek"/>
+      </w:pPr>
       <w:r>
         <w:t>A felhasználói és egyéb adatokat egy MySQL szerver felhasználásával fogjuk tárolni</w:t>
       </w:r>
     </w:p>
-    <w:p/>
+    <w:p>
+      <w:pPr>
+        <w:rPr>
+          <w:rFonts w:ascii="Montserrat" w:hAnsi="Montserrat"/>
+        </w:rPr>
+      </w:pPr>
+      <w:r>
+        <w:br w:type="page"/>
+      </w:r>
+    </w:p>
     <w:p>
       <w:pPr>
         <w:pStyle w:val="Cmsor3"/>
@@ -1308,7 +688,7 @@
           <w:numId w:val="1"/>
         </w:numPr>
       </w:pPr>
-      <w:bookmarkStart w:id="7" w:name="_Toc213932586"/>
+      <w:bookmarkStart w:id="7" w:name="_Toc214479974"/>
       <w:r>
         <w:lastRenderedPageBreak/>
         <w:t>Fejlesztés</w:t>
@@ -1316,6 +696,9 @@
       <w:bookmarkEnd w:id="7"/>
     </w:p>
     <w:p>
+      <w:pPr>
+        <w:pStyle w:val="Bekezdsek"/>
+      </w:pPr>
       <w:r>
         <w:t>A fejlesztés során felhasználásra fog kerülni a Trello a feladatok beosztása és a közös munka gördülékenyebbé tétele érdekében. A kódbázis egy privát GitHub repository-ban lesz megosztva a projekt fejlesztői között amely helytől és időtől függetleníti ezáltal rugalmasabbá teszi az alkalmazás fejlesztését. A fejlesztés során a Docker konténerizációs megoldását fogjuk használni a maximális stabilitás és a kész projekt egyszer</w:t>
       </w:r>
@@ -1328,11 +711,11 @@
         <w:br w:type="page"/>
       </w:r>
     </w:p>
-    <w:p/>
     <w:sdt>
       <w:sdtPr>
         <w:rPr>
           <w:rFonts w:asciiTheme="minorHAnsi" w:eastAsiaTheme="minorHAnsi" w:hAnsiTheme="minorHAnsi" w:cstheme="minorBidi"/>
+          <w:b w:val="0"/>
           <w:color w:val="auto"/>
           <w:kern w:val="2"/>
           <w:sz w:val="24"/>
@@ -1348,18 +731,22 @@
       </w:sdtPr>
       <w:sdtEndPr>
         <w:rPr>
-          <w:b/>
           <w:bCs/>
-          <w:noProof/>
         </w:rPr>
       </w:sdtEndPr>
       <w:sdtContent>
         <w:p>
           <w:pPr>
             <w:pStyle w:val="Tartalomjegyzkcmsora"/>
+            <w:rPr>
+              <w:lang w:val="hu-HU"/>
+            </w:rPr>
           </w:pPr>
           <w:r>
-            <w:t>Contents</w:t>
+            <w:rPr>
+              <w:lang w:val="hu-HU"/>
+            </w:rPr>
+            <w:t>Tartalom</w:t>
           </w:r>
         </w:p>
         <w:p>
@@ -1376,15 +763,24 @@
             </w:rPr>
           </w:pPr>
           <w:r>
+            <w:rPr>
+              <w:rFonts w:ascii="Montserrat" w:hAnsi="Montserrat"/>
+            </w:rPr>
             <w:fldChar w:fldCharType="begin"/>
           </w:r>
           <w:r>
+            <w:rPr>
+              <w:rFonts w:ascii="Montserrat" w:hAnsi="Montserrat"/>
+            </w:rPr>
             <w:instrText xml:space="preserve"> TOC \o "1-3" \h \z \u </w:instrText>
           </w:r>
           <w:r>
+            <w:rPr>
+              <w:rFonts w:ascii="Montserrat" w:hAnsi="Montserrat"/>
+            </w:rPr>
             <w:fldChar w:fldCharType="separate"/>
           </w:r>
-          <w:hyperlink w:anchor="_Toc213932579" w:history="1">
+          <w:hyperlink w:anchor="_Toc214479967" w:history="1">
             <w:r>
               <w:rPr>
                 <w:rStyle w:val="Hiperhivatkozs"/>
@@ -1426,7 +822,7 @@
                 <w:noProof/>
                 <w:webHidden/>
               </w:rPr>
-              <w:instrText xml:space="preserve"> PAGEREF _Toc213932579 \h </w:instrText>
+              <w:instrText xml:space="preserve"> PAGEREF _Toc214479967 \h </w:instrText>
             </w:r>
             <w:r>
               <w:rPr>
@@ -1446,7 +842,7 @@
                 <w:noProof/>
                 <w:webHidden/>
               </w:rPr>
-              <w:t>1</w:t>
+              <w:t>2</w:t>
             </w:r>
             <w:r>
               <w:rPr>
@@ -1470,7 +866,7 @@
               <w:lang w:eastAsia="hu-HU"/>
             </w:rPr>
           </w:pPr>
-          <w:hyperlink w:anchor="_Toc213932580" w:history="1">
+          <w:hyperlink w:anchor="_Toc214479968" w:history="1">
             <w:r>
               <w:rPr>
                 <w:rStyle w:val="Hiperhivatkozs"/>
@@ -1512,7 +908,7 @@
                 <w:noProof/>
                 <w:webHidden/>
               </w:rPr>
-              <w:instrText xml:space="preserve"> PAGEREF _Toc213932580 \h </w:instrText>
+              <w:instrText xml:space="preserve"> PAGEREF _Toc214479968 \h </w:instrText>
             </w:r>
             <w:r>
               <w:rPr>
@@ -1532,7 +928,7 @@
                 <w:noProof/>
                 <w:webHidden/>
               </w:rPr>
-              <w:t>1</w:t>
+              <w:t>2</w:t>
             </w:r>
             <w:r>
               <w:rPr>
@@ -1556,7 +952,7 @@
               <w:lang w:eastAsia="hu-HU"/>
             </w:rPr>
           </w:pPr>
-          <w:hyperlink w:anchor="_Toc213932581" w:history="1">
+          <w:hyperlink w:anchor="_Toc214479969" w:history="1">
             <w:r>
               <w:rPr>
                 <w:rStyle w:val="Hiperhivatkozs"/>
@@ -1598,7 +994,7 @@
                 <w:noProof/>
                 <w:webHidden/>
               </w:rPr>
-              <w:instrText xml:space="preserve"> PAGEREF _Toc213932581 \h </w:instrText>
+              <w:instrText xml:space="preserve"> PAGEREF _Toc214479969 \h </w:instrText>
             </w:r>
             <w:r>
               <w:rPr>
@@ -1618,7 +1014,7 @@
                 <w:noProof/>
                 <w:webHidden/>
               </w:rPr>
-              <w:t>1</w:t>
+              <w:t>2</w:t>
             </w:r>
             <w:r>
               <w:rPr>
@@ -1642,13 +1038,13 @@
               <w:lang w:eastAsia="hu-HU"/>
             </w:rPr>
           </w:pPr>
-          <w:hyperlink w:anchor="_Toc213932582" w:history="1">
+          <w:hyperlink w:anchor="_Toc214479970" w:history="1">
             <w:r>
               <w:rPr>
                 <w:rStyle w:val="Hiperhivatkozs"/>
                 <w:noProof/>
               </w:rPr>
-              <w:t>1.2.1</w:t>
+              <w:t>1.1.1</w:t>
             </w:r>
             <w:r>
               <w:rPr>
@@ -1684,7 +1080,7 @@
                 <w:noProof/>
                 <w:webHidden/>
               </w:rPr>
-              <w:instrText xml:space="preserve"> PAGEREF _Toc213932582 \h </w:instrText>
+              <w:instrText xml:space="preserve"> PAGEREF _Toc214479970 \h </w:instrText>
             </w:r>
             <w:r>
               <w:rPr>
@@ -1704,7 +1100,7 @@
                 <w:noProof/>
                 <w:webHidden/>
               </w:rPr>
-              <w:t>1</w:t>
+              <w:t>2</w:t>
             </w:r>
             <w:r>
               <w:rPr>
@@ -1728,13 +1124,13 @@
               <w:lang w:eastAsia="hu-HU"/>
             </w:rPr>
           </w:pPr>
-          <w:hyperlink w:anchor="_Toc213932583" w:history="1">
+          <w:hyperlink w:anchor="_Toc214479971" w:history="1">
             <w:r>
               <w:rPr>
                 <w:rStyle w:val="Hiperhivatkozs"/>
                 <w:noProof/>
               </w:rPr>
-              <w:t>1.2.2</w:t>
+              <w:t>1.1.2</w:t>
             </w:r>
             <w:r>
               <w:rPr>
@@ -1770,7 +1166,7 @@
                 <w:noProof/>
                 <w:webHidden/>
               </w:rPr>
-              <w:instrText xml:space="preserve"> PAGEREF _Toc213932583 \h </w:instrText>
+              <w:instrText xml:space="preserve"> PAGEREF _Toc214479971 \h </w:instrText>
             </w:r>
             <w:r>
               <w:rPr>
@@ -1790,7 +1186,7 @@
                 <w:noProof/>
                 <w:webHidden/>
               </w:rPr>
-              <w:t>1</w:t>
+              <w:t>2</w:t>
             </w:r>
             <w:r>
               <w:rPr>
@@ -1814,13 +1210,13 @@
               <w:lang w:eastAsia="hu-HU"/>
             </w:rPr>
           </w:pPr>
-          <w:hyperlink w:anchor="_Toc213932584" w:history="1">
+          <w:hyperlink w:anchor="_Toc214479972" w:history="1">
             <w:r>
               <w:rPr>
                 <w:rStyle w:val="Hiperhivatkozs"/>
                 <w:noProof/>
               </w:rPr>
-              <w:t>1.2.3</w:t>
+              <w:t>1.1.3</w:t>
             </w:r>
             <w:r>
               <w:rPr>
@@ -1856,7 +1252,7 @@
                 <w:noProof/>
                 <w:webHidden/>
               </w:rPr>
-              <w:instrText xml:space="preserve"> PAGEREF _Toc213932584 \h </w:instrText>
+              <w:instrText xml:space="preserve"> PAGEREF _Toc214479972 \h </w:instrText>
             </w:r>
             <w:r>
               <w:rPr>
@@ -1876,7 +1272,7 @@
                 <w:noProof/>
                 <w:webHidden/>
               </w:rPr>
-              <w:t>1</w:t>
+              <w:t>2</w:t>
             </w:r>
             <w:r>
               <w:rPr>
@@ -1900,13 +1296,13 @@
               <w:lang w:eastAsia="hu-HU"/>
             </w:rPr>
           </w:pPr>
-          <w:hyperlink w:anchor="_Toc213932585" w:history="1">
+          <w:hyperlink w:anchor="_Toc214479973" w:history="1">
             <w:r>
               <w:rPr>
                 <w:rStyle w:val="Hiperhivatkozs"/>
                 <w:noProof/>
               </w:rPr>
-              <w:t>1.2.4</w:t>
+              <w:t>1.1.4</w:t>
             </w:r>
             <w:r>
               <w:rPr>
@@ -1942,7 +1338,7 @@
                 <w:noProof/>
                 <w:webHidden/>
               </w:rPr>
-              <w:instrText xml:space="preserve"> PAGEREF _Toc213932585 \h </w:instrText>
+              <w:instrText xml:space="preserve"> PAGEREF _Toc214479973 \h </w:instrText>
             </w:r>
             <w:r>
               <w:rPr>
@@ -1962,7 +1358,7 @@
                 <w:noProof/>
                 <w:webHidden/>
               </w:rPr>
-              <w:t>1</w:t>
+              <w:t>2</w:t>
             </w:r>
             <w:r>
               <w:rPr>
@@ -1986,13 +1382,13 @@
               <w:lang w:eastAsia="hu-HU"/>
             </w:rPr>
           </w:pPr>
-          <w:hyperlink w:anchor="_Toc213932586" w:history="1">
+          <w:hyperlink w:anchor="_Toc214479974" w:history="1">
             <w:r>
               <w:rPr>
                 <w:rStyle w:val="Hiperhivatkozs"/>
                 <w:noProof/>
               </w:rPr>
-              <w:t>1.2.5</w:t>
+              <w:t>1.1.5</w:t>
             </w:r>
             <w:r>
               <w:rPr>
@@ -2028,7 +1424,7 @@
                 <w:noProof/>
                 <w:webHidden/>
               </w:rPr>
-              <w:instrText xml:space="preserve"> PAGEREF _Toc213932586 \h </w:instrText>
+              <w:instrText xml:space="preserve"> PAGEREF _Toc214479974 \h </w:instrText>
             </w:r>
             <w:r>
               <w:rPr>
@@ -2048,7 +1444,7 @@
                 <w:noProof/>
                 <w:webHidden/>
               </w:rPr>
-              <w:t>2</w:t>
+              <w:t>3</w:t>
             </w:r>
             <w:r>
               <w:rPr>
@@ -2062,26 +1458,19 @@
         <w:p>
           <w:r>
             <w:rPr>
+              <w:rFonts w:ascii="Montserrat" w:hAnsi="Montserrat"/>
               <w:b/>
               <w:bCs/>
-              <w:noProof/>
             </w:rPr>
             <w:fldChar w:fldCharType="end"/>
           </w:r>
         </w:p>
       </w:sdtContent>
     </w:sdt>
-    <w:p>
-      <w:r>
-        <w:br w:type="page"/>
-      </w:r>
-    </w:p>
     <w:sectPr>
       <w:pgSz w:w="11906" w:h="16838"/>
       <w:pgMar w:top="1417" w:right="1417" w:bottom="1417" w:left="1417" w:header="708" w:footer="708" w:gutter="0"/>
-      <w:pgNumType w:start="0"/>
       <w:cols w:space="708"/>
-      <w:titlePg/>
       <w:docGrid w:linePitch="360"/>
     </w:sectPr>
   </w:body>
@@ -2211,8 +1600,345 @@
       </w:rPr>
     </w:lvl>
   </w:abstractNum>
+  <w:abstractNum w:abstractNumId="1" w15:restartNumberingAfterBreak="0">
+    <w:nsid w:val="206204E0"/>
+    <w:multiLevelType w:val="multilevel"/>
+    <w:tmpl w:val="38B018D0"/>
+    <w:lvl w:ilvl="0">
+      <w:start w:val="1"/>
+      <w:numFmt w:val="decimal"/>
+      <w:lvlText w:val="%1."/>
+      <w:lvlJc w:val="left"/>
+      <w:pPr>
+        <w:ind w:left="1080" w:hanging="720"/>
+      </w:pPr>
+      <w:rPr>
+        <w:rFonts w:hint="default"/>
+      </w:rPr>
+    </w:lvl>
+    <w:lvl w:ilvl="1">
+      <w:start w:val="1"/>
+      <w:numFmt w:val="decimal"/>
+      <w:isLgl/>
+      <w:lvlText w:val="%1.%2"/>
+      <w:lvlJc w:val="left"/>
+      <w:pPr>
+        <w:ind w:left="1080" w:hanging="720"/>
+      </w:pPr>
+      <w:rPr>
+        <w:rFonts w:hint="default"/>
+      </w:rPr>
+    </w:lvl>
+    <w:lvl w:ilvl="2">
+      <w:start w:val="1"/>
+      <w:numFmt w:val="decimal"/>
+      <w:isLgl/>
+      <w:lvlText w:val="%1.%2.%3"/>
+      <w:lvlJc w:val="left"/>
+      <w:pPr>
+        <w:ind w:left="1440" w:hanging="1080"/>
+      </w:pPr>
+      <w:rPr>
+        <w:rFonts w:hint="default"/>
+      </w:rPr>
+    </w:lvl>
+    <w:lvl w:ilvl="3">
+      <w:start w:val="1"/>
+      <w:numFmt w:val="decimal"/>
+      <w:isLgl/>
+      <w:lvlText w:val="%1.%2.%3.%4"/>
+      <w:lvlJc w:val="left"/>
+      <w:pPr>
+        <w:ind w:left="1800" w:hanging="1440"/>
+      </w:pPr>
+      <w:rPr>
+        <w:rFonts w:hint="default"/>
+      </w:rPr>
+    </w:lvl>
+    <w:lvl w:ilvl="4">
+      <w:start w:val="1"/>
+      <w:numFmt w:val="decimal"/>
+      <w:isLgl/>
+      <w:lvlText w:val="%1.%2.%3.%4.%5"/>
+      <w:lvlJc w:val="left"/>
+      <w:pPr>
+        <w:ind w:left="1800" w:hanging="1440"/>
+      </w:pPr>
+      <w:rPr>
+        <w:rFonts w:hint="default"/>
+      </w:rPr>
+    </w:lvl>
+    <w:lvl w:ilvl="5">
+      <w:start w:val="1"/>
+      <w:numFmt w:val="decimal"/>
+      <w:isLgl/>
+      <w:lvlText w:val="%1.%2.%3.%4.%5.%6"/>
+      <w:lvlJc w:val="left"/>
+      <w:pPr>
+        <w:ind w:left="2160" w:hanging="1800"/>
+      </w:pPr>
+      <w:rPr>
+        <w:rFonts w:hint="default"/>
+      </w:rPr>
+    </w:lvl>
+    <w:lvl w:ilvl="6">
+      <w:start w:val="1"/>
+      <w:numFmt w:val="decimal"/>
+      <w:isLgl/>
+      <w:lvlText w:val="%1.%2.%3.%4.%5.%6.%7"/>
+      <w:lvlJc w:val="left"/>
+      <w:pPr>
+        <w:ind w:left="2520" w:hanging="2160"/>
+      </w:pPr>
+      <w:rPr>
+        <w:rFonts w:hint="default"/>
+      </w:rPr>
+    </w:lvl>
+    <w:lvl w:ilvl="7">
+      <w:start w:val="1"/>
+      <w:numFmt w:val="decimal"/>
+      <w:isLgl/>
+      <w:lvlText w:val="%1.%2.%3.%4.%5.%6.%7.%8"/>
+      <w:lvlJc w:val="left"/>
+      <w:pPr>
+        <w:ind w:left="2880" w:hanging="2520"/>
+      </w:pPr>
+      <w:rPr>
+        <w:rFonts w:hint="default"/>
+      </w:rPr>
+    </w:lvl>
+    <w:lvl w:ilvl="8">
+      <w:start w:val="1"/>
+      <w:numFmt w:val="decimal"/>
+      <w:isLgl/>
+      <w:lvlText w:val="%1.%2.%3.%4.%5.%6.%7.%8.%9"/>
+      <w:lvlJc w:val="left"/>
+      <w:pPr>
+        <w:ind w:left="3240" w:hanging="2880"/>
+      </w:pPr>
+      <w:rPr>
+        <w:rFonts w:hint="default"/>
+      </w:rPr>
+    </w:lvl>
+  </w:abstractNum>
+  <w:abstractNum w:abstractNumId="2" w15:restartNumberingAfterBreak="0">
+    <w:nsid w:val="53175545"/>
+    <w:multiLevelType w:val="multilevel"/>
+    <w:tmpl w:val="38B018D0"/>
+    <w:lvl w:ilvl="0">
+      <w:start w:val="1"/>
+      <w:numFmt w:val="decimal"/>
+      <w:lvlText w:val="%1."/>
+      <w:lvlJc w:val="left"/>
+      <w:pPr>
+        <w:ind w:left="1080" w:hanging="720"/>
+      </w:pPr>
+      <w:rPr>
+        <w:rFonts w:hint="default"/>
+      </w:rPr>
+    </w:lvl>
+    <w:lvl w:ilvl="1">
+      <w:start w:val="1"/>
+      <w:numFmt w:val="decimal"/>
+      <w:isLgl/>
+      <w:lvlText w:val="%1.%2"/>
+      <w:lvlJc w:val="left"/>
+      <w:pPr>
+        <w:ind w:left="1080" w:hanging="720"/>
+      </w:pPr>
+      <w:rPr>
+        <w:rFonts w:hint="default"/>
+      </w:rPr>
+    </w:lvl>
+    <w:lvl w:ilvl="2">
+      <w:start w:val="1"/>
+      <w:numFmt w:val="decimal"/>
+      <w:isLgl/>
+      <w:lvlText w:val="%1.%2.%3"/>
+      <w:lvlJc w:val="left"/>
+      <w:pPr>
+        <w:ind w:left="1440" w:hanging="1080"/>
+      </w:pPr>
+      <w:rPr>
+        <w:rFonts w:hint="default"/>
+      </w:rPr>
+    </w:lvl>
+    <w:lvl w:ilvl="3">
+      <w:start w:val="1"/>
+      <w:numFmt w:val="decimal"/>
+      <w:isLgl/>
+      <w:lvlText w:val="%1.%2.%3.%4"/>
+      <w:lvlJc w:val="left"/>
+      <w:pPr>
+        <w:ind w:left="1800" w:hanging="1440"/>
+      </w:pPr>
+      <w:rPr>
+        <w:rFonts w:hint="default"/>
+      </w:rPr>
+    </w:lvl>
+    <w:lvl w:ilvl="4">
+      <w:start w:val="1"/>
+      <w:numFmt w:val="decimal"/>
+      <w:isLgl/>
+      <w:lvlText w:val="%1.%2.%3.%4.%5"/>
+      <w:lvlJc w:val="left"/>
+      <w:pPr>
+        <w:ind w:left="1800" w:hanging="1440"/>
+      </w:pPr>
+      <w:rPr>
+        <w:rFonts w:hint="default"/>
+      </w:rPr>
+    </w:lvl>
+    <w:lvl w:ilvl="5">
+      <w:start w:val="1"/>
+      <w:numFmt w:val="decimal"/>
+      <w:isLgl/>
+      <w:lvlText w:val="%1.%2.%3.%4.%5.%6"/>
+      <w:lvlJc w:val="left"/>
+      <w:pPr>
+        <w:ind w:left="2160" w:hanging="1800"/>
+      </w:pPr>
+      <w:rPr>
+        <w:rFonts w:hint="default"/>
+      </w:rPr>
+    </w:lvl>
+    <w:lvl w:ilvl="6">
+      <w:start w:val="1"/>
+      <w:numFmt w:val="decimal"/>
+      <w:isLgl/>
+      <w:lvlText w:val="%1.%2.%3.%4.%5.%6.%7"/>
+      <w:lvlJc w:val="left"/>
+      <w:pPr>
+        <w:ind w:left="2520" w:hanging="2160"/>
+      </w:pPr>
+      <w:rPr>
+        <w:rFonts w:hint="default"/>
+      </w:rPr>
+    </w:lvl>
+    <w:lvl w:ilvl="7">
+      <w:start w:val="1"/>
+      <w:numFmt w:val="decimal"/>
+      <w:isLgl/>
+      <w:lvlText w:val="%1.%2.%3.%4.%5.%6.%7.%8"/>
+      <w:lvlJc w:val="left"/>
+      <w:pPr>
+        <w:ind w:left="2880" w:hanging="2520"/>
+      </w:pPr>
+      <w:rPr>
+        <w:rFonts w:hint="default"/>
+      </w:rPr>
+    </w:lvl>
+    <w:lvl w:ilvl="8">
+      <w:start w:val="1"/>
+      <w:numFmt w:val="decimal"/>
+      <w:isLgl/>
+      <w:lvlText w:val="%1.%2.%3.%4.%5.%6.%7.%8.%9"/>
+      <w:lvlJc w:val="left"/>
+      <w:pPr>
+        <w:ind w:left="3240" w:hanging="2880"/>
+      </w:pPr>
+      <w:rPr>
+        <w:rFonts w:hint="default"/>
+      </w:rPr>
+    </w:lvl>
+  </w:abstractNum>
+  <w:abstractNum w:abstractNumId="3" w15:restartNumberingAfterBreak="0">
+    <w:nsid w:val="69EA7AEF"/>
+    <w:multiLevelType w:val="hybridMultilevel"/>
+    <w:tmpl w:val="0D722DFC"/>
+    <w:lvl w:ilvl="0" w:tplc="040E000F">
+      <w:start w:val="1"/>
+      <w:numFmt w:val="decimal"/>
+      <w:lvlText w:val="%1."/>
+      <w:lvlJc w:val="left"/>
+      <w:pPr>
+        <w:ind w:left="720" w:hanging="360"/>
+      </w:pPr>
+    </w:lvl>
+    <w:lvl w:ilvl="1" w:tplc="040E0019" w:tentative="1">
+      <w:start w:val="1"/>
+      <w:numFmt w:val="lowerLetter"/>
+      <w:lvlText w:val="%2."/>
+      <w:lvlJc w:val="left"/>
+      <w:pPr>
+        <w:ind w:left="1440" w:hanging="360"/>
+      </w:pPr>
+    </w:lvl>
+    <w:lvl w:ilvl="2" w:tplc="040E001B" w:tentative="1">
+      <w:start w:val="1"/>
+      <w:numFmt w:val="lowerRoman"/>
+      <w:lvlText w:val="%3."/>
+      <w:lvlJc w:val="right"/>
+      <w:pPr>
+        <w:ind w:left="2160" w:hanging="180"/>
+      </w:pPr>
+    </w:lvl>
+    <w:lvl w:ilvl="3" w:tplc="040E000F" w:tentative="1">
+      <w:start w:val="1"/>
+      <w:numFmt w:val="decimal"/>
+      <w:lvlText w:val="%4."/>
+      <w:lvlJc w:val="left"/>
+      <w:pPr>
+        <w:ind w:left="2880" w:hanging="360"/>
+      </w:pPr>
+    </w:lvl>
+    <w:lvl w:ilvl="4" w:tplc="040E0019" w:tentative="1">
+      <w:start w:val="1"/>
+      <w:numFmt w:val="lowerLetter"/>
+      <w:lvlText w:val="%5."/>
+      <w:lvlJc w:val="left"/>
+      <w:pPr>
+        <w:ind w:left="3600" w:hanging="360"/>
+      </w:pPr>
+    </w:lvl>
+    <w:lvl w:ilvl="5" w:tplc="040E001B" w:tentative="1">
+      <w:start w:val="1"/>
+      <w:numFmt w:val="lowerRoman"/>
+      <w:lvlText w:val="%6."/>
+      <w:lvlJc w:val="right"/>
+      <w:pPr>
+        <w:ind w:left="4320" w:hanging="180"/>
+      </w:pPr>
+    </w:lvl>
+    <w:lvl w:ilvl="6" w:tplc="040E000F" w:tentative="1">
+      <w:start w:val="1"/>
+      <w:numFmt w:val="decimal"/>
+      <w:lvlText w:val="%7."/>
+      <w:lvlJc w:val="left"/>
+      <w:pPr>
+        <w:ind w:left="5040" w:hanging="360"/>
+      </w:pPr>
+    </w:lvl>
+    <w:lvl w:ilvl="7" w:tplc="040E0019" w:tentative="1">
+      <w:start w:val="1"/>
+      <w:numFmt w:val="lowerLetter"/>
+      <w:lvlText w:val="%8."/>
+      <w:lvlJc w:val="left"/>
+      <w:pPr>
+        <w:ind w:left="5760" w:hanging="360"/>
+      </w:pPr>
+    </w:lvl>
+    <w:lvl w:ilvl="8" w:tplc="040E001B" w:tentative="1">
+      <w:start w:val="1"/>
+      <w:numFmt w:val="lowerRoman"/>
+      <w:lvlText w:val="%9."/>
+      <w:lvlJc w:val="right"/>
+      <w:pPr>
+        <w:ind w:left="6480" w:hanging="180"/>
+      </w:pPr>
+    </w:lvl>
+  </w:abstractNum>
   <w:num w:numId="1" w16cid:durableId="950480417">
     <w:abstractNumId w:val="0"/>
+  </w:num>
+  <w:num w:numId="2" w16cid:durableId="1294484620">
+    <w:abstractNumId w:val="3"/>
+  </w:num>
+  <w:num w:numId="3" w16cid:durableId="109859399">
+    <w:abstractNumId w:val="2"/>
+  </w:num>
+  <w:num w:numId="4" w16cid:durableId="2064984734">
+    <w:abstractNumId w:val="1"/>
   </w:num>
 </w:numbering>
 </file>
@@ -2625,7 +2351,7 @@
     <w:link w:val="Cmsor1Char"/>
     <w:uiPriority w:val="9"/>
     <w:qFormat/>
-    <w:rsid w:val="00C3069D"/>
+    <w:rsid w:val="00D73700"/>
     <w:pPr>
       <w:keepNext/>
       <w:keepLines/>
@@ -2633,8 +2359,9 @@
       <w:outlineLvl w:val="0"/>
     </w:pPr>
     <w:rPr>
-      <w:rFonts w:asciiTheme="majorHAnsi" w:eastAsiaTheme="majorEastAsia" w:hAnsiTheme="majorHAnsi" w:cstheme="majorBidi"/>
-      <w:color w:val="0F4761" w:themeColor="accent1" w:themeShade="BF"/>
+      <w:rFonts w:ascii="Montserrat" w:eastAsiaTheme="majorEastAsia" w:hAnsi="Montserrat" w:cstheme="majorBidi"/>
+      <w:b/>
+      <w:color w:val="5D28FE"/>
       <w:sz w:val="40"/>
       <w:szCs w:val="40"/>
     </w:rPr>
@@ -2647,7 +2374,7 @@
     <w:uiPriority w:val="9"/>
     <w:unhideWhenUsed/>
     <w:qFormat/>
-    <w:rsid w:val="00C3069D"/>
+    <w:rsid w:val="00D73700"/>
     <w:pPr>
       <w:keepNext/>
       <w:keepLines/>
@@ -2655,8 +2382,8 @@
       <w:outlineLvl w:val="1"/>
     </w:pPr>
     <w:rPr>
-      <w:rFonts w:asciiTheme="majorHAnsi" w:eastAsiaTheme="majorEastAsia" w:hAnsiTheme="majorHAnsi" w:cstheme="majorBidi"/>
-      <w:color w:val="0F4761" w:themeColor="accent1" w:themeShade="BF"/>
+      <w:rFonts w:ascii="Montserrat" w:eastAsiaTheme="majorEastAsia" w:hAnsi="Montserrat" w:cstheme="majorBidi"/>
+      <w:color w:val="5D28FE"/>
       <w:sz w:val="32"/>
       <w:szCs w:val="32"/>
     </w:rPr>
@@ -2669,7 +2396,7 @@
     <w:uiPriority w:val="9"/>
     <w:unhideWhenUsed/>
     <w:qFormat/>
-    <w:rsid w:val="00C3069D"/>
+    <w:rsid w:val="00D73700"/>
     <w:pPr>
       <w:keepNext/>
       <w:keepLines/>
@@ -2677,8 +2404,8 @@
       <w:outlineLvl w:val="2"/>
     </w:pPr>
     <w:rPr>
-      <w:rFonts w:eastAsiaTheme="majorEastAsia" w:cstheme="majorBidi"/>
-      <w:color w:val="0F4761" w:themeColor="accent1" w:themeShade="BF"/>
+      <w:rFonts w:ascii="Montserrat" w:eastAsiaTheme="majorEastAsia" w:hAnsi="Montserrat" w:cstheme="majorBidi"/>
+      <w:color w:val="5D28FE"/>
       <w:sz w:val="28"/>
       <w:szCs w:val="28"/>
     </w:rPr>
@@ -2847,10 +2574,11 @@
     <w:basedOn w:val="Bekezdsalapbettpusa"/>
     <w:link w:val="Cmsor1"/>
     <w:uiPriority w:val="9"/>
-    <w:rsid w:val="00C3069D"/>
+    <w:rsid w:val="00D73700"/>
     <w:rPr>
-      <w:rFonts w:asciiTheme="majorHAnsi" w:eastAsiaTheme="majorEastAsia" w:hAnsiTheme="majorHAnsi" w:cstheme="majorBidi"/>
-      <w:color w:val="0F4761" w:themeColor="accent1" w:themeShade="BF"/>
+      <w:rFonts w:ascii="Montserrat" w:eastAsiaTheme="majorEastAsia" w:hAnsi="Montserrat" w:cstheme="majorBidi"/>
+      <w:b/>
+      <w:color w:val="5D28FE"/>
       <w:sz w:val="40"/>
       <w:szCs w:val="40"/>
     </w:rPr>
@@ -2860,10 +2588,10 @@
     <w:basedOn w:val="Bekezdsalapbettpusa"/>
     <w:link w:val="Cmsor2"/>
     <w:uiPriority w:val="9"/>
-    <w:rsid w:val="00C3069D"/>
+    <w:rsid w:val="00D73700"/>
     <w:rPr>
-      <w:rFonts w:asciiTheme="majorHAnsi" w:eastAsiaTheme="majorEastAsia" w:hAnsiTheme="majorHAnsi" w:cstheme="majorBidi"/>
-      <w:color w:val="0F4761" w:themeColor="accent1" w:themeShade="BF"/>
+      <w:rFonts w:ascii="Montserrat" w:eastAsiaTheme="majorEastAsia" w:hAnsi="Montserrat" w:cstheme="majorBidi"/>
+      <w:color w:val="5D28FE"/>
       <w:sz w:val="32"/>
       <w:szCs w:val="32"/>
     </w:rPr>
@@ -2873,10 +2601,10 @@
     <w:basedOn w:val="Bekezdsalapbettpusa"/>
     <w:link w:val="Cmsor3"/>
     <w:uiPriority w:val="9"/>
-    <w:rsid w:val="00C3069D"/>
+    <w:rsid w:val="00D73700"/>
     <w:rPr>
-      <w:rFonts w:eastAsiaTheme="majorEastAsia" w:cstheme="majorBidi"/>
-      <w:color w:val="0F4761" w:themeColor="accent1" w:themeShade="BF"/>
+      <w:rFonts w:ascii="Montserrat" w:eastAsiaTheme="majorEastAsia" w:hAnsi="Montserrat" w:cstheme="majorBidi"/>
+      <w:color w:val="5D28FE"/>
       <w:sz w:val="28"/>
       <w:szCs w:val="28"/>
     </w:rPr>
@@ -3230,6 +2958,31 @@
     <w:rPr>
       <w:color w:val="467886" w:themeColor="hyperlink"/>
       <w:u w:val="single"/>
+    </w:rPr>
+  </w:style>
+  <w:style w:type="paragraph" w:customStyle="1" w:styleId="Bekezdsek">
+    <w:name w:val="Bekezdések"/>
+    <w:basedOn w:val="Norml"/>
+    <w:link w:val="BekezdsekChar"/>
+    <w:autoRedefine/>
+    <w:qFormat/>
+    <w:rsid w:val="00D73700"/>
+    <w:pPr>
+      <w:spacing w:line="240" w:lineRule="auto"/>
+      <w:ind w:firstLine="567"/>
+      <w:jc w:val="both"/>
+    </w:pPr>
+    <w:rPr>
+      <w:rFonts w:ascii="Montserrat" w:hAnsi="Montserrat"/>
+    </w:rPr>
+  </w:style>
+  <w:style w:type="character" w:customStyle="1" w:styleId="BekezdsekChar">
+    <w:name w:val="Bekezdések Char"/>
+    <w:basedOn w:val="Bekezdsalapbettpusa"/>
+    <w:link w:val="Bekezdsek"/>
+    <w:rsid w:val="00D73700"/>
+    <w:rPr>
+      <w:rFonts w:ascii="Montserrat" w:hAnsi="Montserrat"/>
     </w:rPr>
   </w:style>
 </w:styles>

</xml_diff>

<commit_message>
Added swot gantt chart and wireframe to the documentation
</commit_message>
<xml_diff>
--- a/documentation/documentation.docx
+++ b/documentation/documentation.docx
@@ -3,6 +3,66 @@
 <w:document xmlns:wpc="http://schemas.microsoft.com/office/word/2010/wordprocessingCanvas" xmlns:cx="http://schemas.microsoft.com/office/drawing/2014/chartex" xmlns:cx1="http://schemas.microsoft.com/office/drawing/2015/9/8/chartex" xmlns:cx2="http://schemas.microsoft.com/office/drawing/2015/10/21/chartex" xmlns:cx3="http://schemas.microsoft.com/office/drawing/2016/5/9/chartex" xmlns:cx4="http://schemas.microsoft.com/office/drawing/2016/5/10/chartex" xmlns:cx5="http://schemas.microsoft.com/office/drawing/2016/5/11/chartex" xmlns:cx6="http://schemas.microsoft.com/office/drawing/2016/5/12/chartex" xmlns:cx7="http://schemas.microsoft.com/office/drawing/2016/5/13/chartex" xmlns:cx8="http://schemas.microsoft.com/office/drawing/2016/5/14/chartex" xmlns:mc="http://schemas.openxmlformats.org/markup-compatibility/2006" xmlns:aink="http://schemas.microsoft.com/office/drawing/2016/ink" xmlns:am3d="http://schemas.microsoft.com/office/drawing/2017/model3d" xmlns:o="urn:schemas-microsoft-com:office:office" xmlns:oel="http://schemas.microsoft.com/office/2019/extlst" xmlns:r="http://schemas.openxmlformats.org/officeDocument/2006/relationships" xmlns:m="http://schemas.openxmlformats.org/officeDocument/2006/math" xmlns:v="urn:schemas-microsoft-com:vml" xmlns:wp14="http://schemas.microsoft.com/office/word/2010/wordprocessingDrawing" xmlns:wp="http://schemas.openxmlformats.org/drawingml/2006/wordprocessingDrawing" xmlns:w10="urn:schemas-microsoft-com:office:word" xmlns:w="http://schemas.openxmlformats.org/wordprocessingml/2006/main" xmlns:w14="http://schemas.microsoft.com/office/word/2010/wordml" xmlns:w15="http://schemas.microsoft.com/office/word/2012/wordml" xmlns:w16cex="http://schemas.microsoft.com/office/word/2018/wordml/cex" xmlns:w16cid="http://schemas.microsoft.com/office/word/2016/wordml/cid" xmlns:w16="http://schemas.microsoft.com/office/word/2018/wordml" xmlns:w16du="http://schemas.microsoft.com/office/word/2023/wordml/word16du" xmlns:w16sdtdh="http://schemas.microsoft.com/office/word/2020/wordml/sdtdatahash" xmlns:w16sdtfl="http://schemas.microsoft.com/office/word/2024/wordml/sdtformatlock" xmlns:w16se="http://schemas.microsoft.com/office/word/2015/wordml/symex" xmlns:wpg="http://schemas.microsoft.com/office/word/2010/wordprocessingGroup" xmlns:wpi="http://schemas.microsoft.com/office/word/2010/wordprocessingInk" xmlns:wne="http://schemas.microsoft.com/office/word/2006/wordml" xmlns:wps="http://schemas.microsoft.com/office/word/2010/wordprocessingShape" mc:Ignorable="w14 w15 w16se w16cid w16 w16cex w16sdtdh w16sdtfl w16du wp14">
   <w:body>
     <w:p>
+      <w:r>
+        <w:rPr>
+          <w:noProof/>
+        </w:rPr>
+        <w:drawing>
+          <wp:anchor distT="0" distB="0" distL="114300" distR="114300" simplePos="0" relativeHeight="251666432" behindDoc="0" locked="0" layoutInCell="1" allowOverlap="1" wp14:anchorId="0953EADF" wp14:editId="7DFEA372">
+            <wp:simplePos x="0" y="0"/>
+            <wp:positionH relativeFrom="page">
+              <wp:posOffset>3600450</wp:posOffset>
+            </wp:positionH>
+            <wp:positionV relativeFrom="paragraph">
+              <wp:posOffset>547370</wp:posOffset>
+            </wp:positionV>
+            <wp:extent cx="2545200" cy="2545200"/>
+            <wp:effectExtent l="0" t="0" r="0" b="0"/>
+            <wp:wrapNone/>
+            <wp:docPr id="309679547" name="Ábra 4"/>
+            <wp:cNvGraphicFramePr>
+              <a:graphicFrameLocks xmlns:a="http://schemas.openxmlformats.org/drawingml/2006/main" noChangeAspect="1"/>
+            </wp:cNvGraphicFramePr>
+            <a:graphic xmlns:a="http://schemas.openxmlformats.org/drawingml/2006/main">
+              <a:graphicData uri="http://schemas.openxmlformats.org/drawingml/2006/picture">
+                <pic:pic xmlns:pic="http://schemas.openxmlformats.org/drawingml/2006/picture">
+                  <pic:nvPicPr>
+                    <pic:cNvPr id="309679547" name="Ábra 309679547"/>
+                    <pic:cNvPicPr/>
+                  </pic:nvPicPr>
+                  <pic:blipFill>
+                    <a:blip r:embed="rId6">
+                      <a:extLst>
+                        <a:ext uri="{96DAC541-7B7A-43D3-8B79-37D633B846F1}">
+                          <asvg:svgBlip xmlns:asvg="http://schemas.microsoft.com/office/drawing/2016/SVG/main" r:embed="rId7"/>
+                        </a:ext>
+                      </a:extLst>
+                    </a:blip>
+                    <a:stretch>
+                      <a:fillRect/>
+                    </a:stretch>
+                  </pic:blipFill>
+                  <pic:spPr>
+                    <a:xfrm>
+                      <a:off x="0" y="0"/>
+                      <a:ext cx="2545200" cy="2545200"/>
+                    </a:xfrm>
+                    <a:prstGeom prst="rect">
+                      <a:avLst/>
+                    </a:prstGeom>
+                  </pic:spPr>
+                </pic:pic>
+              </a:graphicData>
+            </a:graphic>
+            <wp14:sizeRelH relativeFrom="margin">
+              <wp14:pctWidth>0</wp14:pctWidth>
+            </wp14:sizeRelH>
+            <wp14:sizeRelV relativeFrom="margin">
+              <wp14:pctHeight>0</wp14:pctHeight>
+            </wp14:sizeRelV>
+          </wp:anchor>
+        </w:drawing>
+      </w:r>
       <w:r>
         <w:rPr>
           <w:noProof/>
@@ -10,15 +70,15 @@
         <mc:AlternateContent>
           <mc:Choice Requires="wps">
             <w:drawing>
-              <wp:anchor distT="45720" distB="45720" distL="114300" distR="114300" simplePos="0" relativeHeight="251661312" behindDoc="0" locked="0" layoutInCell="1" allowOverlap="1" wp14:anchorId="5083EA60" wp14:editId="0424A8E8">
+              <wp:anchor distT="45720" distB="45720" distL="114300" distR="114300" simplePos="0" relativeHeight="251661312" behindDoc="0" locked="0" layoutInCell="1" allowOverlap="1" wp14:anchorId="5083EA60" wp14:editId="5FA63E6D">
                 <wp:simplePos x="0" y="0"/>
                 <wp:positionH relativeFrom="column">
-                  <wp:posOffset>1243330</wp:posOffset>
+                  <wp:posOffset>1440180</wp:posOffset>
                 </wp:positionH>
                 <wp:positionV relativeFrom="paragraph">
-                  <wp:posOffset>3462655</wp:posOffset>
+                  <wp:posOffset>3463925</wp:posOffset>
                 </wp:positionV>
-                <wp:extent cx="5133975" cy="2076450"/>
+                <wp:extent cx="5133600" cy="2077200"/>
                 <wp:effectExtent l="0" t="0" r="0" b="0"/>
                 <wp:wrapSquare wrapText="bothSides"/>
                 <wp:docPr id="1" name="Text Box 2"/>
@@ -34,7 +94,7 @@
                       <wps:spPr bwMode="auto">
                         <a:xfrm>
                           <a:off x="0" y="0"/>
-                          <a:ext cx="5133975" cy="2076450"/>
+                          <a:ext cx="5133600" cy="2077200"/>
                         </a:xfrm>
                         <a:prstGeom prst="rect">
                           <a:avLst/>
@@ -62,6 +122,7 @@
                                 <w:szCs w:val="96"/>
                               </w:rPr>
                             </w:pPr>
+                            <w:proofErr w:type="spellStart"/>
                             <w:r>
                               <w:rPr>
                                 <w:rFonts w:ascii="Montserrat" w:hAnsi="Montserrat" w:cs="Arial"/>
@@ -73,6 +134,7 @@
                               </w:rPr>
                               <w:t>MyTunes</w:t>
                             </w:r>
+                            <w:proofErr w:type="spellEnd"/>
                           </w:p>
                           <w:p>
                             <w:pPr>
@@ -119,7 +181,7 @@
                 <v:stroke joinstyle="miter"/>
                 <v:path gradientshapeok="t" o:connecttype="rect"/>
               </v:shapetype>
-              <v:shape id="Text Box 2" o:spid="_x0000_s1026" type="#_x0000_t202" style="position:absolute;margin-left:97.9pt;margin-top:272.65pt;width:404.25pt;height:163.5pt;z-index:251661312;visibility:visible;mso-wrap-style:square;mso-width-percent:0;mso-height-percent:0;mso-wrap-distance-left:9pt;mso-wrap-distance-top:3.6pt;mso-wrap-distance-right:9pt;mso-wrap-distance-bottom:3.6pt;mso-position-horizontal:absolute;mso-position-horizontal-relative:text;mso-position-vertical:absolute;mso-position-vertical-relative:text;mso-width-percent:0;mso-height-percent:0;mso-width-relative:margin;mso-height-relative:margin;v-text-anchor:top" o:gfxdata="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" filled="f" stroked="f">
+              <v:shape id="Text Box 2" o:spid="_x0000_s1026" type="#_x0000_t202" style="position:absolute;margin-left:113.4pt;margin-top:272.75pt;width:404.2pt;height:163.55pt;z-index:251661312;visibility:visible;mso-wrap-style:square;mso-width-percent:0;mso-height-percent:0;mso-wrap-distance-left:9pt;mso-wrap-distance-top:3.6pt;mso-wrap-distance-right:9pt;mso-wrap-distance-bottom:3.6pt;mso-position-horizontal:absolute;mso-position-horizontal-relative:text;mso-position-vertical:absolute;mso-position-vertical-relative:text;mso-width-percent:0;mso-height-percent:0;mso-width-relative:margin;mso-height-relative:margin;v-text-anchor:top" o:gfxdata="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" filled="f" stroked="f">
                 <v:textbox>
                   <w:txbxContent>
                     <w:p>
@@ -135,6 +197,7 @@
                           <w:szCs w:val="96"/>
                         </w:rPr>
                       </w:pPr>
+                      <w:proofErr w:type="spellStart"/>
                       <w:r>
                         <w:rPr>
                           <w:rFonts w:ascii="Montserrat" w:hAnsi="Montserrat" w:cs="Arial"/>
@@ -146,6 +209,7 @@
                         </w:rPr>
                         <w:t>MyTunes</w:t>
                       </w:r>
+                      <w:proofErr w:type="spellEnd"/>
                     </w:p>
                     <w:p>
                       <w:pPr>
@@ -399,7 +463,7 @@
             <o:lock v:ext="edit" aspectratio="t"/>
           </v:shapetype>
           <v:shape id="_x0000_s1026" type="#_x0000_t75" style="position:absolute;margin-left:-78pt;margin-top:-77.1pt;width:598.55pt;height:845.1pt;z-index:-251657216;mso-position-horizontal-relative:text;mso-position-vertical-relative:text;mso-width-relative:page;mso-height-relative:page">
-            <v:imagedata r:id="rId6" o:title="c4-bg"/>
+            <v:imagedata r:id="rId8" o:title="c4-bg"/>
           </v:shape>
         </w:pict>
       </w:r>
@@ -409,7 +473,7 @@
         </w:rPr>
         <w:pict w14:anchorId="3229BAB0">
           <v:shape id="_x0000_s1027" type="#_x0000_t75" style="position:absolute;margin-left:-70.5pt;margin-top:628.6pt;width:591.05pt;height:139.4pt;z-index:-251656192;mso-position-horizontal-relative:text;mso-position-vertical-relative:text;mso-width-relative:page;mso-height-relative:page">
-            <v:imagedata r:id="rId7" o:title="c4-footer"/>
+            <v:imagedata r:id="rId9" o:title="c4-footer"/>
           </v:shape>
         </w:pict>
       </w:r>
@@ -420,7 +484,7 @@
         <mc:AlternateContent>
           <mc:Choice Requires="wps">
             <w:drawing>
-              <wp:anchor distT="0" distB="0" distL="114300" distR="114300" simplePos="0" relativeHeight="251665408" behindDoc="0" locked="0" layoutInCell="1" allowOverlap="1" wp14:anchorId="01BFC55C" wp14:editId="3503092E">
+              <wp:anchor distT="0" distB="0" distL="114300" distR="114300" simplePos="0" relativeHeight="251665408" behindDoc="0" locked="0" layoutInCell="1" allowOverlap="1" wp14:anchorId="01BFC55C" wp14:editId="79E81974">
                 <wp:simplePos x="0" y="0"/>
                 <wp:positionH relativeFrom="column">
                   <wp:posOffset>2266950</wp:posOffset>
@@ -474,256 +538,21 @@
           </mc:Choice>
           <mc:Fallback>
             <w:pict>
-              <v:line w14:anchorId="236D9301" id="Straight Connector 3" o:spid="_x0000_s1026" style="position:absolute;z-index:251665408;visibility:visible;mso-wrap-style:square;mso-wrap-distance-left:9pt;mso-wrap-distance-top:0;mso-wrap-distance-right:9pt;mso-wrap-distance-bottom:0;mso-position-horizontal:absolute;mso-position-horizontal-relative:text;mso-position-vertical:absolute;mso-position-vertical-relative:text" from="178.5pt,405pt" to="429pt,405pt" o:gfxdata="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" strokecolor="#4acbee" strokeweight="4.5pt">
+              <v:line w14:anchorId="34C958B1" id="Straight Connector 3" o:spid="_x0000_s1026" style="position:absolute;z-index:251665408;visibility:visible;mso-wrap-style:square;mso-wrap-distance-left:9pt;mso-wrap-distance-top:0;mso-wrap-distance-right:9pt;mso-wrap-distance-bottom:0;mso-position-horizontal:absolute;mso-position-horizontal-relative:text;mso-position-vertical:absolute;mso-position-vertical-relative:text" from="178.5pt,405pt" to="429pt,405pt" o:gfxdata="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" strokecolor="#4acbee" strokeweight="4.5pt">
                 <v:stroke joinstyle="miter"/>
               </v:line>
             </w:pict>
           </mc:Fallback>
         </mc:AlternateContent>
       </w:r>
-      <w:r>
-        <w:rPr>
-          <w:noProof/>
-        </w:rPr>
-        <w:pict w14:anchorId="05EBD12D">
-          <v:shape id="_x0000_s1028" type="#_x0000_t75" style="position:absolute;margin-left:177pt;margin-top:124.5pt;width:283.5pt;height:75.6pt;z-index:-251654144;mso-position-horizontal-relative:text;mso-position-vertical-relative:text;mso-width-relative:page;mso-height-relative:page">
-            <v:imagedata r:id="rId8" o:title="company logo"/>
-          </v:shape>
-        </w:pict>
-      </w:r>
     </w:p>
-    <w:p>
-      <w:pPr>
-        <w:rPr>
-          <w:rFonts w:ascii="Montserrat" w:eastAsiaTheme="majorEastAsia" w:hAnsi="Montserrat" w:cstheme="majorBidi"/>
-          <w:b/>
-          <w:color w:val="5D28FE"/>
-          <w:sz w:val="40"/>
-          <w:szCs w:val="40"/>
-        </w:rPr>
-      </w:pPr>
-    </w:p>
-    <w:p>
-      <w:pPr>
-        <w:pStyle w:val="Cmsor1"/>
-        <w:numPr>
-          <w:ilvl w:val="0"/>
-          <w:numId w:val="3"/>
-        </w:numPr>
-      </w:pPr>
-      <w:bookmarkStart w:id="0" w:name="_Toc214479967"/>
-      <w:r>
-        <w:t>Bevezetés</w:t>
-      </w:r>
-      <w:bookmarkEnd w:id="0"/>
-    </w:p>
-    <w:p>
-      <w:pPr>
-        <w:pStyle w:val="Cmsor2"/>
-        <w:numPr>
-          <w:ilvl w:val="1"/>
-          <w:numId w:val="3"/>
-        </w:numPr>
-      </w:pPr>
-      <w:bookmarkStart w:id="1" w:name="_Toc214479968"/>
-      <w:r>
-        <w:t>A projekt célja</w:t>
-      </w:r>
-      <w:bookmarkEnd w:id="1"/>
-    </w:p>
-    <w:p>
-      <w:pPr>
-        <w:pStyle w:val="Bekezdsek"/>
-      </w:pPr>
-      <w:r>
-        <w:t>A MyTunes projekt célja egy olyan multiplatformos zene streaming al-kalmazás létrehozása, amely a manapság divatos előfizetéses modellekkel szemben ingyen és bérmentve nyújt zenehallgatási lehetőséget sokak számára. A fejlesztők célja a hosszútávú értékteremtés, amely a páratlan fel-használói élménnyel társulva garantálja a projekt sikerességét. Az ingyenes modell ezáltal a profitorientált gondolkodás mellőzése egy felhasználóbarát, a felhasználók igényeit maximálisan figyelembe vevő és az igényeket teljes mértékben kielégítő megoldás létrehozását segíti.</w:t>
-      </w:r>
-    </w:p>
-    <w:p>
-      <w:pPr>
-        <w:pStyle w:val="Cmsor2"/>
-        <w:numPr>
-          <w:ilvl w:val="1"/>
-          <w:numId w:val="3"/>
-        </w:numPr>
-      </w:pPr>
-      <w:bookmarkStart w:id="2" w:name="_Toc214479969"/>
-      <w:r>
-        <w:t>A projekt tervezete</w:t>
-      </w:r>
-      <w:bookmarkEnd w:id="2"/>
-    </w:p>
-    <w:p>
-      <w:pPr>
-        <w:pStyle w:val="Bekezdsek"/>
-      </w:pPr>
-      <w:r>
-        <w:t>A tervezet szerint az alkalmazás rendelkezni fog egy webes, asztali és mobil felülettel amely alkalmazások felhasználói felületei ugyanazt a dizájn sémát fogják követni. A három platformot egy központi szerver fogja össze amely intézi mind a webes felület kiszolgálását a háttérszámításokat és egy adatbázis kiszolgálását is.</w:t>
-      </w:r>
-    </w:p>
-    <w:p/>
-    <w:p>
-      <w:pPr>
-        <w:pStyle w:val="Cmsor3"/>
-        <w:numPr>
-          <w:ilvl w:val="2"/>
-          <w:numId w:val="1"/>
-        </w:numPr>
-      </w:pPr>
-      <w:bookmarkStart w:id="3" w:name="_Toc214479970"/>
-      <w:r>
-        <w:t>Webalkalmazás</w:t>
-      </w:r>
-      <w:bookmarkEnd w:id="3"/>
-    </w:p>
-    <w:p>
-      <w:r>
-        <w:rPr>
-          <w:rStyle w:val="BekezdsekChar"/>
-        </w:rPr>
-        <w:t xml:space="preserve">A webes alkalmazás kliens oldali felületét a Vuejs </w:t>
-      </w:r>
-      <w:r>
-        <w:rPr>
-          <w:rStyle w:val="BekezdsekChar"/>
-        </w:rPr>
-        <w:t>JavaScript</w:t>
-      </w:r>
-      <w:r>
-        <w:rPr>
-          <w:rStyle w:val="BekezdsekChar"/>
-        </w:rPr>
-        <w:t xml:space="preserve"> keretrendszer felhasználásával, a szerveroldali funkcionalitást PHP-val fogjuk kivitelezni</w:t>
-      </w:r>
-      <w:r>
-        <w:t>.</w:t>
-      </w:r>
-    </w:p>
-    <w:p/>
-    <w:p>
-      <w:pPr>
-        <w:pStyle w:val="Cmsor3"/>
-        <w:numPr>
-          <w:ilvl w:val="2"/>
-          <w:numId w:val="1"/>
-        </w:numPr>
-      </w:pPr>
-      <w:bookmarkStart w:id="4" w:name="_Toc214479971"/>
-      <w:r>
-        <w:t>Asztali alkalmazás</w:t>
-      </w:r>
-      <w:bookmarkEnd w:id="4"/>
-    </w:p>
-    <w:p>
-      <w:pPr>
-        <w:pStyle w:val="Bekezdsek"/>
-      </w:pPr>
-      <w:r>
-        <w:t xml:space="preserve">Az asztali alkalmazáshoz a Windows Presentation Foundation (WPF) </w:t>
-      </w:r>
-      <w:r>
-        <w:t>keretrendszert fogjuk felhasználni, amelyben a programkód C# nyelven íródik.</w:t>
-      </w:r>
-    </w:p>
-    <w:p/>
-    <w:p>
-      <w:pPr>
-        <w:pStyle w:val="Cmsor3"/>
-        <w:numPr>
-          <w:ilvl w:val="2"/>
-          <w:numId w:val="1"/>
-        </w:numPr>
-      </w:pPr>
-      <w:bookmarkStart w:id="5" w:name="_Toc214479972"/>
-      <w:r>
-        <w:t>Mobil alkalmazás terve</w:t>
-      </w:r>
-      <w:bookmarkEnd w:id="5"/>
-    </w:p>
-    <w:p>
-      <w:pPr>
-        <w:ind w:left="360"/>
-      </w:pPr>
-      <w:r>
-        <w:t>?</w:t>
-      </w:r>
-    </w:p>
-    <w:p>
-      <w:pPr>
-        <w:pStyle w:val="Cmsor3"/>
-        <w:numPr>
-          <w:ilvl w:val="2"/>
-          <w:numId w:val="1"/>
-        </w:numPr>
-      </w:pPr>
-      <w:bookmarkStart w:id="6" w:name="_Toc214479973"/>
-      <w:r>
-        <w:t>Adatbázis</w:t>
-      </w:r>
-      <w:bookmarkEnd w:id="6"/>
-    </w:p>
-    <w:p>
-      <w:pPr>
-        <w:pStyle w:val="Bekezdsek"/>
-      </w:pPr>
-      <w:r>
-        <w:t>A felhasználói és egyéb adatokat egy MySQL szerver felhasználásával fogjuk tárolni</w:t>
-      </w:r>
-    </w:p>
-    <w:p>
-      <w:pPr>
-        <w:rPr>
-          <w:rFonts w:ascii="Montserrat" w:hAnsi="Montserrat"/>
-        </w:rPr>
-      </w:pPr>
-      <w:r>
-        <w:br w:type="page"/>
-      </w:r>
-    </w:p>
-    <w:p>
-      <w:pPr>
-        <w:pStyle w:val="Cmsor3"/>
-        <w:numPr>
-          <w:ilvl w:val="2"/>
-          <w:numId w:val="1"/>
-        </w:numPr>
-      </w:pPr>
-      <w:bookmarkStart w:id="7" w:name="_Toc214479974"/>
-      <w:r>
-        <w:lastRenderedPageBreak/>
-        <w:t>Fejlesztés</w:t>
-      </w:r>
-      <w:bookmarkEnd w:id="7"/>
-    </w:p>
-    <w:p>
-      <w:pPr>
-        <w:pStyle w:val="Bekezdsek"/>
-      </w:pPr>
-      <w:r>
-        <w:t>A fejlesztés során felhasználásra fog kerülni a Trello a feladatok beosztása és a közös munka gördülékenyebbé tétele érdekében. A kódbázis egy privát GitHub repository-ban lesz megosztva a projekt fejlesztői között amely helytől és időtől függetleníti ezáltal rugalmasabbá teszi az alkalmazás fejlesztését. A fejlesztés során a Docker konténerizációs megoldását fogjuk használni a maximális stabilitás és a kész projekt egyszer</w:t>
-      </w:r>
-      <w:r>
-        <w:t>ű telepítése érdekében.</w:t>
-      </w:r>
-    </w:p>
-    <w:p>
-      <w:r>
-        <w:br w:type="page"/>
-      </w:r>
-    </w:p>
+    <w:bookmarkStart w:id="0" w:name="_Toc214722123" w:displacedByCustomXml="next"/>
     <w:sdt>
       <w:sdtPr>
         <w:rPr>
-          <w:rFonts w:asciiTheme="minorHAnsi" w:eastAsiaTheme="minorHAnsi" w:hAnsiTheme="minorHAnsi" w:cstheme="minorBidi"/>
-          <w:b w:val="0"/>
-          <w:color w:val="auto"/>
-          <w:kern w:val="2"/>
-          <w:sz w:val="24"/>
-          <w:szCs w:val="24"/>
           <w:lang w:val="hu-HU"/>
-          <w14:ligatures w14:val="standardContextual"/>
         </w:rPr>
-        <w:id w:val="-1297907132"/>
+        <w:id w:val="1867016788"/>
         <w:docPartObj>
           <w:docPartGallery w:val="Table of Contents"/>
           <w:docPartUnique/>
@@ -731,22 +560,25 @@
       </w:sdtPr>
       <w:sdtEndPr>
         <w:rPr>
+          <w:rFonts w:asciiTheme="minorHAnsi" w:eastAsiaTheme="minorHAnsi" w:hAnsiTheme="minorHAnsi" w:cstheme="minorBidi"/>
           <w:bCs/>
+          <w:color w:val="auto"/>
+          <w:kern w:val="2"/>
+          <w:sz w:val="24"/>
+          <w:szCs w:val="24"/>
+          <w14:ligatures w14:val="standardContextual"/>
         </w:rPr>
       </w:sdtEndPr>
       <w:sdtContent>
         <w:p>
           <w:pPr>
             <w:pStyle w:val="Tartalomjegyzkcmsora"/>
-            <w:rPr>
-              <w:lang w:val="hu-HU"/>
-            </w:rPr>
           </w:pPr>
           <w:r>
             <w:rPr>
               <w:lang w:val="hu-HU"/>
             </w:rPr>
-            <w:t>Tartalom</w:t>
+            <w:t>Tartalomjegyzék</w:t>
           </w:r>
         </w:p>
         <w:p>
@@ -763,24 +595,15 @@
             </w:rPr>
           </w:pPr>
           <w:r>
-            <w:rPr>
-              <w:rFonts w:ascii="Montserrat" w:hAnsi="Montserrat"/>
-            </w:rPr>
             <w:fldChar w:fldCharType="begin"/>
           </w:r>
           <w:r>
-            <w:rPr>
-              <w:rFonts w:ascii="Montserrat" w:hAnsi="Montserrat"/>
-            </w:rPr>
             <w:instrText xml:space="preserve"> TOC \o "1-3" \h \z \u </w:instrText>
           </w:r>
           <w:r>
-            <w:rPr>
-              <w:rFonts w:ascii="Montserrat" w:hAnsi="Montserrat"/>
-            </w:rPr>
             <w:fldChar w:fldCharType="separate"/>
           </w:r>
-          <w:hyperlink w:anchor="_Toc214479967" w:history="1">
+          <w:hyperlink w:anchor="_Toc214723933" w:history="1">
             <w:r>
               <w:rPr>
                 <w:rStyle w:val="Hiperhivatkozs"/>
@@ -822,7 +645,7 @@
                 <w:noProof/>
                 <w:webHidden/>
               </w:rPr>
-              <w:instrText xml:space="preserve"> PAGEREF _Toc214479967 \h </w:instrText>
+              <w:instrText xml:space="preserve"> PAGEREF _Toc214723933 \h </w:instrText>
             </w:r>
             <w:r>
               <w:rPr>
@@ -842,7 +665,7 @@
                 <w:noProof/>
                 <w:webHidden/>
               </w:rPr>
-              <w:t>2</w:t>
+              <w:t>3</w:t>
             </w:r>
             <w:r>
               <w:rPr>
@@ -866,7 +689,7 @@
               <w:lang w:eastAsia="hu-HU"/>
             </w:rPr>
           </w:pPr>
-          <w:hyperlink w:anchor="_Toc214479968" w:history="1">
+          <w:hyperlink w:anchor="_Toc214723934" w:history="1">
             <w:r>
               <w:rPr>
                 <w:rStyle w:val="Hiperhivatkozs"/>
@@ -908,7 +731,7 @@
                 <w:noProof/>
                 <w:webHidden/>
               </w:rPr>
-              <w:instrText xml:space="preserve"> PAGEREF _Toc214479968 \h </w:instrText>
+              <w:instrText xml:space="preserve"> PAGEREF _Toc214723934 \h </w:instrText>
             </w:r>
             <w:r>
               <w:rPr>
@@ -928,7 +751,7 @@
                 <w:noProof/>
                 <w:webHidden/>
               </w:rPr>
-              <w:t>2</w:t>
+              <w:t>3</w:t>
             </w:r>
             <w:r>
               <w:rPr>
@@ -952,7 +775,7 @@
               <w:lang w:eastAsia="hu-HU"/>
             </w:rPr>
           </w:pPr>
-          <w:hyperlink w:anchor="_Toc214479969" w:history="1">
+          <w:hyperlink w:anchor="_Toc214723935" w:history="1">
             <w:r>
               <w:rPr>
                 <w:rStyle w:val="Hiperhivatkozs"/>
@@ -994,7 +817,7 @@
                 <w:noProof/>
                 <w:webHidden/>
               </w:rPr>
-              <w:instrText xml:space="preserve"> PAGEREF _Toc214479969 \h </w:instrText>
+              <w:instrText xml:space="preserve"> PAGEREF _Toc214723935 \h </w:instrText>
             </w:r>
             <w:r>
               <w:rPr>
@@ -1014,7 +837,7 @@
                 <w:noProof/>
                 <w:webHidden/>
               </w:rPr>
-              <w:t>2</w:t>
+              <w:t>3</w:t>
             </w:r>
             <w:r>
               <w:rPr>
@@ -1038,13 +861,13 @@
               <w:lang w:eastAsia="hu-HU"/>
             </w:rPr>
           </w:pPr>
-          <w:hyperlink w:anchor="_Toc214479970" w:history="1">
+          <w:hyperlink w:anchor="_Toc214723936" w:history="1">
             <w:r>
               <w:rPr>
                 <w:rStyle w:val="Hiperhivatkozs"/>
                 <w:noProof/>
               </w:rPr>
-              <w:t>1.1.1</w:t>
+              <w:t>1.2.1</w:t>
             </w:r>
             <w:r>
               <w:rPr>
@@ -1080,7 +903,7 @@
                 <w:noProof/>
                 <w:webHidden/>
               </w:rPr>
-              <w:instrText xml:space="preserve"> PAGEREF _Toc214479970 \h </w:instrText>
+              <w:instrText xml:space="preserve"> PAGEREF _Toc214723936 \h </w:instrText>
             </w:r>
             <w:r>
               <w:rPr>
@@ -1100,7 +923,7 @@
                 <w:noProof/>
                 <w:webHidden/>
               </w:rPr>
-              <w:t>2</w:t>
+              <w:t>3</w:t>
             </w:r>
             <w:r>
               <w:rPr>
@@ -1124,13 +947,13 @@
               <w:lang w:eastAsia="hu-HU"/>
             </w:rPr>
           </w:pPr>
-          <w:hyperlink w:anchor="_Toc214479971" w:history="1">
+          <w:hyperlink w:anchor="_Toc214723937" w:history="1">
             <w:r>
               <w:rPr>
                 <w:rStyle w:val="Hiperhivatkozs"/>
                 <w:noProof/>
               </w:rPr>
-              <w:t>1.1.2</w:t>
+              <w:t>1.2.2</w:t>
             </w:r>
             <w:r>
               <w:rPr>
@@ -1166,7 +989,7 @@
                 <w:noProof/>
                 <w:webHidden/>
               </w:rPr>
-              <w:instrText xml:space="preserve"> PAGEREF _Toc214479971 \h </w:instrText>
+              <w:instrText xml:space="preserve"> PAGEREF _Toc214723937 \h </w:instrText>
             </w:r>
             <w:r>
               <w:rPr>
@@ -1186,7 +1009,7 @@
                 <w:noProof/>
                 <w:webHidden/>
               </w:rPr>
-              <w:t>2</w:t>
+              <w:t>3</w:t>
             </w:r>
             <w:r>
               <w:rPr>
@@ -1210,13 +1033,13 @@
               <w:lang w:eastAsia="hu-HU"/>
             </w:rPr>
           </w:pPr>
-          <w:hyperlink w:anchor="_Toc214479972" w:history="1">
+          <w:hyperlink w:anchor="_Toc214723938" w:history="1">
             <w:r>
               <w:rPr>
                 <w:rStyle w:val="Hiperhivatkozs"/>
                 <w:noProof/>
               </w:rPr>
-              <w:t>1.1.3</w:t>
+              <w:t>1.2.3</w:t>
             </w:r>
             <w:r>
               <w:rPr>
@@ -1252,7 +1075,7 @@
                 <w:noProof/>
                 <w:webHidden/>
               </w:rPr>
-              <w:instrText xml:space="preserve"> PAGEREF _Toc214479972 \h </w:instrText>
+              <w:instrText xml:space="preserve"> PAGEREF _Toc214723938 \h </w:instrText>
             </w:r>
             <w:r>
               <w:rPr>
@@ -1272,7 +1095,7 @@
                 <w:noProof/>
                 <w:webHidden/>
               </w:rPr>
-              <w:t>2</w:t>
+              <w:t>3</w:t>
             </w:r>
             <w:r>
               <w:rPr>
@@ -1296,13 +1119,13 @@
               <w:lang w:eastAsia="hu-HU"/>
             </w:rPr>
           </w:pPr>
-          <w:hyperlink w:anchor="_Toc214479973" w:history="1">
+          <w:hyperlink w:anchor="_Toc214723939" w:history="1">
             <w:r>
               <w:rPr>
                 <w:rStyle w:val="Hiperhivatkozs"/>
                 <w:noProof/>
               </w:rPr>
-              <w:t>1.1.4</w:t>
+              <w:t>1.2.4</w:t>
             </w:r>
             <w:r>
               <w:rPr>
@@ -1338,7 +1161,7 @@
                 <w:noProof/>
                 <w:webHidden/>
               </w:rPr>
-              <w:instrText xml:space="preserve"> PAGEREF _Toc214479973 \h </w:instrText>
+              <w:instrText xml:space="preserve"> PAGEREF _Toc214723939 \h </w:instrText>
             </w:r>
             <w:r>
               <w:rPr>
@@ -1358,7 +1181,7 @@
                 <w:noProof/>
                 <w:webHidden/>
               </w:rPr>
-              <w:t>2</w:t>
+              <w:t>3</w:t>
             </w:r>
             <w:r>
               <w:rPr>
@@ -1382,13 +1205,13 @@
               <w:lang w:eastAsia="hu-HU"/>
             </w:rPr>
           </w:pPr>
-          <w:hyperlink w:anchor="_Toc214479974" w:history="1">
+          <w:hyperlink w:anchor="_Toc214723940" w:history="1">
             <w:r>
               <w:rPr>
                 <w:rStyle w:val="Hiperhivatkozs"/>
                 <w:noProof/>
               </w:rPr>
-              <w:t>1.1.5</w:t>
+              <w:t>1.2.5</w:t>
             </w:r>
             <w:r>
               <w:rPr>
@@ -1424,7 +1247,7 @@
                 <w:noProof/>
                 <w:webHidden/>
               </w:rPr>
-              <w:instrText xml:space="preserve"> PAGEREF _Toc214479974 \h </w:instrText>
+              <w:instrText xml:space="preserve"> PAGEREF _Toc214723940 \h </w:instrText>
             </w:r>
             <w:r>
               <w:rPr>
@@ -1444,7 +1267,265 @@
                 <w:noProof/>
                 <w:webHidden/>
               </w:rPr>
-              <w:t>3</w:t>
+              <w:t>4</w:t>
+            </w:r>
+            <w:r>
+              <w:rPr>
+                <w:noProof/>
+                <w:webHidden/>
+              </w:rPr>
+              <w:fldChar w:fldCharType="end"/>
+            </w:r>
+          </w:hyperlink>
+        </w:p>
+        <w:p>
+          <w:pPr>
+            <w:pStyle w:val="TJ2"/>
+            <w:tabs>
+              <w:tab w:val="left" w:pos="960"/>
+              <w:tab w:val="right" w:leader="dot" w:pos="9062"/>
+            </w:tabs>
+            <w:rPr>
+              <w:rFonts w:eastAsiaTheme="minorEastAsia"/>
+              <w:noProof/>
+              <w:lang w:eastAsia="hu-HU"/>
+            </w:rPr>
+          </w:pPr>
+          <w:hyperlink w:anchor="_Toc214723941" w:history="1">
+            <w:r>
+              <w:rPr>
+                <w:rStyle w:val="Hiperhivatkozs"/>
+                <w:noProof/>
+              </w:rPr>
+              <w:t>1.3</w:t>
+            </w:r>
+            <w:r>
+              <w:rPr>
+                <w:rFonts w:eastAsiaTheme="minorEastAsia"/>
+                <w:noProof/>
+                <w:lang w:eastAsia="hu-HU"/>
+              </w:rPr>
+              <w:tab/>
+            </w:r>
+            <w:r>
+              <w:rPr>
+                <w:rStyle w:val="Hiperhivatkozs"/>
+                <w:noProof/>
+              </w:rPr>
+              <w:t>SWOT analízis</w:t>
+            </w:r>
+            <w:r>
+              <w:rPr>
+                <w:noProof/>
+                <w:webHidden/>
+              </w:rPr>
+              <w:tab/>
+            </w:r>
+            <w:r>
+              <w:rPr>
+                <w:noProof/>
+                <w:webHidden/>
+              </w:rPr>
+              <w:fldChar w:fldCharType="begin"/>
+            </w:r>
+            <w:r>
+              <w:rPr>
+                <w:noProof/>
+                <w:webHidden/>
+              </w:rPr>
+              <w:instrText xml:space="preserve"> PAGEREF _Toc214723941 \h </w:instrText>
+            </w:r>
+            <w:r>
+              <w:rPr>
+                <w:noProof/>
+                <w:webHidden/>
+              </w:rPr>
+            </w:r>
+            <w:r>
+              <w:rPr>
+                <w:noProof/>
+                <w:webHidden/>
+              </w:rPr>
+              <w:fldChar w:fldCharType="separate"/>
+            </w:r>
+            <w:r>
+              <w:rPr>
+                <w:noProof/>
+                <w:webHidden/>
+              </w:rPr>
+              <w:t>4</w:t>
+            </w:r>
+            <w:r>
+              <w:rPr>
+                <w:noProof/>
+                <w:webHidden/>
+              </w:rPr>
+              <w:fldChar w:fldCharType="end"/>
+            </w:r>
+          </w:hyperlink>
+        </w:p>
+        <w:p>
+          <w:pPr>
+            <w:pStyle w:val="TJ2"/>
+            <w:tabs>
+              <w:tab w:val="left" w:pos="960"/>
+              <w:tab w:val="right" w:leader="dot" w:pos="9062"/>
+            </w:tabs>
+            <w:rPr>
+              <w:rFonts w:eastAsiaTheme="minorEastAsia"/>
+              <w:noProof/>
+              <w:lang w:eastAsia="hu-HU"/>
+            </w:rPr>
+          </w:pPr>
+          <w:hyperlink w:anchor="_Toc214723942" w:history="1">
+            <w:r>
+              <w:rPr>
+                <w:rStyle w:val="Hiperhivatkozs"/>
+                <w:noProof/>
+              </w:rPr>
+              <w:t>1.4</w:t>
+            </w:r>
+            <w:r>
+              <w:rPr>
+                <w:rFonts w:eastAsiaTheme="minorEastAsia"/>
+                <w:noProof/>
+                <w:lang w:eastAsia="hu-HU"/>
+              </w:rPr>
+              <w:tab/>
+            </w:r>
+            <w:r>
+              <w:rPr>
+                <w:rStyle w:val="Hiperhivatkozs"/>
+                <w:noProof/>
+              </w:rPr>
+              <w:t>Gantt diagram</w:t>
+            </w:r>
+            <w:r>
+              <w:rPr>
+                <w:noProof/>
+                <w:webHidden/>
+              </w:rPr>
+              <w:tab/>
+            </w:r>
+            <w:r>
+              <w:rPr>
+                <w:noProof/>
+                <w:webHidden/>
+              </w:rPr>
+              <w:fldChar w:fldCharType="begin"/>
+            </w:r>
+            <w:r>
+              <w:rPr>
+                <w:noProof/>
+                <w:webHidden/>
+              </w:rPr>
+              <w:instrText xml:space="preserve"> PAGEREF _Toc214723942 \h </w:instrText>
+            </w:r>
+            <w:r>
+              <w:rPr>
+                <w:noProof/>
+                <w:webHidden/>
+              </w:rPr>
+            </w:r>
+            <w:r>
+              <w:rPr>
+                <w:noProof/>
+                <w:webHidden/>
+              </w:rPr>
+              <w:fldChar w:fldCharType="separate"/>
+            </w:r>
+            <w:r>
+              <w:rPr>
+                <w:noProof/>
+                <w:webHidden/>
+              </w:rPr>
+              <w:t>5</w:t>
+            </w:r>
+            <w:r>
+              <w:rPr>
+                <w:noProof/>
+                <w:webHidden/>
+              </w:rPr>
+              <w:fldChar w:fldCharType="end"/>
+            </w:r>
+          </w:hyperlink>
+        </w:p>
+        <w:p>
+          <w:pPr>
+            <w:pStyle w:val="TJ2"/>
+            <w:tabs>
+              <w:tab w:val="left" w:pos="960"/>
+              <w:tab w:val="right" w:leader="dot" w:pos="9062"/>
+            </w:tabs>
+            <w:rPr>
+              <w:rFonts w:eastAsiaTheme="minorEastAsia"/>
+              <w:noProof/>
+              <w:lang w:eastAsia="hu-HU"/>
+            </w:rPr>
+          </w:pPr>
+          <w:hyperlink w:anchor="_Toc214723943" w:history="1">
+            <w:r>
+              <w:rPr>
+                <w:rStyle w:val="Hiperhivatkozs"/>
+                <w:noProof/>
+              </w:rPr>
+              <w:t>1.5</w:t>
+            </w:r>
+            <w:r>
+              <w:rPr>
+                <w:rFonts w:eastAsiaTheme="minorEastAsia"/>
+                <w:noProof/>
+                <w:lang w:eastAsia="hu-HU"/>
+              </w:rPr>
+              <w:tab/>
+            </w:r>
+            <w:r>
+              <w:rPr>
+                <w:rStyle w:val="Hiperhivatkozs"/>
+                <w:noProof/>
+              </w:rPr>
+              <w:t>Wireframe</w:t>
+            </w:r>
+            <w:r>
+              <w:rPr>
+                <w:noProof/>
+                <w:webHidden/>
+              </w:rPr>
+              <w:tab/>
+            </w:r>
+            <w:r>
+              <w:rPr>
+                <w:noProof/>
+                <w:webHidden/>
+              </w:rPr>
+              <w:fldChar w:fldCharType="begin"/>
+            </w:r>
+            <w:r>
+              <w:rPr>
+                <w:noProof/>
+                <w:webHidden/>
+              </w:rPr>
+              <w:instrText xml:space="preserve"> PAGEREF _Toc214723943 \h </w:instrText>
+            </w:r>
+            <w:r>
+              <w:rPr>
+                <w:noProof/>
+                <w:webHidden/>
+              </w:rPr>
+            </w:r>
+            <w:r>
+              <w:rPr>
+                <w:noProof/>
+                <w:webHidden/>
+              </w:rPr>
+              <w:fldChar w:fldCharType="separate"/>
+            </w:r>
+            <w:r>
+              <w:rPr>
+                <w:noProof/>
+                <w:webHidden/>
+              </w:rPr>
+              <w:t>5</w:t>
             </w:r>
             <w:r>
               <w:rPr>
@@ -1458,7 +1539,6 @@
         <w:p>
           <w:r>
             <w:rPr>
-              <w:rFonts w:ascii="Montserrat" w:hAnsi="Montserrat"/>
               <w:b/>
               <w:bCs/>
             </w:rPr>
@@ -1467,6 +1547,904 @@
         </w:p>
       </w:sdtContent>
     </w:sdt>
+    <w:p>
+      <w:pPr>
+        <w:rPr>
+          <w:rFonts w:ascii="Montserrat" w:eastAsiaTheme="majorEastAsia" w:hAnsi="Montserrat" w:cstheme="majorBidi"/>
+          <w:b/>
+          <w:color w:val="5D28FE"/>
+          <w:sz w:val="40"/>
+          <w:szCs w:val="40"/>
+        </w:rPr>
+      </w:pPr>
+      <w:r>
+        <w:br w:type="page"/>
+      </w:r>
+    </w:p>
+    <w:p>
+      <w:pPr>
+        <w:pStyle w:val="Cmsor1"/>
+        <w:numPr>
+          <w:ilvl w:val="0"/>
+          <w:numId w:val="3"/>
+        </w:numPr>
+      </w:pPr>
+      <w:bookmarkStart w:id="1" w:name="_Toc214723933"/>
+      <w:r>
+        <w:lastRenderedPageBreak/>
+        <w:t>Bevezetés</w:t>
+      </w:r>
+      <w:bookmarkEnd w:id="0"/>
+      <w:bookmarkEnd w:id="1"/>
+    </w:p>
+    <w:p>
+      <w:pPr>
+        <w:pStyle w:val="Cmsor2"/>
+        <w:numPr>
+          <w:ilvl w:val="1"/>
+          <w:numId w:val="3"/>
+        </w:numPr>
+      </w:pPr>
+      <w:bookmarkStart w:id="2" w:name="_Toc214722124"/>
+      <w:bookmarkStart w:id="3" w:name="_Toc214723934"/>
+      <w:r>
+        <w:t>A projekt célja</w:t>
+      </w:r>
+      <w:bookmarkEnd w:id="2"/>
+      <w:bookmarkEnd w:id="3"/>
+    </w:p>
+    <w:p>
+      <w:pPr>
+        <w:pStyle w:val="Bekezdsek"/>
+      </w:pPr>
+      <w:r>
+        <w:t xml:space="preserve">A </w:t>
+      </w:r>
+      <w:proofErr w:type="spellStart"/>
+      <w:r>
+        <w:t>MyTunes</w:t>
+      </w:r>
+      <w:proofErr w:type="spellEnd"/>
+      <w:r>
+        <w:t xml:space="preserve"> projekt célja egy olyan multiplatformos zene streaming </w:t>
+      </w:r>
+      <w:proofErr w:type="spellStart"/>
+      <w:r>
+        <w:t>al-kalmazás</w:t>
+      </w:r>
+      <w:proofErr w:type="spellEnd"/>
+      <w:r>
+        <w:t xml:space="preserve"> létrehozása, amely a manapság divatos előfizetéses modellekkel szemben ingyen és bérmentve nyújt zenehallgatási lehetőséget sokak számára. A fejlesztők célja a hosszútávú értékteremtés, amely a páratlan fel-használói élménnyel társulva garantálja a projekt sikerességét. Az ingyenes modell ezáltal a profitorientált gondolkodás mellőzése egy felhasználóbarát, a felhasználók igényeit maximálisan figyelembe vevő és az igényeket teljes mértékben kielégítő megoldás létrehozását segíti.</w:t>
+      </w:r>
+    </w:p>
+    <w:p>
+      <w:pPr>
+        <w:pStyle w:val="Cmsor2"/>
+        <w:numPr>
+          <w:ilvl w:val="1"/>
+          <w:numId w:val="3"/>
+        </w:numPr>
+      </w:pPr>
+      <w:bookmarkStart w:id="4" w:name="_Toc214722125"/>
+      <w:bookmarkStart w:id="5" w:name="_Toc214723935"/>
+      <w:r>
+        <w:t>A projekt tervezete</w:t>
+      </w:r>
+      <w:bookmarkEnd w:id="4"/>
+      <w:bookmarkEnd w:id="5"/>
+    </w:p>
+    <w:p>
+      <w:pPr>
+        <w:pStyle w:val="Bekezdsek"/>
+      </w:pPr>
+      <w:r>
+        <w:t xml:space="preserve">A tervezet szerint az alkalmazás rendelkezni fog egy webes, asztali és mobil </w:t>
+      </w:r>
+      <w:r>
+        <w:t>felülettel,</w:t>
+      </w:r>
+      <w:r>
+        <w:t xml:space="preserve"> amely alkalmazások felhasználói felületei ugyanazt a dizájn sémát fogják követni. A három platformot egy központi szerver fogja </w:t>
+      </w:r>
+      <w:r>
+        <w:t>össze,</w:t>
+      </w:r>
+      <w:r>
+        <w:t xml:space="preserve"> amely intézi mind a webes felület kiszolgálását a háttérszámításokat és egy adatbázis kiszolgálását is.</w:t>
+      </w:r>
+    </w:p>
+    <w:p/>
+    <w:p>
+      <w:pPr>
+        <w:pStyle w:val="Cmsor3"/>
+        <w:numPr>
+          <w:ilvl w:val="2"/>
+          <w:numId w:val="3"/>
+        </w:numPr>
+        <w:tabs>
+          <w:tab w:val="left" w:pos="993"/>
+        </w:tabs>
+      </w:pPr>
+      <w:bookmarkStart w:id="6" w:name="_Toc214722126"/>
+      <w:bookmarkStart w:id="7" w:name="_Toc214723936"/>
+      <w:r>
+        <w:t>Webalkalmazás</w:t>
+      </w:r>
+      <w:bookmarkEnd w:id="6"/>
+      <w:bookmarkEnd w:id="7"/>
+    </w:p>
+    <w:p>
+      <w:r>
+        <w:rPr>
+          <w:rStyle w:val="BekezdsekChar"/>
+        </w:rPr>
+        <w:t xml:space="preserve">A webes alkalmazás kliens oldali felületét a </w:t>
+      </w:r>
+      <w:proofErr w:type="spellStart"/>
+      <w:r>
+        <w:rPr>
+          <w:rStyle w:val="BekezdsekChar"/>
+        </w:rPr>
+        <w:t>Vuejs</w:t>
+      </w:r>
+      <w:proofErr w:type="spellEnd"/>
+      <w:r>
+        <w:rPr>
+          <w:rStyle w:val="BekezdsekChar"/>
+        </w:rPr>
+        <w:t xml:space="preserve"> </w:t>
+      </w:r>
+      <w:r>
+        <w:rPr>
+          <w:rStyle w:val="BekezdsekChar"/>
+        </w:rPr>
+        <w:t>JavaScript</w:t>
+      </w:r>
+      <w:r>
+        <w:rPr>
+          <w:rStyle w:val="BekezdsekChar"/>
+        </w:rPr>
+        <w:t xml:space="preserve"> keretrendszer felhasználásával, a szerveroldali funkcionalitást PHP-</w:t>
+      </w:r>
+      <w:proofErr w:type="spellStart"/>
+      <w:r>
+        <w:rPr>
+          <w:rStyle w:val="BekezdsekChar"/>
+        </w:rPr>
+        <w:t>val</w:t>
+      </w:r>
+      <w:proofErr w:type="spellEnd"/>
+      <w:r>
+        <w:rPr>
+          <w:rStyle w:val="BekezdsekChar"/>
+        </w:rPr>
+        <w:t xml:space="preserve"> fogjuk kivitelezni</w:t>
+      </w:r>
+      <w:r>
+        <w:t>.</w:t>
+      </w:r>
+    </w:p>
+    <w:p/>
+    <w:p>
+      <w:pPr>
+        <w:pStyle w:val="Cmsor3"/>
+        <w:numPr>
+          <w:ilvl w:val="2"/>
+          <w:numId w:val="5"/>
+        </w:numPr>
+      </w:pPr>
+      <w:bookmarkStart w:id="8" w:name="_Toc214722127"/>
+      <w:bookmarkStart w:id="9" w:name="_Toc214723937"/>
+      <w:r>
+        <w:t>Asztali alkalmazás</w:t>
+      </w:r>
+      <w:bookmarkEnd w:id="8"/>
+      <w:bookmarkEnd w:id="9"/>
+    </w:p>
+    <w:p>
+      <w:pPr>
+        <w:pStyle w:val="Bekezdsek"/>
+      </w:pPr>
+      <w:r>
+        <w:t xml:space="preserve">Az asztali alkalmazáshoz a Windows </w:t>
+      </w:r>
+      <w:proofErr w:type="spellStart"/>
+      <w:r>
+        <w:t>Presentation</w:t>
+      </w:r>
+      <w:proofErr w:type="spellEnd"/>
+      <w:r>
+        <w:t xml:space="preserve"> </w:t>
+      </w:r>
+      <w:proofErr w:type="spellStart"/>
+      <w:r>
+        <w:t>Foundation</w:t>
+      </w:r>
+      <w:proofErr w:type="spellEnd"/>
+      <w:r>
+        <w:t xml:space="preserve"> (WPF) </w:t>
+      </w:r>
+      <w:r>
+        <w:t>keretrendszert fogjuk felhasználni, amelyben a programkód C# nyelven íródik.</w:t>
+      </w:r>
+    </w:p>
+    <w:p/>
+    <w:p>
+      <w:pPr>
+        <w:pStyle w:val="Cmsor3"/>
+        <w:numPr>
+          <w:ilvl w:val="2"/>
+          <w:numId w:val="5"/>
+        </w:numPr>
+      </w:pPr>
+      <w:bookmarkStart w:id="10" w:name="_Toc214722128"/>
+      <w:bookmarkStart w:id="11" w:name="_Toc214723938"/>
+      <w:r>
+        <w:t>Mobil alkalmazás terve</w:t>
+      </w:r>
+      <w:bookmarkEnd w:id="10"/>
+      <w:bookmarkEnd w:id="11"/>
+    </w:p>
+    <w:p>
+      <w:pPr>
+        <w:ind w:left="360"/>
+      </w:pPr>
+      <w:r>
+        <w:t>?</w:t>
+      </w:r>
+    </w:p>
+    <w:p>
+      <w:pPr>
+        <w:pStyle w:val="Cmsor3"/>
+        <w:numPr>
+          <w:ilvl w:val="2"/>
+          <w:numId w:val="5"/>
+        </w:numPr>
+      </w:pPr>
+      <w:bookmarkStart w:id="12" w:name="_Toc214722129"/>
+      <w:bookmarkStart w:id="13" w:name="_Toc214723939"/>
+      <w:r>
+        <w:t>Adatbázis</w:t>
+      </w:r>
+      <w:bookmarkEnd w:id="12"/>
+      <w:bookmarkEnd w:id="13"/>
+    </w:p>
+    <w:p>
+      <w:pPr>
+        <w:pStyle w:val="Bekezdsek"/>
+      </w:pPr>
+      <w:r>
+        <w:t xml:space="preserve">A felhasználói és egyéb adatokat egy </w:t>
+      </w:r>
+      <w:proofErr w:type="spellStart"/>
+      <w:r>
+        <w:t>MySQL</w:t>
+      </w:r>
+      <w:proofErr w:type="spellEnd"/>
+      <w:r>
+        <w:t xml:space="preserve"> szerver felhasználásával fogjuk tárolni</w:t>
+      </w:r>
+    </w:p>
+    <w:p>
+      <w:pPr>
+        <w:rPr>
+          <w:rFonts w:ascii="Montserrat" w:hAnsi="Montserrat"/>
+        </w:rPr>
+      </w:pPr>
+      <w:r>
+        <w:br w:type="page"/>
+      </w:r>
+    </w:p>
+    <w:p>
+      <w:pPr>
+        <w:pStyle w:val="Cmsor3"/>
+        <w:numPr>
+          <w:ilvl w:val="2"/>
+          <w:numId w:val="5"/>
+        </w:numPr>
+      </w:pPr>
+      <w:bookmarkStart w:id="14" w:name="_Toc214722130"/>
+      <w:bookmarkStart w:id="15" w:name="_Toc214723940"/>
+      <w:r>
+        <w:lastRenderedPageBreak/>
+        <w:t>Fejlesztés</w:t>
+      </w:r>
+      <w:bookmarkEnd w:id="14"/>
+      <w:bookmarkEnd w:id="15"/>
+    </w:p>
+    <w:p>
+      <w:pPr>
+        <w:pStyle w:val="Bekezdsek"/>
+      </w:pPr>
+      <w:r>
+        <w:t xml:space="preserve">A fejlesztés során felhasználásra fog kerülni a </w:t>
+      </w:r>
+      <w:proofErr w:type="spellStart"/>
+      <w:r>
+        <w:t>Trello</w:t>
+      </w:r>
+      <w:proofErr w:type="spellEnd"/>
+      <w:r>
+        <w:t xml:space="preserve"> a feladatok beosztása és a közös munka gördülékenyebbé tétele érdekében. A kódbázis egy privát GitHub </w:t>
+      </w:r>
+      <w:proofErr w:type="spellStart"/>
+      <w:r>
+        <w:t>repository</w:t>
+      </w:r>
+      <w:proofErr w:type="spellEnd"/>
+      <w:r>
+        <w:t xml:space="preserve">-ban lesz megosztva a projekt fejlesztői </w:t>
+      </w:r>
+      <w:r>
+        <w:t>között,</w:t>
+      </w:r>
+      <w:r>
+        <w:t xml:space="preserve"> amely helytől és időtől függetleníti ezáltal rugalmasabbá teszi az alkalmazás fejlesztését. A fejlesztés során a Docker </w:t>
+      </w:r>
+      <w:proofErr w:type="spellStart"/>
+      <w:r>
+        <w:t>konténerizációs</w:t>
+      </w:r>
+      <w:proofErr w:type="spellEnd"/>
+      <w:r>
+        <w:t xml:space="preserve"> megoldását fogjuk használni a maximális stabilitás és a kész projekt egyszer</w:t>
+      </w:r>
+      <w:r>
+        <w:t>ű telepítése érdekében.</w:t>
+      </w:r>
+    </w:p>
+    <w:p>
+      <w:pPr>
+        <w:pStyle w:val="Bekezdsek"/>
+        <w:ind w:firstLine="0"/>
+      </w:pPr>
+    </w:p>
+    <w:p>
+      <w:pPr>
+        <w:pStyle w:val="Cmsor2"/>
+        <w:numPr>
+          <w:ilvl w:val="1"/>
+          <w:numId w:val="5"/>
+        </w:numPr>
+      </w:pPr>
+      <w:bookmarkStart w:id="16" w:name="_Toc214722131"/>
+      <w:bookmarkStart w:id="17" w:name="_Toc214723941"/>
+      <w:r>
+        <w:t>SWOT analízis</w:t>
+      </w:r>
+      <w:bookmarkEnd w:id="16"/>
+      <w:bookmarkEnd w:id="17"/>
+    </w:p>
+    <w:p>
+      <w:pPr>
+        <w:pStyle w:val="Bekezdsek"/>
+      </w:pPr>
+      <w:r>
+        <w:rPr>
+          <w:rStyle w:val="BekezdsekChar"/>
+        </w:rPr>
+        <w:t xml:space="preserve">Az alábbi képen látható SWOT </w:t>
+      </w:r>
+      <w:r>
+        <w:rPr>
+          <w:rStyle w:val="BekezdsekChar"/>
+        </w:rPr>
+        <w:t xml:space="preserve">analízis megtalálható a </w:t>
+      </w:r>
+      <w:proofErr w:type="spellStart"/>
+      <w:r>
+        <w:rPr>
+          <w:rStyle w:val="BekezdsekChar"/>
+        </w:rPr>
+        <w:t>MyTunes</w:t>
+      </w:r>
+      <w:proofErr w:type="spellEnd"/>
+      <w:r>
+        <w:rPr>
+          <w:rStyle w:val="BekezdsekChar"/>
+        </w:rPr>
+        <w:t>/</w:t>
+      </w:r>
+      <w:proofErr w:type="spellStart"/>
+      <w:r>
+        <w:rPr>
+          <w:rStyle w:val="BekezdsekChar"/>
+        </w:rPr>
+        <w:t>documentation</w:t>
+      </w:r>
+      <w:proofErr w:type="spellEnd"/>
+      <w:r>
+        <w:rPr>
+          <w:rStyle w:val="BekezdsekChar"/>
+        </w:rPr>
+        <w:t>/SWOT.pptx elérési útvonalon</w:t>
+      </w:r>
+      <w:r>
+        <w:t>.</w:t>
+      </w:r>
+    </w:p>
+    <w:p>
+      <w:pPr>
+        <w:keepNext/>
+      </w:pPr>
+      <w:r>
+        <w:drawing>
+          <wp:inline distT="0" distB="0" distL="0" distR="0" wp14:anchorId="6BF2B6EC" wp14:editId="07EE65F8">
+            <wp:extent cx="5760720" cy="3232150"/>
+            <wp:effectExtent l="114300" t="114300" r="144780" b="139700"/>
+            <wp:docPr id="1369750711" name="Kép 1" descr="A képen szöveg, képernyőkép, Betűtípus, tervezés látható&#10;&#10;Előfordulhat, hogy az AI által létrehozott tartalom helytelen."/>
+            <wp:cNvGraphicFramePr>
+              <a:graphicFrameLocks xmlns:a="http://schemas.openxmlformats.org/drawingml/2006/main" noChangeAspect="1"/>
+            </wp:cNvGraphicFramePr>
+            <a:graphic xmlns:a="http://schemas.openxmlformats.org/drawingml/2006/main">
+              <a:graphicData uri="http://schemas.openxmlformats.org/drawingml/2006/picture">
+                <pic:pic xmlns:pic="http://schemas.openxmlformats.org/drawingml/2006/picture">
+                  <pic:nvPicPr>
+                    <pic:cNvPr id="1369750711" name="Kép 1" descr="A képen szöveg, képernyőkép, Betűtípus, tervezés látható&#10;&#10;Előfordulhat, hogy az AI által létrehozott tartalom helytelen."/>
+                    <pic:cNvPicPr/>
+                  </pic:nvPicPr>
+                  <pic:blipFill>
+                    <a:blip r:embed="rId10"/>
+                    <a:stretch>
+                      <a:fillRect/>
+                    </a:stretch>
+                  </pic:blipFill>
+                  <pic:spPr>
+                    <a:xfrm>
+                      <a:off x="0" y="0"/>
+                      <a:ext cx="5760720" cy="3232150"/>
+                    </a:xfrm>
+                    <a:prstGeom prst="rect">
+                      <a:avLst/>
+                    </a:prstGeom>
+                    <a:solidFill>
+                      <a:srgbClr val="FFFFFF">
+                        <a:shade val="85000"/>
+                      </a:srgbClr>
+                    </a:solidFill>
+                    <a:ln w="88900" cap="sq">
+                      <a:solidFill>
+                        <a:srgbClr val="FFFFFF"/>
+                      </a:solidFill>
+                      <a:miter lim="800000"/>
+                    </a:ln>
+                    <a:effectLst>
+                      <a:outerShdw blurRad="55000" dist="18000" dir="5400000" algn="tl" rotWithShape="0">
+                        <a:srgbClr val="000000">
+                          <a:alpha val="40000"/>
+                        </a:srgbClr>
+                      </a:outerShdw>
+                    </a:effectLst>
+                    <a:scene3d>
+                      <a:camera prst="orthographicFront"/>
+                      <a:lightRig rig="twoPt" dir="t">
+                        <a:rot lat="0" lon="0" rev="7200000"/>
+                      </a:lightRig>
+                    </a:scene3d>
+                    <a:sp3d>
+                      <a:bevelT w="25400" h="19050"/>
+                      <a:contourClr>
+                        <a:srgbClr val="FFFFFF"/>
+                      </a:contourClr>
+                    </a:sp3d>
+                  </pic:spPr>
+                </pic:pic>
+              </a:graphicData>
+            </a:graphic>
+          </wp:inline>
+        </w:drawing>
+      </w:r>
+    </w:p>
+    <w:p>
+      <w:pPr>
+        <w:pStyle w:val="Kpalrs"/>
+      </w:pPr>
+      <w:r>
+        <w:fldChar w:fldCharType="begin"/>
+      </w:r>
+      <w:r>
+        <w:instrText xml:space="preserve"> SEQ ábra \* ARABIC </w:instrText>
+      </w:r>
+      <w:r>
+        <w:fldChar w:fldCharType="separate"/>
+      </w:r>
+      <w:r>
+        <w:rPr>
+          <w:noProof/>
+        </w:rPr>
+        <w:t>1</w:t>
+      </w:r>
+      <w:r>
+        <w:fldChar w:fldCharType="end"/>
+      </w:r>
+      <w:r>
+        <w:t>. SWOT analízis</w:t>
+      </w:r>
+    </w:p>
+    <w:p>
+      <w:pPr>
+        <w:rPr>
+          <w:rFonts w:ascii="Montserrat" w:eastAsiaTheme="majorEastAsia" w:hAnsi="Montserrat" w:cstheme="majorBidi"/>
+          <w:color w:val="5D28FE"/>
+          <w:sz w:val="32"/>
+          <w:szCs w:val="32"/>
+        </w:rPr>
+      </w:pPr>
+      <w:r>
+        <w:br w:type="page"/>
+      </w:r>
+    </w:p>
+    <w:p>
+      <w:pPr>
+        <w:pStyle w:val="Cmsor2"/>
+        <w:numPr>
+          <w:ilvl w:val="1"/>
+          <w:numId w:val="5"/>
+        </w:numPr>
+      </w:pPr>
+      <w:bookmarkStart w:id="18" w:name="_Toc214723942"/>
+      <w:proofErr w:type="spellStart"/>
+      <w:r>
+        <w:lastRenderedPageBreak/>
+        <w:t>Gantt</w:t>
+      </w:r>
+      <w:proofErr w:type="spellEnd"/>
+      <w:r>
+        <w:t xml:space="preserve"> diagram</w:t>
+      </w:r>
+      <w:bookmarkEnd w:id="18"/>
+    </w:p>
+    <w:p>
+      <w:pPr>
+        <w:pStyle w:val="Bekezdsek"/>
+      </w:pPr>
+      <w:r>
+        <w:t xml:space="preserve">Az alábbi </w:t>
+      </w:r>
+      <w:proofErr w:type="spellStart"/>
+      <w:r>
+        <w:t>gantt</w:t>
+      </w:r>
+      <w:proofErr w:type="spellEnd"/>
+      <w:r>
+        <w:t xml:space="preserve"> diagram a projekt elkészítésének tervezett idővonalát </w:t>
+      </w:r>
+      <w:r>
+        <w:t>ábrázolja,</w:t>
+      </w:r>
+      <w:r>
+        <w:t xml:space="preserve"> amely a projekt kezdeti dokumentációs fázisában készült. </w:t>
+      </w:r>
+      <w:r>
+        <w:t>A megvalósítás kis mértékben eltérhet az eredeti ütemtervtől.</w:t>
+      </w:r>
+    </w:p>
+    <w:p>
+      <w:pPr>
+        <w:pStyle w:val="Bekezdsek"/>
+      </w:pPr>
+      <w:r>
+        <w:t xml:space="preserve">A </w:t>
+      </w:r>
+      <w:proofErr w:type="spellStart"/>
+      <w:r>
+        <w:t>gantt</w:t>
+      </w:r>
+      <w:proofErr w:type="spellEnd"/>
+      <w:r>
+        <w:t xml:space="preserve"> diagram megtalálható a </w:t>
+      </w:r>
+      <w:proofErr w:type="spellStart"/>
+      <w:r>
+        <w:t>Mytunes</w:t>
+      </w:r>
+      <w:proofErr w:type="spellEnd"/>
+      <w:r>
+        <w:t>/</w:t>
+      </w:r>
+      <w:proofErr w:type="spellStart"/>
+      <w:r>
+        <w:t>documenattion</w:t>
+      </w:r>
+      <w:proofErr w:type="spellEnd"/>
+      <w:r>
+        <w:t xml:space="preserve"> elérési útvonalon </w:t>
+      </w:r>
+      <w:r>
+        <w:rPr>
+          <w:b/>
+          <w:bCs/>
+        </w:rPr>
+        <w:t>pdf</w:t>
+      </w:r>
+      <w:r>
+        <w:rPr>
+          <w:b/>
+          <w:bCs/>
+        </w:rPr>
+        <w:t xml:space="preserve"> </w:t>
+      </w:r>
+      <w:r>
+        <w:t>és</w:t>
+      </w:r>
+      <w:r>
+        <w:rPr>
+          <w:b/>
+          <w:bCs/>
+        </w:rPr>
+        <w:t xml:space="preserve"> </w:t>
+      </w:r>
+      <w:proofErr w:type="spellStart"/>
+      <w:r>
+        <w:rPr>
+          <w:b/>
+          <w:bCs/>
+        </w:rPr>
+        <w:t>gantt</w:t>
+      </w:r>
+      <w:proofErr w:type="spellEnd"/>
+      <w:r>
+        <w:rPr>
+          <w:b/>
+          <w:bCs/>
+        </w:rPr>
+        <w:t xml:space="preserve"> </w:t>
+      </w:r>
+      <w:r>
+        <w:t>kiterjesztéssel is.</w:t>
+      </w:r>
+    </w:p>
+    <w:p>
+      <w:pPr>
+        <w:keepNext/>
+      </w:pPr>
+      <w:r>
+        <w:drawing>
+          <wp:inline distT="0" distB="0" distL="0" distR="0" wp14:anchorId="4FA7022E" wp14:editId="1BFF0486">
+            <wp:extent cx="5760720" cy="1219200"/>
+            <wp:effectExtent l="0" t="0" r="0" b="0"/>
+            <wp:docPr id="755683826" name="Kép 1" descr="A képen képernyőkép, Multimédiás szoftver, Grafikai szoftver, 3D modellezés látható&#10;&#10;Előfordulhat, hogy az AI által létrehozott tartalom helytelen."/>
+            <wp:cNvGraphicFramePr>
+              <a:graphicFrameLocks xmlns:a="http://schemas.openxmlformats.org/drawingml/2006/main" noChangeAspect="1"/>
+            </wp:cNvGraphicFramePr>
+            <a:graphic xmlns:a="http://schemas.openxmlformats.org/drawingml/2006/main">
+              <a:graphicData uri="http://schemas.openxmlformats.org/drawingml/2006/picture">
+                <pic:pic xmlns:pic="http://schemas.openxmlformats.org/drawingml/2006/picture">
+                  <pic:nvPicPr>
+                    <pic:cNvPr id="755683826" name="Kép 1" descr="A képen képernyőkép, Multimédiás szoftver, Grafikai szoftver, 3D modellezés látható&#10;&#10;Előfordulhat, hogy az AI által létrehozott tartalom helytelen."/>
+                    <pic:cNvPicPr/>
+                  </pic:nvPicPr>
+                  <pic:blipFill>
+                    <a:blip r:embed="rId11"/>
+                    <a:stretch>
+                      <a:fillRect/>
+                    </a:stretch>
+                  </pic:blipFill>
+                  <pic:spPr>
+                    <a:xfrm>
+                      <a:off x="0" y="0"/>
+                      <a:ext cx="5760720" cy="1219200"/>
+                    </a:xfrm>
+                    <a:prstGeom prst="rect">
+                      <a:avLst/>
+                    </a:prstGeom>
+                  </pic:spPr>
+                </pic:pic>
+              </a:graphicData>
+            </a:graphic>
+          </wp:inline>
+        </w:drawing>
+      </w:r>
+    </w:p>
+    <w:p>
+      <w:pPr>
+        <w:pStyle w:val="Kpalrs"/>
+        <w:rPr>
+          <w:rStyle w:val="KpalrsChar"/>
+        </w:rPr>
+      </w:pPr>
+      <w:r>
+        <w:fldChar w:fldCharType="begin"/>
+      </w:r>
+      <w:r>
+        <w:instrText xml:space="preserve"> SEQ ábra \* ARABIC </w:instrText>
+      </w:r>
+      <w:r>
+        <w:fldChar w:fldCharType="separate"/>
+      </w:r>
+      <w:r>
+        <w:rPr>
+          <w:noProof/>
+        </w:rPr>
+        <w:t>2</w:t>
+      </w:r>
+      <w:r>
+        <w:fldChar w:fldCharType="end"/>
+      </w:r>
+      <w:r>
+        <w:rPr>
+          <w:rStyle w:val="KpalrsChar"/>
+        </w:rPr>
+        <w:t xml:space="preserve">. </w:t>
+      </w:r>
+      <w:proofErr w:type="spellStart"/>
+      <w:r>
+        <w:rPr>
+          <w:rStyle w:val="KpalrsChar"/>
+        </w:rPr>
+        <w:t>Gantt</w:t>
+      </w:r>
+      <w:proofErr w:type="spellEnd"/>
+      <w:r>
+        <w:rPr>
+          <w:rStyle w:val="KpalrsChar"/>
+        </w:rPr>
+        <w:t xml:space="preserve"> diagram</w:t>
+      </w:r>
+    </w:p>
+    <w:p/>
+    <w:p>
+      <w:pPr>
+        <w:pStyle w:val="Cmsor2"/>
+        <w:numPr>
+          <w:ilvl w:val="1"/>
+          <w:numId w:val="5"/>
+        </w:numPr>
+      </w:pPr>
+      <w:bookmarkStart w:id="19" w:name="_Toc214723943"/>
+      <w:proofErr w:type="spellStart"/>
+      <w:r>
+        <w:t>Wireframe</w:t>
+      </w:r>
+      <w:bookmarkEnd w:id="19"/>
+      <w:proofErr w:type="spellEnd"/>
+    </w:p>
+    <w:p>
+      <w:pPr>
+        <w:pStyle w:val="Bekezdsek"/>
+      </w:pPr>
+      <w:r>
+        <w:t xml:space="preserve">Az alábbi </w:t>
+      </w:r>
+      <w:proofErr w:type="spellStart"/>
+      <w:r>
+        <w:t>wireframe</w:t>
+      </w:r>
+      <w:proofErr w:type="spellEnd"/>
+      <w:r>
+        <w:t>(drótváz)</w:t>
+      </w:r>
+      <w:r>
+        <w:t xml:space="preserve"> az alkalmazás </w:t>
+      </w:r>
+      <w:proofErr w:type="spellStart"/>
+      <w:r>
+        <w:t>leegyszerüsített</w:t>
+      </w:r>
+      <w:proofErr w:type="spellEnd"/>
+      <w:r>
+        <w:t xml:space="preserve"> felépítését hivatott bemutatni. A </w:t>
+      </w:r>
+      <w:proofErr w:type="spellStart"/>
+      <w:r>
+        <w:t>wireframe</w:t>
+      </w:r>
+      <w:proofErr w:type="spellEnd"/>
+      <w:r>
+        <w:t xml:space="preserve"> megtalálható a </w:t>
+      </w:r>
+      <w:proofErr w:type="spellStart"/>
+      <w:r>
+        <w:t>MyTunes</w:t>
+      </w:r>
+      <w:proofErr w:type="spellEnd"/>
+      <w:r>
+        <w:t>/</w:t>
+      </w:r>
+      <w:proofErr w:type="spellStart"/>
+      <w:r>
+        <w:t>documentation</w:t>
+      </w:r>
+      <w:proofErr w:type="spellEnd"/>
+      <w:r>
+        <w:t xml:space="preserve"> elérési útvonalon </w:t>
+      </w:r>
+      <w:r>
+        <w:rPr>
+          <w:b/>
+          <w:bCs/>
+        </w:rPr>
+        <w:t>AI</w:t>
+      </w:r>
+      <w:r>
+        <w:t xml:space="preserve"> és </w:t>
+      </w:r>
+      <w:proofErr w:type="spellStart"/>
+      <w:r>
+        <w:rPr>
+          <w:b/>
+          <w:bCs/>
+        </w:rPr>
+        <w:t>svg</w:t>
+      </w:r>
+      <w:proofErr w:type="spellEnd"/>
+      <w:r>
+        <w:t xml:space="preserve"> formátumokban.</w:t>
+      </w:r>
+    </w:p>
+    <w:p>
+      <w:pPr>
+        <w:keepNext/>
+      </w:pPr>
+      <w:r>
+        <w:drawing>
+          <wp:inline distT="0" distB="0" distL="0" distR="0" wp14:anchorId="01777348" wp14:editId="5EFE4EC0">
+            <wp:extent cx="5760720" cy="2951480"/>
+            <wp:effectExtent l="0" t="0" r="0" b="1270"/>
+            <wp:docPr id="167297260" name="Kép 1" descr="A képen szöveg, diagram, Műszaki rajz, Téglalap látható&#10;&#10;Előfordulhat, hogy az AI által létrehozott tartalom helytelen."/>
+            <wp:cNvGraphicFramePr>
+              <a:graphicFrameLocks xmlns:a="http://schemas.openxmlformats.org/drawingml/2006/main" noChangeAspect="1"/>
+            </wp:cNvGraphicFramePr>
+            <a:graphic xmlns:a="http://schemas.openxmlformats.org/drawingml/2006/main">
+              <a:graphicData uri="http://schemas.openxmlformats.org/drawingml/2006/picture">
+                <pic:pic xmlns:pic="http://schemas.openxmlformats.org/drawingml/2006/picture">
+                  <pic:nvPicPr>
+                    <pic:cNvPr id="167297260" name="Kép 1" descr="A képen szöveg, diagram, Műszaki rajz, Téglalap látható&#10;&#10;Előfordulhat, hogy az AI által létrehozott tartalom helytelen."/>
+                    <pic:cNvPicPr/>
+                  </pic:nvPicPr>
+                  <pic:blipFill>
+                    <a:blip r:embed="rId12"/>
+                    <a:stretch>
+                      <a:fillRect/>
+                    </a:stretch>
+                  </pic:blipFill>
+                  <pic:spPr>
+                    <a:xfrm>
+                      <a:off x="0" y="0"/>
+                      <a:ext cx="5760720" cy="2951480"/>
+                    </a:xfrm>
+                    <a:prstGeom prst="rect">
+                      <a:avLst/>
+                    </a:prstGeom>
+                  </pic:spPr>
+                </pic:pic>
+              </a:graphicData>
+            </a:graphic>
+          </wp:inline>
+        </w:drawing>
+      </w:r>
+    </w:p>
+    <w:p>
+      <w:pPr>
+        <w:pStyle w:val="Kpalrs"/>
+      </w:pPr>
+      <w:r>
+        <w:fldChar w:fldCharType="begin"/>
+      </w:r>
+      <w:r>
+        <w:instrText xml:space="preserve"> SEQ ábra \* ARABIC </w:instrText>
+      </w:r>
+      <w:r>
+        <w:fldChar w:fldCharType="separate"/>
+      </w:r>
+      <w:r>
+        <w:rPr>
+          <w:noProof/>
+        </w:rPr>
+        <w:t>3</w:t>
+      </w:r>
+      <w:r>
+        <w:fldChar w:fldCharType="end"/>
+      </w:r>
+      <w:r>
+        <w:t xml:space="preserve">. </w:t>
+      </w:r>
+      <w:proofErr w:type="spellStart"/>
+      <w:r>
+        <w:t>Wireframe</w:t>
+      </w:r>
+      <w:proofErr w:type="spellEnd"/>
+    </w:p>
     <w:sectPr>
       <w:pgSz w:w="11906" w:h="16838"/>
       <w:pgMar w:top="1417" w:right="1417" w:bottom="1417" w:left="1417" w:header="708" w:footer="708" w:gutter="0"/>
@@ -1722,6 +2700,232 @@
     </w:lvl>
   </w:abstractNum>
   <w:abstractNum w:abstractNumId="2" w15:restartNumberingAfterBreak="0">
+    <w:nsid w:val="3B283F30"/>
+    <w:multiLevelType w:val="multilevel"/>
+    <w:tmpl w:val="A9606782"/>
+    <w:lvl w:ilvl="0">
+      <w:start w:val="1"/>
+      <w:numFmt w:val="decimal"/>
+      <w:lvlText w:val="%1"/>
+      <w:lvlJc w:val="left"/>
+      <w:pPr>
+        <w:ind w:left="555" w:hanging="555"/>
+      </w:pPr>
+      <w:rPr>
+        <w:rFonts w:hint="default"/>
+      </w:rPr>
+    </w:lvl>
+    <w:lvl w:ilvl="1">
+      <w:start w:val="2"/>
+      <w:numFmt w:val="decimal"/>
+      <w:lvlText w:val="%1.%2"/>
+      <w:lvlJc w:val="left"/>
+      <w:pPr>
+        <w:ind w:left="900" w:hanging="720"/>
+      </w:pPr>
+      <w:rPr>
+        <w:rFonts w:hint="default"/>
+      </w:rPr>
+    </w:lvl>
+    <w:lvl w:ilvl="2">
+      <w:start w:val="2"/>
+      <w:numFmt w:val="decimal"/>
+      <w:lvlText w:val="%1.%2.%3"/>
+      <w:lvlJc w:val="left"/>
+      <w:pPr>
+        <w:ind w:left="1080" w:hanging="720"/>
+      </w:pPr>
+      <w:rPr>
+        <w:rFonts w:hint="default"/>
+      </w:rPr>
+    </w:lvl>
+    <w:lvl w:ilvl="3">
+      <w:start w:val="1"/>
+      <w:numFmt w:val="decimal"/>
+      <w:lvlText w:val="%1.%2.%3.%4"/>
+      <w:lvlJc w:val="left"/>
+      <w:pPr>
+        <w:ind w:left="1620" w:hanging="1080"/>
+      </w:pPr>
+      <w:rPr>
+        <w:rFonts w:hint="default"/>
+      </w:rPr>
+    </w:lvl>
+    <w:lvl w:ilvl="4">
+      <w:start w:val="1"/>
+      <w:numFmt w:val="decimal"/>
+      <w:lvlText w:val="%1.%2.%3.%4.%5"/>
+      <w:lvlJc w:val="left"/>
+      <w:pPr>
+        <w:ind w:left="2160" w:hanging="1440"/>
+      </w:pPr>
+      <w:rPr>
+        <w:rFonts w:hint="default"/>
+      </w:rPr>
+    </w:lvl>
+    <w:lvl w:ilvl="5">
+      <w:start w:val="1"/>
+      <w:numFmt w:val="decimal"/>
+      <w:lvlText w:val="%1.%2.%3.%4.%5.%6"/>
+      <w:lvlJc w:val="left"/>
+      <w:pPr>
+        <w:ind w:left="2700" w:hanging="1800"/>
+      </w:pPr>
+      <w:rPr>
+        <w:rFonts w:hint="default"/>
+      </w:rPr>
+    </w:lvl>
+    <w:lvl w:ilvl="6">
+      <w:start w:val="1"/>
+      <w:numFmt w:val="decimal"/>
+      <w:lvlText w:val="%1.%2.%3.%4.%5.%6.%7"/>
+      <w:lvlJc w:val="left"/>
+      <w:pPr>
+        <w:ind w:left="2880" w:hanging="1800"/>
+      </w:pPr>
+      <w:rPr>
+        <w:rFonts w:hint="default"/>
+      </w:rPr>
+    </w:lvl>
+    <w:lvl w:ilvl="7">
+      <w:start w:val="1"/>
+      <w:numFmt w:val="decimal"/>
+      <w:lvlText w:val="%1.%2.%3.%4.%5.%6.%7.%8"/>
+      <w:lvlJc w:val="left"/>
+      <w:pPr>
+        <w:ind w:left="3420" w:hanging="2160"/>
+      </w:pPr>
+      <w:rPr>
+        <w:rFonts w:hint="default"/>
+      </w:rPr>
+    </w:lvl>
+    <w:lvl w:ilvl="8">
+      <w:start w:val="1"/>
+      <w:numFmt w:val="decimal"/>
+      <w:lvlText w:val="%1.%2.%3.%4.%5.%6.%7.%8.%9"/>
+      <w:lvlJc w:val="left"/>
+      <w:pPr>
+        <w:ind w:left="3960" w:hanging="2520"/>
+      </w:pPr>
+      <w:rPr>
+        <w:rFonts w:hint="default"/>
+      </w:rPr>
+    </w:lvl>
+  </w:abstractNum>
+  <w:abstractNum w:abstractNumId="3" w15:restartNumberingAfterBreak="0">
+    <w:nsid w:val="522D4035"/>
+    <w:multiLevelType w:val="multilevel"/>
+    <w:tmpl w:val="A9606782"/>
+    <w:lvl w:ilvl="0">
+      <w:start w:val="1"/>
+      <w:numFmt w:val="decimal"/>
+      <w:lvlText w:val="%1"/>
+      <w:lvlJc w:val="left"/>
+      <w:pPr>
+        <w:ind w:left="555" w:hanging="555"/>
+      </w:pPr>
+      <w:rPr>
+        <w:rFonts w:hint="default"/>
+      </w:rPr>
+    </w:lvl>
+    <w:lvl w:ilvl="1">
+      <w:start w:val="2"/>
+      <w:numFmt w:val="decimal"/>
+      <w:lvlText w:val="%1.%2"/>
+      <w:lvlJc w:val="left"/>
+      <w:pPr>
+        <w:ind w:left="900" w:hanging="720"/>
+      </w:pPr>
+      <w:rPr>
+        <w:rFonts w:hint="default"/>
+      </w:rPr>
+    </w:lvl>
+    <w:lvl w:ilvl="2">
+      <w:start w:val="2"/>
+      <w:numFmt w:val="decimal"/>
+      <w:lvlText w:val="%1.%2.%3"/>
+      <w:lvlJc w:val="left"/>
+      <w:pPr>
+        <w:ind w:left="1080" w:hanging="720"/>
+      </w:pPr>
+      <w:rPr>
+        <w:rFonts w:hint="default"/>
+      </w:rPr>
+    </w:lvl>
+    <w:lvl w:ilvl="3">
+      <w:start w:val="1"/>
+      <w:numFmt w:val="decimal"/>
+      <w:lvlText w:val="%1.%2.%3.%4"/>
+      <w:lvlJc w:val="left"/>
+      <w:pPr>
+        <w:ind w:left="1620" w:hanging="1080"/>
+      </w:pPr>
+      <w:rPr>
+        <w:rFonts w:hint="default"/>
+      </w:rPr>
+    </w:lvl>
+    <w:lvl w:ilvl="4">
+      <w:start w:val="1"/>
+      <w:numFmt w:val="decimal"/>
+      <w:lvlText w:val="%1.%2.%3.%4.%5"/>
+      <w:lvlJc w:val="left"/>
+      <w:pPr>
+        <w:ind w:left="2160" w:hanging="1440"/>
+      </w:pPr>
+      <w:rPr>
+        <w:rFonts w:hint="default"/>
+      </w:rPr>
+    </w:lvl>
+    <w:lvl w:ilvl="5">
+      <w:start w:val="1"/>
+      <w:numFmt w:val="decimal"/>
+      <w:lvlText w:val="%1.%2.%3.%4.%5.%6"/>
+      <w:lvlJc w:val="left"/>
+      <w:pPr>
+        <w:ind w:left="2700" w:hanging="1800"/>
+      </w:pPr>
+      <w:rPr>
+        <w:rFonts w:hint="default"/>
+      </w:rPr>
+    </w:lvl>
+    <w:lvl w:ilvl="6">
+      <w:start w:val="1"/>
+      <w:numFmt w:val="decimal"/>
+      <w:lvlText w:val="%1.%2.%3.%4.%5.%6.%7"/>
+      <w:lvlJc w:val="left"/>
+      <w:pPr>
+        <w:ind w:left="2880" w:hanging="1800"/>
+      </w:pPr>
+      <w:rPr>
+        <w:rFonts w:hint="default"/>
+      </w:rPr>
+    </w:lvl>
+    <w:lvl w:ilvl="7">
+      <w:start w:val="1"/>
+      <w:numFmt w:val="decimal"/>
+      <w:lvlText w:val="%1.%2.%3.%4.%5.%6.%7.%8"/>
+      <w:lvlJc w:val="left"/>
+      <w:pPr>
+        <w:ind w:left="3420" w:hanging="2160"/>
+      </w:pPr>
+      <w:rPr>
+        <w:rFonts w:hint="default"/>
+      </w:rPr>
+    </w:lvl>
+    <w:lvl w:ilvl="8">
+      <w:start w:val="1"/>
+      <w:numFmt w:val="decimal"/>
+      <w:lvlText w:val="%1.%2.%3.%4.%5.%6.%7.%8.%9"/>
+      <w:lvlJc w:val="left"/>
+      <w:pPr>
+        <w:ind w:left="3960" w:hanging="2520"/>
+      </w:pPr>
+      <w:rPr>
+        <w:rFonts w:hint="default"/>
+      </w:rPr>
+    </w:lvl>
+  </w:abstractNum>
+  <w:abstractNum w:abstractNumId="4" w15:restartNumberingAfterBreak="0">
     <w:nsid w:val="53175545"/>
     <w:multiLevelType w:val="multilevel"/>
     <w:tmpl w:val="38B018D0"/>
@@ -1842,7 +3046,7 @@
       </w:rPr>
     </w:lvl>
   </w:abstractNum>
-  <w:abstractNum w:abstractNumId="3" w15:restartNumberingAfterBreak="0">
+  <w:abstractNum w:abstractNumId="5" w15:restartNumberingAfterBreak="0">
     <w:nsid w:val="69EA7AEF"/>
     <w:multiLevelType w:val="hybridMultilevel"/>
     <w:tmpl w:val="0D722DFC"/>
@@ -1932,13 +3136,19 @@
     <w:abstractNumId w:val="0"/>
   </w:num>
   <w:num w:numId="2" w16cid:durableId="1294484620">
-    <w:abstractNumId w:val="3"/>
+    <w:abstractNumId w:val="5"/>
   </w:num>
   <w:num w:numId="3" w16cid:durableId="109859399">
-    <w:abstractNumId w:val="2"/>
+    <w:abstractNumId w:val="4"/>
   </w:num>
   <w:num w:numId="4" w16cid:durableId="2064984734">
     <w:abstractNumId w:val="1"/>
+  </w:num>
+  <w:num w:numId="5" w16cid:durableId="775255097">
+    <w:abstractNumId w:val="2"/>
+  </w:num>
+  <w:num w:numId="6" w16cid:durableId="1162816396">
+    <w:abstractNumId w:val="3"/>
   </w:num>
 </w:numbering>
 </file>
@@ -2545,7 +3755,6 @@
   <w:style w:type="character" w:default="1" w:styleId="Bekezdsalapbettpusa">
     <w:name w:val="Default Paragraph Font"/>
     <w:uiPriority w:val="1"/>
-    <w:semiHidden/>
     <w:unhideWhenUsed/>
   </w:style>
   <w:style w:type="table" w:default="1" w:styleId="Normltblzat">
@@ -2966,7 +4175,7 @@
     <w:link w:val="BekezdsekChar"/>
     <w:autoRedefine/>
     <w:qFormat/>
-    <w:rsid w:val="00D73700"/>
+    <w:rsid w:val="002C34C3"/>
     <w:pPr>
       <w:spacing w:line="240" w:lineRule="auto"/>
       <w:ind w:firstLine="567"/>
@@ -2980,9 +4189,65 @@
     <w:name w:val="Bekezdések Char"/>
     <w:basedOn w:val="Bekezdsalapbettpusa"/>
     <w:link w:val="Bekezdsek"/>
-    <w:rsid w:val="00D73700"/>
+    <w:rsid w:val="002C34C3"/>
     <w:rPr>
       <w:rFonts w:ascii="Montserrat" w:hAnsi="Montserrat"/>
+    </w:rPr>
+  </w:style>
+  <w:style w:type="paragraph" w:styleId="Kpalrs">
+    <w:name w:val="caption"/>
+    <w:basedOn w:val="Norml"/>
+    <w:next w:val="Norml"/>
+    <w:link w:val="KpalrsChar"/>
+    <w:uiPriority w:val="35"/>
+    <w:unhideWhenUsed/>
+    <w:qFormat/>
+    <w:rsid w:val="002C34C3"/>
+    <w:pPr>
+      <w:spacing w:after="200" w:line="240" w:lineRule="auto"/>
+    </w:pPr>
+    <w:rPr>
+      <w:rFonts w:ascii="Montserrat" w:hAnsi="Montserrat"/>
+      <w:i/>
+      <w:iCs/>
+      <w:color w:val="5D28FE"/>
+      <w:sz w:val="18"/>
+      <w:szCs w:val="18"/>
+    </w:rPr>
+  </w:style>
+  <w:style w:type="paragraph" w:customStyle="1" w:styleId="Kpalrs0">
+    <w:name w:val="_Képaláírás"/>
+    <w:basedOn w:val="Kpalrs"/>
+    <w:link w:val="KpalrsChar0"/>
+    <w:rsid w:val="002C34C3"/>
+  </w:style>
+  <w:style w:type="character" w:customStyle="1" w:styleId="KpalrsChar">
+    <w:name w:val="Képaláírás Char"/>
+    <w:basedOn w:val="Bekezdsalapbettpusa"/>
+    <w:link w:val="Kpalrs"/>
+    <w:uiPriority w:val="35"/>
+    <w:rsid w:val="002C34C3"/>
+    <w:rPr>
+      <w:rFonts w:ascii="Montserrat" w:hAnsi="Montserrat"/>
+      <w:i/>
+      <w:iCs/>
+      <w:color w:val="5D28FE"/>
+      <w:sz w:val="18"/>
+      <w:szCs w:val="18"/>
+    </w:rPr>
+  </w:style>
+  <w:style w:type="character" w:customStyle="1" w:styleId="KpalrsChar0">
+    <w:name w:val="_Képaláírás Char"/>
+    <w:basedOn w:val="KpalrsChar"/>
+    <w:link w:val="Kpalrs0"/>
+    <w:rsid w:val="002C34C3"/>
+    <w:rPr>
+      <w:rFonts w:ascii="Montserrat" w:hAnsi="Montserrat"/>
+      <w:i/>
+      <w:iCs/>
+      <w:color w:val="5D28FE"/>
+      <w:sz w:val="18"/>
+      <w:szCs w:val="18"/>
     </w:rPr>
   </w:style>
 </w:styles>

</xml_diff>

<commit_message>
Improved the documentation and swapped the images with the new ones
</commit_message>
<xml_diff>
--- a/documentation/documentation.docx
+++ b/documentation/documentation.docx
@@ -7,78 +7,466 @@
         <w:rPr>
           <w:noProof/>
         </w:rPr>
-        <w:drawing>
-          <wp:anchor distT="0" distB="0" distL="114300" distR="114300" simplePos="0" relativeHeight="251666432" behindDoc="0" locked="0" layoutInCell="1" allowOverlap="1" wp14:anchorId="0953EADF" wp14:editId="7DFEA372">
-            <wp:simplePos x="0" y="0"/>
-            <wp:positionH relativeFrom="page">
-              <wp:posOffset>3600450</wp:posOffset>
-            </wp:positionH>
-            <wp:positionV relativeFrom="paragraph">
-              <wp:posOffset>547370</wp:posOffset>
-            </wp:positionV>
-            <wp:extent cx="2545200" cy="2545200"/>
-            <wp:effectExtent l="0" t="0" r="0" b="0"/>
-            <wp:wrapNone/>
-            <wp:docPr id="309679547" name="Ábra 4"/>
-            <wp:cNvGraphicFramePr>
-              <a:graphicFrameLocks xmlns:a="http://schemas.openxmlformats.org/drawingml/2006/main" noChangeAspect="1"/>
-            </wp:cNvGraphicFramePr>
-            <a:graphic xmlns:a="http://schemas.openxmlformats.org/drawingml/2006/main">
-              <a:graphicData uri="http://schemas.openxmlformats.org/drawingml/2006/picture">
-                <pic:pic xmlns:pic="http://schemas.openxmlformats.org/drawingml/2006/picture">
-                  <pic:nvPicPr>
-                    <pic:cNvPr id="309679547" name="Ábra 309679547"/>
-                    <pic:cNvPicPr/>
-                  </pic:nvPicPr>
-                  <pic:blipFill>
-                    <a:blip r:embed="rId6">
-                      <a:extLst>
-                        <a:ext uri="{96DAC541-7B7A-43D3-8B79-37D633B846F1}">
-                          <asvg:svgBlip xmlns:asvg="http://schemas.microsoft.com/office/drawing/2016/SVG/main" r:embed="rId7"/>
-                        </a:ext>
-                      </a:extLst>
-                    </a:blip>
-                    <a:stretch>
-                      <a:fillRect/>
-                    </a:stretch>
-                  </pic:blipFill>
-                  <pic:spPr>
-                    <a:xfrm>
-                      <a:off x="0" y="0"/>
-                      <a:ext cx="2545200" cy="2545200"/>
-                    </a:xfrm>
-                    <a:prstGeom prst="rect">
-                      <a:avLst/>
-                    </a:prstGeom>
-                  </pic:spPr>
-                </pic:pic>
-              </a:graphicData>
-            </a:graphic>
-            <wp14:sizeRelH relativeFrom="margin">
-              <wp14:pctWidth>0</wp14:pctWidth>
-            </wp14:sizeRelH>
-            <wp14:sizeRelV relativeFrom="margin">
-              <wp14:pctHeight>0</wp14:pctHeight>
-            </wp14:sizeRelV>
-          </wp:anchor>
-        </w:drawing>
-      </w:r>
-      <w:r>
-        <w:rPr>
-          <w:noProof/>
-        </w:rPr>
         <mc:AlternateContent>
           <mc:Choice Requires="wps">
             <w:drawing>
-              <wp:anchor distT="45720" distB="45720" distL="114300" distR="114300" simplePos="0" relativeHeight="251661312" behindDoc="0" locked="0" layoutInCell="1" allowOverlap="1" wp14:anchorId="5083EA60" wp14:editId="5FA63E6D">
+              <wp:anchor distT="45720" distB="45720" distL="114300" distR="114300" simplePos="0" relativeHeight="251663360" behindDoc="1" locked="0" layoutInCell="1" allowOverlap="1" wp14:anchorId="3783ECA1" wp14:editId="3D289DA6">
+                <wp:simplePos x="0" y="0"/>
+                <wp:positionH relativeFrom="margin">
+                  <wp:posOffset>1224280</wp:posOffset>
+                </wp:positionH>
+                <wp:positionV relativeFrom="paragraph">
+                  <wp:posOffset>5396231</wp:posOffset>
+                </wp:positionV>
+                <wp:extent cx="5076825" cy="2971800"/>
+                <wp:effectExtent l="0" t="0" r="0" b="0"/>
+                <wp:wrapNone/>
+                <wp:docPr id="2" name="Text Box 2"/>
+                <wp:cNvGraphicFramePr>
+                  <a:graphicFrameLocks xmlns:a="http://schemas.openxmlformats.org/drawingml/2006/main"/>
+                </wp:cNvGraphicFramePr>
+                <a:graphic xmlns:a="http://schemas.openxmlformats.org/drawingml/2006/main">
+                  <a:graphicData uri="http://schemas.microsoft.com/office/word/2010/wordprocessingShape">
+                    <wps:wsp>
+                      <wps:cNvSpPr txBox="1">
+                        <a:spLocks noChangeArrowheads="1"/>
+                      </wps:cNvSpPr>
+                      <wps:spPr bwMode="auto">
+                        <a:xfrm>
+                          <a:off x="0" y="0"/>
+                          <a:ext cx="5076825" cy="2971800"/>
+                        </a:xfrm>
+                        <a:prstGeom prst="rect">
+                          <a:avLst/>
+                        </a:prstGeom>
+                        <a:noFill/>
+                        <a:ln w="9525">
+                          <a:noFill/>
+                          <a:miter lim="800000"/>
+                          <a:headEnd/>
+                          <a:tailEnd/>
+                        </a:ln>
+                      </wps:spPr>
+                      <wps:txbx>
+                        <w:txbxContent>
+                          <w:p>
+                            <w:pPr>
+                              <w:jc w:val="right"/>
+                              <w:rPr>
+                                <w:rFonts w:ascii="Montserrat" w:hAnsi="Montserrat" w:cs="Arial"/>
+                                <w:color w:val="000000" w:themeColor="text1"/>
+                                <w:sz w:val="30"/>
+                                <w:szCs w:val="30"/>
+                              </w:rPr>
+                            </w:pPr>
+                            <w:r>
+                              <w:rPr>
+                                <w:rFonts w:ascii="Montserrat" w:hAnsi="Montserrat" w:cs="Arial"/>
+                                <w:b/>
+                                <w:bCs/>
+                                <w:color w:val="5D28FE"/>
+                                <w:sz w:val="30"/>
+                                <w:szCs w:val="30"/>
+                              </w:rPr>
+                              <w:t>Készítette:</w:t>
+                            </w:r>
+                            <w:r>
+                              <w:rPr>
+                                <w:rFonts w:ascii="Montserrat" w:hAnsi="Montserrat" w:cs="Arial"/>
+                                <w:color w:val="000000" w:themeColor="text1"/>
+                                <w:sz w:val="30"/>
+                                <w:szCs w:val="30"/>
+                              </w:rPr>
+                              <w:t xml:space="preserve"> Nagy Ákos és Bernáth Ábel</w:t>
+                            </w:r>
+                          </w:p>
+                          <w:p>
+                            <w:pPr>
+                              <w:jc w:val="right"/>
+                              <w:rPr>
+                                <w:rFonts w:ascii="Montserrat" w:hAnsi="Montserrat" w:cs="Arial"/>
+                                <w:color w:val="000000" w:themeColor="text1"/>
+                                <w:sz w:val="30"/>
+                                <w:szCs w:val="30"/>
+                              </w:rPr>
+                            </w:pPr>
+                          </w:p>
+                          <w:p>
+                            <w:pPr>
+                              <w:jc w:val="right"/>
+                              <w:rPr>
+                                <w:rFonts w:ascii="Montserrat" w:hAnsi="Montserrat" w:cs="Arial"/>
+                                <w:b/>
+                                <w:bCs/>
+                                <w:color w:val="5D28FE"/>
+                                <w:sz w:val="30"/>
+                                <w:szCs w:val="30"/>
+                              </w:rPr>
+                            </w:pPr>
+                            <w:r>
+                              <w:rPr>
+                                <w:rFonts w:ascii="Montserrat" w:hAnsi="Montserrat" w:cs="Arial"/>
+                                <w:b/>
+                                <w:bCs/>
+                                <w:color w:val="5D28FE"/>
+                                <w:sz w:val="30"/>
+                                <w:szCs w:val="30"/>
+                              </w:rPr>
+                              <w:t>Felkészítő tanárok neve:</w:t>
+                            </w:r>
+                          </w:p>
+                          <w:p>
+                            <w:pPr>
+                              <w:jc w:val="right"/>
+                              <w:rPr>
+                                <w:rFonts w:ascii="Montserrat" w:hAnsi="Montserrat" w:cs="Arial"/>
+                                <w:color w:val="000000" w:themeColor="text1"/>
+                                <w:sz w:val="30"/>
+                                <w:szCs w:val="30"/>
+                              </w:rPr>
+                            </w:pPr>
+                            <w:r>
+                              <w:rPr>
+                                <w:rFonts w:ascii="Montserrat" w:hAnsi="Montserrat" w:cs="Arial"/>
+                                <w:color w:val="000000" w:themeColor="text1"/>
+                                <w:sz w:val="30"/>
+                                <w:szCs w:val="30"/>
+                              </w:rPr>
+                              <w:t>Barta András Gábor</w:t>
+                            </w:r>
+                          </w:p>
+                          <w:p>
+                            <w:pPr>
+                              <w:jc w:val="right"/>
+                              <w:rPr>
+                                <w:rFonts w:ascii="Montserrat" w:hAnsi="Montserrat" w:cs="Arial"/>
+                                <w:color w:val="000000" w:themeColor="text1"/>
+                                <w:sz w:val="30"/>
+                                <w:szCs w:val="30"/>
+                              </w:rPr>
+                            </w:pPr>
+                            <w:r>
+                              <w:rPr>
+                                <w:rFonts w:ascii="Montserrat" w:hAnsi="Montserrat" w:cs="Arial"/>
+                                <w:color w:val="000000" w:themeColor="text1"/>
+                                <w:sz w:val="30"/>
+                                <w:szCs w:val="30"/>
+                              </w:rPr>
+                              <w:t>Wilhelm Zsolt Ádám</w:t>
+                            </w:r>
+                          </w:p>
+                          <w:p>
+                            <w:pPr>
+                              <w:jc w:val="right"/>
+                              <w:rPr>
+                                <w:rFonts w:ascii="Montserrat" w:hAnsi="Montserrat" w:cs="Arial"/>
+                                <w:color w:val="000000" w:themeColor="text1"/>
+                                <w:sz w:val="30"/>
+                                <w:szCs w:val="30"/>
+                              </w:rPr>
+                            </w:pPr>
+                            <w:r>
+                              <w:rPr>
+                                <w:rFonts w:ascii="Montserrat" w:hAnsi="Montserrat" w:cs="Arial"/>
+                                <w:color w:val="000000" w:themeColor="text1"/>
+                                <w:sz w:val="30"/>
+                                <w:szCs w:val="30"/>
+                              </w:rPr>
+                              <w:t>Tóth Szilárd Attila</w:t>
+                            </w:r>
+                          </w:p>
+                          <w:p>
+                            <w:pPr>
+                              <w:jc w:val="right"/>
+                              <w:rPr>
+                                <w:rFonts w:ascii="Montserrat" w:hAnsi="Montserrat" w:cs="Arial"/>
+                                <w:color w:val="000000" w:themeColor="text1"/>
+                                <w:sz w:val="30"/>
+                                <w:szCs w:val="30"/>
+                              </w:rPr>
+                            </w:pPr>
+                          </w:p>
+                          <w:p>
+                            <w:pPr>
+                              <w:jc w:val="right"/>
+                              <w:rPr>
+                                <w:rFonts w:ascii="Montserrat" w:hAnsi="Montserrat" w:cs="Arial"/>
+                                <w:b/>
+                                <w:bCs/>
+                                <w:color w:val="5D28FE"/>
+                                <w:sz w:val="30"/>
+                                <w:szCs w:val="30"/>
+                              </w:rPr>
+                            </w:pPr>
+                            <w:r>
+                              <w:rPr>
+                                <w:rFonts w:ascii="Montserrat" w:hAnsi="Montserrat" w:cs="Arial"/>
+                                <w:b/>
+                                <w:bCs/>
+                                <w:color w:val="5D28FE"/>
+                                <w:sz w:val="30"/>
+                                <w:szCs w:val="30"/>
+                              </w:rPr>
+                              <w:t>2</w:t>
+                            </w:r>
+                            <w:r>
+                              <w:rPr>
+                                <w:rFonts w:ascii="Montserrat" w:hAnsi="Montserrat" w:cs="Arial"/>
+                                <w:b/>
+                                <w:bCs/>
+                                <w:color w:val="5D28FE"/>
+                                <w:sz w:val="30"/>
+                                <w:szCs w:val="30"/>
+                                <w:lang w:val="en-US"/>
+                              </w:rPr>
+                              <w:t>025</w:t>
+                            </w:r>
+                            <w:r>
+                              <w:rPr>
+                                <w:rFonts w:ascii="Montserrat" w:hAnsi="Montserrat" w:cs="Arial"/>
+                                <w:b/>
+                                <w:bCs/>
+                                <w:color w:val="5D28FE"/>
+                                <w:sz w:val="30"/>
+                                <w:szCs w:val="30"/>
+                              </w:rPr>
+                              <w:t>-26</w:t>
+                            </w:r>
+                          </w:p>
+                        </w:txbxContent>
+                      </wps:txbx>
+                      <wps:bodyPr rot="0" vert="horz" wrap="square" lIns="91440" tIns="45720" rIns="91440" bIns="45720" anchor="t" anchorCtr="0">
+                        <a:noAutofit/>
+                      </wps:bodyPr>
+                    </wps:wsp>
+                  </a:graphicData>
+                </a:graphic>
+                <wp14:sizeRelH relativeFrom="margin">
+                  <wp14:pctWidth>0</wp14:pctWidth>
+                </wp14:sizeRelH>
+                <wp14:sizeRelV relativeFrom="margin">
+                  <wp14:pctHeight>0</wp14:pctHeight>
+                </wp14:sizeRelV>
+              </wp:anchor>
+            </w:drawing>
+          </mc:Choice>
+          <mc:Fallback>
+            <w:pict>
+              <v:shapetype w14:anchorId="3783ECA1" id="_x0000_t202" coordsize="21600,21600" o:spt="202" path="m,l,21600r21600,l21600,xe">
+                <v:stroke joinstyle="miter"/>
+                <v:path gradientshapeok="t" o:connecttype="rect"/>
+              </v:shapetype>
+              <v:shape id="Text Box 2" o:spid="_x0000_s1026" type="#_x0000_t202" style="position:absolute;margin-left:96.4pt;margin-top:424.9pt;width:399.75pt;height:234pt;z-index:-251653120;visibility:visible;mso-wrap-style:square;mso-width-percent:0;mso-height-percent:0;mso-wrap-distance-left:9pt;mso-wrap-distance-top:3.6pt;mso-wrap-distance-right:9pt;mso-wrap-distance-bottom:3.6pt;mso-position-horizontal:absolute;mso-position-horizontal-relative:margin;mso-position-vertical:absolute;mso-position-vertical-relative:text;mso-width-percent:0;mso-height-percent:0;mso-width-relative:margin;mso-height-relative:margin;v-text-anchor:top" o:gfxdata="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" filled="f" stroked="f">
+                <v:textbox>
+                  <w:txbxContent>
+                    <w:p>
+                      <w:pPr>
+                        <w:jc w:val="right"/>
+                        <w:rPr>
+                          <w:rFonts w:ascii="Montserrat" w:hAnsi="Montserrat" w:cs="Arial"/>
+                          <w:color w:val="000000" w:themeColor="text1"/>
+                          <w:sz w:val="30"/>
+                          <w:szCs w:val="30"/>
+                        </w:rPr>
+                      </w:pPr>
+                      <w:r>
+                        <w:rPr>
+                          <w:rFonts w:ascii="Montserrat" w:hAnsi="Montserrat" w:cs="Arial"/>
+                          <w:b/>
+                          <w:bCs/>
+                          <w:color w:val="5D28FE"/>
+                          <w:sz w:val="30"/>
+                          <w:szCs w:val="30"/>
+                        </w:rPr>
+                        <w:t>Készítette:</w:t>
+                      </w:r>
+                      <w:r>
+                        <w:rPr>
+                          <w:rFonts w:ascii="Montserrat" w:hAnsi="Montserrat" w:cs="Arial"/>
+                          <w:color w:val="000000" w:themeColor="text1"/>
+                          <w:sz w:val="30"/>
+                          <w:szCs w:val="30"/>
+                        </w:rPr>
+                        <w:t xml:space="preserve"> Nagy Ákos és Bernáth Ábel</w:t>
+                      </w:r>
+                    </w:p>
+                    <w:p>
+                      <w:pPr>
+                        <w:jc w:val="right"/>
+                        <w:rPr>
+                          <w:rFonts w:ascii="Montserrat" w:hAnsi="Montserrat" w:cs="Arial"/>
+                          <w:color w:val="000000" w:themeColor="text1"/>
+                          <w:sz w:val="30"/>
+                          <w:szCs w:val="30"/>
+                        </w:rPr>
+                      </w:pPr>
+                    </w:p>
+                    <w:p>
+                      <w:pPr>
+                        <w:jc w:val="right"/>
+                        <w:rPr>
+                          <w:rFonts w:ascii="Montserrat" w:hAnsi="Montserrat" w:cs="Arial"/>
+                          <w:b/>
+                          <w:bCs/>
+                          <w:color w:val="5D28FE"/>
+                          <w:sz w:val="30"/>
+                          <w:szCs w:val="30"/>
+                        </w:rPr>
+                      </w:pPr>
+                      <w:r>
+                        <w:rPr>
+                          <w:rFonts w:ascii="Montserrat" w:hAnsi="Montserrat" w:cs="Arial"/>
+                          <w:b/>
+                          <w:bCs/>
+                          <w:color w:val="5D28FE"/>
+                          <w:sz w:val="30"/>
+                          <w:szCs w:val="30"/>
+                        </w:rPr>
+                        <w:t>Felkészítő tanárok neve:</w:t>
+                      </w:r>
+                    </w:p>
+                    <w:p>
+                      <w:pPr>
+                        <w:jc w:val="right"/>
+                        <w:rPr>
+                          <w:rFonts w:ascii="Montserrat" w:hAnsi="Montserrat" w:cs="Arial"/>
+                          <w:color w:val="000000" w:themeColor="text1"/>
+                          <w:sz w:val="30"/>
+                          <w:szCs w:val="30"/>
+                        </w:rPr>
+                      </w:pPr>
+                      <w:r>
+                        <w:rPr>
+                          <w:rFonts w:ascii="Montserrat" w:hAnsi="Montserrat" w:cs="Arial"/>
+                          <w:color w:val="000000" w:themeColor="text1"/>
+                          <w:sz w:val="30"/>
+                          <w:szCs w:val="30"/>
+                        </w:rPr>
+                        <w:t>Barta András Gábor</w:t>
+                      </w:r>
+                    </w:p>
+                    <w:p>
+                      <w:pPr>
+                        <w:jc w:val="right"/>
+                        <w:rPr>
+                          <w:rFonts w:ascii="Montserrat" w:hAnsi="Montserrat" w:cs="Arial"/>
+                          <w:color w:val="000000" w:themeColor="text1"/>
+                          <w:sz w:val="30"/>
+                          <w:szCs w:val="30"/>
+                        </w:rPr>
+                      </w:pPr>
+                      <w:r>
+                        <w:rPr>
+                          <w:rFonts w:ascii="Montserrat" w:hAnsi="Montserrat" w:cs="Arial"/>
+                          <w:color w:val="000000" w:themeColor="text1"/>
+                          <w:sz w:val="30"/>
+                          <w:szCs w:val="30"/>
+                        </w:rPr>
+                        <w:t>Wilhelm Zsolt Ádám</w:t>
+                      </w:r>
+                    </w:p>
+                    <w:p>
+                      <w:pPr>
+                        <w:jc w:val="right"/>
+                        <w:rPr>
+                          <w:rFonts w:ascii="Montserrat" w:hAnsi="Montserrat" w:cs="Arial"/>
+                          <w:color w:val="000000" w:themeColor="text1"/>
+                          <w:sz w:val="30"/>
+                          <w:szCs w:val="30"/>
+                        </w:rPr>
+                      </w:pPr>
+                      <w:r>
+                        <w:rPr>
+                          <w:rFonts w:ascii="Montserrat" w:hAnsi="Montserrat" w:cs="Arial"/>
+                          <w:color w:val="000000" w:themeColor="text1"/>
+                          <w:sz w:val="30"/>
+                          <w:szCs w:val="30"/>
+                        </w:rPr>
+                        <w:t>Tóth Szilárd Attila</w:t>
+                      </w:r>
+                    </w:p>
+                    <w:p>
+                      <w:pPr>
+                        <w:jc w:val="right"/>
+                        <w:rPr>
+                          <w:rFonts w:ascii="Montserrat" w:hAnsi="Montserrat" w:cs="Arial"/>
+                          <w:color w:val="000000" w:themeColor="text1"/>
+                          <w:sz w:val="30"/>
+                          <w:szCs w:val="30"/>
+                        </w:rPr>
+                      </w:pPr>
+                    </w:p>
+                    <w:p>
+                      <w:pPr>
+                        <w:jc w:val="right"/>
+                        <w:rPr>
+                          <w:rFonts w:ascii="Montserrat" w:hAnsi="Montserrat" w:cs="Arial"/>
+                          <w:b/>
+                          <w:bCs/>
+                          <w:color w:val="5D28FE"/>
+                          <w:sz w:val="30"/>
+                          <w:szCs w:val="30"/>
+                        </w:rPr>
+                      </w:pPr>
+                      <w:r>
+                        <w:rPr>
+                          <w:rFonts w:ascii="Montserrat" w:hAnsi="Montserrat" w:cs="Arial"/>
+                          <w:b/>
+                          <w:bCs/>
+                          <w:color w:val="5D28FE"/>
+                          <w:sz w:val="30"/>
+                          <w:szCs w:val="30"/>
+                        </w:rPr>
+                        <w:t>2</w:t>
+                      </w:r>
+                      <w:r>
+                        <w:rPr>
+                          <w:rFonts w:ascii="Montserrat" w:hAnsi="Montserrat" w:cs="Arial"/>
+                          <w:b/>
+                          <w:bCs/>
+                          <w:color w:val="5D28FE"/>
+                          <w:sz w:val="30"/>
+                          <w:szCs w:val="30"/>
+                          <w:lang w:val="en-US"/>
+                        </w:rPr>
+                        <w:t>025</w:t>
+                      </w:r>
+                      <w:r>
+                        <w:rPr>
+                          <w:rFonts w:ascii="Montserrat" w:hAnsi="Montserrat" w:cs="Arial"/>
+                          <w:b/>
+                          <w:bCs/>
+                          <w:color w:val="5D28FE"/>
+                          <w:sz w:val="30"/>
+                          <w:szCs w:val="30"/>
+                        </w:rPr>
+                        <w:t>-26</w:t>
+                      </w:r>
+                    </w:p>
+                  </w:txbxContent>
+                </v:textbox>
+                <w10:wrap anchorx="margin"/>
+              </v:shape>
+            </w:pict>
+          </mc:Fallback>
+        </mc:AlternateContent>
+      </w:r>
+      <w:r>
+        <w:rPr>
+          <w:noProof/>
+        </w:rPr>
+        <mc:AlternateContent>
+          <mc:Choice Requires="wps">
+            <w:drawing>
+              <wp:anchor distT="45720" distB="45720" distL="114300" distR="114300" simplePos="0" relativeHeight="251661312" behindDoc="0" locked="0" layoutInCell="1" allowOverlap="1" wp14:anchorId="5083EA60" wp14:editId="327BD9FE">
                 <wp:simplePos x="0" y="0"/>
                 <wp:positionH relativeFrom="column">
-                  <wp:posOffset>1440180</wp:posOffset>
+                  <wp:posOffset>1357630</wp:posOffset>
                 </wp:positionH>
                 <wp:positionV relativeFrom="paragraph">
-                  <wp:posOffset>3463925</wp:posOffset>
+                  <wp:posOffset>3462655</wp:posOffset>
                 </wp:positionV>
-                <wp:extent cx="5133600" cy="2077200"/>
+                <wp:extent cx="5219065" cy="2077085"/>
                 <wp:effectExtent l="0" t="0" r="0" b="0"/>
                 <wp:wrapSquare wrapText="bothSides"/>
                 <wp:docPr id="1" name="Text Box 2"/>
@@ -94,7 +482,7 @@
                       <wps:spPr bwMode="auto">
                         <a:xfrm>
                           <a:off x="0" y="0"/>
-                          <a:ext cx="5133600" cy="2077200"/>
+                          <a:ext cx="5219065" cy="2077085"/>
                         </a:xfrm>
                         <a:prstGeom prst="rect">
                           <a:avLst/>
@@ -155,7 +543,34 @@
                                 <w:sz w:val="96"/>
                                 <w:szCs w:val="96"/>
                               </w:rPr>
-                              <w:t>zene-streaming</w:t>
+                              <w:t>Z</w:t>
+                            </w:r>
+                            <w:r>
+                              <w:rPr>
+                                <w:rFonts w:ascii="Montserrat" w:hAnsi="Montserrat" w:cs="Arial"/>
+                                <w:color w:val="000000" w:themeColor="text1"/>
+                                <w:sz w:val="96"/>
+                                <w:szCs w:val="96"/>
+                              </w:rPr>
+                              <w:t>ene-</w:t>
+                            </w:r>
+                            <w:r>
+                              <w:rPr>
+                                <w:rFonts w:ascii="Montserrat" w:hAnsi="Montserrat" w:cs="Arial"/>
+                                <w:color w:val="000000" w:themeColor="text1"/>
+                                <w:sz w:val="96"/>
+                                <w:szCs w:val="96"/>
+                              </w:rPr>
+                              <w:t>S</w:t>
+                            </w:r>
+                            <w:r>
+                              <w:rPr>
+                                <w:rFonts w:ascii="Montserrat" w:hAnsi="Montserrat" w:cs="Arial"/>
+                                <w:color w:val="000000" w:themeColor="text1"/>
+                                <w:sz w:val="96"/>
+                                <w:szCs w:val="96"/>
+                              </w:rPr>
+                              <w:t>treaming</w:t>
                             </w:r>
                           </w:p>
                         </w:txbxContent>
@@ -177,11 +592,7 @@
           </mc:Choice>
           <mc:Fallback>
             <w:pict>
-              <v:shapetype w14:anchorId="5083EA60" id="_x0000_t202" coordsize="21600,21600" o:spt="202" path="m,l,21600r21600,l21600,xe">
-                <v:stroke joinstyle="miter"/>
-                <v:path gradientshapeok="t" o:connecttype="rect"/>
-              </v:shapetype>
-              <v:shape id="Text Box 2" o:spid="_x0000_s1026" type="#_x0000_t202" style="position:absolute;margin-left:113.4pt;margin-top:272.75pt;width:404.2pt;height:163.55pt;z-index:251661312;visibility:visible;mso-wrap-style:square;mso-width-percent:0;mso-height-percent:0;mso-wrap-distance-left:9pt;mso-wrap-distance-top:3.6pt;mso-wrap-distance-right:9pt;mso-wrap-distance-bottom:3.6pt;mso-position-horizontal:absolute;mso-position-horizontal-relative:text;mso-position-vertical:absolute;mso-position-vertical-relative:text;mso-width-percent:0;mso-height-percent:0;mso-width-relative:margin;mso-height-relative:margin;v-text-anchor:top" o:gfxdata="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" filled="f" stroked="f">
+              <v:shape w14:anchorId="5083EA60" id="_x0000_s1027" type="#_x0000_t202" style="position:absolute;margin-left:106.9pt;margin-top:272.65pt;width:410.95pt;height:163.55pt;z-index:251661312;visibility:visible;mso-wrap-style:square;mso-width-percent:0;mso-height-percent:0;mso-wrap-distance-left:9pt;mso-wrap-distance-top:3.6pt;mso-wrap-distance-right:9pt;mso-wrap-distance-bottom:3.6pt;mso-position-horizontal:absolute;mso-position-horizontal-relative:text;mso-position-vertical:absolute;mso-position-vertical-relative:text;mso-width-percent:0;mso-height-percent:0;mso-width-relative:margin;mso-height-relative:margin;v-text-anchor:top" o:gfxdata="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" filled="f" stroked="f">
                 <v:textbox>
                   <w:txbxContent>
                     <w:p>
@@ -230,7 +641,34 @@
                           <w:sz w:val="96"/>
                           <w:szCs w:val="96"/>
                         </w:rPr>
-                        <w:t>zene-streaming</w:t>
+                        <w:t>Z</w:t>
+                      </w:r>
+                      <w:r>
+                        <w:rPr>
+                          <w:rFonts w:ascii="Montserrat" w:hAnsi="Montserrat" w:cs="Arial"/>
+                          <w:color w:val="000000" w:themeColor="text1"/>
+                          <w:sz w:val="96"/>
+                          <w:szCs w:val="96"/>
+                        </w:rPr>
+                        <w:t>ene-</w:t>
+                      </w:r>
+                      <w:r>
+                        <w:rPr>
+                          <w:rFonts w:ascii="Montserrat" w:hAnsi="Montserrat" w:cs="Arial"/>
+                          <w:color w:val="000000" w:themeColor="text1"/>
+                          <w:sz w:val="96"/>
+                          <w:szCs w:val="96"/>
+                        </w:rPr>
+                        <w:t>S</w:t>
+                      </w:r>
+                      <w:r>
+                        <w:rPr>
+                          <w:rFonts w:ascii="Montserrat" w:hAnsi="Montserrat" w:cs="Arial"/>
+                          <w:color w:val="000000" w:themeColor="text1"/>
+                          <w:sz w:val="96"/>
+                          <w:szCs w:val="96"/>
+                        </w:rPr>
+                        <w:t>treaming</w:t>
                       </w:r>
                     </w:p>
                   </w:txbxContent>
@@ -245,195 +683,61 @@
         <w:rPr>
           <w:noProof/>
         </w:rPr>
-        <mc:AlternateContent>
-          <mc:Choice Requires="wps">
-            <w:drawing>
-              <wp:anchor distT="45720" distB="45720" distL="114300" distR="114300" simplePos="0" relativeHeight="251663360" behindDoc="1" locked="0" layoutInCell="1" allowOverlap="1" wp14:anchorId="3783ECA1" wp14:editId="14DB9884">
-                <wp:simplePos x="0" y="0"/>
-                <wp:positionH relativeFrom="margin">
-                  <wp:posOffset>3376930</wp:posOffset>
-                </wp:positionH>
-                <wp:positionV relativeFrom="paragraph">
-                  <wp:posOffset>5520055</wp:posOffset>
-                </wp:positionV>
-                <wp:extent cx="2924175" cy="1200150"/>
-                <wp:effectExtent l="0" t="0" r="0" b="0"/>
-                <wp:wrapNone/>
-                <wp:docPr id="2" name="Text Box 2"/>
-                <wp:cNvGraphicFramePr>
-                  <a:graphicFrameLocks xmlns:a="http://schemas.openxmlformats.org/drawingml/2006/main"/>
-                </wp:cNvGraphicFramePr>
-                <a:graphic xmlns:a="http://schemas.openxmlformats.org/drawingml/2006/main">
-                  <a:graphicData uri="http://schemas.microsoft.com/office/word/2010/wordprocessingShape">
-                    <wps:wsp>
-                      <wps:cNvSpPr txBox="1">
-                        <a:spLocks noChangeArrowheads="1"/>
-                      </wps:cNvSpPr>
-                      <wps:spPr bwMode="auto">
-                        <a:xfrm>
-                          <a:off x="0" y="0"/>
-                          <a:ext cx="2924175" cy="1200150"/>
-                        </a:xfrm>
-                        <a:prstGeom prst="rect">
-                          <a:avLst/>
-                        </a:prstGeom>
-                        <a:noFill/>
-                        <a:ln w="9525">
-                          <a:noFill/>
-                          <a:miter lim="800000"/>
-                          <a:headEnd/>
-                          <a:tailEnd/>
-                        </a:ln>
-                      </wps:spPr>
-                      <wps:txbx>
-                        <w:txbxContent>
-                          <w:p>
-                            <w:pPr>
-                              <w:jc w:val="right"/>
-                              <w:rPr>
-                                <w:rFonts w:ascii="Montserrat" w:hAnsi="Montserrat" w:cs="Arial"/>
-                                <w:color w:val="000000" w:themeColor="text1"/>
-                                <w:sz w:val="30"/>
-                                <w:szCs w:val="30"/>
-                              </w:rPr>
-                            </w:pPr>
-                            <w:r>
-                              <w:rPr>
-                                <w:rFonts w:ascii="Montserrat" w:hAnsi="Montserrat" w:cs="Arial"/>
-                                <w:color w:val="000000" w:themeColor="text1"/>
-                                <w:sz w:val="30"/>
-                                <w:szCs w:val="30"/>
-                              </w:rPr>
-                              <w:t>Készítette: Nagy Ákos és Bernáth Ábel</w:t>
-                            </w:r>
-                          </w:p>
-                          <w:p>
-                            <w:pPr>
-                              <w:jc w:val="right"/>
-                              <w:rPr>
-                                <w:rFonts w:ascii="Montserrat" w:hAnsi="Montserrat" w:cs="Arial"/>
-                                <w:color w:val="5D28FE"/>
-                                <w:sz w:val="30"/>
-                                <w:szCs w:val="30"/>
-                              </w:rPr>
-                            </w:pPr>
-                            <w:r>
-                              <w:rPr>
-                                <w:rFonts w:ascii="Montserrat" w:hAnsi="Montserrat" w:cs="Arial"/>
-                                <w:color w:val="5D28FE"/>
-                                <w:sz w:val="30"/>
-                                <w:szCs w:val="30"/>
-                              </w:rPr>
-                              <w:t>2</w:t>
-                            </w:r>
-                            <w:r>
-                              <w:rPr>
-                                <w:rFonts w:ascii="Montserrat" w:hAnsi="Montserrat" w:cs="Arial"/>
-                                <w:color w:val="5D28FE"/>
-                                <w:sz w:val="30"/>
-                                <w:szCs w:val="30"/>
-                                <w:lang w:val="en-US"/>
-                              </w:rPr>
-                              <w:t>025</w:t>
-                            </w:r>
-                            <w:r>
-                              <w:rPr>
-                                <w:rFonts w:ascii="Montserrat" w:hAnsi="Montserrat" w:cs="Arial"/>
-                                <w:color w:val="5D28FE"/>
-                                <w:sz w:val="30"/>
-                                <w:szCs w:val="30"/>
-                              </w:rPr>
-                              <w:t>-26</w:t>
-                            </w:r>
-                          </w:p>
-                        </w:txbxContent>
-                      </wps:txbx>
-                      <wps:bodyPr rot="0" vert="horz" wrap="square" lIns="91440" tIns="45720" rIns="91440" bIns="45720" anchor="t" anchorCtr="0">
-                        <a:noAutofit/>
-                      </wps:bodyPr>
-                    </wps:wsp>
-                  </a:graphicData>
-                </a:graphic>
-                <wp14:sizeRelH relativeFrom="margin">
-                  <wp14:pctWidth>0</wp14:pctWidth>
-                </wp14:sizeRelH>
-                <wp14:sizeRelV relativeFrom="margin">
-                  <wp14:pctHeight>0</wp14:pctHeight>
-                </wp14:sizeRelV>
-              </wp:anchor>
-            </w:drawing>
-          </mc:Choice>
-          <mc:Fallback>
-            <w:pict>
-              <v:shape w14:anchorId="3783ECA1" id="_x0000_s1027" type="#_x0000_t202" style="position:absolute;margin-left:265.9pt;margin-top:434.65pt;width:230.25pt;height:94.5pt;z-index:-251653120;visibility:visible;mso-wrap-style:square;mso-width-percent:0;mso-height-percent:0;mso-wrap-distance-left:9pt;mso-wrap-distance-top:3.6pt;mso-wrap-distance-right:9pt;mso-wrap-distance-bottom:3.6pt;mso-position-horizontal:absolute;mso-position-horizontal-relative:margin;mso-position-vertical:absolute;mso-position-vertical-relative:text;mso-width-percent:0;mso-height-percent:0;mso-width-relative:margin;mso-height-relative:margin;v-text-anchor:top" o:gfxdata="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" filled="f" stroked="f">
-                <v:textbox>
-                  <w:txbxContent>
-                    <w:p>
-                      <w:pPr>
-                        <w:jc w:val="right"/>
-                        <w:rPr>
-                          <w:rFonts w:ascii="Montserrat" w:hAnsi="Montserrat" w:cs="Arial"/>
-                          <w:color w:val="000000" w:themeColor="text1"/>
-                          <w:sz w:val="30"/>
-                          <w:szCs w:val="30"/>
-                        </w:rPr>
-                      </w:pPr>
-                      <w:r>
-                        <w:rPr>
-                          <w:rFonts w:ascii="Montserrat" w:hAnsi="Montserrat" w:cs="Arial"/>
-                          <w:color w:val="000000" w:themeColor="text1"/>
-                          <w:sz w:val="30"/>
-                          <w:szCs w:val="30"/>
-                        </w:rPr>
-                        <w:t>Készítette: Nagy Ákos és Bernáth Ábel</w:t>
-                      </w:r>
-                    </w:p>
-                    <w:p>
-                      <w:pPr>
-                        <w:jc w:val="right"/>
-                        <w:rPr>
-                          <w:rFonts w:ascii="Montserrat" w:hAnsi="Montserrat" w:cs="Arial"/>
-                          <w:color w:val="5D28FE"/>
-                          <w:sz w:val="30"/>
-                          <w:szCs w:val="30"/>
-                        </w:rPr>
-                      </w:pPr>
-                      <w:r>
-                        <w:rPr>
-                          <w:rFonts w:ascii="Montserrat" w:hAnsi="Montserrat" w:cs="Arial"/>
-                          <w:color w:val="5D28FE"/>
-                          <w:sz w:val="30"/>
-                          <w:szCs w:val="30"/>
-                        </w:rPr>
-                        <w:t>2</w:t>
-                      </w:r>
-                      <w:r>
-                        <w:rPr>
-                          <w:rFonts w:ascii="Montserrat" w:hAnsi="Montserrat" w:cs="Arial"/>
-                          <w:color w:val="5D28FE"/>
-                          <w:sz w:val="30"/>
-                          <w:szCs w:val="30"/>
-                          <w:lang w:val="en-US"/>
-                        </w:rPr>
-                        <w:t>025</w:t>
-                      </w:r>
-                      <w:r>
-                        <w:rPr>
-                          <w:rFonts w:ascii="Montserrat" w:hAnsi="Montserrat" w:cs="Arial"/>
-                          <w:color w:val="5D28FE"/>
-                          <w:sz w:val="30"/>
-                          <w:szCs w:val="30"/>
-                        </w:rPr>
-                        <w:t>-26</w:t>
-                      </w:r>
-                    </w:p>
-                  </w:txbxContent>
-                </v:textbox>
-                <w10:wrap anchorx="margin"/>
-              </v:shape>
-            </w:pict>
-          </mc:Fallback>
-        </mc:AlternateContent>
+        <w:drawing>
+          <wp:anchor distT="0" distB="0" distL="114300" distR="114300" simplePos="0" relativeHeight="251666432" behindDoc="0" locked="0" layoutInCell="1" allowOverlap="1" wp14:anchorId="0953EADF" wp14:editId="2ACEF45D">
+            <wp:simplePos x="0" y="0"/>
+            <wp:positionH relativeFrom="page">
+              <wp:posOffset>3600450</wp:posOffset>
+            </wp:positionH>
+            <wp:positionV relativeFrom="paragraph">
+              <wp:posOffset>547370</wp:posOffset>
+            </wp:positionV>
+            <wp:extent cx="2545200" cy="2545200"/>
+            <wp:effectExtent l="0" t="0" r="0" b="0"/>
+            <wp:wrapNone/>
+            <wp:docPr id="309679547" name="Ábra 4"/>
+            <wp:cNvGraphicFramePr>
+              <a:graphicFrameLocks xmlns:a="http://schemas.openxmlformats.org/drawingml/2006/main" noChangeAspect="1"/>
+            </wp:cNvGraphicFramePr>
+            <a:graphic xmlns:a="http://schemas.openxmlformats.org/drawingml/2006/main">
+              <a:graphicData uri="http://schemas.openxmlformats.org/drawingml/2006/picture">
+                <pic:pic xmlns:pic="http://schemas.openxmlformats.org/drawingml/2006/picture">
+                  <pic:nvPicPr>
+                    <pic:cNvPr id="309679547" name="Ábra 309679547"/>
+                    <pic:cNvPicPr/>
+                  </pic:nvPicPr>
+                  <pic:blipFill>
+                    <a:blip r:embed="rId8">
+                      <a:extLst>
+                        <a:ext uri="{96DAC541-7B7A-43D3-8B79-37D633B846F1}">
+                          <asvg:svgBlip xmlns:asvg="http://schemas.microsoft.com/office/drawing/2016/SVG/main" r:embed="rId9"/>
+                        </a:ext>
+                      </a:extLst>
+                    </a:blip>
+                    <a:stretch>
+                      <a:fillRect/>
+                    </a:stretch>
+                  </pic:blipFill>
+                  <pic:spPr>
+                    <a:xfrm>
+                      <a:off x="0" y="0"/>
+                      <a:ext cx="2545200" cy="2545200"/>
+                    </a:xfrm>
+                    <a:prstGeom prst="rect">
+                      <a:avLst/>
+                    </a:prstGeom>
+                  </pic:spPr>
+                </pic:pic>
+              </a:graphicData>
+            </a:graphic>
+            <wp14:sizeRelH relativeFrom="margin">
+              <wp14:pctWidth>0</wp14:pctWidth>
+            </wp14:sizeRelH>
+            <wp14:sizeRelV relativeFrom="margin">
+              <wp14:pctHeight>0</wp14:pctHeight>
+            </wp14:sizeRelV>
+          </wp:anchor>
+        </w:drawing>
       </w:r>
       <w:r>
         <w:br w:type="page"/>
@@ -463,7 +767,7 @@
             <o:lock v:ext="edit" aspectratio="t"/>
           </v:shapetype>
           <v:shape id="_x0000_s1026" type="#_x0000_t75" style="position:absolute;margin-left:-78pt;margin-top:-77.1pt;width:598.55pt;height:845.1pt;z-index:-251657216;mso-position-horizontal-relative:text;mso-position-vertical-relative:text;mso-width-relative:page;mso-height-relative:page">
-            <v:imagedata r:id="rId8" o:title="c4-bg"/>
+            <v:imagedata r:id="rId10" o:title="c4-bg"/>
           </v:shape>
         </w:pict>
       </w:r>
@@ -473,7 +777,7 @@
         </w:rPr>
         <w:pict w14:anchorId="3229BAB0">
           <v:shape id="_x0000_s1027" type="#_x0000_t75" style="position:absolute;margin-left:-70.5pt;margin-top:628.6pt;width:591.05pt;height:139.4pt;z-index:-251656192;mso-position-horizontal-relative:text;mso-position-vertical-relative:text;mso-width-relative:page;mso-height-relative:page">
-            <v:imagedata r:id="rId9" o:title="c4-footer"/>
+            <v:imagedata r:id="rId11" o:title="c4-footer"/>
           </v:shape>
         </w:pict>
       </w:r>
@@ -550,7 +854,14 @@
     <w:sdt>
       <w:sdtPr>
         <w:rPr>
+          <w:rFonts w:asciiTheme="minorHAnsi" w:eastAsiaTheme="minorHAnsi" w:hAnsiTheme="minorHAnsi" w:cstheme="minorBidi"/>
+          <w:b w:val="0"/>
+          <w:color w:val="auto"/>
+          <w:kern w:val="2"/>
+          <w:sz w:val="24"/>
+          <w:szCs w:val="24"/>
           <w:lang w:val="hu-HU"/>
+          <w14:ligatures w14:val="standardContextual"/>
         </w:rPr>
         <w:id w:val="1867016788"/>
         <w:docPartObj>
@@ -560,13 +871,7 @@
       </w:sdtPr>
       <w:sdtEndPr>
         <w:rPr>
-          <w:rFonts w:asciiTheme="minorHAnsi" w:eastAsiaTheme="minorHAnsi" w:hAnsiTheme="minorHAnsi" w:cstheme="minorBidi"/>
           <w:bCs/>
-          <w:color w:val="auto"/>
-          <w:kern w:val="2"/>
-          <w:sz w:val="24"/>
-          <w:szCs w:val="24"/>
-          <w14:ligatures w14:val="standardContextual"/>
         </w:rPr>
       </w:sdtEndPr>
       <w:sdtContent>
@@ -603,7 +908,7 @@
           <w:r>
             <w:fldChar w:fldCharType="separate"/>
           </w:r>
-          <w:hyperlink w:anchor="_Toc214723933" w:history="1">
+          <w:hyperlink w:anchor="_Toc215832361" w:history="1">
             <w:r>
               <w:rPr>
                 <w:rStyle w:val="Hiperhivatkozs"/>
@@ -645,7 +950,7 @@
                 <w:noProof/>
                 <w:webHidden/>
               </w:rPr>
-              <w:instrText xml:space="preserve"> PAGEREF _Toc214723933 \h </w:instrText>
+              <w:instrText xml:space="preserve"> PAGEREF _Toc215832361 \h </w:instrText>
             </w:r>
             <w:r>
               <w:rPr>
@@ -689,7 +994,7 @@
               <w:lang w:eastAsia="hu-HU"/>
             </w:rPr>
           </w:pPr>
-          <w:hyperlink w:anchor="_Toc214723934" w:history="1">
+          <w:hyperlink w:anchor="_Toc215832362" w:history="1">
             <w:r>
               <w:rPr>
                 <w:rStyle w:val="Hiperhivatkozs"/>
@@ -731,7 +1036,7 @@
                 <w:noProof/>
                 <w:webHidden/>
               </w:rPr>
-              <w:instrText xml:space="preserve"> PAGEREF _Toc214723934 \h </w:instrText>
+              <w:instrText xml:space="preserve"> PAGEREF _Toc215832362 \h </w:instrText>
             </w:r>
             <w:r>
               <w:rPr>
@@ -775,7 +1080,7 @@
               <w:lang w:eastAsia="hu-HU"/>
             </w:rPr>
           </w:pPr>
-          <w:hyperlink w:anchor="_Toc214723935" w:history="1">
+          <w:hyperlink w:anchor="_Toc215832363" w:history="1">
             <w:r>
               <w:rPr>
                 <w:rStyle w:val="Hiperhivatkozs"/>
@@ -817,7 +1122,7 @@
                 <w:noProof/>
                 <w:webHidden/>
               </w:rPr>
-              <w:instrText xml:space="preserve"> PAGEREF _Toc214723935 \h </w:instrText>
+              <w:instrText xml:space="preserve"> PAGEREF _Toc215832363 \h </w:instrText>
             </w:r>
             <w:r>
               <w:rPr>
@@ -850,9 +1155,8 @@
         </w:p>
         <w:p>
           <w:pPr>
-            <w:pStyle w:val="TJ3"/>
+            <w:pStyle w:val="TJ2"/>
             <w:tabs>
-              <w:tab w:val="left" w:pos="1440"/>
               <w:tab w:val="right" w:leader="dot" w:pos="9062"/>
             </w:tabs>
             <w:rPr>
@@ -861,38 +1165,25 @@
               <w:lang w:eastAsia="hu-HU"/>
             </w:rPr>
           </w:pPr>
-          <w:hyperlink w:anchor="_Toc214723936" w:history="1">
+          <w:hyperlink w:anchor="_Toc215832364" w:history="1">
             <w:r>
               <w:rPr>
                 <w:rStyle w:val="Hiperhivatkozs"/>
-                <w:noProof/>
-              </w:rPr>
-              <w:t>1.2.1</w:t>
-            </w:r>
-            <w:r>
-              <w:rPr>
-                <w:rFonts w:eastAsiaTheme="minorEastAsia"/>
-                <w:noProof/>
-                <w:lang w:eastAsia="hu-HU"/>
+                <w:i/>
+                <w:iCs/>
+                <w:noProof/>
+              </w:rPr>
+              <w:t>Webalkalmazás</w:t>
+            </w:r>
+            <w:r>
+              <w:rPr>
+                <w:noProof/>
+                <w:webHidden/>
               </w:rPr>
               <w:tab/>
             </w:r>
             <w:r>
               <w:rPr>
-                <w:rStyle w:val="Hiperhivatkozs"/>
-                <w:noProof/>
-              </w:rPr>
-              <w:t>Webalkalmazás</w:t>
-            </w:r>
-            <w:r>
-              <w:rPr>
-                <w:noProof/>
-                <w:webHidden/>
-              </w:rPr>
-              <w:tab/>
-            </w:r>
-            <w:r>
-              <w:rPr>
                 <w:noProof/>
                 <w:webHidden/>
               </w:rPr>
@@ -903,7 +1194,7 @@
                 <w:noProof/>
                 <w:webHidden/>
               </w:rPr>
-              <w:instrText xml:space="preserve"> PAGEREF _Toc214723936 \h </w:instrText>
+              <w:instrText xml:space="preserve"> PAGEREF _Toc215832364 \h </w:instrText>
             </w:r>
             <w:r>
               <w:rPr>
@@ -936,9 +1227,8 @@
         </w:p>
         <w:p>
           <w:pPr>
-            <w:pStyle w:val="TJ3"/>
+            <w:pStyle w:val="TJ2"/>
             <w:tabs>
-              <w:tab w:val="left" w:pos="1440"/>
               <w:tab w:val="right" w:leader="dot" w:pos="9062"/>
             </w:tabs>
             <w:rPr>
@@ -947,38 +1237,23 @@
               <w:lang w:eastAsia="hu-HU"/>
             </w:rPr>
           </w:pPr>
-          <w:hyperlink w:anchor="_Toc214723937" w:history="1">
+          <w:hyperlink w:anchor="_Toc215832365" w:history="1">
             <w:r>
               <w:rPr>
                 <w:rStyle w:val="Hiperhivatkozs"/>
                 <w:noProof/>
               </w:rPr>
-              <w:t>1.2.2</w:t>
-            </w:r>
-            <w:r>
-              <w:rPr>
-                <w:rFonts w:eastAsiaTheme="minorEastAsia"/>
-                <w:noProof/>
-                <w:lang w:eastAsia="hu-HU"/>
+              <w:t>Asztali alkalmazás</w:t>
+            </w:r>
+            <w:r>
+              <w:rPr>
+                <w:noProof/>
+                <w:webHidden/>
               </w:rPr>
               <w:tab/>
             </w:r>
             <w:r>
               <w:rPr>
-                <w:rStyle w:val="Hiperhivatkozs"/>
-                <w:noProof/>
-              </w:rPr>
-              <w:t>Asztali alkalmazás</w:t>
-            </w:r>
-            <w:r>
-              <w:rPr>
-                <w:noProof/>
-                <w:webHidden/>
-              </w:rPr>
-              <w:tab/>
-            </w:r>
-            <w:r>
-              <w:rPr>
                 <w:noProof/>
                 <w:webHidden/>
               </w:rPr>
@@ -989,7 +1264,7 @@
                 <w:noProof/>
                 <w:webHidden/>
               </w:rPr>
-              <w:instrText xml:space="preserve"> PAGEREF _Toc214723937 \h </w:instrText>
+              <w:instrText xml:space="preserve"> PAGEREF _Toc215832365 \h </w:instrText>
             </w:r>
             <w:r>
               <w:rPr>
@@ -1022,9 +1297,8 @@
         </w:p>
         <w:p>
           <w:pPr>
-            <w:pStyle w:val="TJ3"/>
+            <w:pStyle w:val="TJ2"/>
             <w:tabs>
-              <w:tab w:val="left" w:pos="1440"/>
               <w:tab w:val="right" w:leader="dot" w:pos="9062"/>
             </w:tabs>
             <w:rPr>
@@ -1033,38 +1307,23 @@
               <w:lang w:eastAsia="hu-HU"/>
             </w:rPr>
           </w:pPr>
-          <w:hyperlink w:anchor="_Toc214723938" w:history="1">
+          <w:hyperlink w:anchor="_Toc215832366" w:history="1">
             <w:r>
               <w:rPr>
                 <w:rStyle w:val="Hiperhivatkozs"/>
                 <w:noProof/>
               </w:rPr>
-              <w:t>1.2.3</w:t>
-            </w:r>
-            <w:r>
-              <w:rPr>
-                <w:rFonts w:eastAsiaTheme="minorEastAsia"/>
-                <w:noProof/>
-                <w:lang w:eastAsia="hu-HU"/>
+              <w:t>Mobil alkalmazás terve</w:t>
+            </w:r>
+            <w:r>
+              <w:rPr>
+                <w:noProof/>
+                <w:webHidden/>
               </w:rPr>
               <w:tab/>
             </w:r>
             <w:r>
               <w:rPr>
-                <w:rStyle w:val="Hiperhivatkozs"/>
-                <w:noProof/>
-              </w:rPr>
-              <w:t>Mobil alkalmazás terve</w:t>
-            </w:r>
-            <w:r>
-              <w:rPr>
-                <w:noProof/>
-                <w:webHidden/>
-              </w:rPr>
-              <w:tab/>
-            </w:r>
-            <w:r>
-              <w:rPr>
                 <w:noProof/>
                 <w:webHidden/>
               </w:rPr>
@@ -1075,7 +1334,7 @@
                 <w:noProof/>
                 <w:webHidden/>
               </w:rPr>
-              <w:instrText xml:space="preserve"> PAGEREF _Toc214723938 \h </w:instrText>
+              <w:instrText xml:space="preserve"> PAGEREF _Toc215832366 \h </w:instrText>
             </w:r>
             <w:r>
               <w:rPr>
@@ -1108,9 +1367,8 @@
         </w:p>
         <w:p>
           <w:pPr>
-            <w:pStyle w:val="TJ3"/>
+            <w:pStyle w:val="TJ2"/>
             <w:tabs>
-              <w:tab w:val="left" w:pos="1440"/>
               <w:tab w:val="right" w:leader="dot" w:pos="9062"/>
             </w:tabs>
             <w:rPr>
@@ -1119,38 +1377,23 @@
               <w:lang w:eastAsia="hu-HU"/>
             </w:rPr>
           </w:pPr>
-          <w:hyperlink w:anchor="_Toc214723939" w:history="1">
+          <w:hyperlink w:anchor="_Toc215832367" w:history="1">
             <w:r>
               <w:rPr>
                 <w:rStyle w:val="Hiperhivatkozs"/>
                 <w:noProof/>
               </w:rPr>
-              <w:t>1.2.4</w:t>
-            </w:r>
-            <w:r>
-              <w:rPr>
-                <w:rFonts w:eastAsiaTheme="minorEastAsia"/>
-                <w:noProof/>
-                <w:lang w:eastAsia="hu-HU"/>
+              <w:t>Adatbázis</w:t>
+            </w:r>
+            <w:r>
+              <w:rPr>
+                <w:noProof/>
+                <w:webHidden/>
               </w:rPr>
               <w:tab/>
             </w:r>
             <w:r>
               <w:rPr>
-                <w:rStyle w:val="Hiperhivatkozs"/>
-                <w:noProof/>
-              </w:rPr>
-              <w:t>Adatbázis</w:t>
-            </w:r>
-            <w:r>
-              <w:rPr>
-                <w:noProof/>
-                <w:webHidden/>
-              </w:rPr>
-              <w:tab/>
-            </w:r>
-            <w:r>
-              <w:rPr>
                 <w:noProof/>
                 <w:webHidden/>
               </w:rPr>
@@ -1161,7 +1404,7 @@
                 <w:noProof/>
                 <w:webHidden/>
               </w:rPr>
-              <w:instrText xml:space="preserve"> PAGEREF _Toc214723939 \h </w:instrText>
+              <w:instrText xml:space="preserve"> PAGEREF _Toc215832367 \h </w:instrText>
             </w:r>
             <w:r>
               <w:rPr>
@@ -1194,9 +1437,8 @@
         </w:p>
         <w:p>
           <w:pPr>
-            <w:pStyle w:val="TJ3"/>
+            <w:pStyle w:val="TJ2"/>
             <w:tabs>
-              <w:tab w:val="left" w:pos="1440"/>
               <w:tab w:val="right" w:leader="dot" w:pos="9062"/>
             </w:tabs>
             <w:rPr>
@@ -1205,38 +1447,23 @@
               <w:lang w:eastAsia="hu-HU"/>
             </w:rPr>
           </w:pPr>
-          <w:hyperlink w:anchor="_Toc214723940" w:history="1">
+          <w:hyperlink w:anchor="_Toc215832368" w:history="1">
             <w:r>
               <w:rPr>
                 <w:rStyle w:val="Hiperhivatkozs"/>
                 <w:noProof/>
               </w:rPr>
-              <w:t>1.2.5</w:t>
-            </w:r>
-            <w:r>
-              <w:rPr>
-                <w:rFonts w:eastAsiaTheme="minorEastAsia"/>
-                <w:noProof/>
-                <w:lang w:eastAsia="hu-HU"/>
+              <w:t>Fejlesztés</w:t>
+            </w:r>
+            <w:r>
+              <w:rPr>
+                <w:noProof/>
+                <w:webHidden/>
               </w:rPr>
               <w:tab/>
             </w:r>
             <w:r>
               <w:rPr>
-                <w:rStyle w:val="Hiperhivatkozs"/>
-                <w:noProof/>
-              </w:rPr>
-              <w:t>Fejlesztés</w:t>
-            </w:r>
-            <w:r>
-              <w:rPr>
-                <w:noProof/>
-                <w:webHidden/>
-              </w:rPr>
-              <w:tab/>
-            </w:r>
-            <w:r>
-              <w:rPr>
                 <w:noProof/>
                 <w:webHidden/>
               </w:rPr>
@@ -1247,7 +1474,7 @@
                 <w:noProof/>
                 <w:webHidden/>
               </w:rPr>
-              <w:instrText xml:space="preserve"> PAGEREF _Toc214723940 \h </w:instrText>
+              <w:instrText xml:space="preserve"> PAGEREF _Toc215832368 \h </w:instrText>
             </w:r>
             <w:r>
               <w:rPr>
@@ -1291,13 +1518,13 @@
               <w:lang w:eastAsia="hu-HU"/>
             </w:rPr>
           </w:pPr>
-          <w:hyperlink w:anchor="_Toc214723941" w:history="1">
+          <w:hyperlink w:anchor="_Toc215832369" w:history="1">
             <w:r>
               <w:rPr>
                 <w:rStyle w:val="Hiperhivatkozs"/>
                 <w:noProof/>
               </w:rPr>
-              <w:t>1.3</w:t>
+              <w:t>1.2</w:t>
             </w:r>
             <w:r>
               <w:rPr>
@@ -1333,7 +1560,7 @@
                 <w:noProof/>
                 <w:webHidden/>
               </w:rPr>
-              <w:instrText xml:space="preserve"> PAGEREF _Toc214723941 \h </w:instrText>
+              <w:instrText xml:space="preserve"> PAGEREF _Toc215832369 \h </w:instrText>
             </w:r>
             <w:r>
               <w:rPr>
@@ -1377,13 +1604,13 @@
               <w:lang w:eastAsia="hu-HU"/>
             </w:rPr>
           </w:pPr>
-          <w:hyperlink w:anchor="_Toc214723942" w:history="1">
+          <w:hyperlink w:anchor="_Toc215832370" w:history="1">
             <w:r>
               <w:rPr>
                 <w:rStyle w:val="Hiperhivatkozs"/>
                 <w:noProof/>
               </w:rPr>
-              <w:t>1.4</w:t>
+              <w:t>1.3</w:t>
             </w:r>
             <w:r>
               <w:rPr>
@@ -1419,7 +1646,7 @@
                 <w:noProof/>
                 <w:webHidden/>
               </w:rPr>
-              <w:instrText xml:space="preserve"> PAGEREF _Toc214723942 \h </w:instrText>
+              <w:instrText xml:space="preserve"> PAGEREF _Toc215832370 \h </w:instrText>
             </w:r>
             <w:r>
               <w:rPr>
@@ -1463,13 +1690,13 @@
               <w:lang w:eastAsia="hu-HU"/>
             </w:rPr>
           </w:pPr>
-          <w:hyperlink w:anchor="_Toc214723943" w:history="1">
+          <w:hyperlink w:anchor="_Toc215832371" w:history="1">
             <w:r>
               <w:rPr>
                 <w:rStyle w:val="Hiperhivatkozs"/>
                 <w:noProof/>
               </w:rPr>
-              <w:t>1.5</w:t>
+              <w:t>1.4</w:t>
             </w:r>
             <w:r>
               <w:rPr>
@@ -1505,7 +1732,7 @@
                 <w:noProof/>
                 <w:webHidden/>
               </w:rPr>
-              <w:instrText xml:space="preserve"> PAGEREF _Toc214723943 \h </w:instrText>
+              <w:instrText xml:space="preserve"> PAGEREF _Toc215832371 \h </w:instrText>
             </w:r>
             <w:r>
               <w:rPr>
@@ -1569,7 +1796,7 @@
           <w:numId w:val="3"/>
         </w:numPr>
       </w:pPr>
-      <w:bookmarkStart w:id="1" w:name="_Toc214723933"/>
+      <w:bookmarkStart w:id="1" w:name="_Toc215832361"/>
       <w:r>
         <w:lastRenderedPageBreak/>
         <w:t>Bevezetés</w:t>
@@ -1586,7 +1813,7 @@
         </w:numPr>
       </w:pPr>
       <w:bookmarkStart w:id="2" w:name="_Toc214722124"/>
-      <w:bookmarkStart w:id="3" w:name="_Toc214723934"/>
+      <w:bookmarkStart w:id="3" w:name="_Toc215832362"/>
       <w:r>
         <w:t>A projekt célja</w:t>
       </w:r>
@@ -1626,7 +1853,7 @@
         </w:numPr>
       </w:pPr>
       <w:bookmarkStart w:id="4" w:name="_Toc214722125"/>
-      <w:bookmarkStart w:id="5" w:name="_Toc214723935"/>
+      <w:bookmarkStart w:id="5" w:name="_Toc215832363"/>
       <w:r>
         <w:t>A projekt tervezete</w:t>
       </w:r>
@@ -1656,18 +1883,19 @@
     <w:p/>
     <w:p>
       <w:pPr>
-        <w:pStyle w:val="Cmsor3"/>
-        <w:numPr>
-          <w:ilvl w:val="2"/>
-          <w:numId w:val="3"/>
-        </w:numPr>
-        <w:tabs>
-          <w:tab w:val="left" w:pos="993"/>
-        </w:tabs>
+        <w:pStyle w:val="Normlcmsor"/>
+        <w:rPr>
+          <w:i/>
+          <w:iCs/>
+        </w:rPr>
       </w:pPr>
       <w:bookmarkStart w:id="6" w:name="_Toc214722126"/>
-      <w:bookmarkStart w:id="7" w:name="_Toc214723936"/>
-      <w:r>
+      <w:bookmarkStart w:id="7" w:name="_Toc215832364"/>
+      <w:r>
+        <w:rPr>
+          <w:i/>
+          <w:iCs/>
+        </w:rPr>
         <w:t>Webalkalmazás</w:t>
       </w:r>
       <w:bookmarkEnd w:id="6"/>
@@ -1727,14 +1955,10 @@
     <w:p/>
     <w:p>
       <w:pPr>
-        <w:pStyle w:val="Cmsor3"/>
-        <w:numPr>
-          <w:ilvl w:val="2"/>
-          <w:numId w:val="5"/>
-        </w:numPr>
+        <w:pStyle w:val="Normlcmsor"/>
       </w:pPr>
       <w:bookmarkStart w:id="8" w:name="_Toc214722127"/>
-      <w:bookmarkStart w:id="9" w:name="_Toc214723937"/>
+      <w:bookmarkStart w:id="9" w:name="_Toc215832365"/>
       <w:r>
         <w:t>Asztali alkalmazás</w:t>
       </w:r>
@@ -1771,14 +1995,10 @@
     <w:p/>
     <w:p>
       <w:pPr>
-        <w:pStyle w:val="Cmsor3"/>
-        <w:numPr>
-          <w:ilvl w:val="2"/>
-          <w:numId w:val="5"/>
-        </w:numPr>
+        <w:pStyle w:val="Normlcmsor"/>
       </w:pPr>
       <w:bookmarkStart w:id="10" w:name="_Toc214722128"/>
-      <w:bookmarkStart w:id="11" w:name="_Toc214723938"/>
+      <w:bookmarkStart w:id="11" w:name="_Toc215832366"/>
       <w:r>
         <w:t>Mobil alkalmazás terve</w:t>
       </w:r>
@@ -1795,14 +2015,10 @@
     </w:p>
     <w:p>
       <w:pPr>
-        <w:pStyle w:val="Cmsor3"/>
-        <w:numPr>
-          <w:ilvl w:val="2"/>
-          <w:numId w:val="5"/>
-        </w:numPr>
+        <w:pStyle w:val="Normlcmsor"/>
       </w:pPr>
       <w:bookmarkStart w:id="12" w:name="_Toc214722129"/>
-      <w:bookmarkStart w:id="13" w:name="_Toc214723939"/>
+      <w:bookmarkStart w:id="13" w:name="_Toc215832367"/>
       <w:r>
         <w:t>Adatbázis</w:t>
       </w:r>
@@ -1837,14 +2053,10 @@
     </w:p>
     <w:p>
       <w:pPr>
-        <w:pStyle w:val="Cmsor3"/>
-        <w:numPr>
-          <w:ilvl w:val="2"/>
-          <w:numId w:val="5"/>
-        </w:numPr>
+        <w:pStyle w:val="Normlcmsor"/>
       </w:pPr>
       <w:bookmarkStart w:id="14" w:name="_Toc214722130"/>
-      <w:bookmarkStart w:id="15" w:name="_Toc214723940"/>
+      <w:bookmarkStart w:id="15" w:name="_Toc215832368"/>
       <w:r>
         <w:lastRenderedPageBreak/>
         <w:t>Fejlesztés</w:t>
@@ -1908,7 +2120,7 @@
         </w:numPr>
       </w:pPr>
       <w:bookmarkStart w:id="16" w:name="_Toc214722131"/>
-      <w:bookmarkStart w:id="17" w:name="_Toc214723941"/>
+      <w:bookmarkStart w:id="17" w:name="_Toc215832369"/>
       <w:r>
         <w:t>SWOT analízis</w:t>
       </w:r>
@@ -1957,10 +2169,46 @@
         <w:rPr>
           <w:rStyle w:val="BekezdsekChar"/>
         </w:rPr>
-        <w:t>/SWOT.pptx elérési útvonalon</w:t>
-      </w:r>
-      <w:r>
-        <w:t>.</w:t>
+        <w:t>/</w:t>
+      </w:r>
+      <w:r>
+        <w:rPr>
+          <w:rStyle w:val="BekezdsekChar"/>
+        </w:rPr>
+        <w:t xml:space="preserve">SWOT </w:t>
+      </w:r>
+      <w:r>
+        <w:rPr>
+          <w:rStyle w:val="BekezdsekChar"/>
+        </w:rPr>
+        <w:t>elérési útvonalon</w:t>
+      </w:r>
+      <w:r>
+        <w:t xml:space="preserve"> </w:t>
+      </w:r>
+      <w:proofErr w:type="spellStart"/>
+      <w:r>
+        <w:rPr>
+          <w:b/>
+          <w:bCs/>
+        </w:rPr>
+        <w:t>pptx</w:t>
+      </w:r>
+      <w:proofErr w:type="spellEnd"/>
+      <w:r>
+        <w:t xml:space="preserve"> és </w:t>
+      </w:r>
+      <w:proofErr w:type="spellStart"/>
+      <w:r>
+        <w:rPr>
+          <w:b/>
+          <w:bCs/>
+        </w:rPr>
+        <w:t>png</w:t>
+      </w:r>
+      <w:proofErr w:type="spellEnd"/>
+      <w:r>
+        <w:t xml:space="preserve"> formátumokban.</w:t>
       </w:r>
     </w:p>
     <w:p>
@@ -1968,6 +2216,9 @@
         <w:keepNext/>
       </w:pPr>
       <w:r>
+        <w:rPr>
+          <w:noProof/>
+        </w:rPr>
         <w:drawing>
           <wp:inline distT="0" distB="0" distL="0" distR="0" wp14:anchorId="6BF2B6EC" wp14:editId="07EE65F8">
             <wp:extent cx="5760720" cy="3232150"/>
@@ -1984,7 +2235,7 @@
                     <pic:cNvPicPr/>
                   </pic:nvPicPr>
                   <pic:blipFill>
-                    <a:blip r:embed="rId10"/>
+                    <a:blip r:embed="rId12"/>
                     <a:stretch>
                       <a:fillRect/>
                     </a:stretch>
@@ -2039,27 +2290,25 @@
       <w:pPr>
         <w:pStyle w:val="Kpalrs"/>
       </w:pPr>
-      <w:r>
-        <w:fldChar w:fldCharType="begin"/>
-      </w:r>
-      <w:r>
-        <w:instrText xml:space="preserve"> SEQ ábra \* ARABIC </w:instrText>
-      </w:r>
-      <w:r>
-        <w:fldChar w:fldCharType="separate"/>
-      </w:r>
-      <w:r>
-        <w:rPr>
-          <w:noProof/>
-        </w:rPr>
-        <w:t>1</w:t>
-      </w:r>
-      <w:r>
-        <w:fldChar w:fldCharType="end"/>
-      </w:r>
-      <w:r>
-        <w:t>. SWOT analízis</w:t>
-      </w:r>
+      <w:fldSimple w:instr=" SEQ ábra \* ARABIC ">
+        <w:bookmarkStart w:id="18" w:name="_Toc215832090"/>
+        <w:r>
+          <w:rPr>
+            <w:noProof/>
+          </w:rPr>
+          <w:t>1</w:t>
+        </w:r>
+      </w:fldSimple>
+      <w:r>
+        <w:t>.</w:t>
+      </w:r>
+      <w:r>
+        <w:t xml:space="preserve"> ábra:</w:t>
+      </w:r>
+      <w:r>
+        <w:t xml:space="preserve"> SWOT analízis</w:t>
+      </w:r>
+      <w:bookmarkEnd w:id="18"/>
     </w:p>
     <w:p>
       <w:pPr>
@@ -2082,7 +2331,7 @@
           <w:numId w:val="5"/>
         </w:numPr>
       </w:pPr>
-      <w:bookmarkStart w:id="18" w:name="_Toc214723942"/>
+      <w:bookmarkStart w:id="19" w:name="_Toc215832370"/>
       <w:proofErr w:type="spellStart"/>
       <w:r>
         <w:lastRenderedPageBreak/>
@@ -2092,7 +2341,7 @@
       <w:r>
         <w:t xml:space="preserve"> diagram</w:t>
       </w:r>
-      <w:bookmarkEnd w:id="18"/>
+      <w:bookmarkEnd w:id="19"/>
     </w:p>
     <w:p>
       <w:pPr>
@@ -2148,15 +2397,25 @@
       </w:r>
       <w:proofErr w:type="spellEnd"/>
       <w:r>
+        <w:t>/</w:t>
+      </w:r>
+      <w:proofErr w:type="spellStart"/>
+      <w:r>
+        <w:t>gantt_chart</w:t>
+      </w:r>
+      <w:proofErr w:type="spellEnd"/>
+      <w:r>
         <w:t xml:space="preserve"> elérési útvonalon </w:t>
       </w:r>
+      <w:proofErr w:type="spellStart"/>
       <w:r>
         <w:rPr>
           <w:b/>
           <w:bCs/>
         </w:rPr>
-        <w:t>pdf</w:t>
-      </w:r>
+        <w:t>png</w:t>
+      </w:r>
+      <w:proofErr w:type="spellEnd"/>
       <w:r>
         <w:rPr>
           <w:b/>
@@ -2191,6 +2450,24 @@
         <w:t xml:space="preserve"> </w:t>
       </w:r>
       <w:r>
+        <w:t xml:space="preserve">(az általunk használt </w:t>
+      </w:r>
+      <w:proofErr w:type="spellStart"/>
+      <w:r>
+        <w:t>gantt</w:t>
+      </w:r>
+      <w:proofErr w:type="spellEnd"/>
+      <w:r>
+        <w:t xml:space="preserve"> diagram készítő az onlinegantt.com alapértelmezett fájlformátuma)</w:t>
+      </w:r>
+      <w:r>
+        <w:rPr>
+          <w:b/>
+          <w:bCs/>
+        </w:rPr>
+        <w:t xml:space="preserve"> </w:t>
+      </w:r>
+      <w:r>
         <w:t>kiterjesztéssel is.</w:t>
       </w:r>
     </w:p>
@@ -2199,11 +2476,14 @@
         <w:keepNext/>
       </w:pPr>
       <w:r>
+        <w:rPr>
+          <w:noProof/>
+        </w:rPr>
         <w:drawing>
-          <wp:inline distT="0" distB="0" distL="0" distR="0" wp14:anchorId="4FA7022E" wp14:editId="1BFF0486">
-            <wp:extent cx="5760720" cy="1219200"/>
-            <wp:effectExtent l="0" t="0" r="0" b="0"/>
-            <wp:docPr id="755683826" name="Kép 1" descr="A képen képernyőkép, Multimédiás szoftver, Grafikai szoftver, 3D modellezés látható&#10;&#10;Előfordulhat, hogy az AI által létrehozott tartalom helytelen."/>
+          <wp:inline distT="0" distB="0" distL="0" distR="0" wp14:anchorId="4FA7022E" wp14:editId="1865DA59">
+            <wp:extent cx="6016502" cy="1685925"/>
+            <wp:effectExtent l="0" t="0" r="3810" b="0"/>
+            <wp:docPr id="755683826" name="Kép 1"/>
             <wp:cNvGraphicFramePr>
               <a:graphicFrameLocks xmlns:a="http://schemas.openxmlformats.org/drawingml/2006/main" noChangeAspect="1"/>
             </wp:cNvGraphicFramePr>
@@ -2211,11 +2491,17 @@
               <a:graphicData uri="http://schemas.openxmlformats.org/drawingml/2006/picture">
                 <pic:pic xmlns:pic="http://schemas.openxmlformats.org/drawingml/2006/picture">
                   <pic:nvPicPr>
-                    <pic:cNvPr id="755683826" name="Kép 1" descr="A képen képernyőkép, Multimédiás szoftver, Grafikai szoftver, 3D modellezés látható&#10;&#10;Előfordulhat, hogy az AI által létrehozott tartalom helytelen."/>
+                    <pic:cNvPr id="755683826" name="Kép 1"/>
                     <pic:cNvPicPr/>
                   </pic:nvPicPr>
                   <pic:blipFill>
-                    <a:blip r:embed="rId11"/>
+                    <a:blip r:embed="rId13" cstate="print">
+                      <a:extLst>
+                        <a:ext uri="{28A0092B-C50C-407E-A947-70E740481C1C}">
+                          <a14:useLocalDpi xmlns:a14="http://schemas.microsoft.com/office/drawing/2010/main" val="0"/>
+                        </a:ext>
+                      </a:extLst>
+                    </a:blip>
                     <a:stretch>
                       <a:fillRect/>
                     </a:stretch>
@@ -2223,7 +2509,7 @@
                   <pic:spPr>
                     <a:xfrm>
                       <a:off x="0" y="0"/>
-                      <a:ext cx="5760720" cy="1219200"/>
+                      <a:ext cx="6025696" cy="1688501"/>
                     </a:xfrm>
                     <a:prstGeom prst="rect">
                       <a:avLst/>
@@ -2243,29 +2529,32 @@
           <w:rStyle w:val="KpalrsChar"/>
         </w:rPr>
       </w:pPr>
-      <w:r>
-        <w:fldChar w:fldCharType="begin"/>
-      </w:r>
-      <w:r>
-        <w:instrText xml:space="preserve"> SEQ ábra \* ARABIC </w:instrText>
-      </w:r>
-      <w:r>
-        <w:fldChar w:fldCharType="separate"/>
-      </w:r>
-      <w:r>
-        <w:rPr>
-          <w:noProof/>
-        </w:rPr>
-        <w:t>2</w:t>
-      </w:r>
-      <w:r>
-        <w:fldChar w:fldCharType="end"/>
-      </w:r>
+      <w:fldSimple w:instr=" SEQ ábra \* ARABIC ">
+        <w:bookmarkStart w:id="20" w:name="_Toc215832091"/>
+        <w:r>
+          <w:rPr>
+            <w:noProof/>
+          </w:rPr>
+          <w:t>2</w:t>
+        </w:r>
+      </w:fldSimple>
       <w:r>
         <w:rPr>
           <w:rStyle w:val="KpalrsChar"/>
         </w:rPr>
-        <w:t xml:space="preserve">. </w:t>
+        <w:t>.</w:t>
+      </w:r>
+      <w:r>
+        <w:rPr>
+          <w:rStyle w:val="KpalrsChar"/>
+        </w:rPr>
+        <w:t>ábra:</w:t>
+      </w:r>
+      <w:r>
+        <w:rPr>
+          <w:rStyle w:val="KpalrsChar"/>
+        </w:rPr>
+        <w:t xml:space="preserve"> </w:t>
       </w:r>
       <w:proofErr w:type="spellStart"/>
       <w:r>
@@ -2281,6 +2570,7 @@
         </w:rPr>
         <w:t xml:space="preserve"> diagram</w:t>
       </w:r>
+      <w:bookmarkEnd w:id="20"/>
     </w:p>
     <w:p/>
     <w:p>
@@ -2291,12 +2581,12 @@
           <w:numId w:val="5"/>
         </w:numPr>
       </w:pPr>
-      <w:bookmarkStart w:id="19" w:name="_Toc214723943"/>
+      <w:bookmarkStart w:id="21" w:name="_Toc215832371"/>
       <w:proofErr w:type="spellStart"/>
       <w:r>
         <w:t>Wireframe</w:t>
       </w:r>
-      <w:bookmarkEnd w:id="19"/>
+      <w:bookmarkEnd w:id="21"/>
       <w:proofErr w:type="spellEnd"/>
     </w:p>
     <w:p>
@@ -2347,6 +2637,14 @@
       </w:r>
       <w:proofErr w:type="spellEnd"/>
       <w:r>
+        <w:t>/</w:t>
+      </w:r>
+      <w:proofErr w:type="spellStart"/>
+      <w:r>
+        <w:t>wireframe</w:t>
+      </w:r>
+      <w:proofErr w:type="spellEnd"/>
+      <w:r>
         <w:t xml:space="preserve"> elérési útvonalon </w:t>
       </w:r>
       <w:r>
@@ -2357,15 +2655,59 @@
         <w:t>AI</w:t>
       </w:r>
       <w:r>
-        <w:t xml:space="preserve"> és </w:t>
-      </w:r>
-      <w:proofErr w:type="spellStart"/>
-      <w:r>
         <w:rPr>
           <w:b/>
           <w:bCs/>
         </w:rPr>
+        <w:t xml:space="preserve"> </w:t>
+      </w:r>
+      <w:r>
+        <w:t xml:space="preserve">(Adobe </w:t>
+      </w:r>
+      <w:proofErr w:type="spellStart"/>
+      <w:r>
+        <w:t>Illustrator</w:t>
+      </w:r>
+      <w:proofErr w:type="spellEnd"/>
+      <w:r>
+        <w:t>),</w:t>
+      </w:r>
+      <w:r>
+        <w:t xml:space="preserve"> </w:t>
+      </w:r>
+      <w:proofErr w:type="spellStart"/>
+      <w:r>
+        <w:rPr>
+          <w:b/>
+          <w:bCs/>
+        </w:rPr>
         <w:t>svg</w:t>
+      </w:r>
+      <w:proofErr w:type="spellEnd"/>
+      <w:r>
+        <w:rPr>
+          <w:b/>
+          <w:bCs/>
+        </w:rPr>
+        <w:t xml:space="preserve"> </w:t>
+      </w:r>
+      <w:r>
+        <w:t>és</w:t>
+      </w:r>
+      <w:r>
+        <w:rPr>
+          <w:b/>
+          <w:bCs/>
+        </w:rPr>
+        <w:t xml:space="preserve"> </w:t>
+      </w:r>
+      <w:proofErr w:type="spellStart"/>
+      <w:r>
+        <w:rPr>
+          <w:b/>
+          <w:bCs/>
+        </w:rPr>
+        <w:t>png</w:t>
       </w:r>
       <w:proofErr w:type="spellEnd"/>
       <w:r>
@@ -2377,6 +2719,9 @@
         <w:keepNext/>
       </w:pPr>
       <w:r>
+        <w:rPr>
+          <w:noProof/>
+        </w:rPr>
         <w:drawing>
           <wp:inline distT="0" distB="0" distL="0" distR="0" wp14:anchorId="01777348" wp14:editId="5EFE4EC0">
             <wp:extent cx="5760720" cy="2951480"/>
@@ -2393,7 +2738,7 @@
                     <pic:cNvPicPr/>
                   </pic:nvPicPr>
                   <pic:blipFill>
-                    <a:blip r:embed="rId12"/>
+                    <a:blip r:embed="rId14"/>
                     <a:stretch>
                       <a:fillRect/>
                     </a:stretch>
@@ -2418,41 +2763,445 @@
       <w:pPr>
         <w:pStyle w:val="Kpalrs"/>
       </w:pPr>
-      <w:r>
-        <w:fldChar w:fldCharType="begin"/>
-      </w:r>
-      <w:r>
-        <w:instrText xml:space="preserve"> SEQ ábra \* ARABIC </w:instrText>
-      </w:r>
-      <w:r>
-        <w:fldChar w:fldCharType="separate"/>
-      </w:r>
-      <w:r>
-        <w:rPr>
-          <w:noProof/>
-        </w:rPr>
-        <w:t>3</w:t>
-      </w:r>
-      <w:r>
-        <w:fldChar w:fldCharType="end"/>
-      </w:r>
-      <w:r>
-        <w:t xml:space="preserve">. </w:t>
+      <w:fldSimple w:instr=" SEQ ábra \* ARABIC ">
+        <w:bookmarkStart w:id="22" w:name="_Toc215832092"/>
+        <w:r>
+          <w:rPr>
+            <w:noProof/>
+          </w:rPr>
+          <w:t>3</w:t>
+        </w:r>
+      </w:fldSimple>
+      <w:r>
+        <w:t>. ábra:</w:t>
+      </w:r>
+      <w:r>
+        <w:t xml:space="preserve"> </w:t>
       </w:r>
       <w:proofErr w:type="spellStart"/>
       <w:r>
         <w:t>Wireframe</w:t>
       </w:r>
+      <w:bookmarkEnd w:id="22"/>
       <w:proofErr w:type="spellEnd"/>
     </w:p>
+    <w:p>
+      <w:pPr>
+        <w:rPr>
+          <w:rFonts w:ascii="Montserrat" w:hAnsi="Montserrat"/>
+          <w:i/>
+          <w:iCs/>
+          <w:color w:val="5D28FE"/>
+          <w:sz w:val="18"/>
+          <w:szCs w:val="18"/>
+        </w:rPr>
+      </w:pPr>
+      <w:r>
+        <w:br w:type="page"/>
+      </w:r>
+    </w:p>
+    <w:p>
+      <w:pPr>
+        <w:pStyle w:val="brajegyzk"/>
+        <w:tabs>
+          <w:tab w:val="right" w:leader="dot" w:pos="9062"/>
+        </w:tabs>
+        <w:rPr>
+          <w:noProof/>
+        </w:rPr>
+      </w:pPr>
+      <w:r>
+        <w:rPr>
+          <w:i/>
+          <w:iCs/>
+        </w:rPr>
+        <w:lastRenderedPageBreak/>
+        <w:fldChar w:fldCharType="begin"/>
+      </w:r>
+      <w:r>
+        <w:rPr>
+          <w:i/>
+          <w:iCs/>
+        </w:rPr>
+        <w:instrText xml:space="preserve"> TOC \h \z \c "ábra" </w:instrText>
+      </w:r>
+      <w:r>
+        <w:rPr>
+          <w:i/>
+          <w:iCs/>
+        </w:rPr>
+        <w:fldChar w:fldCharType="separate"/>
+      </w:r>
+      <w:hyperlink w:anchor="_Toc215832090" w:history="1">
+        <w:r>
+          <w:rPr>
+            <w:rStyle w:val="Hiperhivatkozs"/>
+            <w:noProof/>
+          </w:rPr>
+          <w:t>1. ábra: SWOT analízis</w:t>
+        </w:r>
+        <w:r>
+          <w:rPr>
+            <w:noProof/>
+            <w:webHidden/>
+          </w:rPr>
+          <w:tab/>
+        </w:r>
+        <w:r>
+          <w:rPr>
+            <w:noProof/>
+            <w:webHidden/>
+          </w:rPr>
+          <w:fldChar w:fldCharType="begin"/>
+        </w:r>
+        <w:r>
+          <w:rPr>
+            <w:noProof/>
+            <w:webHidden/>
+          </w:rPr>
+          <w:instrText xml:space="preserve"> PAGEREF _Toc215832090 \h </w:instrText>
+        </w:r>
+        <w:r>
+          <w:rPr>
+            <w:noProof/>
+            <w:webHidden/>
+          </w:rPr>
+        </w:r>
+        <w:r>
+          <w:rPr>
+            <w:noProof/>
+            <w:webHidden/>
+          </w:rPr>
+          <w:fldChar w:fldCharType="separate"/>
+        </w:r>
+        <w:r>
+          <w:rPr>
+            <w:noProof/>
+            <w:webHidden/>
+          </w:rPr>
+          <w:t>4</w:t>
+        </w:r>
+        <w:r>
+          <w:rPr>
+            <w:noProof/>
+            <w:webHidden/>
+          </w:rPr>
+          <w:fldChar w:fldCharType="end"/>
+        </w:r>
+      </w:hyperlink>
+    </w:p>
+    <w:p>
+      <w:pPr>
+        <w:pStyle w:val="brajegyzk"/>
+        <w:tabs>
+          <w:tab w:val="right" w:leader="dot" w:pos="9062"/>
+        </w:tabs>
+        <w:rPr>
+          <w:noProof/>
+        </w:rPr>
+      </w:pPr>
+      <w:hyperlink w:anchor="_Toc215832091" w:history="1">
+        <w:r>
+          <w:rPr>
+            <w:rStyle w:val="Hiperhivatkozs"/>
+            <w:noProof/>
+          </w:rPr>
+          <w:t>2.ábra: Gantt diagram</w:t>
+        </w:r>
+        <w:r>
+          <w:rPr>
+            <w:noProof/>
+            <w:webHidden/>
+          </w:rPr>
+          <w:tab/>
+        </w:r>
+        <w:r>
+          <w:rPr>
+            <w:noProof/>
+            <w:webHidden/>
+          </w:rPr>
+          <w:fldChar w:fldCharType="begin"/>
+        </w:r>
+        <w:r>
+          <w:rPr>
+            <w:noProof/>
+            <w:webHidden/>
+          </w:rPr>
+          <w:instrText xml:space="preserve"> PAGEREF _Toc215832091 \h </w:instrText>
+        </w:r>
+        <w:r>
+          <w:rPr>
+            <w:noProof/>
+            <w:webHidden/>
+          </w:rPr>
+        </w:r>
+        <w:r>
+          <w:rPr>
+            <w:noProof/>
+            <w:webHidden/>
+          </w:rPr>
+          <w:fldChar w:fldCharType="separate"/>
+        </w:r>
+        <w:r>
+          <w:rPr>
+            <w:noProof/>
+            <w:webHidden/>
+          </w:rPr>
+          <w:t>5</w:t>
+        </w:r>
+        <w:r>
+          <w:rPr>
+            <w:noProof/>
+            <w:webHidden/>
+          </w:rPr>
+          <w:fldChar w:fldCharType="end"/>
+        </w:r>
+      </w:hyperlink>
+    </w:p>
+    <w:p>
+      <w:pPr>
+        <w:pStyle w:val="brajegyzk"/>
+        <w:tabs>
+          <w:tab w:val="right" w:leader="dot" w:pos="9062"/>
+        </w:tabs>
+        <w:rPr>
+          <w:noProof/>
+        </w:rPr>
+      </w:pPr>
+      <w:hyperlink w:anchor="_Toc215832092" w:history="1">
+        <w:r>
+          <w:rPr>
+            <w:rStyle w:val="Hiperhivatkozs"/>
+            <w:noProof/>
+          </w:rPr>
+          <w:t>3. ábra: Wireframe</w:t>
+        </w:r>
+        <w:r>
+          <w:rPr>
+            <w:noProof/>
+            <w:webHidden/>
+          </w:rPr>
+          <w:tab/>
+        </w:r>
+        <w:r>
+          <w:rPr>
+            <w:noProof/>
+            <w:webHidden/>
+          </w:rPr>
+          <w:fldChar w:fldCharType="begin"/>
+        </w:r>
+        <w:r>
+          <w:rPr>
+            <w:noProof/>
+            <w:webHidden/>
+          </w:rPr>
+          <w:instrText xml:space="preserve"> PAGEREF _Toc215832092 \h </w:instrText>
+        </w:r>
+        <w:r>
+          <w:rPr>
+            <w:noProof/>
+            <w:webHidden/>
+          </w:rPr>
+        </w:r>
+        <w:r>
+          <w:rPr>
+            <w:noProof/>
+            <w:webHidden/>
+          </w:rPr>
+          <w:fldChar w:fldCharType="separate"/>
+        </w:r>
+        <w:r>
+          <w:rPr>
+            <w:noProof/>
+            <w:webHidden/>
+          </w:rPr>
+          <w:t>5</w:t>
+        </w:r>
+        <w:r>
+          <w:rPr>
+            <w:noProof/>
+            <w:webHidden/>
+          </w:rPr>
+          <w:fldChar w:fldCharType="end"/>
+        </w:r>
+      </w:hyperlink>
+    </w:p>
+    <w:p>
+      <w:pPr>
+        <w:pStyle w:val="Kpalrs"/>
+        <w:rPr>
+          <w:i w:val="0"/>
+          <w:iCs w:val="0"/>
+        </w:rPr>
+      </w:pPr>
+      <w:r>
+        <w:rPr>
+          <w:i w:val="0"/>
+          <w:iCs w:val="0"/>
+        </w:rPr>
+        <w:fldChar w:fldCharType="end"/>
+      </w:r>
+    </w:p>
     <w:sectPr>
+      <w:headerReference w:type="even" r:id="rId15"/>
+      <w:footerReference w:type="even" r:id="rId16"/>
+      <w:footerReference w:type="default" r:id="rId17"/>
       <w:pgSz w:w="11906" w:h="16838"/>
       <w:pgMar w:top="1417" w:right="1417" w:bottom="1417" w:left="1417" w:header="708" w:footer="708" w:gutter="0"/>
       <w:cols w:space="708"/>
+      <w:titlePg/>
       <w:docGrid w:linePitch="360"/>
     </w:sectPr>
   </w:body>
 </w:document>
+</file>
+
+<file path=word/endnotes.xml><?xml version="1.0" encoding="utf-8"?>
+<w:endnotes xmlns:wpc="http://schemas.microsoft.com/office/word/2010/wordprocessingCanvas" xmlns:cx="http://schemas.microsoft.com/office/drawing/2014/chartex" xmlns:cx1="http://schemas.microsoft.com/office/drawing/2015/9/8/chartex" xmlns:cx2="http://schemas.microsoft.com/office/drawing/2015/10/21/chartex" xmlns:cx3="http://schemas.microsoft.com/office/drawing/2016/5/9/chartex" xmlns:cx4="http://schemas.microsoft.com/office/drawing/2016/5/10/chartex" xmlns:cx5="http://schemas.microsoft.com/office/drawing/2016/5/11/chartex" xmlns:cx6="http://schemas.microsoft.com/office/drawing/2016/5/12/chartex" xmlns:cx7="http://schemas.microsoft.com/office/drawing/2016/5/13/chartex" xmlns:cx8="http://schemas.microsoft.com/office/drawing/2016/5/14/chartex" xmlns:mc="http://schemas.openxmlformats.org/markup-compatibility/2006" xmlns:aink="http://schemas.microsoft.com/office/drawing/2016/ink" xmlns:am3d="http://schemas.microsoft.com/office/drawing/2017/model3d" xmlns:o="urn:schemas-microsoft-com:office:office" xmlns:oel="http://schemas.microsoft.com/office/2019/extlst" xmlns:r="http://schemas.openxmlformats.org/officeDocument/2006/relationships" xmlns:m="http://schemas.openxmlformats.org/officeDocument/2006/math" xmlns:v="urn:schemas-microsoft-com:vml" xmlns:wp14="http://schemas.microsoft.com/office/word/2010/wordprocessingDrawing" xmlns:wp="http://schemas.openxmlformats.org/drawingml/2006/wordprocessingDrawing" xmlns:w10="urn:schemas-microsoft-com:office:word" xmlns:w="http://schemas.openxmlformats.org/wordprocessingml/2006/main" xmlns:w14="http://schemas.microsoft.com/office/word/2010/wordml" xmlns:w15="http://schemas.microsoft.com/office/word/2012/wordml" xmlns:w16cex="http://schemas.microsoft.com/office/word/2018/wordml/cex" xmlns:w16cid="http://schemas.microsoft.com/office/word/2016/wordml/cid" xmlns:w16="http://schemas.microsoft.com/office/word/2018/wordml" xmlns:w16du="http://schemas.microsoft.com/office/word/2023/wordml/word16du" xmlns:w16sdtdh="http://schemas.microsoft.com/office/word/2020/wordml/sdtdatahash" xmlns:w16sdtfl="http://schemas.microsoft.com/office/word/2024/wordml/sdtformatlock" xmlns:w16se="http://schemas.microsoft.com/office/word/2015/wordml/symex" xmlns:wpg="http://schemas.microsoft.com/office/word/2010/wordprocessingGroup" xmlns:wpi="http://schemas.microsoft.com/office/word/2010/wordprocessingInk" xmlns:wne="http://schemas.microsoft.com/office/word/2006/wordml" xmlns:wps="http://schemas.microsoft.com/office/word/2010/wordprocessingShape" mc:Ignorable="w14 w15 w16se w16cid w16 w16cex w16sdtdh w16sdtfl w16du wp14">
+  <w:endnote w:type="separator" w:id="-1">
+    <w:p>
+      <w:pPr>
+        <w:spacing w:after="0" w:line="240" w:lineRule="auto"/>
+      </w:pPr>
+      <w:r>
+        <w:separator/>
+      </w:r>
+    </w:p>
+  </w:endnote>
+  <w:endnote w:type="continuationSeparator" w:id="0">
+    <w:p>
+      <w:pPr>
+        <w:spacing w:after="0" w:line="240" w:lineRule="auto"/>
+      </w:pPr>
+      <w:r>
+        <w:continuationSeparator/>
+      </w:r>
+    </w:p>
+  </w:endnote>
+</w:endnotes>
+</file>
+
+<file path=word/footer1.xml><?xml version="1.0" encoding="utf-8"?>
+<w:ftr xmlns:wpc="http://schemas.microsoft.com/office/word/2010/wordprocessingCanvas" xmlns:cx="http://schemas.microsoft.com/office/drawing/2014/chartex" xmlns:cx1="http://schemas.microsoft.com/office/drawing/2015/9/8/chartex" xmlns:cx2="http://schemas.microsoft.com/office/drawing/2015/10/21/chartex" xmlns:cx3="http://schemas.microsoft.com/office/drawing/2016/5/9/chartex" xmlns:cx4="http://schemas.microsoft.com/office/drawing/2016/5/10/chartex" xmlns:cx5="http://schemas.microsoft.com/office/drawing/2016/5/11/chartex" xmlns:cx6="http://schemas.microsoft.com/office/drawing/2016/5/12/chartex" xmlns:cx7="http://schemas.microsoft.com/office/drawing/2016/5/13/chartex" xmlns:cx8="http://schemas.microsoft.com/office/drawing/2016/5/14/chartex" xmlns:mc="http://schemas.openxmlformats.org/markup-compatibility/2006" xmlns:aink="http://schemas.microsoft.com/office/drawing/2016/ink" xmlns:am3d="http://schemas.microsoft.com/office/drawing/2017/model3d" xmlns:o="urn:schemas-microsoft-com:office:office" xmlns:oel="http://schemas.microsoft.com/office/2019/extlst" xmlns:r="http://schemas.openxmlformats.org/officeDocument/2006/relationships" xmlns:m="http://schemas.openxmlformats.org/officeDocument/2006/math" xmlns:v="urn:schemas-microsoft-com:vml" xmlns:wp14="http://schemas.microsoft.com/office/word/2010/wordprocessingDrawing" xmlns:wp="http://schemas.openxmlformats.org/drawingml/2006/wordprocessingDrawing" xmlns:w10="urn:schemas-microsoft-com:office:word" xmlns:w="http://schemas.openxmlformats.org/wordprocessingml/2006/main" xmlns:w14="http://schemas.microsoft.com/office/word/2010/wordml" xmlns:w15="http://schemas.microsoft.com/office/word/2012/wordml" xmlns:w16cex="http://schemas.microsoft.com/office/word/2018/wordml/cex" xmlns:w16cid="http://schemas.microsoft.com/office/word/2016/wordml/cid" xmlns:w16="http://schemas.microsoft.com/office/word/2018/wordml" xmlns:w16du="http://schemas.microsoft.com/office/word/2023/wordml/word16du" xmlns:w16sdtdh="http://schemas.microsoft.com/office/word/2020/wordml/sdtdatahash" xmlns:w16sdtfl="http://schemas.microsoft.com/office/word/2024/wordml/sdtformatlock" xmlns:w16se="http://schemas.microsoft.com/office/word/2015/wordml/symex" xmlns:wpg="http://schemas.microsoft.com/office/word/2010/wordprocessingGroup" xmlns:wpi="http://schemas.microsoft.com/office/word/2010/wordprocessingInk" xmlns:wne="http://schemas.microsoft.com/office/word/2006/wordml" xmlns:wps="http://schemas.microsoft.com/office/word/2010/wordprocessingShape" mc:Ignorable="w14 w15 w16se w16cid w16 w16cex w16sdtdh w16sdtfl w16du wp14">
+  <w:sdt>
+    <w:sdtPr>
+      <w:id w:val="-215821500"/>
+      <w:docPartObj>
+        <w:docPartGallery w:val="Page Numbers (Bottom of Page)"/>
+        <w:docPartUnique/>
+      </w:docPartObj>
+    </w:sdtPr>
+    <w:sdtContent>
+      <w:p>
+        <w:pPr>
+          <w:pStyle w:val="llb"/>
+        </w:pPr>
+        <w:r>
+          <w:fldChar w:fldCharType="begin"/>
+        </w:r>
+        <w:r>
+          <w:instrText>PAGE   \* MERGEFORMAT</w:instrText>
+        </w:r>
+        <w:r>
+          <w:fldChar w:fldCharType="separate"/>
+        </w:r>
+        <w:r>
+          <w:t>2</w:t>
+        </w:r>
+        <w:r>
+          <w:fldChar w:fldCharType="end"/>
+        </w:r>
+      </w:p>
+    </w:sdtContent>
+  </w:sdt>
+  <w:p>
+    <w:pPr>
+      <w:pStyle w:val="llb"/>
+    </w:pPr>
+  </w:p>
+</w:ftr>
+</file>
+
+<file path=word/footer2.xml><?xml version="1.0" encoding="utf-8"?>
+<w:ftr xmlns:wpc="http://schemas.microsoft.com/office/word/2010/wordprocessingCanvas" xmlns:cx="http://schemas.microsoft.com/office/drawing/2014/chartex" xmlns:cx1="http://schemas.microsoft.com/office/drawing/2015/9/8/chartex" xmlns:cx2="http://schemas.microsoft.com/office/drawing/2015/10/21/chartex" xmlns:cx3="http://schemas.microsoft.com/office/drawing/2016/5/9/chartex" xmlns:cx4="http://schemas.microsoft.com/office/drawing/2016/5/10/chartex" xmlns:cx5="http://schemas.microsoft.com/office/drawing/2016/5/11/chartex" xmlns:cx6="http://schemas.microsoft.com/office/drawing/2016/5/12/chartex" xmlns:cx7="http://schemas.microsoft.com/office/drawing/2016/5/13/chartex" xmlns:cx8="http://schemas.microsoft.com/office/drawing/2016/5/14/chartex" xmlns:mc="http://schemas.openxmlformats.org/markup-compatibility/2006" xmlns:aink="http://schemas.microsoft.com/office/drawing/2016/ink" xmlns:am3d="http://schemas.microsoft.com/office/drawing/2017/model3d" xmlns:o="urn:schemas-microsoft-com:office:office" xmlns:oel="http://schemas.microsoft.com/office/2019/extlst" xmlns:r="http://schemas.openxmlformats.org/officeDocument/2006/relationships" xmlns:m="http://schemas.openxmlformats.org/officeDocument/2006/math" xmlns:v="urn:schemas-microsoft-com:vml" xmlns:wp14="http://schemas.microsoft.com/office/word/2010/wordprocessingDrawing" xmlns:wp="http://schemas.openxmlformats.org/drawingml/2006/wordprocessingDrawing" xmlns:w10="urn:schemas-microsoft-com:office:word" xmlns:w="http://schemas.openxmlformats.org/wordprocessingml/2006/main" xmlns:w14="http://schemas.microsoft.com/office/word/2010/wordml" xmlns:w15="http://schemas.microsoft.com/office/word/2012/wordml" xmlns:w16cex="http://schemas.microsoft.com/office/word/2018/wordml/cex" xmlns:w16cid="http://schemas.microsoft.com/office/word/2016/wordml/cid" xmlns:w16="http://schemas.microsoft.com/office/word/2018/wordml" xmlns:w16du="http://schemas.microsoft.com/office/word/2023/wordml/word16du" xmlns:w16sdtdh="http://schemas.microsoft.com/office/word/2020/wordml/sdtdatahash" xmlns:w16sdtfl="http://schemas.microsoft.com/office/word/2024/wordml/sdtformatlock" xmlns:w16se="http://schemas.microsoft.com/office/word/2015/wordml/symex" xmlns:wpg="http://schemas.microsoft.com/office/word/2010/wordprocessingGroup" xmlns:wpi="http://schemas.microsoft.com/office/word/2010/wordprocessingInk" xmlns:wne="http://schemas.microsoft.com/office/word/2006/wordml" xmlns:wps="http://schemas.microsoft.com/office/word/2010/wordprocessingShape" mc:Ignorable="w14 w15 w16se w16cid w16 w16cex w16sdtdh w16sdtfl w16du wp14">
+  <w:sdt>
+    <w:sdtPr>
+      <w:id w:val="-1488935247"/>
+      <w:docPartObj>
+        <w:docPartGallery w:val="Page Numbers (Bottom of Page)"/>
+        <w:docPartUnique/>
+      </w:docPartObj>
+    </w:sdtPr>
+    <w:sdtContent>
+      <w:p>
+        <w:pPr>
+          <w:pStyle w:val="llb"/>
+          <w:jc w:val="right"/>
+        </w:pPr>
+        <w:r>
+          <w:fldChar w:fldCharType="begin"/>
+        </w:r>
+        <w:r>
+          <w:instrText>PAGE   \* MERGEFORMAT</w:instrText>
+        </w:r>
+        <w:r>
+          <w:fldChar w:fldCharType="separate"/>
+        </w:r>
+        <w:r>
+          <w:t>2</w:t>
+        </w:r>
+        <w:r>
+          <w:fldChar w:fldCharType="end"/>
+        </w:r>
+      </w:p>
+    </w:sdtContent>
+  </w:sdt>
+  <w:p>
+    <w:pPr>
+      <w:pStyle w:val="llb"/>
+    </w:pPr>
+  </w:p>
+</w:ftr>
+</file>
+
+<file path=word/footnotes.xml><?xml version="1.0" encoding="utf-8"?>
+<w:footnotes xmlns:wpc="http://schemas.microsoft.com/office/word/2010/wordprocessingCanvas" xmlns:cx="http://schemas.microsoft.com/office/drawing/2014/chartex" xmlns:cx1="http://schemas.microsoft.com/office/drawing/2015/9/8/chartex" xmlns:cx2="http://schemas.microsoft.com/office/drawing/2015/10/21/chartex" xmlns:cx3="http://schemas.microsoft.com/office/drawing/2016/5/9/chartex" xmlns:cx4="http://schemas.microsoft.com/office/drawing/2016/5/10/chartex" xmlns:cx5="http://schemas.microsoft.com/office/drawing/2016/5/11/chartex" xmlns:cx6="http://schemas.microsoft.com/office/drawing/2016/5/12/chartex" xmlns:cx7="http://schemas.microsoft.com/office/drawing/2016/5/13/chartex" xmlns:cx8="http://schemas.microsoft.com/office/drawing/2016/5/14/chartex" xmlns:mc="http://schemas.openxmlformats.org/markup-compatibility/2006" xmlns:aink="http://schemas.microsoft.com/office/drawing/2016/ink" xmlns:am3d="http://schemas.microsoft.com/office/drawing/2017/model3d" xmlns:o="urn:schemas-microsoft-com:office:office" xmlns:oel="http://schemas.microsoft.com/office/2019/extlst" xmlns:r="http://schemas.openxmlformats.org/officeDocument/2006/relationships" xmlns:m="http://schemas.openxmlformats.org/officeDocument/2006/math" xmlns:v="urn:schemas-microsoft-com:vml" xmlns:wp14="http://schemas.microsoft.com/office/word/2010/wordprocessingDrawing" xmlns:wp="http://schemas.openxmlformats.org/drawingml/2006/wordprocessingDrawing" xmlns:w10="urn:schemas-microsoft-com:office:word" xmlns:w="http://schemas.openxmlformats.org/wordprocessingml/2006/main" xmlns:w14="http://schemas.microsoft.com/office/word/2010/wordml" xmlns:w15="http://schemas.microsoft.com/office/word/2012/wordml" xmlns:w16cex="http://schemas.microsoft.com/office/word/2018/wordml/cex" xmlns:w16cid="http://schemas.microsoft.com/office/word/2016/wordml/cid" xmlns:w16="http://schemas.microsoft.com/office/word/2018/wordml" xmlns:w16du="http://schemas.microsoft.com/office/word/2023/wordml/word16du" xmlns:w16sdtdh="http://schemas.microsoft.com/office/word/2020/wordml/sdtdatahash" xmlns:w16sdtfl="http://schemas.microsoft.com/office/word/2024/wordml/sdtformatlock" xmlns:w16se="http://schemas.microsoft.com/office/word/2015/wordml/symex" xmlns:wpg="http://schemas.microsoft.com/office/word/2010/wordprocessingGroup" xmlns:wpi="http://schemas.microsoft.com/office/word/2010/wordprocessingInk" xmlns:wne="http://schemas.microsoft.com/office/word/2006/wordml" xmlns:wps="http://schemas.microsoft.com/office/word/2010/wordprocessingShape" mc:Ignorable="w14 w15 w16se w16cid w16 w16cex w16sdtdh w16sdtfl w16du wp14">
+  <w:footnote w:type="separator" w:id="-1">
+    <w:p>
+      <w:pPr>
+        <w:spacing w:after="0" w:line="240" w:lineRule="auto"/>
+      </w:pPr>
+      <w:r>
+        <w:separator/>
+      </w:r>
+    </w:p>
+  </w:footnote>
+  <w:footnote w:type="continuationSeparator" w:id="0">
+    <w:p>
+      <w:pPr>
+        <w:spacing w:after="0" w:line="240" w:lineRule="auto"/>
+      </w:pPr>
+      <w:r>
+        <w:continuationSeparator/>
+      </w:r>
+    </w:p>
+  </w:footnote>
+</w:footnotes>
+</file>
+
+<file path=word/header1.xml><?xml version="1.0" encoding="utf-8"?>
+<w:hdr xmlns:wpc="http://schemas.microsoft.com/office/word/2010/wordprocessingCanvas" xmlns:cx="http://schemas.microsoft.com/office/drawing/2014/chartex" xmlns:cx1="http://schemas.microsoft.com/office/drawing/2015/9/8/chartex" xmlns:cx2="http://schemas.microsoft.com/office/drawing/2015/10/21/chartex" xmlns:cx3="http://schemas.microsoft.com/office/drawing/2016/5/9/chartex" xmlns:cx4="http://schemas.microsoft.com/office/drawing/2016/5/10/chartex" xmlns:cx5="http://schemas.microsoft.com/office/drawing/2016/5/11/chartex" xmlns:cx6="http://schemas.microsoft.com/office/drawing/2016/5/12/chartex" xmlns:cx7="http://schemas.microsoft.com/office/drawing/2016/5/13/chartex" xmlns:cx8="http://schemas.microsoft.com/office/drawing/2016/5/14/chartex" xmlns:mc="http://schemas.openxmlformats.org/markup-compatibility/2006" xmlns:aink="http://schemas.microsoft.com/office/drawing/2016/ink" xmlns:am3d="http://schemas.microsoft.com/office/drawing/2017/model3d" xmlns:o="urn:schemas-microsoft-com:office:office" xmlns:oel="http://schemas.microsoft.com/office/2019/extlst" xmlns:r="http://schemas.openxmlformats.org/officeDocument/2006/relationships" xmlns:m="http://schemas.openxmlformats.org/officeDocument/2006/math" xmlns:v="urn:schemas-microsoft-com:vml" xmlns:wp14="http://schemas.microsoft.com/office/word/2010/wordprocessingDrawing" xmlns:wp="http://schemas.openxmlformats.org/drawingml/2006/wordprocessingDrawing" xmlns:w10="urn:schemas-microsoft-com:office:word" xmlns:w="http://schemas.openxmlformats.org/wordprocessingml/2006/main" xmlns:w14="http://schemas.microsoft.com/office/word/2010/wordml" xmlns:w15="http://schemas.microsoft.com/office/word/2012/wordml" xmlns:w16cex="http://schemas.microsoft.com/office/word/2018/wordml/cex" xmlns:w16cid="http://schemas.microsoft.com/office/word/2016/wordml/cid" xmlns:w16="http://schemas.microsoft.com/office/word/2018/wordml" xmlns:w16du="http://schemas.microsoft.com/office/word/2023/wordml/word16du" xmlns:w16sdtdh="http://schemas.microsoft.com/office/word/2020/wordml/sdtdatahash" xmlns:w16sdtfl="http://schemas.microsoft.com/office/word/2024/wordml/sdtformatlock" xmlns:w16se="http://schemas.microsoft.com/office/word/2015/wordml/symex" xmlns:wpg="http://schemas.microsoft.com/office/word/2010/wordprocessingGroup" xmlns:wpi="http://schemas.microsoft.com/office/word/2010/wordprocessingInk" xmlns:wne="http://schemas.microsoft.com/office/word/2006/wordml" xmlns:wps="http://schemas.microsoft.com/office/word/2010/wordprocessingShape" mc:Ignorable="w14 w15 w16se w16cid w16 w16cex w16sdtdh w16sdtfl w16du wp14">
+  <w:p>
+    <w:pPr>
+      <w:pStyle w:val="lfej"/>
+    </w:pPr>
+  </w:p>
+  <w:p>
+    <w:pPr>
+      <w:pStyle w:val="lfej"/>
+    </w:pPr>
+  </w:p>
+</w:hdr>
 </file>
 
 <file path=word/numbering.xml><?xml version="1.0" encoding="utf-8"?>
@@ -3755,6 +4504,7 @@
   <w:style w:type="character" w:default="1" w:styleId="Bekezdsalapbettpusa">
     <w:name w:val="Default Paragraph Font"/>
     <w:uiPriority w:val="1"/>
+    <w:semiHidden/>
     <w:unhideWhenUsed/>
   </w:style>
   <w:style w:type="table" w:default="1" w:styleId="Normltblzat">
@@ -4250,6 +5000,86 @@
       <w:szCs w:val="18"/>
     </w:rPr>
   </w:style>
+  <w:style w:type="paragraph" w:customStyle="1" w:styleId="Normlcmsor">
+    <w:name w:val="Normál címsor"/>
+    <w:basedOn w:val="Cmsor2"/>
+    <w:link w:val="NormlcmsorChar"/>
+    <w:qFormat/>
+    <w:rsid w:val="0035100D"/>
+    <w:rPr>
+      <w:b/>
+      <w:color w:val="000000" w:themeColor="text1"/>
+      <w:sz w:val="28"/>
+    </w:rPr>
+  </w:style>
+  <w:style w:type="character" w:customStyle="1" w:styleId="NormlcmsorChar">
+    <w:name w:val="Normál címsor Char"/>
+    <w:basedOn w:val="Bekezdsalapbettpusa"/>
+    <w:link w:val="Normlcmsor"/>
+    <w:rsid w:val="0035100D"/>
+    <w:rPr>
+      <w:rFonts w:ascii="Montserrat" w:eastAsiaTheme="majorEastAsia" w:hAnsi="Montserrat" w:cstheme="majorBidi"/>
+      <w:b/>
+      <w:color w:val="000000" w:themeColor="text1"/>
+      <w:sz w:val="28"/>
+      <w:szCs w:val="32"/>
+    </w:rPr>
+  </w:style>
+  <w:style w:type="paragraph" w:styleId="brajegyzk">
+    <w:name w:val="table of figures"/>
+    <w:basedOn w:val="Norml"/>
+    <w:next w:val="Norml"/>
+    <w:uiPriority w:val="99"/>
+    <w:unhideWhenUsed/>
+    <w:rsid w:val="006974BA"/>
+    <w:pPr>
+      <w:spacing w:after="0"/>
+    </w:pPr>
+  </w:style>
+  <w:style w:type="paragraph" w:styleId="lfej">
+    <w:name w:val="header"/>
+    <w:basedOn w:val="Norml"/>
+    <w:link w:val="lfejChar"/>
+    <w:uiPriority w:val="99"/>
+    <w:unhideWhenUsed/>
+    <w:rsid w:val="00F610D5"/>
+    <w:pPr>
+      <w:tabs>
+        <w:tab w:val="center" w:pos="4536"/>
+        <w:tab w:val="right" w:pos="9072"/>
+      </w:tabs>
+      <w:spacing w:after="0" w:line="240" w:lineRule="auto"/>
+    </w:pPr>
+  </w:style>
+  <w:style w:type="character" w:customStyle="1" w:styleId="lfejChar">
+    <w:name w:val="Élőfej Char"/>
+    <w:basedOn w:val="Bekezdsalapbettpusa"/>
+    <w:link w:val="lfej"/>
+    <w:uiPriority w:val="99"/>
+    <w:rsid w:val="00F610D5"/>
+  </w:style>
+  <w:style w:type="paragraph" w:styleId="llb">
+    <w:name w:val="footer"/>
+    <w:basedOn w:val="Norml"/>
+    <w:link w:val="llbChar"/>
+    <w:uiPriority w:val="99"/>
+    <w:unhideWhenUsed/>
+    <w:rsid w:val="00F610D5"/>
+    <w:pPr>
+      <w:tabs>
+        <w:tab w:val="center" w:pos="4536"/>
+        <w:tab w:val="right" w:pos="9072"/>
+      </w:tabs>
+      <w:spacing w:after="0" w:line="240" w:lineRule="auto"/>
+    </w:pPr>
+  </w:style>
+  <w:style w:type="character" w:customStyle="1" w:styleId="llbChar">
+    <w:name w:val="Élőláb Char"/>
+    <w:basedOn w:val="Bekezdsalapbettpusa"/>
+    <w:link w:val="llb"/>
+    <w:uiPriority w:val="99"/>
+    <w:rsid w:val="00F610D5"/>
+  </w:style>
 </w:styles>
 </file>
 

</xml_diff>

<commit_message>
Applied discussed changes in the documentation
</commit_message>
<xml_diff>
--- a/documentation/documentation.docx
+++ b/documentation/documentation.docx
@@ -77,7 +77,25 @@
                                 <w:sz w:val="30"/>
                                 <w:szCs w:val="30"/>
                               </w:rPr>
-                              <w:t xml:space="preserve"> Nagy Ákos és Bernáth Ábel</w:t>
+                              <w:t xml:space="preserve"> Nagy Ákos</w:t>
+                            </w:r>
+                            <w:r>
+                              <w:rPr>
+                                <w:rFonts w:ascii="Montserrat" w:hAnsi="Montserrat" w:cs="Arial"/>
+                                <w:color w:val="000000" w:themeColor="text1"/>
+                                <w:sz w:val="30"/>
+                                <w:szCs w:val="30"/>
+                              </w:rPr>
+                              <w:t xml:space="preserve"> Attila</w:t>
+                            </w:r>
+                            <w:r>
+                              <w:rPr>
+                                <w:rFonts w:ascii="Montserrat" w:hAnsi="Montserrat" w:cs="Arial"/>
+                                <w:color w:val="000000" w:themeColor="text1"/>
+                                <w:sz w:val="30"/>
+                                <w:szCs w:val="30"/>
+                              </w:rPr>
+                              <w:t xml:space="preserve"> és Bernáth Ábel</w:t>
                             </w:r>
                           </w:p>
                           <w:p>
@@ -152,7 +170,7 @@
                                 <w:sz w:val="30"/>
                                 <w:szCs w:val="30"/>
                               </w:rPr>
-                              <w:t>Wilhelm Zsolt Ádám</w:t>
+                              <w:t>Tóth Szilárd Attila</w:t>
                             </w:r>
                           </w:p>
                           <w:p>
@@ -172,7 +190,7 @@
                                 <w:sz w:val="30"/>
                                 <w:szCs w:val="30"/>
                               </w:rPr>
-                              <w:t>Tóth Szilárd Attila</w:t>
+                              <w:t>Wilhelm Zsolt Ádám</w:t>
                             </w:r>
                           </w:p>
                           <w:p>
@@ -287,7 +305,25 @@
                           <w:sz w:val="30"/>
                           <w:szCs w:val="30"/>
                         </w:rPr>
-                        <w:t xml:space="preserve"> Nagy Ákos és Bernáth Ábel</w:t>
+                        <w:t xml:space="preserve"> Nagy Ákos</w:t>
+                      </w:r>
+                      <w:r>
+                        <w:rPr>
+                          <w:rFonts w:ascii="Montserrat" w:hAnsi="Montserrat" w:cs="Arial"/>
+                          <w:color w:val="000000" w:themeColor="text1"/>
+                          <w:sz w:val="30"/>
+                          <w:szCs w:val="30"/>
+                        </w:rPr>
+                        <w:t xml:space="preserve"> Attila</w:t>
+                      </w:r>
+                      <w:r>
+                        <w:rPr>
+                          <w:rFonts w:ascii="Montserrat" w:hAnsi="Montserrat" w:cs="Arial"/>
+                          <w:color w:val="000000" w:themeColor="text1"/>
+                          <w:sz w:val="30"/>
+                          <w:szCs w:val="30"/>
+                        </w:rPr>
+                        <w:t xml:space="preserve"> és Bernáth Ábel</w:t>
                       </w:r>
                     </w:p>
                     <w:p>
@@ -362,7 +398,7 @@
                           <w:sz w:val="30"/>
                           <w:szCs w:val="30"/>
                         </w:rPr>
-                        <w:t>Wilhelm Zsolt Ádám</w:t>
+                        <w:t>Tóth Szilárd Attila</w:t>
                       </w:r>
                     </w:p>
                     <w:p>
@@ -382,7 +418,7 @@
                           <w:sz w:val="30"/>
                           <w:szCs w:val="30"/>
                         </w:rPr>
-                        <w:t>Tóth Szilárd Attila</w:t>
+                        <w:t>Wilhelm Zsolt Ádám</w:t>
                       </w:r>
                     </w:p>
                     <w:p>
@@ -849,937 +885,586 @@
           </mc:Fallback>
         </mc:AlternateContent>
       </w:r>
+      <w:bookmarkStart w:id="0" w:name="_Toc214722123"/>
     </w:p>
-    <w:bookmarkStart w:id="0" w:name="_Toc214722123" w:displacedByCustomXml="next"/>
-    <w:sdt>
-      <w:sdtPr>
+    <w:bookmarkStart w:id="1" w:name="_Toc216365007"/>
+    <w:p>
+      <w:pPr>
+        <w:pStyle w:val="TJ1"/>
+        <w:tabs>
+          <w:tab w:val="left" w:pos="480"/>
+          <w:tab w:val="right" w:leader="dot" w:pos="9062"/>
+        </w:tabs>
         <w:rPr>
-          <w:rFonts w:asciiTheme="minorHAnsi" w:eastAsiaTheme="minorHAnsi" w:hAnsiTheme="minorHAnsi" w:cstheme="minorBidi"/>
+          <w:rFonts w:eastAsiaTheme="minorEastAsia"/>
           <w:b w:val="0"/>
-          <w:color w:val="auto"/>
-          <w:kern w:val="2"/>
+          <w:bCs w:val="0"/>
+          <w:caps w:val="0"/>
+          <w:noProof/>
           <w:sz w:val="24"/>
           <w:szCs w:val="24"/>
-          <w:lang w:val="hu-HU"/>
-          <w14:ligatures w14:val="standardContextual"/>
+          <w:lang w:eastAsia="hu-HU"/>
         </w:rPr>
-        <w:id w:val="1867016788"/>
-        <w:docPartObj>
-          <w:docPartGallery w:val="Table of Contents"/>
-          <w:docPartUnique/>
-        </w:docPartObj>
-      </w:sdtPr>
-      <w:sdtEndPr>
+      </w:pPr>
+      <w:r>
+        <w:lastRenderedPageBreak/>
+        <w:fldChar w:fldCharType="begin"/>
+      </w:r>
+      <w:r>
+        <w:instrText xml:space="preserve"> TOC \o "1-1" \h \z \u \t "Címsor 2;2" </w:instrText>
+      </w:r>
+      <w:r>
+        <w:fldChar w:fldCharType="separate"/>
+      </w:r>
+      <w:hyperlink w:anchor="_Toc216365068" w:history="1">
+        <w:r>
+          <w:rPr>
+            <w:rStyle w:val="Hiperhivatkozs"/>
+            <w:noProof/>
+          </w:rPr>
+          <w:t>1.</w:t>
+        </w:r>
+        <w:r>
+          <w:rPr>
+            <w:rFonts w:eastAsiaTheme="minorEastAsia"/>
+            <w:b w:val="0"/>
+            <w:bCs w:val="0"/>
+            <w:caps w:val="0"/>
+            <w:noProof/>
+            <w:sz w:val="24"/>
+            <w:szCs w:val="24"/>
+            <w:lang w:eastAsia="hu-HU"/>
+          </w:rPr>
+          <w:tab/>
+        </w:r>
+        <w:r>
+          <w:rPr>
+            <w:rStyle w:val="Hiperhivatkozs"/>
+            <w:noProof/>
+          </w:rPr>
+          <w:t>Bevezetés</w:t>
+        </w:r>
+        <w:r>
+          <w:rPr>
+            <w:noProof/>
+            <w:webHidden/>
+          </w:rPr>
+          <w:tab/>
+        </w:r>
+        <w:r>
+          <w:rPr>
+            <w:noProof/>
+            <w:webHidden/>
+          </w:rPr>
+          <w:fldChar w:fldCharType="begin"/>
+        </w:r>
+        <w:r>
+          <w:rPr>
+            <w:noProof/>
+            <w:webHidden/>
+          </w:rPr>
+          <w:instrText xml:space="preserve"> PAGEREF _Toc216365068 \h </w:instrText>
+        </w:r>
+        <w:r>
+          <w:rPr>
+            <w:noProof/>
+            <w:webHidden/>
+          </w:rPr>
+        </w:r>
+        <w:r>
+          <w:rPr>
+            <w:noProof/>
+            <w:webHidden/>
+          </w:rPr>
+          <w:fldChar w:fldCharType="separate"/>
+        </w:r>
+        <w:r>
+          <w:rPr>
+            <w:noProof/>
+            <w:webHidden/>
+          </w:rPr>
+          <w:t>3</w:t>
+        </w:r>
+        <w:r>
+          <w:rPr>
+            <w:noProof/>
+            <w:webHidden/>
+          </w:rPr>
+          <w:fldChar w:fldCharType="end"/>
+        </w:r>
+      </w:hyperlink>
+    </w:p>
+    <w:p>
+      <w:pPr>
+        <w:pStyle w:val="TJ2"/>
+        <w:tabs>
+          <w:tab w:val="left" w:pos="960"/>
+          <w:tab w:val="right" w:leader="dot" w:pos="9062"/>
+        </w:tabs>
         <w:rPr>
-          <w:bCs/>
+          <w:rFonts w:eastAsiaTheme="minorEastAsia"/>
+          <w:smallCaps w:val="0"/>
+          <w:noProof/>
+          <w:sz w:val="24"/>
+          <w:szCs w:val="24"/>
+          <w:lang w:eastAsia="hu-HU"/>
         </w:rPr>
-      </w:sdtEndPr>
-      <w:sdtContent>
-        <w:p>
-          <w:pPr>
-            <w:pStyle w:val="Tartalomjegyzkcmsora"/>
-          </w:pPr>
-          <w:r>
-            <w:rPr>
-              <w:lang w:val="hu-HU"/>
-            </w:rPr>
-            <w:t>Tartalomjegyzék</w:t>
-          </w:r>
-        </w:p>
-        <w:p>
-          <w:pPr>
-            <w:pStyle w:val="TJ1"/>
-            <w:tabs>
-              <w:tab w:val="left" w:pos="480"/>
-              <w:tab w:val="right" w:leader="dot" w:pos="9062"/>
-            </w:tabs>
-            <w:rPr>
-              <w:rFonts w:eastAsiaTheme="minorEastAsia"/>
-              <w:noProof/>
-              <w:lang w:eastAsia="hu-HU"/>
-            </w:rPr>
-          </w:pPr>
-          <w:r>
-            <w:fldChar w:fldCharType="begin"/>
-          </w:r>
-          <w:r>
-            <w:instrText xml:space="preserve"> TOC \o "1-3" \h \z \u </w:instrText>
-          </w:r>
-          <w:r>
-            <w:fldChar w:fldCharType="separate"/>
-          </w:r>
-          <w:hyperlink w:anchor="_Toc215832361" w:history="1">
-            <w:r>
-              <w:rPr>
-                <w:rStyle w:val="Hiperhivatkozs"/>
-                <w:noProof/>
-              </w:rPr>
-              <w:t>1.</w:t>
-            </w:r>
-            <w:r>
-              <w:rPr>
-                <w:rFonts w:eastAsiaTheme="minorEastAsia"/>
-                <w:noProof/>
-                <w:lang w:eastAsia="hu-HU"/>
-              </w:rPr>
-              <w:tab/>
-            </w:r>
-            <w:r>
-              <w:rPr>
-                <w:rStyle w:val="Hiperhivatkozs"/>
-                <w:noProof/>
-              </w:rPr>
-              <w:t>Bevezetés</w:t>
-            </w:r>
-            <w:r>
-              <w:rPr>
-                <w:noProof/>
-                <w:webHidden/>
-              </w:rPr>
-              <w:tab/>
-            </w:r>
-            <w:r>
-              <w:rPr>
-                <w:noProof/>
-                <w:webHidden/>
-              </w:rPr>
-              <w:fldChar w:fldCharType="begin"/>
-            </w:r>
-            <w:r>
-              <w:rPr>
-                <w:noProof/>
-                <w:webHidden/>
-              </w:rPr>
-              <w:instrText xml:space="preserve"> PAGEREF _Toc215832361 \h </w:instrText>
-            </w:r>
-            <w:r>
-              <w:rPr>
-                <w:noProof/>
-                <w:webHidden/>
-              </w:rPr>
-            </w:r>
-            <w:r>
-              <w:rPr>
-                <w:noProof/>
-                <w:webHidden/>
-              </w:rPr>
-              <w:fldChar w:fldCharType="separate"/>
-            </w:r>
-            <w:r>
-              <w:rPr>
-                <w:noProof/>
-                <w:webHidden/>
-              </w:rPr>
-              <w:t>3</w:t>
-            </w:r>
-            <w:r>
-              <w:rPr>
-                <w:noProof/>
-                <w:webHidden/>
-              </w:rPr>
-              <w:fldChar w:fldCharType="end"/>
-            </w:r>
-          </w:hyperlink>
-        </w:p>
-        <w:p>
-          <w:pPr>
-            <w:pStyle w:val="TJ2"/>
-            <w:tabs>
-              <w:tab w:val="left" w:pos="960"/>
-              <w:tab w:val="right" w:leader="dot" w:pos="9062"/>
-            </w:tabs>
-            <w:rPr>
-              <w:rFonts w:eastAsiaTheme="minorEastAsia"/>
-              <w:noProof/>
-              <w:lang w:eastAsia="hu-HU"/>
-            </w:rPr>
-          </w:pPr>
-          <w:hyperlink w:anchor="_Toc215832362" w:history="1">
-            <w:r>
-              <w:rPr>
-                <w:rStyle w:val="Hiperhivatkozs"/>
-                <w:noProof/>
-              </w:rPr>
-              <w:t>1.1</w:t>
-            </w:r>
-            <w:r>
-              <w:rPr>
-                <w:rFonts w:eastAsiaTheme="minorEastAsia"/>
-                <w:noProof/>
-                <w:lang w:eastAsia="hu-HU"/>
-              </w:rPr>
-              <w:tab/>
-            </w:r>
-            <w:r>
-              <w:rPr>
-                <w:rStyle w:val="Hiperhivatkozs"/>
-                <w:noProof/>
-              </w:rPr>
-              <w:t>A projekt célja</w:t>
-            </w:r>
-            <w:r>
-              <w:rPr>
-                <w:noProof/>
-                <w:webHidden/>
-              </w:rPr>
-              <w:tab/>
-            </w:r>
-            <w:r>
-              <w:rPr>
-                <w:noProof/>
-                <w:webHidden/>
-              </w:rPr>
-              <w:fldChar w:fldCharType="begin"/>
-            </w:r>
-            <w:r>
-              <w:rPr>
-                <w:noProof/>
-                <w:webHidden/>
-              </w:rPr>
-              <w:instrText xml:space="preserve"> PAGEREF _Toc215832362 \h </w:instrText>
-            </w:r>
-            <w:r>
-              <w:rPr>
-                <w:noProof/>
-                <w:webHidden/>
-              </w:rPr>
-            </w:r>
-            <w:r>
-              <w:rPr>
-                <w:noProof/>
-                <w:webHidden/>
-              </w:rPr>
-              <w:fldChar w:fldCharType="separate"/>
-            </w:r>
-            <w:r>
-              <w:rPr>
-                <w:noProof/>
-                <w:webHidden/>
-              </w:rPr>
-              <w:t>3</w:t>
-            </w:r>
-            <w:r>
-              <w:rPr>
-                <w:noProof/>
-                <w:webHidden/>
-              </w:rPr>
-              <w:fldChar w:fldCharType="end"/>
-            </w:r>
-          </w:hyperlink>
-        </w:p>
-        <w:p>
-          <w:pPr>
-            <w:pStyle w:val="TJ2"/>
-            <w:tabs>
-              <w:tab w:val="left" w:pos="960"/>
-              <w:tab w:val="right" w:leader="dot" w:pos="9062"/>
-            </w:tabs>
-            <w:rPr>
-              <w:rFonts w:eastAsiaTheme="minorEastAsia"/>
-              <w:noProof/>
-              <w:lang w:eastAsia="hu-HU"/>
-            </w:rPr>
-          </w:pPr>
-          <w:hyperlink w:anchor="_Toc215832363" w:history="1">
-            <w:r>
-              <w:rPr>
-                <w:rStyle w:val="Hiperhivatkozs"/>
-                <w:noProof/>
-              </w:rPr>
-              <w:t>1.2</w:t>
-            </w:r>
-            <w:r>
-              <w:rPr>
-                <w:rFonts w:eastAsiaTheme="minorEastAsia"/>
-                <w:noProof/>
-                <w:lang w:eastAsia="hu-HU"/>
-              </w:rPr>
-              <w:tab/>
-            </w:r>
-            <w:r>
-              <w:rPr>
-                <w:rStyle w:val="Hiperhivatkozs"/>
-                <w:noProof/>
-              </w:rPr>
-              <w:t>A projekt tervezete</w:t>
-            </w:r>
-            <w:r>
-              <w:rPr>
-                <w:noProof/>
-                <w:webHidden/>
-              </w:rPr>
-              <w:tab/>
-            </w:r>
-            <w:r>
-              <w:rPr>
-                <w:noProof/>
-                <w:webHidden/>
-              </w:rPr>
-              <w:fldChar w:fldCharType="begin"/>
-            </w:r>
-            <w:r>
-              <w:rPr>
-                <w:noProof/>
-                <w:webHidden/>
-              </w:rPr>
-              <w:instrText xml:space="preserve"> PAGEREF _Toc215832363 \h </w:instrText>
-            </w:r>
-            <w:r>
-              <w:rPr>
-                <w:noProof/>
-                <w:webHidden/>
-              </w:rPr>
-            </w:r>
-            <w:r>
-              <w:rPr>
-                <w:noProof/>
-                <w:webHidden/>
-              </w:rPr>
-              <w:fldChar w:fldCharType="separate"/>
-            </w:r>
-            <w:r>
-              <w:rPr>
-                <w:noProof/>
-                <w:webHidden/>
-              </w:rPr>
-              <w:t>3</w:t>
-            </w:r>
-            <w:r>
-              <w:rPr>
-                <w:noProof/>
-                <w:webHidden/>
-              </w:rPr>
-              <w:fldChar w:fldCharType="end"/>
-            </w:r>
-          </w:hyperlink>
-        </w:p>
-        <w:p>
-          <w:pPr>
-            <w:pStyle w:val="TJ2"/>
-            <w:tabs>
-              <w:tab w:val="right" w:leader="dot" w:pos="9062"/>
-            </w:tabs>
-            <w:rPr>
-              <w:rFonts w:eastAsiaTheme="minorEastAsia"/>
-              <w:noProof/>
-              <w:lang w:eastAsia="hu-HU"/>
-            </w:rPr>
-          </w:pPr>
-          <w:hyperlink w:anchor="_Toc215832364" w:history="1">
-            <w:r>
-              <w:rPr>
-                <w:rStyle w:val="Hiperhivatkozs"/>
-                <w:i/>
-                <w:iCs/>
-                <w:noProof/>
-              </w:rPr>
-              <w:t>Webalkalmazás</w:t>
-            </w:r>
-            <w:r>
-              <w:rPr>
-                <w:noProof/>
-                <w:webHidden/>
-              </w:rPr>
-              <w:tab/>
-            </w:r>
-            <w:r>
-              <w:rPr>
-                <w:noProof/>
-                <w:webHidden/>
-              </w:rPr>
-              <w:fldChar w:fldCharType="begin"/>
-            </w:r>
-            <w:r>
-              <w:rPr>
-                <w:noProof/>
-                <w:webHidden/>
-              </w:rPr>
-              <w:instrText xml:space="preserve"> PAGEREF _Toc215832364 \h </w:instrText>
-            </w:r>
-            <w:r>
-              <w:rPr>
-                <w:noProof/>
-                <w:webHidden/>
-              </w:rPr>
-            </w:r>
-            <w:r>
-              <w:rPr>
-                <w:noProof/>
-                <w:webHidden/>
-              </w:rPr>
-              <w:fldChar w:fldCharType="separate"/>
-            </w:r>
-            <w:r>
-              <w:rPr>
-                <w:noProof/>
-                <w:webHidden/>
-              </w:rPr>
-              <w:t>3</w:t>
-            </w:r>
-            <w:r>
-              <w:rPr>
-                <w:noProof/>
-                <w:webHidden/>
-              </w:rPr>
-              <w:fldChar w:fldCharType="end"/>
-            </w:r>
-          </w:hyperlink>
-        </w:p>
-        <w:p>
-          <w:pPr>
-            <w:pStyle w:val="TJ2"/>
-            <w:tabs>
-              <w:tab w:val="right" w:leader="dot" w:pos="9062"/>
-            </w:tabs>
-            <w:rPr>
-              <w:rFonts w:eastAsiaTheme="minorEastAsia"/>
-              <w:noProof/>
-              <w:lang w:eastAsia="hu-HU"/>
-            </w:rPr>
-          </w:pPr>
-          <w:hyperlink w:anchor="_Toc215832365" w:history="1">
-            <w:r>
-              <w:rPr>
-                <w:rStyle w:val="Hiperhivatkozs"/>
-                <w:noProof/>
-              </w:rPr>
-              <w:t>Asztali alkalmazás</w:t>
-            </w:r>
-            <w:r>
-              <w:rPr>
-                <w:noProof/>
-                <w:webHidden/>
-              </w:rPr>
-              <w:tab/>
-            </w:r>
-            <w:r>
-              <w:rPr>
-                <w:noProof/>
-                <w:webHidden/>
-              </w:rPr>
-              <w:fldChar w:fldCharType="begin"/>
-            </w:r>
-            <w:r>
-              <w:rPr>
-                <w:noProof/>
-                <w:webHidden/>
-              </w:rPr>
-              <w:instrText xml:space="preserve"> PAGEREF _Toc215832365 \h </w:instrText>
-            </w:r>
-            <w:r>
-              <w:rPr>
-                <w:noProof/>
-                <w:webHidden/>
-              </w:rPr>
-            </w:r>
-            <w:r>
-              <w:rPr>
-                <w:noProof/>
-                <w:webHidden/>
-              </w:rPr>
-              <w:fldChar w:fldCharType="separate"/>
-            </w:r>
-            <w:r>
-              <w:rPr>
-                <w:noProof/>
-                <w:webHidden/>
-              </w:rPr>
-              <w:t>3</w:t>
-            </w:r>
-            <w:r>
-              <w:rPr>
-                <w:noProof/>
-                <w:webHidden/>
-              </w:rPr>
-              <w:fldChar w:fldCharType="end"/>
-            </w:r>
-          </w:hyperlink>
-        </w:p>
-        <w:p>
-          <w:pPr>
-            <w:pStyle w:val="TJ2"/>
-            <w:tabs>
-              <w:tab w:val="right" w:leader="dot" w:pos="9062"/>
-            </w:tabs>
-            <w:rPr>
-              <w:rFonts w:eastAsiaTheme="minorEastAsia"/>
-              <w:noProof/>
-              <w:lang w:eastAsia="hu-HU"/>
-            </w:rPr>
-          </w:pPr>
-          <w:hyperlink w:anchor="_Toc215832366" w:history="1">
-            <w:r>
-              <w:rPr>
-                <w:rStyle w:val="Hiperhivatkozs"/>
-                <w:noProof/>
-              </w:rPr>
-              <w:t>Mobil alkalmazás terve</w:t>
-            </w:r>
-            <w:r>
-              <w:rPr>
-                <w:noProof/>
-                <w:webHidden/>
-              </w:rPr>
-              <w:tab/>
-            </w:r>
-            <w:r>
-              <w:rPr>
-                <w:noProof/>
-                <w:webHidden/>
-              </w:rPr>
-              <w:fldChar w:fldCharType="begin"/>
-            </w:r>
-            <w:r>
-              <w:rPr>
-                <w:noProof/>
-                <w:webHidden/>
-              </w:rPr>
-              <w:instrText xml:space="preserve"> PAGEREF _Toc215832366 \h </w:instrText>
-            </w:r>
-            <w:r>
-              <w:rPr>
-                <w:noProof/>
-                <w:webHidden/>
-              </w:rPr>
-            </w:r>
-            <w:r>
-              <w:rPr>
-                <w:noProof/>
-                <w:webHidden/>
-              </w:rPr>
-              <w:fldChar w:fldCharType="separate"/>
-            </w:r>
-            <w:r>
-              <w:rPr>
-                <w:noProof/>
-                <w:webHidden/>
-              </w:rPr>
-              <w:t>3</w:t>
-            </w:r>
-            <w:r>
-              <w:rPr>
-                <w:noProof/>
-                <w:webHidden/>
-              </w:rPr>
-              <w:fldChar w:fldCharType="end"/>
-            </w:r>
-          </w:hyperlink>
-        </w:p>
-        <w:p>
-          <w:pPr>
-            <w:pStyle w:val="TJ2"/>
-            <w:tabs>
-              <w:tab w:val="right" w:leader="dot" w:pos="9062"/>
-            </w:tabs>
-            <w:rPr>
-              <w:rFonts w:eastAsiaTheme="minorEastAsia"/>
-              <w:noProof/>
-              <w:lang w:eastAsia="hu-HU"/>
-            </w:rPr>
-          </w:pPr>
-          <w:hyperlink w:anchor="_Toc215832367" w:history="1">
-            <w:r>
-              <w:rPr>
-                <w:rStyle w:val="Hiperhivatkozs"/>
-                <w:noProof/>
-              </w:rPr>
-              <w:t>Adatbázis</w:t>
-            </w:r>
-            <w:r>
-              <w:rPr>
-                <w:noProof/>
-                <w:webHidden/>
-              </w:rPr>
-              <w:tab/>
-            </w:r>
-            <w:r>
-              <w:rPr>
-                <w:noProof/>
-                <w:webHidden/>
-              </w:rPr>
-              <w:fldChar w:fldCharType="begin"/>
-            </w:r>
-            <w:r>
-              <w:rPr>
-                <w:noProof/>
-                <w:webHidden/>
-              </w:rPr>
-              <w:instrText xml:space="preserve"> PAGEREF _Toc215832367 \h </w:instrText>
-            </w:r>
-            <w:r>
-              <w:rPr>
-                <w:noProof/>
-                <w:webHidden/>
-              </w:rPr>
-            </w:r>
-            <w:r>
-              <w:rPr>
-                <w:noProof/>
-                <w:webHidden/>
-              </w:rPr>
-              <w:fldChar w:fldCharType="separate"/>
-            </w:r>
-            <w:r>
-              <w:rPr>
-                <w:noProof/>
-                <w:webHidden/>
-              </w:rPr>
-              <w:t>3</w:t>
-            </w:r>
-            <w:r>
-              <w:rPr>
-                <w:noProof/>
-                <w:webHidden/>
-              </w:rPr>
-              <w:fldChar w:fldCharType="end"/>
-            </w:r>
-          </w:hyperlink>
-        </w:p>
-        <w:p>
-          <w:pPr>
-            <w:pStyle w:val="TJ2"/>
-            <w:tabs>
-              <w:tab w:val="right" w:leader="dot" w:pos="9062"/>
-            </w:tabs>
-            <w:rPr>
-              <w:rFonts w:eastAsiaTheme="minorEastAsia"/>
-              <w:noProof/>
-              <w:lang w:eastAsia="hu-HU"/>
-            </w:rPr>
-          </w:pPr>
-          <w:hyperlink w:anchor="_Toc215832368" w:history="1">
-            <w:r>
-              <w:rPr>
-                <w:rStyle w:val="Hiperhivatkozs"/>
-                <w:noProof/>
-              </w:rPr>
-              <w:t>Fejlesztés</w:t>
-            </w:r>
-            <w:r>
-              <w:rPr>
-                <w:noProof/>
-                <w:webHidden/>
-              </w:rPr>
-              <w:tab/>
-            </w:r>
-            <w:r>
-              <w:rPr>
-                <w:noProof/>
-                <w:webHidden/>
-              </w:rPr>
-              <w:fldChar w:fldCharType="begin"/>
-            </w:r>
-            <w:r>
-              <w:rPr>
-                <w:noProof/>
-                <w:webHidden/>
-              </w:rPr>
-              <w:instrText xml:space="preserve"> PAGEREF _Toc215832368 \h </w:instrText>
-            </w:r>
-            <w:r>
-              <w:rPr>
-                <w:noProof/>
-                <w:webHidden/>
-              </w:rPr>
-            </w:r>
-            <w:r>
-              <w:rPr>
-                <w:noProof/>
-                <w:webHidden/>
-              </w:rPr>
-              <w:fldChar w:fldCharType="separate"/>
-            </w:r>
-            <w:r>
-              <w:rPr>
-                <w:noProof/>
-                <w:webHidden/>
-              </w:rPr>
-              <w:t>4</w:t>
-            </w:r>
-            <w:r>
-              <w:rPr>
-                <w:noProof/>
-                <w:webHidden/>
-              </w:rPr>
-              <w:fldChar w:fldCharType="end"/>
-            </w:r>
-          </w:hyperlink>
-        </w:p>
-        <w:p>
-          <w:pPr>
-            <w:pStyle w:val="TJ2"/>
-            <w:tabs>
-              <w:tab w:val="left" w:pos="960"/>
-              <w:tab w:val="right" w:leader="dot" w:pos="9062"/>
-            </w:tabs>
-            <w:rPr>
-              <w:rFonts w:eastAsiaTheme="minorEastAsia"/>
-              <w:noProof/>
-              <w:lang w:eastAsia="hu-HU"/>
-            </w:rPr>
-          </w:pPr>
-          <w:hyperlink w:anchor="_Toc215832369" w:history="1">
-            <w:r>
-              <w:rPr>
-                <w:rStyle w:val="Hiperhivatkozs"/>
-                <w:noProof/>
-              </w:rPr>
-              <w:t>1.2</w:t>
-            </w:r>
-            <w:r>
-              <w:rPr>
-                <w:rFonts w:eastAsiaTheme="minorEastAsia"/>
-                <w:noProof/>
-                <w:lang w:eastAsia="hu-HU"/>
-              </w:rPr>
-              <w:tab/>
-            </w:r>
-            <w:r>
-              <w:rPr>
-                <w:rStyle w:val="Hiperhivatkozs"/>
-                <w:noProof/>
-              </w:rPr>
-              <w:t>SWOT analízis</w:t>
-            </w:r>
-            <w:r>
-              <w:rPr>
-                <w:noProof/>
-                <w:webHidden/>
-              </w:rPr>
-              <w:tab/>
-            </w:r>
-            <w:r>
-              <w:rPr>
-                <w:noProof/>
-                <w:webHidden/>
-              </w:rPr>
-              <w:fldChar w:fldCharType="begin"/>
-            </w:r>
-            <w:r>
-              <w:rPr>
-                <w:noProof/>
-                <w:webHidden/>
-              </w:rPr>
-              <w:instrText xml:space="preserve"> PAGEREF _Toc215832369 \h </w:instrText>
-            </w:r>
-            <w:r>
-              <w:rPr>
-                <w:noProof/>
-                <w:webHidden/>
-              </w:rPr>
-            </w:r>
-            <w:r>
-              <w:rPr>
-                <w:noProof/>
-                <w:webHidden/>
-              </w:rPr>
-              <w:fldChar w:fldCharType="separate"/>
-            </w:r>
-            <w:r>
-              <w:rPr>
-                <w:noProof/>
-                <w:webHidden/>
-              </w:rPr>
-              <w:t>4</w:t>
-            </w:r>
-            <w:r>
-              <w:rPr>
-                <w:noProof/>
-                <w:webHidden/>
-              </w:rPr>
-              <w:fldChar w:fldCharType="end"/>
-            </w:r>
-          </w:hyperlink>
-        </w:p>
-        <w:p>
-          <w:pPr>
-            <w:pStyle w:val="TJ2"/>
-            <w:tabs>
-              <w:tab w:val="left" w:pos="960"/>
-              <w:tab w:val="right" w:leader="dot" w:pos="9062"/>
-            </w:tabs>
-            <w:rPr>
-              <w:rFonts w:eastAsiaTheme="minorEastAsia"/>
-              <w:noProof/>
-              <w:lang w:eastAsia="hu-HU"/>
-            </w:rPr>
-          </w:pPr>
-          <w:hyperlink w:anchor="_Toc215832370" w:history="1">
-            <w:r>
-              <w:rPr>
-                <w:rStyle w:val="Hiperhivatkozs"/>
-                <w:noProof/>
-              </w:rPr>
-              <w:t>1.3</w:t>
-            </w:r>
-            <w:r>
-              <w:rPr>
-                <w:rFonts w:eastAsiaTheme="minorEastAsia"/>
-                <w:noProof/>
-                <w:lang w:eastAsia="hu-HU"/>
-              </w:rPr>
-              <w:tab/>
-            </w:r>
-            <w:r>
-              <w:rPr>
-                <w:rStyle w:val="Hiperhivatkozs"/>
-                <w:noProof/>
-              </w:rPr>
-              <w:t>Gantt diagram</w:t>
-            </w:r>
-            <w:r>
-              <w:rPr>
-                <w:noProof/>
-                <w:webHidden/>
-              </w:rPr>
-              <w:tab/>
-            </w:r>
-            <w:r>
-              <w:rPr>
-                <w:noProof/>
-                <w:webHidden/>
-              </w:rPr>
-              <w:fldChar w:fldCharType="begin"/>
-            </w:r>
-            <w:r>
-              <w:rPr>
-                <w:noProof/>
-                <w:webHidden/>
-              </w:rPr>
-              <w:instrText xml:space="preserve"> PAGEREF _Toc215832370 \h </w:instrText>
-            </w:r>
-            <w:r>
-              <w:rPr>
-                <w:noProof/>
-                <w:webHidden/>
-              </w:rPr>
-            </w:r>
-            <w:r>
-              <w:rPr>
-                <w:noProof/>
-                <w:webHidden/>
-              </w:rPr>
-              <w:fldChar w:fldCharType="separate"/>
-            </w:r>
-            <w:r>
-              <w:rPr>
-                <w:noProof/>
-                <w:webHidden/>
-              </w:rPr>
-              <w:t>5</w:t>
-            </w:r>
-            <w:r>
-              <w:rPr>
-                <w:noProof/>
-                <w:webHidden/>
-              </w:rPr>
-              <w:fldChar w:fldCharType="end"/>
-            </w:r>
-          </w:hyperlink>
-        </w:p>
-        <w:p>
-          <w:pPr>
-            <w:pStyle w:val="TJ2"/>
-            <w:tabs>
-              <w:tab w:val="left" w:pos="960"/>
-              <w:tab w:val="right" w:leader="dot" w:pos="9062"/>
-            </w:tabs>
-            <w:rPr>
-              <w:rFonts w:eastAsiaTheme="minorEastAsia"/>
-              <w:noProof/>
-              <w:lang w:eastAsia="hu-HU"/>
-            </w:rPr>
-          </w:pPr>
-          <w:hyperlink w:anchor="_Toc215832371" w:history="1">
-            <w:r>
-              <w:rPr>
-                <w:rStyle w:val="Hiperhivatkozs"/>
-                <w:noProof/>
-              </w:rPr>
-              <w:t>1.4</w:t>
-            </w:r>
-            <w:r>
-              <w:rPr>
-                <w:rFonts w:eastAsiaTheme="minorEastAsia"/>
-                <w:noProof/>
-                <w:lang w:eastAsia="hu-HU"/>
-              </w:rPr>
-              <w:tab/>
-            </w:r>
-            <w:r>
-              <w:rPr>
-                <w:rStyle w:val="Hiperhivatkozs"/>
-                <w:noProof/>
-              </w:rPr>
-              <w:t>Wireframe</w:t>
-            </w:r>
-            <w:r>
-              <w:rPr>
-                <w:noProof/>
-                <w:webHidden/>
-              </w:rPr>
-              <w:tab/>
-            </w:r>
-            <w:r>
-              <w:rPr>
-                <w:noProof/>
-                <w:webHidden/>
-              </w:rPr>
-              <w:fldChar w:fldCharType="begin"/>
-            </w:r>
-            <w:r>
-              <w:rPr>
-                <w:noProof/>
-                <w:webHidden/>
-              </w:rPr>
-              <w:instrText xml:space="preserve"> PAGEREF _Toc215832371 \h </w:instrText>
-            </w:r>
-            <w:r>
-              <w:rPr>
-                <w:noProof/>
-                <w:webHidden/>
-              </w:rPr>
-            </w:r>
-            <w:r>
-              <w:rPr>
-                <w:noProof/>
-                <w:webHidden/>
-              </w:rPr>
-              <w:fldChar w:fldCharType="separate"/>
-            </w:r>
-            <w:r>
-              <w:rPr>
-                <w:noProof/>
-                <w:webHidden/>
-              </w:rPr>
-              <w:t>5</w:t>
-            </w:r>
-            <w:r>
-              <w:rPr>
-                <w:noProof/>
-                <w:webHidden/>
-              </w:rPr>
-              <w:fldChar w:fldCharType="end"/>
-            </w:r>
-          </w:hyperlink>
-        </w:p>
-        <w:p>
-          <w:r>
-            <w:rPr>
-              <w:b/>
-              <w:bCs/>
-            </w:rPr>
-            <w:fldChar w:fldCharType="end"/>
-          </w:r>
-        </w:p>
-      </w:sdtContent>
-    </w:sdt>
+      </w:pPr>
+      <w:hyperlink w:anchor="_Toc216365069" w:history="1">
+        <w:r>
+          <w:rPr>
+            <w:rStyle w:val="Hiperhivatkozs"/>
+            <w:noProof/>
+          </w:rPr>
+          <w:t>1.1</w:t>
+        </w:r>
+        <w:r>
+          <w:rPr>
+            <w:rFonts w:eastAsiaTheme="minorEastAsia"/>
+            <w:smallCaps w:val="0"/>
+            <w:noProof/>
+            <w:sz w:val="24"/>
+            <w:szCs w:val="24"/>
+            <w:lang w:eastAsia="hu-HU"/>
+          </w:rPr>
+          <w:tab/>
+        </w:r>
+        <w:r>
+          <w:rPr>
+            <w:rStyle w:val="Hiperhivatkozs"/>
+            <w:noProof/>
+          </w:rPr>
+          <w:t>A projekt célja</w:t>
+        </w:r>
+        <w:r>
+          <w:rPr>
+            <w:noProof/>
+            <w:webHidden/>
+          </w:rPr>
+          <w:tab/>
+        </w:r>
+        <w:r>
+          <w:rPr>
+            <w:noProof/>
+            <w:webHidden/>
+          </w:rPr>
+          <w:fldChar w:fldCharType="begin"/>
+        </w:r>
+        <w:r>
+          <w:rPr>
+            <w:noProof/>
+            <w:webHidden/>
+          </w:rPr>
+          <w:instrText xml:space="preserve"> PAGEREF _Toc216365069 \h </w:instrText>
+        </w:r>
+        <w:r>
+          <w:rPr>
+            <w:noProof/>
+            <w:webHidden/>
+          </w:rPr>
+        </w:r>
+        <w:r>
+          <w:rPr>
+            <w:noProof/>
+            <w:webHidden/>
+          </w:rPr>
+          <w:fldChar w:fldCharType="separate"/>
+        </w:r>
+        <w:r>
+          <w:rPr>
+            <w:noProof/>
+            <w:webHidden/>
+          </w:rPr>
+          <w:t>3</w:t>
+        </w:r>
+        <w:r>
+          <w:rPr>
+            <w:noProof/>
+            <w:webHidden/>
+          </w:rPr>
+          <w:fldChar w:fldCharType="end"/>
+        </w:r>
+      </w:hyperlink>
+    </w:p>
+    <w:p>
+      <w:pPr>
+        <w:pStyle w:val="TJ2"/>
+        <w:tabs>
+          <w:tab w:val="left" w:pos="960"/>
+          <w:tab w:val="right" w:leader="dot" w:pos="9062"/>
+        </w:tabs>
+        <w:rPr>
+          <w:rFonts w:eastAsiaTheme="minorEastAsia"/>
+          <w:smallCaps w:val="0"/>
+          <w:noProof/>
+          <w:sz w:val="24"/>
+          <w:szCs w:val="24"/>
+          <w:lang w:eastAsia="hu-HU"/>
+        </w:rPr>
+      </w:pPr>
+      <w:hyperlink w:anchor="_Toc216365070" w:history="1">
+        <w:r>
+          <w:rPr>
+            <w:rStyle w:val="Hiperhivatkozs"/>
+            <w:noProof/>
+          </w:rPr>
+          <w:t>1.2</w:t>
+        </w:r>
+        <w:r>
+          <w:rPr>
+            <w:rFonts w:eastAsiaTheme="minorEastAsia"/>
+            <w:smallCaps w:val="0"/>
+            <w:noProof/>
+            <w:sz w:val="24"/>
+            <w:szCs w:val="24"/>
+            <w:lang w:eastAsia="hu-HU"/>
+          </w:rPr>
+          <w:tab/>
+        </w:r>
+        <w:r>
+          <w:rPr>
+            <w:rStyle w:val="Hiperhivatkozs"/>
+            <w:noProof/>
+          </w:rPr>
+          <w:t>A projekt tervezete</w:t>
+        </w:r>
+        <w:r>
+          <w:rPr>
+            <w:noProof/>
+            <w:webHidden/>
+          </w:rPr>
+          <w:tab/>
+        </w:r>
+        <w:r>
+          <w:rPr>
+            <w:noProof/>
+            <w:webHidden/>
+          </w:rPr>
+          <w:fldChar w:fldCharType="begin"/>
+        </w:r>
+        <w:r>
+          <w:rPr>
+            <w:noProof/>
+            <w:webHidden/>
+          </w:rPr>
+          <w:instrText xml:space="preserve"> PAGEREF _Toc216365070 \h </w:instrText>
+        </w:r>
+        <w:r>
+          <w:rPr>
+            <w:noProof/>
+            <w:webHidden/>
+          </w:rPr>
+        </w:r>
+        <w:r>
+          <w:rPr>
+            <w:noProof/>
+            <w:webHidden/>
+          </w:rPr>
+          <w:fldChar w:fldCharType="separate"/>
+        </w:r>
+        <w:r>
+          <w:rPr>
+            <w:noProof/>
+            <w:webHidden/>
+          </w:rPr>
+          <w:t>3</w:t>
+        </w:r>
+        <w:r>
+          <w:rPr>
+            <w:noProof/>
+            <w:webHidden/>
+          </w:rPr>
+          <w:fldChar w:fldCharType="end"/>
+        </w:r>
+      </w:hyperlink>
+    </w:p>
+    <w:p>
+      <w:pPr>
+        <w:pStyle w:val="TJ2"/>
+        <w:tabs>
+          <w:tab w:val="left" w:pos="960"/>
+          <w:tab w:val="right" w:leader="dot" w:pos="9062"/>
+        </w:tabs>
+        <w:rPr>
+          <w:rFonts w:eastAsiaTheme="minorEastAsia"/>
+          <w:smallCaps w:val="0"/>
+          <w:noProof/>
+          <w:sz w:val="24"/>
+          <w:szCs w:val="24"/>
+          <w:lang w:eastAsia="hu-HU"/>
+        </w:rPr>
+      </w:pPr>
+      <w:hyperlink w:anchor="_Toc216365071" w:history="1">
+        <w:r>
+          <w:rPr>
+            <w:rStyle w:val="Hiperhivatkozs"/>
+            <w:noProof/>
+          </w:rPr>
+          <w:t>1.3</w:t>
+        </w:r>
+        <w:r>
+          <w:rPr>
+            <w:rFonts w:eastAsiaTheme="minorEastAsia"/>
+            <w:smallCaps w:val="0"/>
+            <w:noProof/>
+            <w:sz w:val="24"/>
+            <w:szCs w:val="24"/>
+            <w:lang w:eastAsia="hu-HU"/>
+          </w:rPr>
+          <w:tab/>
+        </w:r>
+        <w:r>
+          <w:rPr>
+            <w:rStyle w:val="Hiperhivatkozs"/>
+            <w:noProof/>
+          </w:rPr>
+          <w:t>SWOT analízis</w:t>
+        </w:r>
+        <w:r>
+          <w:rPr>
+            <w:noProof/>
+            <w:webHidden/>
+          </w:rPr>
+          <w:tab/>
+        </w:r>
+        <w:r>
+          <w:rPr>
+            <w:noProof/>
+            <w:webHidden/>
+          </w:rPr>
+          <w:fldChar w:fldCharType="begin"/>
+        </w:r>
+        <w:r>
+          <w:rPr>
+            <w:noProof/>
+            <w:webHidden/>
+          </w:rPr>
+          <w:instrText xml:space="preserve"> PAGEREF _Toc216365071 \h </w:instrText>
+        </w:r>
+        <w:r>
+          <w:rPr>
+            <w:noProof/>
+            <w:webHidden/>
+          </w:rPr>
+        </w:r>
+        <w:r>
+          <w:rPr>
+            <w:noProof/>
+            <w:webHidden/>
+          </w:rPr>
+          <w:fldChar w:fldCharType="separate"/>
+        </w:r>
+        <w:r>
+          <w:rPr>
+            <w:noProof/>
+            <w:webHidden/>
+          </w:rPr>
+          <w:t>4</w:t>
+        </w:r>
+        <w:r>
+          <w:rPr>
+            <w:noProof/>
+            <w:webHidden/>
+          </w:rPr>
+          <w:fldChar w:fldCharType="end"/>
+        </w:r>
+      </w:hyperlink>
+    </w:p>
+    <w:p>
+      <w:pPr>
+        <w:pStyle w:val="TJ2"/>
+        <w:tabs>
+          <w:tab w:val="left" w:pos="960"/>
+          <w:tab w:val="right" w:leader="dot" w:pos="9062"/>
+        </w:tabs>
+        <w:rPr>
+          <w:rFonts w:eastAsiaTheme="minorEastAsia"/>
+          <w:smallCaps w:val="0"/>
+          <w:noProof/>
+          <w:sz w:val="24"/>
+          <w:szCs w:val="24"/>
+          <w:lang w:eastAsia="hu-HU"/>
+        </w:rPr>
+      </w:pPr>
+      <w:hyperlink w:anchor="_Toc216365072" w:history="1">
+        <w:r>
+          <w:rPr>
+            <w:rStyle w:val="Hiperhivatkozs"/>
+            <w:noProof/>
+          </w:rPr>
+          <w:t>1.4</w:t>
+        </w:r>
+        <w:r>
+          <w:rPr>
+            <w:rFonts w:eastAsiaTheme="minorEastAsia"/>
+            <w:smallCaps w:val="0"/>
+            <w:noProof/>
+            <w:sz w:val="24"/>
+            <w:szCs w:val="24"/>
+            <w:lang w:eastAsia="hu-HU"/>
+          </w:rPr>
+          <w:tab/>
+        </w:r>
+        <w:r>
+          <w:rPr>
+            <w:rStyle w:val="Hiperhivatkozs"/>
+            <w:noProof/>
+          </w:rPr>
+          <w:t>Gantt diagram</w:t>
+        </w:r>
+        <w:r>
+          <w:rPr>
+            <w:noProof/>
+            <w:webHidden/>
+          </w:rPr>
+          <w:tab/>
+        </w:r>
+        <w:r>
+          <w:rPr>
+            <w:noProof/>
+            <w:webHidden/>
+          </w:rPr>
+          <w:fldChar w:fldCharType="begin"/>
+        </w:r>
+        <w:r>
+          <w:rPr>
+            <w:noProof/>
+            <w:webHidden/>
+          </w:rPr>
+          <w:instrText xml:space="preserve"> PAGEREF _Toc216365072 \h </w:instrText>
+        </w:r>
+        <w:r>
+          <w:rPr>
+            <w:noProof/>
+            <w:webHidden/>
+          </w:rPr>
+        </w:r>
+        <w:r>
+          <w:rPr>
+            <w:noProof/>
+            <w:webHidden/>
+          </w:rPr>
+          <w:fldChar w:fldCharType="separate"/>
+        </w:r>
+        <w:r>
+          <w:rPr>
+            <w:noProof/>
+            <w:webHidden/>
+          </w:rPr>
+          <w:t>5</w:t>
+        </w:r>
+        <w:r>
+          <w:rPr>
+            <w:noProof/>
+            <w:webHidden/>
+          </w:rPr>
+          <w:fldChar w:fldCharType="end"/>
+        </w:r>
+      </w:hyperlink>
+    </w:p>
+    <w:p>
+      <w:pPr>
+        <w:pStyle w:val="TJ2"/>
+        <w:tabs>
+          <w:tab w:val="left" w:pos="960"/>
+          <w:tab w:val="right" w:leader="dot" w:pos="9062"/>
+        </w:tabs>
+        <w:rPr>
+          <w:rFonts w:eastAsiaTheme="minorEastAsia"/>
+          <w:smallCaps w:val="0"/>
+          <w:noProof/>
+          <w:sz w:val="24"/>
+          <w:szCs w:val="24"/>
+          <w:lang w:eastAsia="hu-HU"/>
+        </w:rPr>
+      </w:pPr>
+      <w:hyperlink w:anchor="_Toc216365073" w:history="1">
+        <w:r>
+          <w:rPr>
+            <w:rStyle w:val="Hiperhivatkozs"/>
+            <w:noProof/>
+          </w:rPr>
+          <w:t>1.5</w:t>
+        </w:r>
+        <w:r>
+          <w:rPr>
+            <w:rFonts w:eastAsiaTheme="minorEastAsia"/>
+            <w:smallCaps w:val="0"/>
+            <w:noProof/>
+            <w:sz w:val="24"/>
+            <w:szCs w:val="24"/>
+            <w:lang w:eastAsia="hu-HU"/>
+          </w:rPr>
+          <w:tab/>
+        </w:r>
+        <w:r>
+          <w:rPr>
+            <w:rStyle w:val="Hiperhivatkozs"/>
+            <w:noProof/>
+          </w:rPr>
+          <w:t>Wireframe</w:t>
+        </w:r>
+        <w:r>
+          <w:rPr>
+            <w:noProof/>
+            <w:webHidden/>
+          </w:rPr>
+          <w:tab/>
+        </w:r>
+        <w:r>
+          <w:rPr>
+            <w:noProof/>
+            <w:webHidden/>
+          </w:rPr>
+          <w:fldChar w:fldCharType="begin"/>
+        </w:r>
+        <w:r>
+          <w:rPr>
+            <w:noProof/>
+            <w:webHidden/>
+          </w:rPr>
+          <w:instrText xml:space="preserve"> PAGEREF _Toc216365073 \h </w:instrText>
+        </w:r>
+        <w:r>
+          <w:rPr>
+            <w:noProof/>
+            <w:webHidden/>
+          </w:rPr>
+        </w:r>
+        <w:r>
+          <w:rPr>
+            <w:noProof/>
+            <w:webHidden/>
+          </w:rPr>
+          <w:fldChar w:fldCharType="separate"/>
+        </w:r>
+        <w:r>
+          <w:rPr>
+            <w:noProof/>
+            <w:webHidden/>
+          </w:rPr>
+          <w:t>5</w:t>
+        </w:r>
+        <w:r>
+          <w:rPr>
+            <w:noProof/>
+            <w:webHidden/>
+          </w:rPr>
+          <w:fldChar w:fldCharType="end"/>
+        </w:r>
+      </w:hyperlink>
+    </w:p>
+    <w:p>
+      <w:r>
+        <w:fldChar w:fldCharType="end"/>
+      </w:r>
+    </w:p>
     <w:p>
       <w:pPr>
         <w:rPr>
           <w:rFonts w:ascii="Montserrat" w:eastAsiaTheme="majorEastAsia" w:hAnsi="Montserrat" w:cstheme="majorBidi"/>
           <w:b/>
-          <w:color w:val="5D28FE"/>
+          <w:color w:val="000000" w:themeColor="text1"/>
           <w:sz w:val="40"/>
           <w:szCs w:val="40"/>
         </w:rPr>
@@ -1791,34 +1476,45 @@
     <w:p>
       <w:pPr>
         <w:pStyle w:val="Cmsor1"/>
-        <w:numPr>
-          <w:ilvl w:val="0"/>
-          <w:numId w:val="3"/>
-        </w:numPr>
-      </w:pPr>
-      <w:bookmarkStart w:id="1" w:name="_Toc215832361"/>
+      </w:pPr>
+      <w:bookmarkStart w:id="2" w:name="_Toc216365068"/>
       <w:r>
         <w:lastRenderedPageBreak/>
+        <w:t>1.</w:t>
+      </w:r>
+      <w:r>
+        <w:tab/>
+      </w:r>
+      <w:r>
         <w:t>Bevezetés</w:t>
       </w:r>
       <w:bookmarkEnd w:id="0"/>
       <w:bookmarkEnd w:id="1"/>
+      <w:bookmarkEnd w:id="2"/>
     </w:p>
     <w:p>
       <w:pPr>
         <w:pStyle w:val="Cmsor2"/>
-        <w:numPr>
-          <w:ilvl w:val="1"/>
-          <w:numId w:val="3"/>
-        </w:numPr>
-      </w:pPr>
-      <w:bookmarkStart w:id="2" w:name="_Toc214722124"/>
-      <w:bookmarkStart w:id="3" w:name="_Toc215832362"/>
-      <w:r>
-        <w:t>A projekt célja</w:t>
-      </w:r>
-      <w:bookmarkEnd w:id="2"/>
+      </w:pPr>
+      <w:bookmarkStart w:id="3" w:name="_Toc214722124"/>
+      <w:bookmarkStart w:id="4" w:name="_Toc216365008"/>
+      <w:bookmarkStart w:id="5" w:name="_Toc216365069"/>
+      <w:r>
+        <w:t>1.1</w:t>
+      </w:r>
+      <w:r>
+        <w:tab/>
+        <w:t>A</w:t>
+      </w:r>
+      <w:r>
+        <w:t xml:space="preserve"> </w:t>
+      </w:r>
+      <w:r>
+        <w:t>projekt célja</w:t>
+      </w:r>
       <w:bookmarkEnd w:id="3"/>
+      <w:bookmarkEnd w:id="4"/>
+      <w:bookmarkEnd w:id="5"/>
     </w:p>
     <w:p>
       <w:pPr>
@@ -1847,18 +1543,22 @@
     <w:p>
       <w:pPr>
         <w:pStyle w:val="Cmsor2"/>
-        <w:numPr>
-          <w:ilvl w:val="1"/>
-          <w:numId w:val="3"/>
-        </w:numPr>
-      </w:pPr>
-      <w:bookmarkStart w:id="4" w:name="_Toc214722125"/>
-      <w:bookmarkStart w:id="5" w:name="_Toc215832363"/>
+      </w:pPr>
+      <w:bookmarkStart w:id="6" w:name="_Toc214722125"/>
+      <w:bookmarkStart w:id="7" w:name="_Toc216365009"/>
+      <w:bookmarkStart w:id="8" w:name="_Toc216365070"/>
+      <w:r>
+        <w:t>1.2</w:t>
+      </w:r>
+      <w:r>
+        <w:tab/>
+      </w:r>
       <w:r>
         <w:t>A projekt tervezete</w:t>
       </w:r>
-      <w:bookmarkEnd w:id="4"/>
-      <w:bookmarkEnd w:id="5"/>
+      <w:bookmarkEnd w:id="6"/>
+      <w:bookmarkEnd w:id="7"/>
+      <w:bookmarkEnd w:id="8"/>
     </w:p>
     <w:p>
       <w:pPr>
@@ -1889,8 +1589,7 @@
           <w:iCs/>
         </w:rPr>
       </w:pPr>
-      <w:bookmarkStart w:id="6" w:name="_Toc214722126"/>
-      <w:bookmarkStart w:id="7" w:name="_Toc215832364"/>
+      <w:bookmarkStart w:id="9" w:name="_Toc214722126"/>
       <w:r>
         <w:rPr>
           <w:i/>
@@ -1898,8 +1597,7 @@
         </w:rPr>
         <w:t>Webalkalmazás</w:t>
       </w:r>
-      <w:bookmarkEnd w:id="6"/>
-      <w:bookmarkEnd w:id="7"/>
+      <w:bookmarkEnd w:id="9"/>
     </w:p>
     <w:p>
       <w:r>
@@ -1957,13 +1655,11 @@
       <w:pPr>
         <w:pStyle w:val="Normlcmsor"/>
       </w:pPr>
-      <w:bookmarkStart w:id="8" w:name="_Toc214722127"/>
-      <w:bookmarkStart w:id="9" w:name="_Toc215832365"/>
+      <w:bookmarkStart w:id="10" w:name="_Toc214722127"/>
       <w:r>
         <w:t>Asztali alkalmazás</w:t>
       </w:r>
-      <w:bookmarkEnd w:id="8"/>
-      <w:bookmarkEnd w:id="9"/>
+      <w:bookmarkEnd w:id="10"/>
     </w:p>
     <w:p>
       <w:pPr>
@@ -1997,12 +1693,10 @@
       <w:pPr>
         <w:pStyle w:val="Normlcmsor"/>
       </w:pPr>
-      <w:bookmarkStart w:id="10" w:name="_Toc214722128"/>
-      <w:bookmarkStart w:id="11" w:name="_Toc215832366"/>
+      <w:bookmarkStart w:id="11" w:name="_Toc214722128"/>
       <w:r>
         <w:t>Mobil alkalmazás terve</w:t>
       </w:r>
-      <w:bookmarkEnd w:id="10"/>
       <w:bookmarkEnd w:id="11"/>
     </w:p>
     <w:p>
@@ -2018,11 +1712,46 @@
         <w:pStyle w:val="Normlcmsor"/>
       </w:pPr>
       <w:bookmarkStart w:id="12" w:name="_Toc214722129"/>
-      <w:bookmarkStart w:id="13" w:name="_Toc215832367"/>
       <w:r>
         <w:t>Adatbázis</w:t>
       </w:r>
       <w:bookmarkEnd w:id="12"/>
+    </w:p>
+    <w:p>
+      <w:pPr>
+        <w:pStyle w:val="Bekezdsek"/>
+      </w:pPr>
+      <w:r>
+        <w:t xml:space="preserve">A felhasználói és egyéb adatokat egy </w:t>
+      </w:r>
+      <w:proofErr w:type="spellStart"/>
+      <w:r>
+        <w:t>MySQL</w:t>
+      </w:r>
+      <w:proofErr w:type="spellEnd"/>
+      <w:r>
+        <w:t xml:space="preserve"> szerver felhasználásával fogjuk tárolni</w:t>
+      </w:r>
+    </w:p>
+    <w:p>
+      <w:pPr>
+        <w:rPr>
+          <w:rFonts w:ascii="Montserrat" w:hAnsi="Montserrat"/>
+        </w:rPr>
+      </w:pPr>
+      <w:r>
+        <w:br w:type="page"/>
+      </w:r>
+    </w:p>
+    <w:p>
+      <w:pPr>
+        <w:pStyle w:val="Normlcmsor"/>
+      </w:pPr>
+      <w:bookmarkStart w:id="13" w:name="_Toc214722130"/>
+      <w:r>
+        <w:lastRenderedPageBreak/>
+        <w:t>Fejlesztés</w:t>
+      </w:r>
       <w:bookmarkEnd w:id="13"/>
     </w:p>
     <w:p>
@@ -2030,102 +1759,67 @@
         <w:pStyle w:val="Bekezdsek"/>
       </w:pPr>
       <w:r>
-        <w:t xml:space="preserve">A felhasználói és egyéb adatokat egy </w:t>
+        <w:t xml:space="preserve">A fejlesztés során felhasználásra fog kerülni a </w:t>
       </w:r>
       <w:proofErr w:type="spellStart"/>
       <w:r>
-        <w:t>MySQL</w:t>
+        <w:t>Trello</w:t>
       </w:r>
       <w:proofErr w:type="spellEnd"/>
       <w:r>
-        <w:t xml:space="preserve"> szerver felhasználásával fogjuk tárolni</w:t>
+        <w:t xml:space="preserve"> a feladatok beosztása és a közös munka gördülékenyebbé tétele érdekében. A kódbázis egy privát GitHub </w:t>
+      </w:r>
+      <w:proofErr w:type="spellStart"/>
+      <w:r>
+        <w:t>repository</w:t>
+      </w:r>
+      <w:proofErr w:type="spellEnd"/>
+      <w:r>
+        <w:t xml:space="preserve">-ban lesz megosztva a projekt fejlesztői </w:t>
+      </w:r>
+      <w:r>
+        <w:t>között,</w:t>
+      </w:r>
+      <w:r>
+        <w:t xml:space="preserve"> amely helytől és időtől függetleníti ezáltal rugalmasabbá teszi az alkalmazás fejlesztését. A fejlesztés során a Docker </w:t>
+      </w:r>
+      <w:proofErr w:type="spellStart"/>
+      <w:r>
+        <w:t>konténerizációs</w:t>
+      </w:r>
+      <w:proofErr w:type="spellEnd"/>
+      <w:r>
+        <w:t xml:space="preserve"> megoldását fogjuk használni a maximális stabilitás és a kész projekt egyszer</w:t>
+      </w:r>
+      <w:r>
+        <w:t>ű telepítése érdekében.</w:t>
       </w:r>
     </w:p>
     <w:p>
       <w:pPr>
-        <w:rPr>
-          <w:rFonts w:ascii="Montserrat" w:hAnsi="Montserrat"/>
-        </w:rPr>
-      </w:pPr>
-      <w:r>
-        <w:br w:type="page"/>
-      </w:r>
+        <w:pStyle w:val="Bekezdsek"/>
+        <w:ind w:firstLine="0"/>
+      </w:pPr>
     </w:p>
     <w:p>
       <w:pPr>
-        <w:pStyle w:val="Normlcmsor"/>
-      </w:pPr>
-      <w:bookmarkStart w:id="14" w:name="_Toc214722130"/>
-      <w:bookmarkStart w:id="15" w:name="_Toc215832368"/>
-      <w:r>
-        <w:lastRenderedPageBreak/>
-        <w:t>Fejlesztés</w:t>
+        <w:pStyle w:val="Cmsor2"/>
+      </w:pPr>
+      <w:bookmarkStart w:id="14" w:name="_Toc214722131"/>
+      <w:bookmarkStart w:id="15" w:name="_Toc216365010"/>
+      <w:bookmarkStart w:id="16" w:name="_Toc216365071"/>
+      <w:r>
+        <w:t>1.3</w:t>
+      </w:r>
+      <w:r>
+        <w:tab/>
+      </w:r>
+      <w:r>
+        <w:t>SWOT analízis</w:t>
       </w:r>
       <w:bookmarkEnd w:id="14"/>
       <w:bookmarkEnd w:id="15"/>
-    </w:p>
-    <w:p>
-      <w:pPr>
-        <w:pStyle w:val="Bekezdsek"/>
-      </w:pPr>
-      <w:r>
-        <w:t xml:space="preserve">A fejlesztés során felhasználásra fog kerülni a </w:t>
-      </w:r>
-      <w:proofErr w:type="spellStart"/>
-      <w:r>
-        <w:t>Trello</w:t>
-      </w:r>
-      <w:proofErr w:type="spellEnd"/>
-      <w:r>
-        <w:t xml:space="preserve"> a feladatok beosztása és a közös munka gördülékenyebbé tétele érdekében. A kódbázis egy privát GitHub </w:t>
-      </w:r>
-      <w:proofErr w:type="spellStart"/>
-      <w:r>
-        <w:t>repository</w:t>
-      </w:r>
-      <w:proofErr w:type="spellEnd"/>
-      <w:r>
-        <w:t xml:space="preserve">-ban lesz megosztva a projekt fejlesztői </w:t>
-      </w:r>
-      <w:r>
-        <w:t>között,</w:t>
-      </w:r>
-      <w:r>
-        <w:t xml:space="preserve"> amely helytől és időtől függetleníti ezáltal rugalmasabbá teszi az alkalmazás fejlesztését. A fejlesztés során a Docker </w:t>
-      </w:r>
-      <w:proofErr w:type="spellStart"/>
-      <w:r>
-        <w:t>konténerizációs</w:t>
-      </w:r>
-      <w:proofErr w:type="spellEnd"/>
-      <w:r>
-        <w:t xml:space="preserve"> megoldását fogjuk használni a maximális stabilitás és a kész projekt egyszer</w:t>
-      </w:r>
-      <w:r>
-        <w:t>ű telepítése érdekében.</w:t>
-      </w:r>
-    </w:p>
-    <w:p>
-      <w:pPr>
-        <w:pStyle w:val="Bekezdsek"/>
-        <w:ind w:firstLine="0"/>
-      </w:pPr>
-    </w:p>
-    <w:p>
-      <w:pPr>
-        <w:pStyle w:val="Cmsor2"/>
-        <w:numPr>
-          <w:ilvl w:val="1"/>
-          <w:numId w:val="5"/>
-        </w:numPr>
-      </w:pPr>
-      <w:bookmarkStart w:id="16" w:name="_Toc214722131"/>
-      <w:bookmarkStart w:id="17" w:name="_Toc215832369"/>
-      <w:r>
-        <w:t>SWOT analízis</w:t>
-      </w:r>
       <w:bookmarkEnd w:id="16"/>
-      <w:bookmarkEnd w:id="17"/>
     </w:p>
     <w:p>
       <w:pPr>
@@ -2291,7 +1985,7 @@
         <w:pStyle w:val="Kpalrs"/>
       </w:pPr>
       <w:fldSimple w:instr=" SEQ ábra \* ARABIC ">
-        <w:bookmarkStart w:id="18" w:name="_Toc215832090"/>
+        <w:bookmarkStart w:id="17" w:name="_Toc215832090"/>
         <w:r>
           <w:rPr>
             <w:noProof/>
@@ -2308,7 +2002,7 @@
       <w:r>
         <w:t xml:space="preserve"> SWOT analízis</w:t>
       </w:r>
-      <w:bookmarkEnd w:id="18"/>
+      <w:bookmarkEnd w:id="17"/>
     </w:p>
     <w:p>
       <w:pPr>
@@ -2326,21 +2020,25 @@
     <w:p>
       <w:pPr>
         <w:pStyle w:val="Cmsor2"/>
-        <w:numPr>
-          <w:ilvl w:val="1"/>
-          <w:numId w:val="5"/>
-        </w:numPr>
-      </w:pPr>
-      <w:bookmarkStart w:id="19" w:name="_Toc215832370"/>
+      </w:pPr>
+      <w:bookmarkStart w:id="18" w:name="_Toc216365011"/>
+      <w:bookmarkStart w:id="19" w:name="_Toc216365072"/>
+      <w:r>
+        <w:lastRenderedPageBreak/>
+        <w:t>1.4</w:t>
+      </w:r>
+      <w:r>
+        <w:tab/>
+      </w:r>
       <w:proofErr w:type="spellStart"/>
       <w:r>
-        <w:lastRenderedPageBreak/>
         <w:t>Gantt</w:t>
       </w:r>
       <w:proofErr w:type="spellEnd"/>
       <w:r>
         <w:t xml:space="preserve"> diagram</w:t>
       </w:r>
+      <w:bookmarkEnd w:id="18"/>
       <w:bookmarkEnd w:id="19"/>
     </w:p>
     <w:p>
@@ -2480,7 +2178,7 @@
           <w:noProof/>
         </w:rPr>
         <w:drawing>
-          <wp:inline distT="0" distB="0" distL="0" distR="0" wp14:anchorId="4FA7022E" wp14:editId="1865DA59">
+          <wp:inline distT="0" distB="0" distL="0" distR="0" wp14:anchorId="4FA7022E" wp14:editId="6CCD44C4">
             <wp:extent cx="6016502" cy="1685925"/>
             <wp:effectExtent l="0" t="0" r="3810" b="0"/>
             <wp:docPr id="755683826" name="Kép 1"/>
@@ -2576,17 +2274,21 @@
     <w:p>
       <w:pPr>
         <w:pStyle w:val="Cmsor2"/>
-        <w:numPr>
-          <w:ilvl w:val="1"/>
-          <w:numId w:val="5"/>
-        </w:numPr>
-      </w:pPr>
-      <w:bookmarkStart w:id="21" w:name="_Toc215832371"/>
+      </w:pPr>
+      <w:bookmarkStart w:id="21" w:name="_Toc216365012"/>
+      <w:bookmarkStart w:id="22" w:name="_Toc216365073"/>
+      <w:r>
+        <w:t>1.5</w:t>
+      </w:r>
+      <w:r>
+        <w:tab/>
+      </w:r>
       <w:proofErr w:type="spellStart"/>
       <w:r>
         <w:t>Wireframe</w:t>
       </w:r>
       <w:bookmarkEnd w:id="21"/>
+      <w:bookmarkEnd w:id="22"/>
       <w:proofErr w:type="spellEnd"/>
     </w:p>
     <w:p>
@@ -2764,7 +2466,7 @@
         <w:pStyle w:val="Kpalrs"/>
       </w:pPr>
       <w:fldSimple w:instr=" SEQ ábra \* ARABIC ">
-        <w:bookmarkStart w:id="22" w:name="_Toc215832092"/>
+        <w:bookmarkStart w:id="23" w:name="_Toc215832092"/>
         <w:r>
           <w:rPr>
             <w:noProof/>
@@ -2782,7 +2484,7 @@
       <w:r>
         <w:t>Wireframe</w:t>
       </w:r>
-      <w:bookmarkEnd w:id="22"/>
+      <w:bookmarkEnd w:id="23"/>
       <w:proofErr w:type="spellEnd"/>
     </w:p>
     <w:p>
@@ -3207,6 +2909,216 @@
 <file path=word/numbering.xml><?xml version="1.0" encoding="utf-8"?>
 <w:numbering xmlns:wpc="http://schemas.microsoft.com/office/word/2010/wordprocessingCanvas" xmlns:cx="http://schemas.microsoft.com/office/drawing/2014/chartex" xmlns:cx1="http://schemas.microsoft.com/office/drawing/2015/9/8/chartex" xmlns:cx2="http://schemas.microsoft.com/office/drawing/2015/10/21/chartex" xmlns:cx3="http://schemas.microsoft.com/office/drawing/2016/5/9/chartex" xmlns:cx4="http://schemas.microsoft.com/office/drawing/2016/5/10/chartex" xmlns:cx5="http://schemas.microsoft.com/office/drawing/2016/5/11/chartex" xmlns:cx6="http://schemas.microsoft.com/office/drawing/2016/5/12/chartex" xmlns:cx7="http://schemas.microsoft.com/office/drawing/2016/5/13/chartex" xmlns:cx8="http://schemas.microsoft.com/office/drawing/2016/5/14/chartex" xmlns:mc="http://schemas.openxmlformats.org/markup-compatibility/2006" xmlns:aink="http://schemas.microsoft.com/office/drawing/2016/ink" xmlns:am3d="http://schemas.microsoft.com/office/drawing/2017/model3d" xmlns:o="urn:schemas-microsoft-com:office:office" xmlns:oel="http://schemas.microsoft.com/office/2019/extlst" xmlns:r="http://schemas.openxmlformats.org/officeDocument/2006/relationships" xmlns:m="http://schemas.openxmlformats.org/officeDocument/2006/math" xmlns:v="urn:schemas-microsoft-com:vml" xmlns:wp14="http://schemas.microsoft.com/office/word/2010/wordprocessingDrawing" xmlns:wp="http://schemas.openxmlformats.org/drawingml/2006/wordprocessingDrawing" xmlns:w10="urn:schemas-microsoft-com:office:word" xmlns:w="http://schemas.openxmlformats.org/wordprocessingml/2006/main" xmlns:w14="http://schemas.microsoft.com/office/word/2010/wordml" xmlns:w15="http://schemas.microsoft.com/office/word/2012/wordml" xmlns:w16cex="http://schemas.microsoft.com/office/word/2018/wordml/cex" xmlns:w16cid="http://schemas.microsoft.com/office/word/2016/wordml/cid" xmlns:w16="http://schemas.microsoft.com/office/word/2018/wordml" xmlns:w16du="http://schemas.microsoft.com/office/word/2023/wordml/word16du" xmlns:w16sdtdh="http://schemas.microsoft.com/office/word/2020/wordml/sdtdatahash" xmlns:w16sdtfl="http://schemas.microsoft.com/office/word/2024/wordml/sdtformatlock" xmlns:w16se="http://schemas.microsoft.com/office/word/2015/wordml/symex" xmlns:wpg="http://schemas.microsoft.com/office/word/2010/wordprocessingGroup" xmlns:wpi="http://schemas.microsoft.com/office/word/2010/wordprocessingInk" xmlns:wne="http://schemas.microsoft.com/office/word/2006/wordml" xmlns:wps="http://schemas.microsoft.com/office/word/2010/wordprocessingShape" mc:Ignorable="w14 w15 w16se w16cid w16 w16cex w16sdtdh w16sdtfl w16du wp14">
   <w:abstractNum w:abstractNumId="0" w15:restartNumberingAfterBreak="0">
+    <w:nsid w:val="077249B8"/>
+    <w:multiLevelType w:val="hybridMultilevel"/>
+    <w:tmpl w:val="AA6ED6C6"/>
+    <w:lvl w:ilvl="0" w:tplc="E708DE48">
+      <w:start w:val="20"/>
+      <w:numFmt w:val="decimal"/>
+      <w:lvlText w:val="%1."/>
+      <w:lvlJc w:val="left"/>
+      <w:pPr>
+        <w:ind w:left="1440" w:hanging="360"/>
+      </w:pPr>
+      <w:rPr>
+        <w:rFonts w:hint="default"/>
+      </w:rPr>
+    </w:lvl>
+    <w:lvl w:ilvl="1" w:tplc="040E0019" w:tentative="1">
+      <w:start w:val="1"/>
+      <w:numFmt w:val="lowerLetter"/>
+      <w:lvlText w:val="%2."/>
+      <w:lvlJc w:val="left"/>
+      <w:pPr>
+        <w:ind w:left="2160" w:hanging="360"/>
+      </w:pPr>
+    </w:lvl>
+    <w:lvl w:ilvl="2" w:tplc="040E001B" w:tentative="1">
+      <w:start w:val="1"/>
+      <w:numFmt w:val="lowerRoman"/>
+      <w:lvlText w:val="%3."/>
+      <w:lvlJc w:val="right"/>
+      <w:pPr>
+        <w:ind w:left="2880" w:hanging="180"/>
+      </w:pPr>
+    </w:lvl>
+    <w:lvl w:ilvl="3" w:tplc="040E000F" w:tentative="1">
+      <w:start w:val="1"/>
+      <w:numFmt w:val="decimal"/>
+      <w:lvlText w:val="%4."/>
+      <w:lvlJc w:val="left"/>
+      <w:pPr>
+        <w:ind w:left="3600" w:hanging="360"/>
+      </w:pPr>
+    </w:lvl>
+    <w:lvl w:ilvl="4" w:tplc="040E0019" w:tentative="1">
+      <w:start w:val="1"/>
+      <w:numFmt w:val="lowerLetter"/>
+      <w:lvlText w:val="%5."/>
+      <w:lvlJc w:val="left"/>
+      <w:pPr>
+        <w:ind w:left="4320" w:hanging="360"/>
+      </w:pPr>
+    </w:lvl>
+    <w:lvl w:ilvl="5" w:tplc="040E001B" w:tentative="1">
+      <w:start w:val="1"/>
+      <w:numFmt w:val="lowerRoman"/>
+      <w:lvlText w:val="%6."/>
+      <w:lvlJc w:val="right"/>
+      <w:pPr>
+        <w:ind w:left="5040" w:hanging="180"/>
+      </w:pPr>
+    </w:lvl>
+    <w:lvl w:ilvl="6" w:tplc="040E000F" w:tentative="1">
+      <w:start w:val="1"/>
+      <w:numFmt w:val="decimal"/>
+      <w:lvlText w:val="%7."/>
+      <w:lvlJc w:val="left"/>
+      <w:pPr>
+        <w:ind w:left="5760" w:hanging="360"/>
+      </w:pPr>
+    </w:lvl>
+    <w:lvl w:ilvl="7" w:tplc="040E0019" w:tentative="1">
+      <w:start w:val="1"/>
+      <w:numFmt w:val="lowerLetter"/>
+      <w:lvlText w:val="%8."/>
+      <w:lvlJc w:val="left"/>
+      <w:pPr>
+        <w:ind w:left="6480" w:hanging="360"/>
+      </w:pPr>
+    </w:lvl>
+    <w:lvl w:ilvl="8" w:tplc="040E001B" w:tentative="1">
+      <w:start w:val="1"/>
+      <w:numFmt w:val="lowerRoman"/>
+      <w:lvlText w:val="%9."/>
+      <w:lvlJc w:val="right"/>
+      <w:pPr>
+        <w:ind w:left="7200" w:hanging="180"/>
+      </w:pPr>
+    </w:lvl>
+  </w:abstractNum>
+  <w:abstractNum w:abstractNumId="1" w15:restartNumberingAfterBreak="0">
+    <w:nsid w:val="0B091927"/>
+    <w:multiLevelType w:val="multilevel"/>
+    <w:tmpl w:val="38B018D0"/>
+    <w:lvl w:ilvl="0">
+      <w:start w:val="1"/>
+      <w:numFmt w:val="decimal"/>
+      <w:lvlText w:val="%1."/>
+      <w:lvlJc w:val="left"/>
+      <w:pPr>
+        <w:ind w:left="1080" w:hanging="720"/>
+      </w:pPr>
+      <w:rPr>
+        <w:rFonts w:hint="default"/>
+      </w:rPr>
+    </w:lvl>
+    <w:lvl w:ilvl="1">
+      <w:start w:val="1"/>
+      <w:numFmt w:val="decimal"/>
+      <w:isLgl/>
+      <w:lvlText w:val="%1.%2"/>
+      <w:lvlJc w:val="left"/>
+      <w:pPr>
+        <w:ind w:left="1080" w:hanging="720"/>
+      </w:pPr>
+      <w:rPr>
+        <w:rFonts w:hint="default"/>
+      </w:rPr>
+    </w:lvl>
+    <w:lvl w:ilvl="2">
+      <w:start w:val="1"/>
+      <w:numFmt w:val="decimal"/>
+      <w:isLgl/>
+      <w:lvlText w:val="%1.%2.%3"/>
+      <w:lvlJc w:val="left"/>
+      <w:pPr>
+        <w:ind w:left="1440" w:hanging="1080"/>
+      </w:pPr>
+      <w:rPr>
+        <w:rFonts w:hint="default"/>
+      </w:rPr>
+    </w:lvl>
+    <w:lvl w:ilvl="3">
+      <w:start w:val="1"/>
+      <w:numFmt w:val="decimal"/>
+      <w:isLgl/>
+      <w:lvlText w:val="%1.%2.%3.%4"/>
+      <w:lvlJc w:val="left"/>
+      <w:pPr>
+        <w:ind w:left="1800" w:hanging="1440"/>
+      </w:pPr>
+      <w:rPr>
+        <w:rFonts w:hint="default"/>
+      </w:rPr>
+    </w:lvl>
+    <w:lvl w:ilvl="4">
+      <w:start w:val="1"/>
+      <w:numFmt w:val="decimal"/>
+      <w:isLgl/>
+      <w:lvlText w:val="%1.%2.%3.%4.%5"/>
+      <w:lvlJc w:val="left"/>
+      <w:pPr>
+        <w:ind w:left="1800" w:hanging="1440"/>
+      </w:pPr>
+      <w:rPr>
+        <w:rFonts w:hint="default"/>
+      </w:rPr>
+    </w:lvl>
+    <w:lvl w:ilvl="5">
+      <w:start w:val="1"/>
+      <w:numFmt w:val="decimal"/>
+      <w:isLgl/>
+      <w:lvlText w:val="%1.%2.%3.%4.%5.%6"/>
+      <w:lvlJc w:val="left"/>
+      <w:pPr>
+        <w:ind w:left="2160" w:hanging="1800"/>
+      </w:pPr>
+      <w:rPr>
+        <w:rFonts w:hint="default"/>
+      </w:rPr>
+    </w:lvl>
+    <w:lvl w:ilvl="6">
+      <w:start w:val="1"/>
+      <w:numFmt w:val="decimal"/>
+      <w:isLgl/>
+      <w:lvlText w:val="%1.%2.%3.%4.%5.%6.%7"/>
+      <w:lvlJc w:val="left"/>
+      <w:pPr>
+        <w:ind w:left="2520" w:hanging="2160"/>
+      </w:pPr>
+      <w:rPr>
+        <w:rFonts w:hint="default"/>
+      </w:rPr>
+    </w:lvl>
+    <w:lvl w:ilvl="7">
+      <w:start w:val="1"/>
+      <w:numFmt w:val="decimal"/>
+      <w:isLgl/>
+      <w:lvlText w:val="%1.%2.%3.%4.%5.%6.%7.%8"/>
+      <w:lvlJc w:val="left"/>
+      <w:pPr>
+        <w:ind w:left="2880" w:hanging="2520"/>
+      </w:pPr>
+      <w:rPr>
+        <w:rFonts w:hint="default"/>
+      </w:rPr>
+    </w:lvl>
+    <w:lvl w:ilvl="8">
+      <w:start w:val="1"/>
+      <w:numFmt w:val="decimal"/>
+      <w:isLgl/>
+      <w:lvlText w:val="%1.%2.%3.%4.%5.%6.%7.%8.%9"/>
+      <w:lvlJc w:val="left"/>
+      <w:pPr>
+        <w:ind w:left="3240" w:hanging="2880"/>
+      </w:pPr>
+      <w:rPr>
+        <w:rFonts w:hint="default"/>
+      </w:rPr>
+    </w:lvl>
+  </w:abstractNum>
+  <w:abstractNum w:abstractNumId="2" w15:restartNumberingAfterBreak="0">
     <w:nsid w:val="0BB67D71"/>
     <w:multiLevelType w:val="multilevel"/>
     <w:tmpl w:val="1CD224BE"/>
@@ -3327,7 +3239,421 @@
       </w:rPr>
     </w:lvl>
   </w:abstractNum>
-  <w:abstractNum w:abstractNumId="1" w15:restartNumberingAfterBreak="0">
+  <w:abstractNum w:abstractNumId="3" w15:restartNumberingAfterBreak="0">
+    <w:nsid w:val="0F7B2163"/>
+    <w:multiLevelType w:val="multilevel"/>
+    <w:tmpl w:val="00647290"/>
+    <w:lvl w:ilvl="0">
+      <w:start w:val="1"/>
+      <w:numFmt w:val="decimal"/>
+      <w:lvlText w:val="%1."/>
+      <w:lvlJc w:val="left"/>
+      <w:pPr>
+        <w:ind w:left="1080" w:hanging="720"/>
+      </w:pPr>
+      <w:rPr>
+        <w:rFonts w:hint="default"/>
+      </w:rPr>
+    </w:lvl>
+    <w:lvl w:ilvl="1">
+      <w:start w:val="2"/>
+      <w:numFmt w:val="decimal"/>
+      <w:isLgl/>
+      <w:lvlText w:val="%1.%2"/>
+      <w:lvlJc w:val="left"/>
+      <w:pPr>
+        <w:ind w:left="1080" w:hanging="720"/>
+      </w:pPr>
+      <w:rPr>
+        <w:rFonts w:hint="default"/>
+      </w:rPr>
+    </w:lvl>
+    <w:lvl w:ilvl="2">
+      <w:start w:val="1"/>
+      <w:numFmt w:val="decimal"/>
+      <w:isLgl/>
+      <w:lvlText w:val="%1.%2.%3"/>
+      <w:lvlJc w:val="left"/>
+      <w:pPr>
+        <w:ind w:left="1440" w:hanging="1080"/>
+      </w:pPr>
+      <w:rPr>
+        <w:rFonts w:hint="default"/>
+      </w:rPr>
+    </w:lvl>
+    <w:lvl w:ilvl="3">
+      <w:start w:val="1"/>
+      <w:numFmt w:val="decimal"/>
+      <w:isLgl/>
+      <w:lvlText w:val="%1.%2.%3.%4"/>
+      <w:lvlJc w:val="left"/>
+      <w:pPr>
+        <w:ind w:left="1800" w:hanging="1440"/>
+      </w:pPr>
+      <w:rPr>
+        <w:rFonts w:hint="default"/>
+      </w:rPr>
+    </w:lvl>
+    <w:lvl w:ilvl="4">
+      <w:start w:val="1"/>
+      <w:numFmt w:val="decimal"/>
+      <w:isLgl/>
+      <w:lvlText w:val="%1.%2.%3.%4.%5"/>
+      <w:lvlJc w:val="left"/>
+      <w:pPr>
+        <w:ind w:left="1800" w:hanging="1440"/>
+      </w:pPr>
+      <w:rPr>
+        <w:rFonts w:hint="default"/>
+      </w:rPr>
+    </w:lvl>
+    <w:lvl w:ilvl="5">
+      <w:start w:val="1"/>
+      <w:numFmt w:val="decimal"/>
+      <w:isLgl/>
+      <w:lvlText w:val="%1.%2.%3.%4.%5.%6"/>
+      <w:lvlJc w:val="left"/>
+      <w:pPr>
+        <w:ind w:left="2160" w:hanging="1800"/>
+      </w:pPr>
+      <w:rPr>
+        <w:rFonts w:hint="default"/>
+      </w:rPr>
+    </w:lvl>
+    <w:lvl w:ilvl="6">
+      <w:start w:val="1"/>
+      <w:numFmt w:val="decimal"/>
+      <w:isLgl/>
+      <w:lvlText w:val="%1.%2.%3.%4.%5.%6.%7"/>
+      <w:lvlJc w:val="left"/>
+      <w:pPr>
+        <w:ind w:left="2520" w:hanging="2160"/>
+      </w:pPr>
+      <w:rPr>
+        <w:rFonts w:hint="default"/>
+      </w:rPr>
+    </w:lvl>
+    <w:lvl w:ilvl="7">
+      <w:start w:val="1"/>
+      <w:numFmt w:val="decimal"/>
+      <w:isLgl/>
+      <w:lvlText w:val="%1.%2.%3.%4.%5.%6.%7.%8"/>
+      <w:lvlJc w:val="left"/>
+      <w:pPr>
+        <w:ind w:left="2880" w:hanging="2520"/>
+      </w:pPr>
+      <w:rPr>
+        <w:rFonts w:hint="default"/>
+      </w:rPr>
+    </w:lvl>
+    <w:lvl w:ilvl="8">
+      <w:start w:val="1"/>
+      <w:numFmt w:val="decimal"/>
+      <w:isLgl/>
+      <w:lvlText w:val="%1.%2.%3.%4.%5.%6.%7.%8.%9"/>
+      <w:lvlJc w:val="left"/>
+      <w:pPr>
+        <w:ind w:left="3240" w:hanging="2880"/>
+      </w:pPr>
+      <w:rPr>
+        <w:rFonts w:hint="default"/>
+      </w:rPr>
+    </w:lvl>
+  </w:abstractNum>
+  <w:abstractNum w:abstractNumId="4" w15:restartNumberingAfterBreak="0">
+    <w:nsid w:val="144F3E1D"/>
+    <w:multiLevelType w:val="hybridMultilevel"/>
+    <w:tmpl w:val="5B38C960"/>
+    <w:lvl w:ilvl="0" w:tplc="040E000F">
+      <w:start w:val="1"/>
+      <w:numFmt w:val="decimal"/>
+      <w:lvlText w:val="%1."/>
+      <w:lvlJc w:val="left"/>
+      <w:pPr>
+        <w:ind w:left="1080" w:hanging="360"/>
+      </w:pPr>
+    </w:lvl>
+    <w:lvl w:ilvl="1" w:tplc="040E0019" w:tentative="1">
+      <w:start w:val="1"/>
+      <w:numFmt w:val="lowerLetter"/>
+      <w:lvlText w:val="%2."/>
+      <w:lvlJc w:val="left"/>
+      <w:pPr>
+        <w:ind w:left="1800" w:hanging="360"/>
+      </w:pPr>
+    </w:lvl>
+    <w:lvl w:ilvl="2" w:tplc="040E001B" w:tentative="1">
+      <w:start w:val="1"/>
+      <w:numFmt w:val="lowerRoman"/>
+      <w:lvlText w:val="%3."/>
+      <w:lvlJc w:val="right"/>
+      <w:pPr>
+        <w:ind w:left="2520" w:hanging="180"/>
+      </w:pPr>
+    </w:lvl>
+    <w:lvl w:ilvl="3" w:tplc="040E000F" w:tentative="1">
+      <w:start w:val="1"/>
+      <w:numFmt w:val="decimal"/>
+      <w:lvlText w:val="%4."/>
+      <w:lvlJc w:val="left"/>
+      <w:pPr>
+        <w:ind w:left="3240" w:hanging="360"/>
+      </w:pPr>
+    </w:lvl>
+    <w:lvl w:ilvl="4" w:tplc="040E0019" w:tentative="1">
+      <w:start w:val="1"/>
+      <w:numFmt w:val="lowerLetter"/>
+      <w:lvlText w:val="%5."/>
+      <w:lvlJc w:val="left"/>
+      <w:pPr>
+        <w:ind w:left="3960" w:hanging="360"/>
+      </w:pPr>
+    </w:lvl>
+    <w:lvl w:ilvl="5" w:tplc="040E001B" w:tentative="1">
+      <w:start w:val="1"/>
+      <w:numFmt w:val="lowerRoman"/>
+      <w:lvlText w:val="%6."/>
+      <w:lvlJc w:val="right"/>
+      <w:pPr>
+        <w:ind w:left="4680" w:hanging="180"/>
+      </w:pPr>
+    </w:lvl>
+    <w:lvl w:ilvl="6" w:tplc="040E000F" w:tentative="1">
+      <w:start w:val="1"/>
+      <w:numFmt w:val="decimal"/>
+      <w:lvlText w:val="%7."/>
+      <w:lvlJc w:val="left"/>
+      <w:pPr>
+        <w:ind w:left="5400" w:hanging="360"/>
+      </w:pPr>
+    </w:lvl>
+    <w:lvl w:ilvl="7" w:tplc="040E0019" w:tentative="1">
+      <w:start w:val="1"/>
+      <w:numFmt w:val="lowerLetter"/>
+      <w:lvlText w:val="%8."/>
+      <w:lvlJc w:val="left"/>
+      <w:pPr>
+        <w:ind w:left="6120" w:hanging="360"/>
+      </w:pPr>
+    </w:lvl>
+    <w:lvl w:ilvl="8" w:tplc="040E001B" w:tentative="1">
+      <w:start w:val="1"/>
+      <w:numFmt w:val="lowerRoman"/>
+      <w:lvlText w:val="%9."/>
+      <w:lvlJc w:val="right"/>
+      <w:pPr>
+        <w:ind w:left="6840" w:hanging="180"/>
+      </w:pPr>
+    </w:lvl>
+  </w:abstractNum>
+  <w:abstractNum w:abstractNumId="5" w15:restartNumberingAfterBreak="0">
+    <w:nsid w:val="165F016B"/>
+    <w:multiLevelType w:val="hybridMultilevel"/>
+    <w:tmpl w:val="05ACE2DA"/>
+    <w:lvl w:ilvl="0" w:tplc="040E000F">
+      <w:start w:val="1"/>
+      <w:numFmt w:val="decimal"/>
+      <w:lvlText w:val="%1."/>
+      <w:lvlJc w:val="left"/>
+      <w:pPr>
+        <w:ind w:left="1080" w:hanging="360"/>
+      </w:pPr>
+    </w:lvl>
+    <w:lvl w:ilvl="1" w:tplc="040E0019" w:tentative="1">
+      <w:start w:val="1"/>
+      <w:numFmt w:val="lowerLetter"/>
+      <w:lvlText w:val="%2."/>
+      <w:lvlJc w:val="left"/>
+      <w:pPr>
+        <w:ind w:left="1800" w:hanging="360"/>
+      </w:pPr>
+    </w:lvl>
+    <w:lvl w:ilvl="2" w:tplc="040E001B" w:tentative="1">
+      <w:start w:val="1"/>
+      <w:numFmt w:val="lowerRoman"/>
+      <w:lvlText w:val="%3."/>
+      <w:lvlJc w:val="right"/>
+      <w:pPr>
+        <w:ind w:left="2520" w:hanging="180"/>
+      </w:pPr>
+    </w:lvl>
+    <w:lvl w:ilvl="3" w:tplc="040E000F" w:tentative="1">
+      <w:start w:val="1"/>
+      <w:numFmt w:val="decimal"/>
+      <w:lvlText w:val="%4."/>
+      <w:lvlJc w:val="left"/>
+      <w:pPr>
+        <w:ind w:left="3240" w:hanging="360"/>
+      </w:pPr>
+    </w:lvl>
+    <w:lvl w:ilvl="4" w:tplc="040E0019" w:tentative="1">
+      <w:start w:val="1"/>
+      <w:numFmt w:val="lowerLetter"/>
+      <w:lvlText w:val="%5."/>
+      <w:lvlJc w:val="left"/>
+      <w:pPr>
+        <w:ind w:left="3960" w:hanging="360"/>
+      </w:pPr>
+    </w:lvl>
+    <w:lvl w:ilvl="5" w:tplc="040E001B" w:tentative="1">
+      <w:start w:val="1"/>
+      <w:numFmt w:val="lowerRoman"/>
+      <w:lvlText w:val="%6."/>
+      <w:lvlJc w:val="right"/>
+      <w:pPr>
+        <w:ind w:left="4680" w:hanging="180"/>
+      </w:pPr>
+    </w:lvl>
+    <w:lvl w:ilvl="6" w:tplc="040E000F" w:tentative="1">
+      <w:start w:val="1"/>
+      <w:numFmt w:val="decimal"/>
+      <w:lvlText w:val="%7."/>
+      <w:lvlJc w:val="left"/>
+      <w:pPr>
+        <w:ind w:left="5400" w:hanging="360"/>
+      </w:pPr>
+    </w:lvl>
+    <w:lvl w:ilvl="7" w:tplc="040E0019" w:tentative="1">
+      <w:start w:val="1"/>
+      <w:numFmt w:val="lowerLetter"/>
+      <w:lvlText w:val="%8."/>
+      <w:lvlJc w:val="left"/>
+      <w:pPr>
+        <w:ind w:left="6120" w:hanging="360"/>
+      </w:pPr>
+    </w:lvl>
+    <w:lvl w:ilvl="8" w:tplc="040E001B" w:tentative="1">
+      <w:start w:val="1"/>
+      <w:numFmt w:val="lowerRoman"/>
+      <w:lvlText w:val="%9."/>
+      <w:lvlJc w:val="right"/>
+      <w:pPr>
+        <w:ind w:left="6840" w:hanging="180"/>
+      </w:pPr>
+    </w:lvl>
+  </w:abstractNum>
+  <w:abstractNum w:abstractNumId="6" w15:restartNumberingAfterBreak="0">
+    <w:nsid w:val="18203FAC"/>
+    <w:multiLevelType w:val="multilevel"/>
+    <w:tmpl w:val="38B018D0"/>
+    <w:lvl w:ilvl="0">
+      <w:start w:val="1"/>
+      <w:numFmt w:val="decimal"/>
+      <w:lvlText w:val="%1."/>
+      <w:lvlJc w:val="left"/>
+      <w:pPr>
+        <w:ind w:left="1080" w:hanging="720"/>
+      </w:pPr>
+      <w:rPr>
+        <w:rFonts w:hint="default"/>
+      </w:rPr>
+    </w:lvl>
+    <w:lvl w:ilvl="1">
+      <w:start w:val="1"/>
+      <w:numFmt w:val="decimal"/>
+      <w:isLgl/>
+      <w:lvlText w:val="%1.%2"/>
+      <w:lvlJc w:val="left"/>
+      <w:pPr>
+        <w:ind w:left="1080" w:hanging="720"/>
+      </w:pPr>
+      <w:rPr>
+        <w:rFonts w:hint="default"/>
+      </w:rPr>
+    </w:lvl>
+    <w:lvl w:ilvl="2">
+      <w:start w:val="1"/>
+      <w:numFmt w:val="decimal"/>
+      <w:isLgl/>
+      <w:lvlText w:val="%1.%2.%3"/>
+      <w:lvlJc w:val="left"/>
+      <w:pPr>
+        <w:ind w:left="1440" w:hanging="1080"/>
+      </w:pPr>
+      <w:rPr>
+        <w:rFonts w:hint="default"/>
+      </w:rPr>
+    </w:lvl>
+    <w:lvl w:ilvl="3">
+      <w:start w:val="1"/>
+      <w:numFmt w:val="decimal"/>
+      <w:isLgl/>
+      <w:lvlText w:val="%1.%2.%3.%4"/>
+      <w:lvlJc w:val="left"/>
+      <w:pPr>
+        <w:ind w:left="1800" w:hanging="1440"/>
+      </w:pPr>
+      <w:rPr>
+        <w:rFonts w:hint="default"/>
+      </w:rPr>
+    </w:lvl>
+    <w:lvl w:ilvl="4">
+      <w:start w:val="1"/>
+      <w:numFmt w:val="decimal"/>
+      <w:isLgl/>
+      <w:lvlText w:val="%1.%2.%3.%4.%5"/>
+      <w:lvlJc w:val="left"/>
+      <w:pPr>
+        <w:ind w:left="1800" w:hanging="1440"/>
+      </w:pPr>
+      <w:rPr>
+        <w:rFonts w:hint="default"/>
+      </w:rPr>
+    </w:lvl>
+    <w:lvl w:ilvl="5">
+      <w:start w:val="1"/>
+      <w:numFmt w:val="decimal"/>
+      <w:isLgl/>
+      <w:lvlText w:val="%1.%2.%3.%4.%5.%6"/>
+      <w:lvlJc w:val="left"/>
+      <w:pPr>
+        <w:ind w:left="2160" w:hanging="1800"/>
+      </w:pPr>
+      <w:rPr>
+        <w:rFonts w:hint="default"/>
+      </w:rPr>
+    </w:lvl>
+    <w:lvl w:ilvl="6">
+      <w:start w:val="1"/>
+      <w:numFmt w:val="decimal"/>
+      <w:isLgl/>
+      <w:lvlText w:val="%1.%2.%3.%4.%5.%6.%7"/>
+      <w:lvlJc w:val="left"/>
+      <w:pPr>
+        <w:ind w:left="2520" w:hanging="2160"/>
+      </w:pPr>
+      <w:rPr>
+        <w:rFonts w:hint="default"/>
+      </w:rPr>
+    </w:lvl>
+    <w:lvl w:ilvl="7">
+      <w:start w:val="1"/>
+      <w:numFmt w:val="decimal"/>
+      <w:isLgl/>
+      <w:lvlText w:val="%1.%2.%3.%4.%5.%6.%7.%8"/>
+      <w:lvlJc w:val="left"/>
+      <w:pPr>
+        <w:ind w:left="2880" w:hanging="2520"/>
+      </w:pPr>
+      <w:rPr>
+        <w:rFonts w:hint="default"/>
+      </w:rPr>
+    </w:lvl>
+    <w:lvl w:ilvl="8">
+      <w:start w:val="1"/>
+      <w:numFmt w:val="decimal"/>
+      <w:isLgl/>
+      <w:lvlText w:val="%1.%2.%3.%4.%5.%6.%7.%8.%9"/>
+      <w:lvlJc w:val="left"/>
+      <w:pPr>
+        <w:ind w:left="3240" w:hanging="2880"/>
+      </w:pPr>
+      <w:rPr>
+        <w:rFonts w:hint="default"/>
+      </w:rPr>
+    </w:lvl>
+  </w:abstractNum>
+  <w:abstractNum w:abstractNumId="7" w15:restartNumberingAfterBreak="0">
     <w:nsid w:val="206204E0"/>
     <w:multiLevelType w:val="multilevel"/>
     <w:tmpl w:val="38B018D0"/>
@@ -3448,7 +3774,268 @@
       </w:rPr>
     </w:lvl>
   </w:abstractNum>
-  <w:abstractNum w:abstractNumId="2" w15:restartNumberingAfterBreak="0">
+  <w:abstractNum w:abstractNumId="8" w15:restartNumberingAfterBreak="0">
+    <w:nsid w:val="2C230258"/>
+    <w:multiLevelType w:val="hybridMultilevel"/>
+    <w:tmpl w:val="2856F778"/>
+    <w:lvl w:ilvl="0" w:tplc="040E000F">
+      <w:start w:val="1"/>
+      <w:numFmt w:val="decimal"/>
+      <w:lvlText w:val="%1."/>
+      <w:lvlJc w:val="left"/>
+      <w:pPr>
+        <w:ind w:left="900" w:hanging="360"/>
+      </w:pPr>
+    </w:lvl>
+    <w:lvl w:ilvl="1" w:tplc="040E0019" w:tentative="1">
+      <w:start w:val="1"/>
+      <w:numFmt w:val="lowerLetter"/>
+      <w:lvlText w:val="%2."/>
+      <w:lvlJc w:val="left"/>
+      <w:pPr>
+        <w:ind w:left="1620" w:hanging="360"/>
+      </w:pPr>
+    </w:lvl>
+    <w:lvl w:ilvl="2" w:tplc="040E001B" w:tentative="1">
+      <w:start w:val="1"/>
+      <w:numFmt w:val="lowerRoman"/>
+      <w:lvlText w:val="%3."/>
+      <w:lvlJc w:val="right"/>
+      <w:pPr>
+        <w:ind w:left="2340" w:hanging="180"/>
+      </w:pPr>
+    </w:lvl>
+    <w:lvl w:ilvl="3" w:tplc="040E000F" w:tentative="1">
+      <w:start w:val="1"/>
+      <w:numFmt w:val="decimal"/>
+      <w:lvlText w:val="%4."/>
+      <w:lvlJc w:val="left"/>
+      <w:pPr>
+        <w:ind w:left="3060" w:hanging="360"/>
+      </w:pPr>
+    </w:lvl>
+    <w:lvl w:ilvl="4" w:tplc="040E0019" w:tentative="1">
+      <w:start w:val="1"/>
+      <w:numFmt w:val="lowerLetter"/>
+      <w:lvlText w:val="%5."/>
+      <w:lvlJc w:val="left"/>
+      <w:pPr>
+        <w:ind w:left="3780" w:hanging="360"/>
+      </w:pPr>
+    </w:lvl>
+    <w:lvl w:ilvl="5" w:tplc="040E001B" w:tentative="1">
+      <w:start w:val="1"/>
+      <w:numFmt w:val="lowerRoman"/>
+      <w:lvlText w:val="%6."/>
+      <w:lvlJc w:val="right"/>
+      <w:pPr>
+        <w:ind w:left="4500" w:hanging="180"/>
+      </w:pPr>
+    </w:lvl>
+    <w:lvl w:ilvl="6" w:tplc="040E000F" w:tentative="1">
+      <w:start w:val="1"/>
+      <w:numFmt w:val="decimal"/>
+      <w:lvlText w:val="%7."/>
+      <w:lvlJc w:val="left"/>
+      <w:pPr>
+        <w:ind w:left="5220" w:hanging="360"/>
+      </w:pPr>
+    </w:lvl>
+    <w:lvl w:ilvl="7" w:tplc="040E0019" w:tentative="1">
+      <w:start w:val="1"/>
+      <w:numFmt w:val="lowerLetter"/>
+      <w:lvlText w:val="%8."/>
+      <w:lvlJc w:val="left"/>
+      <w:pPr>
+        <w:ind w:left="5940" w:hanging="360"/>
+      </w:pPr>
+    </w:lvl>
+    <w:lvl w:ilvl="8" w:tplc="040E001B" w:tentative="1">
+      <w:start w:val="1"/>
+      <w:numFmt w:val="lowerRoman"/>
+      <w:lvlText w:val="%9."/>
+      <w:lvlJc w:val="right"/>
+      <w:pPr>
+        <w:ind w:left="6660" w:hanging="180"/>
+      </w:pPr>
+    </w:lvl>
+  </w:abstractNum>
+  <w:abstractNum w:abstractNumId="9" w15:restartNumberingAfterBreak="0">
+    <w:nsid w:val="2FD66730"/>
+    <w:multiLevelType w:val="hybridMultilevel"/>
+    <w:tmpl w:val="E48EB5CE"/>
+    <w:lvl w:ilvl="0" w:tplc="E708DE48">
+      <w:start w:val="20"/>
+      <w:numFmt w:val="decimal"/>
+      <w:lvlText w:val="%1."/>
+      <w:lvlJc w:val="left"/>
+      <w:pPr>
+        <w:ind w:left="720" w:hanging="360"/>
+      </w:pPr>
+      <w:rPr>
+        <w:rFonts w:hint="default"/>
+      </w:rPr>
+    </w:lvl>
+    <w:lvl w:ilvl="1" w:tplc="040E0019" w:tentative="1">
+      <w:start w:val="1"/>
+      <w:numFmt w:val="lowerLetter"/>
+      <w:lvlText w:val="%2."/>
+      <w:lvlJc w:val="left"/>
+      <w:pPr>
+        <w:ind w:left="1440" w:hanging="360"/>
+      </w:pPr>
+    </w:lvl>
+    <w:lvl w:ilvl="2" w:tplc="040E001B" w:tentative="1">
+      <w:start w:val="1"/>
+      <w:numFmt w:val="lowerRoman"/>
+      <w:lvlText w:val="%3."/>
+      <w:lvlJc w:val="right"/>
+      <w:pPr>
+        <w:ind w:left="2160" w:hanging="180"/>
+      </w:pPr>
+    </w:lvl>
+    <w:lvl w:ilvl="3" w:tplc="040E000F" w:tentative="1">
+      <w:start w:val="1"/>
+      <w:numFmt w:val="decimal"/>
+      <w:lvlText w:val="%4."/>
+      <w:lvlJc w:val="left"/>
+      <w:pPr>
+        <w:ind w:left="2880" w:hanging="360"/>
+      </w:pPr>
+    </w:lvl>
+    <w:lvl w:ilvl="4" w:tplc="040E0019" w:tentative="1">
+      <w:start w:val="1"/>
+      <w:numFmt w:val="lowerLetter"/>
+      <w:lvlText w:val="%5."/>
+      <w:lvlJc w:val="left"/>
+      <w:pPr>
+        <w:ind w:left="3600" w:hanging="360"/>
+      </w:pPr>
+    </w:lvl>
+    <w:lvl w:ilvl="5" w:tplc="040E001B" w:tentative="1">
+      <w:start w:val="1"/>
+      <w:numFmt w:val="lowerRoman"/>
+      <w:lvlText w:val="%6."/>
+      <w:lvlJc w:val="right"/>
+      <w:pPr>
+        <w:ind w:left="4320" w:hanging="180"/>
+      </w:pPr>
+    </w:lvl>
+    <w:lvl w:ilvl="6" w:tplc="040E000F" w:tentative="1">
+      <w:start w:val="1"/>
+      <w:numFmt w:val="decimal"/>
+      <w:lvlText w:val="%7."/>
+      <w:lvlJc w:val="left"/>
+      <w:pPr>
+        <w:ind w:left="5040" w:hanging="360"/>
+      </w:pPr>
+    </w:lvl>
+    <w:lvl w:ilvl="7" w:tplc="040E0019" w:tentative="1">
+      <w:start w:val="1"/>
+      <w:numFmt w:val="lowerLetter"/>
+      <w:lvlText w:val="%8."/>
+      <w:lvlJc w:val="left"/>
+      <w:pPr>
+        <w:ind w:left="5760" w:hanging="360"/>
+      </w:pPr>
+    </w:lvl>
+    <w:lvl w:ilvl="8" w:tplc="040E001B" w:tentative="1">
+      <w:start w:val="1"/>
+      <w:numFmt w:val="lowerRoman"/>
+      <w:lvlText w:val="%9."/>
+      <w:lvlJc w:val="right"/>
+      <w:pPr>
+        <w:ind w:left="6480" w:hanging="180"/>
+      </w:pPr>
+    </w:lvl>
+  </w:abstractNum>
+  <w:abstractNum w:abstractNumId="10" w15:restartNumberingAfterBreak="0">
+    <w:nsid w:val="333B1F69"/>
+    <w:multiLevelType w:val="hybridMultilevel"/>
+    <w:tmpl w:val="55646E1A"/>
+    <w:lvl w:ilvl="0" w:tplc="040E000F">
+      <w:start w:val="1"/>
+      <w:numFmt w:val="decimal"/>
+      <w:lvlText w:val="%1."/>
+      <w:lvlJc w:val="left"/>
+      <w:pPr>
+        <w:ind w:left="1080" w:hanging="360"/>
+      </w:pPr>
+    </w:lvl>
+    <w:lvl w:ilvl="1" w:tplc="040E0019" w:tentative="1">
+      <w:start w:val="1"/>
+      <w:numFmt w:val="lowerLetter"/>
+      <w:lvlText w:val="%2."/>
+      <w:lvlJc w:val="left"/>
+      <w:pPr>
+        <w:ind w:left="1800" w:hanging="360"/>
+      </w:pPr>
+    </w:lvl>
+    <w:lvl w:ilvl="2" w:tplc="040E001B" w:tentative="1">
+      <w:start w:val="1"/>
+      <w:numFmt w:val="lowerRoman"/>
+      <w:lvlText w:val="%3."/>
+      <w:lvlJc w:val="right"/>
+      <w:pPr>
+        <w:ind w:left="2520" w:hanging="180"/>
+      </w:pPr>
+    </w:lvl>
+    <w:lvl w:ilvl="3" w:tplc="040E000F" w:tentative="1">
+      <w:start w:val="1"/>
+      <w:numFmt w:val="decimal"/>
+      <w:lvlText w:val="%4."/>
+      <w:lvlJc w:val="left"/>
+      <w:pPr>
+        <w:ind w:left="3240" w:hanging="360"/>
+      </w:pPr>
+    </w:lvl>
+    <w:lvl w:ilvl="4" w:tplc="040E0019" w:tentative="1">
+      <w:start w:val="1"/>
+      <w:numFmt w:val="lowerLetter"/>
+      <w:lvlText w:val="%5."/>
+      <w:lvlJc w:val="left"/>
+      <w:pPr>
+        <w:ind w:left="3960" w:hanging="360"/>
+      </w:pPr>
+    </w:lvl>
+    <w:lvl w:ilvl="5" w:tplc="040E001B" w:tentative="1">
+      <w:start w:val="1"/>
+      <w:numFmt w:val="lowerRoman"/>
+      <w:lvlText w:val="%6."/>
+      <w:lvlJc w:val="right"/>
+      <w:pPr>
+        <w:ind w:left="4680" w:hanging="180"/>
+      </w:pPr>
+    </w:lvl>
+    <w:lvl w:ilvl="6" w:tplc="040E000F" w:tentative="1">
+      <w:start w:val="1"/>
+      <w:numFmt w:val="decimal"/>
+      <w:lvlText w:val="%7."/>
+      <w:lvlJc w:val="left"/>
+      <w:pPr>
+        <w:ind w:left="5400" w:hanging="360"/>
+      </w:pPr>
+    </w:lvl>
+    <w:lvl w:ilvl="7" w:tplc="040E0019" w:tentative="1">
+      <w:start w:val="1"/>
+      <w:numFmt w:val="lowerLetter"/>
+      <w:lvlText w:val="%8."/>
+      <w:lvlJc w:val="left"/>
+      <w:pPr>
+        <w:ind w:left="6120" w:hanging="360"/>
+      </w:pPr>
+    </w:lvl>
+    <w:lvl w:ilvl="8" w:tplc="040E001B" w:tentative="1">
+      <w:start w:val="1"/>
+      <w:numFmt w:val="lowerRoman"/>
+      <w:lvlText w:val="%9."/>
+      <w:lvlJc w:val="right"/>
+      <w:pPr>
+        <w:ind w:left="6840" w:hanging="180"/>
+      </w:pPr>
+    </w:lvl>
+  </w:abstractNum>
+  <w:abstractNum w:abstractNumId="11" w15:restartNumberingAfterBreak="0">
     <w:nsid w:val="3B283F30"/>
     <w:multiLevelType w:val="multilevel"/>
     <w:tmpl w:val="A9606782"/>
@@ -3561,7 +4148,96 @@
       </w:rPr>
     </w:lvl>
   </w:abstractNum>
-  <w:abstractNum w:abstractNumId="3" w15:restartNumberingAfterBreak="0">
+  <w:abstractNum w:abstractNumId="12" w15:restartNumberingAfterBreak="0">
+    <w:nsid w:val="46EC213D"/>
+    <w:multiLevelType w:val="hybridMultilevel"/>
+    <w:tmpl w:val="D542C52C"/>
+    <w:lvl w:ilvl="0" w:tplc="E25441E8">
+      <w:start w:val="1"/>
+      <w:numFmt w:val="decimal"/>
+      <w:lvlText w:val="%1."/>
+      <w:lvlJc w:val="left"/>
+      <w:pPr>
+        <w:ind w:left="1080" w:hanging="720"/>
+      </w:pPr>
+      <w:rPr>
+        <w:rFonts w:hint="default"/>
+      </w:rPr>
+    </w:lvl>
+    <w:lvl w:ilvl="1" w:tplc="040E0019" w:tentative="1">
+      <w:start w:val="1"/>
+      <w:numFmt w:val="lowerLetter"/>
+      <w:lvlText w:val="%2."/>
+      <w:lvlJc w:val="left"/>
+      <w:pPr>
+        <w:ind w:left="1440" w:hanging="360"/>
+      </w:pPr>
+    </w:lvl>
+    <w:lvl w:ilvl="2" w:tplc="040E001B" w:tentative="1">
+      <w:start w:val="1"/>
+      <w:numFmt w:val="lowerRoman"/>
+      <w:lvlText w:val="%3."/>
+      <w:lvlJc w:val="right"/>
+      <w:pPr>
+        <w:ind w:left="2160" w:hanging="180"/>
+      </w:pPr>
+    </w:lvl>
+    <w:lvl w:ilvl="3" w:tplc="040E000F" w:tentative="1">
+      <w:start w:val="1"/>
+      <w:numFmt w:val="decimal"/>
+      <w:lvlText w:val="%4."/>
+      <w:lvlJc w:val="left"/>
+      <w:pPr>
+        <w:ind w:left="2880" w:hanging="360"/>
+      </w:pPr>
+    </w:lvl>
+    <w:lvl w:ilvl="4" w:tplc="040E0019" w:tentative="1">
+      <w:start w:val="1"/>
+      <w:numFmt w:val="lowerLetter"/>
+      <w:lvlText w:val="%5."/>
+      <w:lvlJc w:val="left"/>
+      <w:pPr>
+        <w:ind w:left="3600" w:hanging="360"/>
+      </w:pPr>
+    </w:lvl>
+    <w:lvl w:ilvl="5" w:tplc="040E001B" w:tentative="1">
+      <w:start w:val="1"/>
+      <w:numFmt w:val="lowerRoman"/>
+      <w:lvlText w:val="%6."/>
+      <w:lvlJc w:val="right"/>
+      <w:pPr>
+        <w:ind w:left="4320" w:hanging="180"/>
+      </w:pPr>
+    </w:lvl>
+    <w:lvl w:ilvl="6" w:tplc="040E000F" w:tentative="1">
+      <w:start w:val="1"/>
+      <w:numFmt w:val="decimal"/>
+      <w:lvlText w:val="%7."/>
+      <w:lvlJc w:val="left"/>
+      <w:pPr>
+        <w:ind w:left="5040" w:hanging="360"/>
+      </w:pPr>
+    </w:lvl>
+    <w:lvl w:ilvl="7" w:tplc="040E0019" w:tentative="1">
+      <w:start w:val="1"/>
+      <w:numFmt w:val="lowerLetter"/>
+      <w:lvlText w:val="%8."/>
+      <w:lvlJc w:val="left"/>
+      <w:pPr>
+        <w:ind w:left="5760" w:hanging="360"/>
+      </w:pPr>
+    </w:lvl>
+    <w:lvl w:ilvl="8" w:tplc="040E001B" w:tentative="1">
+      <w:start w:val="1"/>
+      <w:numFmt w:val="lowerRoman"/>
+      <w:lvlText w:val="%9."/>
+      <w:lvlJc w:val="right"/>
+      <w:pPr>
+        <w:ind w:left="6480" w:hanging="180"/>
+      </w:pPr>
+    </w:lvl>
+  </w:abstractNum>
+  <w:abstractNum w:abstractNumId="13" w15:restartNumberingAfterBreak="0">
     <w:nsid w:val="522D4035"/>
     <w:multiLevelType w:val="multilevel"/>
     <w:tmpl w:val="A9606782"/>
@@ -3674,7 +4350,7 @@
       </w:rPr>
     </w:lvl>
   </w:abstractNum>
-  <w:abstractNum w:abstractNumId="4" w15:restartNumberingAfterBreak="0">
+  <w:abstractNum w:abstractNumId="14" w15:restartNumberingAfterBreak="0">
     <w:nsid w:val="53175545"/>
     <w:multiLevelType w:val="multilevel"/>
     <w:tmpl w:val="38B018D0"/>
@@ -3795,7 +4471,271 @@
       </w:rPr>
     </w:lvl>
   </w:abstractNum>
-  <w:abstractNum w:abstractNumId="5" w15:restartNumberingAfterBreak="0">
+  <w:abstractNum w:abstractNumId="15" w15:restartNumberingAfterBreak="0">
+    <w:nsid w:val="5511323B"/>
+    <w:multiLevelType w:val="hybridMultilevel"/>
+    <w:tmpl w:val="983A6960"/>
+    <w:lvl w:ilvl="0" w:tplc="040E000F">
+      <w:start w:val="1"/>
+      <w:numFmt w:val="decimal"/>
+      <w:lvlText w:val="%1."/>
+      <w:lvlJc w:val="left"/>
+      <w:pPr>
+        <w:ind w:left="720" w:hanging="360"/>
+      </w:pPr>
+    </w:lvl>
+    <w:lvl w:ilvl="1" w:tplc="040E0019" w:tentative="1">
+      <w:start w:val="1"/>
+      <w:numFmt w:val="lowerLetter"/>
+      <w:lvlText w:val="%2."/>
+      <w:lvlJc w:val="left"/>
+      <w:pPr>
+        <w:ind w:left="1440" w:hanging="360"/>
+      </w:pPr>
+    </w:lvl>
+    <w:lvl w:ilvl="2" w:tplc="040E001B" w:tentative="1">
+      <w:start w:val="1"/>
+      <w:numFmt w:val="lowerRoman"/>
+      <w:lvlText w:val="%3."/>
+      <w:lvlJc w:val="right"/>
+      <w:pPr>
+        <w:ind w:left="2160" w:hanging="180"/>
+      </w:pPr>
+    </w:lvl>
+    <w:lvl w:ilvl="3" w:tplc="040E000F" w:tentative="1">
+      <w:start w:val="1"/>
+      <w:numFmt w:val="decimal"/>
+      <w:lvlText w:val="%4."/>
+      <w:lvlJc w:val="left"/>
+      <w:pPr>
+        <w:ind w:left="2880" w:hanging="360"/>
+      </w:pPr>
+    </w:lvl>
+    <w:lvl w:ilvl="4" w:tplc="040E0019" w:tentative="1">
+      <w:start w:val="1"/>
+      <w:numFmt w:val="lowerLetter"/>
+      <w:lvlText w:val="%5."/>
+      <w:lvlJc w:val="left"/>
+      <w:pPr>
+        <w:ind w:left="3600" w:hanging="360"/>
+      </w:pPr>
+    </w:lvl>
+    <w:lvl w:ilvl="5" w:tplc="040E001B" w:tentative="1">
+      <w:start w:val="1"/>
+      <w:numFmt w:val="lowerRoman"/>
+      <w:lvlText w:val="%6."/>
+      <w:lvlJc w:val="right"/>
+      <w:pPr>
+        <w:ind w:left="4320" w:hanging="180"/>
+      </w:pPr>
+    </w:lvl>
+    <w:lvl w:ilvl="6" w:tplc="040E000F" w:tentative="1">
+      <w:start w:val="1"/>
+      <w:numFmt w:val="decimal"/>
+      <w:lvlText w:val="%7."/>
+      <w:lvlJc w:val="left"/>
+      <w:pPr>
+        <w:ind w:left="5040" w:hanging="360"/>
+      </w:pPr>
+    </w:lvl>
+    <w:lvl w:ilvl="7" w:tplc="040E0019" w:tentative="1">
+      <w:start w:val="1"/>
+      <w:numFmt w:val="lowerLetter"/>
+      <w:lvlText w:val="%8."/>
+      <w:lvlJc w:val="left"/>
+      <w:pPr>
+        <w:ind w:left="5760" w:hanging="360"/>
+      </w:pPr>
+    </w:lvl>
+    <w:lvl w:ilvl="8" w:tplc="040E001B" w:tentative="1">
+      <w:start w:val="1"/>
+      <w:numFmt w:val="lowerRoman"/>
+      <w:lvlText w:val="%9."/>
+      <w:lvlJc w:val="right"/>
+      <w:pPr>
+        <w:ind w:left="6480" w:hanging="180"/>
+      </w:pPr>
+    </w:lvl>
+  </w:abstractNum>
+  <w:abstractNum w:abstractNumId="16" w15:restartNumberingAfterBreak="0">
+    <w:nsid w:val="5DEE3724"/>
+    <w:multiLevelType w:val="hybridMultilevel"/>
+    <w:tmpl w:val="4210BBF8"/>
+    <w:lvl w:ilvl="0" w:tplc="04DCD2DE">
+      <w:start w:val="1"/>
+      <w:numFmt w:val="decimal"/>
+      <w:lvlText w:val="%1."/>
+      <w:lvlJc w:val="left"/>
+      <w:pPr>
+        <w:ind w:left="1080" w:hanging="720"/>
+      </w:pPr>
+      <w:rPr>
+        <w:rFonts w:hint="default"/>
+      </w:rPr>
+    </w:lvl>
+    <w:lvl w:ilvl="1" w:tplc="040E0019" w:tentative="1">
+      <w:start w:val="1"/>
+      <w:numFmt w:val="lowerLetter"/>
+      <w:lvlText w:val="%2."/>
+      <w:lvlJc w:val="left"/>
+      <w:pPr>
+        <w:ind w:left="1440" w:hanging="360"/>
+      </w:pPr>
+    </w:lvl>
+    <w:lvl w:ilvl="2" w:tplc="040E001B" w:tentative="1">
+      <w:start w:val="1"/>
+      <w:numFmt w:val="lowerRoman"/>
+      <w:lvlText w:val="%3."/>
+      <w:lvlJc w:val="right"/>
+      <w:pPr>
+        <w:ind w:left="2160" w:hanging="180"/>
+      </w:pPr>
+    </w:lvl>
+    <w:lvl w:ilvl="3" w:tplc="040E000F" w:tentative="1">
+      <w:start w:val="1"/>
+      <w:numFmt w:val="decimal"/>
+      <w:lvlText w:val="%4."/>
+      <w:lvlJc w:val="left"/>
+      <w:pPr>
+        <w:ind w:left="2880" w:hanging="360"/>
+      </w:pPr>
+    </w:lvl>
+    <w:lvl w:ilvl="4" w:tplc="040E0019" w:tentative="1">
+      <w:start w:val="1"/>
+      <w:numFmt w:val="lowerLetter"/>
+      <w:lvlText w:val="%5."/>
+      <w:lvlJc w:val="left"/>
+      <w:pPr>
+        <w:ind w:left="3600" w:hanging="360"/>
+      </w:pPr>
+    </w:lvl>
+    <w:lvl w:ilvl="5" w:tplc="040E001B" w:tentative="1">
+      <w:start w:val="1"/>
+      <w:numFmt w:val="lowerRoman"/>
+      <w:lvlText w:val="%6."/>
+      <w:lvlJc w:val="right"/>
+      <w:pPr>
+        <w:ind w:left="4320" w:hanging="180"/>
+      </w:pPr>
+    </w:lvl>
+    <w:lvl w:ilvl="6" w:tplc="040E000F" w:tentative="1">
+      <w:start w:val="1"/>
+      <w:numFmt w:val="decimal"/>
+      <w:lvlText w:val="%7."/>
+      <w:lvlJc w:val="left"/>
+      <w:pPr>
+        <w:ind w:left="5040" w:hanging="360"/>
+      </w:pPr>
+    </w:lvl>
+    <w:lvl w:ilvl="7" w:tplc="040E0019" w:tentative="1">
+      <w:start w:val="1"/>
+      <w:numFmt w:val="lowerLetter"/>
+      <w:lvlText w:val="%8."/>
+      <w:lvlJc w:val="left"/>
+      <w:pPr>
+        <w:ind w:left="5760" w:hanging="360"/>
+      </w:pPr>
+    </w:lvl>
+    <w:lvl w:ilvl="8" w:tplc="040E001B" w:tentative="1">
+      <w:start w:val="1"/>
+      <w:numFmt w:val="lowerRoman"/>
+      <w:lvlText w:val="%9."/>
+      <w:lvlJc w:val="right"/>
+      <w:pPr>
+        <w:ind w:left="6480" w:hanging="180"/>
+      </w:pPr>
+    </w:lvl>
+  </w:abstractNum>
+  <w:abstractNum w:abstractNumId="17" w15:restartNumberingAfterBreak="0">
+    <w:nsid w:val="5F1446AE"/>
+    <w:multiLevelType w:val="hybridMultilevel"/>
+    <w:tmpl w:val="6AEC6C7C"/>
+    <w:lvl w:ilvl="0" w:tplc="E708DE48">
+      <w:start w:val="20"/>
+      <w:numFmt w:val="decimal"/>
+      <w:lvlText w:val="%1."/>
+      <w:lvlJc w:val="left"/>
+      <w:pPr>
+        <w:ind w:left="720" w:hanging="360"/>
+      </w:pPr>
+      <w:rPr>
+        <w:rFonts w:hint="default"/>
+      </w:rPr>
+    </w:lvl>
+    <w:lvl w:ilvl="1" w:tplc="040E0019" w:tentative="1">
+      <w:start w:val="1"/>
+      <w:numFmt w:val="lowerLetter"/>
+      <w:lvlText w:val="%2."/>
+      <w:lvlJc w:val="left"/>
+      <w:pPr>
+        <w:ind w:left="1440" w:hanging="360"/>
+      </w:pPr>
+    </w:lvl>
+    <w:lvl w:ilvl="2" w:tplc="040E001B" w:tentative="1">
+      <w:start w:val="1"/>
+      <w:numFmt w:val="lowerRoman"/>
+      <w:lvlText w:val="%3."/>
+      <w:lvlJc w:val="right"/>
+      <w:pPr>
+        <w:ind w:left="2160" w:hanging="180"/>
+      </w:pPr>
+    </w:lvl>
+    <w:lvl w:ilvl="3" w:tplc="040E000F" w:tentative="1">
+      <w:start w:val="1"/>
+      <w:numFmt w:val="decimal"/>
+      <w:lvlText w:val="%4."/>
+      <w:lvlJc w:val="left"/>
+      <w:pPr>
+        <w:ind w:left="2880" w:hanging="360"/>
+      </w:pPr>
+    </w:lvl>
+    <w:lvl w:ilvl="4" w:tplc="040E0019" w:tentative="1">
+      <w:start w:val="1"/>
+      <w:numFmt w:val="lowerLetter"/>
+      <w:lvlText w:val="%5."/>
+      <w:lvlJc w:val="left"/>
+      <w:pPr>
+        <w:ind w:left="3600" w:hanging="360"/>
+      </w:pPr>
+    </w:lvl>
+    <w:lvl w:ilvl="5" w:tplc="040E001B" w:tentative="1">
+      <w:start w:val="1"/>
+      <w:numFmt w:val="lowerRoman"/>
+      <w:lvlText w:val="%6."/>
+      <w:lvlJc w:val="right"/>
+      <w:pPr>
+        <w:ind w:left="4320" w:hanging="180"/>
+      </w:pPr>
+    </w:lvl>
+    <w:lvl w:ilvl="6" w:tplc="040E000F" w:tentative="1">
+      <w:start w:val="1"/>
+      <w:numFmt w:val="decimal"/>
+      <w:lvlText w:val="%7."/>
+      <w:lvlJc w:val="left"/>
+      <w:pPr>
+        <w:ind w:left="5040" w:hanging="360"/>
+      </w:pPr>
+    </w:lvl>
+    <w:lvl w:ilvl="7" w:tplc="040E0019" w:tentative="1">
+      <w:start w:val="1"/>
+      <w:numFmt w:val="lowerLetter"/>
+      <w:lvlText w:val="%8."/>
+      <w:lvlJc w:val="left"/>
+      <w:pPr>
+        <w:ind w:left="5760" w:hanging="360"/>
+      </w:pPr>
+    </w:lvl>
+    <w:lvl w:ilvl="8" w:tplc="040E001B" w:tentative="1">
+      <w:start w:val="1"/>
+      <w:numFmt w:val="lowerRoman"/>
+      <w:lvlText w:val="%9."/>
+      <w:lvlJc w:val="right"/>
+      <w:pPr>
+        <w:ind w:left="6480" w:hanging="180"/>
+      </w:pPr>
+    </w:lvl>
+  </w:abstractNum>
+  <w:abstractNum w:abstractNumId="18" w15:restartNumberingAfterBreak="0">
     <w:nsid w:val="69EA7AEF"/>
     <w:multiLevelType w:val="hybridMultilevel"/>
     <w:tmpl w:val="0D722DFC"/>
@@ -3881,23 +4821,151 @@
       </w:pPr>
     </w:lvl>
   </w:abstractNum>
+  <w:abstractNum w:abstractNumId="19" w15:restartNumberingAfterBreak="0">
+    <w:nsid w:val="71DD7A9F"/>
+    <w:multiLevelType w:val="hybridMultilevel"/>
+    <w:tmpl w:val="F43C4814"/>
+    <w:lvl w:ilvl="0" w:tplc="040E000F">
+      <w:start w:val="1"/>
+      <w:numFmt w:val="decimal"/>
+      <w:lvlText w:val="%1."/>
+      <w:lvlJc w:val="left"/>
+      <w:pPr>
+        <w:ind w:left="1080" w:hanging="360"/>
+      </w:pPr>
+    </w:lvl>
+    <w:lvl w:ilvl="1" w:tplc="040E0019" w:tentative="1">
+      <w:start w:val="1"/>
+      <w:numFmt w:val="lowerLetter"/>
+      <w:lvlText w:val="%2."/>
+      <w:lvlJc w:val="left"/>
+      <w:pPr>
+        <w:ind w:left="1800" w:hanging="360"/>
+      </w:pPr>
+    </w:lvl>
+    <w:lvl w:ilvl="2" w:tplc="040E001B" w:tentative="1">
+      <w:start w:val="1"/>
+      <w:numFmt w:val="lowerRoman"/>
+      <w:lvlText w:val="%3."/>
+      <w:lvlJc w:val="right"/>
+      <w:pPr>
+        <w:ind w:left="2520" w:hanging="180"/>
+      </w:pPr>
+    </w:lvl>
+    <w:lvl w:ilvl="3" w:tplc="040E000F" w:tentative="1">
+      <w:start w:val="1"/>
+      <w:numFmt w:val="decimal"/>
+      <w:lvlText w:val="%4."/>
+      <w:lvlJc w:val="left"/>
+      <w:pPr>
+        <w:ind w:left="3240" w:hanging="360"/>
+      </w:pPr>
+    </w:lvl>
+    <w:lvl w:ilvl="4" w:tplc="040E0019" w:tentative="1">
+      <w:start w:val="1"/>
+      <w:numFmt w:val="lowerLetter"/>
+      <w:lvlText w:val="%5."/>
+      <w:lvlJc w:val="left"/>
+      <w:pPr>
+        <w:ind w:left="3960" w:hanging="360"/>
+      </w:pPr>
+    </w:lvl>
+    <w:lvl w:ilvl="5" w:tplc="040E001B" w:tentative="1">
+      <w:start w:val="1"/>
+      <w:numFmt w:val="lowerRoman"/>
+      <w:lvlText w:val="%6."/>
+      <w:lvlJc w:val="right"/>
+      <w:pPr>
+        <w:ind w:left="4680" w:hanging="180"/>
+      </w:pPr>
+    </w:lvl>
+    <w:lvl w:ilvl="6" w:tplc="040E000F" w:tentative="1">
+      <w:start w:val="1"/>
+      <w:numFmt w:val="decimal"/>
+      <w:lvlText w:val="%7."/>
+      <w:lvlJc w:val="left"/>
+      <w:pPr>
+        <w:ind w:left="5400" w:hanging="360"/>
+      </w:pPr>
+    </w:lvl>
+    <w:lvl w:ilvl="7" w:tplc="040E0019" w:tentative="1">
+      <w:start w:val="1"/>
+      <w:numFmt w:val="lowerLetter"/>
+      <w:lvlText w:val="%8."/>
+      <w:lvlJc w:val="left"/>
+      <w:pPr>
+        <w:ind w:left="6120" w:hanging="360"/>
+      </w:pPr>
+    </w:lvl>
+    <w:lvl w:ilvl="8" w:tplc="040E001B" w:tentative="1">
+      <w:start w:val="1"/>
+      <w:numFmt w:val="lowerRoman"/>
+      <w:lvlText w:val="%9."/>
+      <w:lvlJc w:val="right"/>
+      <w:pPr>
+        <w:ind w:left="6840" w:hanging="180"/>
+      </w:pPr>
+    </w:lvl>
+  </w:abstractNum>
   <w:num w:numId="1" w16cid:durableId="950480417">
+    <w:abstractNumId w:val="2"/>
+  </w:num>
+  <w:num w:numId="2" w16cid:durableId="1294484620">
+    <w:abstractNumId w:val="18"/>
+  </w:num>
+  <w:num w:numId="3" w16cid:durableId="109859399">
+    <w:abstractNumId w:val="14"/>
+  </w:num>
+  <w:num w:numId="4" w16cid:durableId="2064984734">
+    <w:abstractNumId w:val="7"/>
+  </w:num>
+  <w:num w:numId="5" w16cid:durableId="775255097">
+    <w:abstractNumId w:val="11"/>
+  </w:num>
+  <w:num w:numId="6" w16cid:durableId="1162816396">
+    <w:abstractNumId w:val="13"/>
+  </w:num>
+  <w:num w:numId="7" w16cid:durableId="160434847">
+    <w:abstractNumId w:val="8"/>
+  </w:num>
+  <w:num w:numId="8" w16cid:durableId="1628196365">
+    <w:abstractNumId w:val="1"/>
+  </w:num>
+  <w:num w:numId="9" w16cid:durableId="904877455">
+    <w:abstractNumId w:val="4"/>
+  </w:num>
+  <w:num w:numId="10" w16cid:durableId="1459451361">
+    <w:abstractNumId w:val="5"/>
+  </w:num>
+  <w:num w:numId="11" w16cid:durableId="1404989224">
+    <w:abstractNumId w:val="10"/>
+  </w:num>
+  <w:num w:numId="12" w16cid:durableId="1305815945">
+    <w:abstractNumId w:val="19"/>
+  </w:num>
+  <w:num w:numId="13" w16cid:durableId="1380935091">
+    <w:abstractNumId w:val="15"/>
+  </w:num>
+  <w:num w:numId="14" w16cid:durableId="2098594617">
+    <w:abstractNumId w:val="17"/>
+  </w:num>
+  <w:num w:numId="15" w16cid:durableId="452945306">
     <w:abstractNumId w:val="0"/>
   </w:num>
-  <w:num w:numId="2" w16cid:durableId="1294484620">
-    <w:abstractNumId w:val="5"/>
+  <w:num w:numId="16" w16cid:durableId="94179773">
+    <w:abstractNumId w:val="9"/>
   </w:num>
-  <w:num w:numId="3" w16cid:durableId="109859399">
-    <w:abstractNumId w:val="4"/>
+  <w:num w:numId="17" w16cid:durableId="1961378457">
+    <w:abstractNumId w:val="6"/>
   </w:num>
-  <w:num w:numId="4" w16cid:durableId="2064984734">
-    <w:abstractNumId w:val="1"/>
+  <w:num w:numId="18" w16cid:durableId="2112433967">
+    <w:abstractNumId w:val="3"/>
   </w:num>
-  <w:num w:numId="5" w16cid:durableId="775255097">
-    <w:abstractNumId w:val="2"/>
+  <w:num w:numId="19" w16cid:durableId="250357141">
+    <w:abstractNumId w:val="12"/>
   </w:num>
-  <w:num w:numId="6" w16cid:durableId="1162816396">
-    <w:abstractNumId w:val="3"/>
+  <w:num w:numId="20" w16cid:durableId="1053311693">
+    <w:abstractNumId w:val="16"/>
   </w:num>
 </w:numbering>
 </file>
@@ -4310,7 +5378,7 @@
     <w:link w:val="Cmsor1Char"/>
     <w:uiPriority w:val="9"/>
     <w:qFormat/>
-    <w:rsid w:val="00D73700"/>
+    <w:rsid w:val="00A315C7"/>
     <w:pPr>
       <w:keepNext/>
       <w:keepLines/>
@@ -4320,7 +5388,7 @@
     <w:rPr>
       <w:rFonts w:ascii="Montserrat" w:eastAsiaTheme="majorEastAsia" w:hAnsi="Montserrat" w:cstheme="majorBidi"/>
       <w:b/>
-      <w:color w:val="5D28FE"/>
+      <w:color w:val="000000" w:themeColor="text1"/>
       <w:sz w:val="40"/>
       <w:szCs w:val="40"/>
     </w:rPr>
@@ -4333,7 +5401,7 @@
     <w:uiPriority w:val="9"/>
     <w:unhideWhenUsed/>
     <w:qFormat/>
-    <w:rsid w:val="00D73700"/>
+    <w:rsid w:val="00A315C7"/>
     <w:pPr>
       <w:keepNext/>
       <w:keepLines/>
@@ -4342,7 +5410,8 @@
     </w:pPr>
     <w:rPr>
       <w:rFonts w:ascii="Montserrat" w:eastAsiaTheme="majorEastAsia" w:hAnsi="Montserrat" w:cstheme="majorBidi"/>
-      <w:color w:val="5D28FE"/>
+      <w:b/>
+      <w:color w:val="000000" w:themeColor="text1"/>
       <w:sz w:val="32"/>
       <w:szCs w:val="32"/>
     </w:rPr>
@@ -4533,11 +5602,11 @@
     <w:basedOn w:val="Bekezdsalapbettpusa"/>
     <w:link w:val="Cmsor1"/>
     <w:uiPriority w:val="9"/>
-    <w:rsid w:val="00D73700"/>
+    <w:rsid w:val="00A315C7"/>
     <w:rPr>
       <w:rFonts w:ascii="Montserrat" w:eastAsiaTheme="majorEastAsia" w:hAnsi="Montserrat" w:cstheme="majorBidi"/>
       <w:b/>
-      <w:color w:val="5D28FE"/>
+      <w:color w:val="000000" w:themeColor="text1"/>
       <w:sz w:val="40"/>
       <w:szCs w:val="40"/>
     </w:rPr>
@@ -4547,10 +5616,11 @@
     <w:basedOn w:val="Bekezdsalapbettpusa"/>
     <w:link w:val="Cmsor2"/>
     <w:uiPriority w:val="9"/>
-    <w:rsid w:val="00D73700"/>
+    <w:rsid w:val="00A315C7"/>
     <w:rPr>
       <w:rFonts w:ascii="Montserrat" w:eastAsiaTheme="majorEastAsia" w:hAnsi="Montserrat" w:cstheme="majorBidi"/>
-      <w:color w:val="5D28FE"/>
+      <w:b/>
+      <w:color w:val="000000" w:themeColor="text1"/>
       <w:sz w:val="32"/>
       <w:szCs w:val="32"/>
     </w:rPr>
@@ -4879,8 +5949,15 @@
     <w:unhideWhenUsed/>
     <w:rsid w:val="0065753C"/>
     <w:pPr>
-      <w:spacing w:after="100"/>
+      <w:spacing w:before="120" w:after="120"/>
     </w:pPr>
+    <w:rPr>
+      <w:b/>
+      <w:bCs/>
+      <w:caps/>
+      <w:sz w:val="20"/>
+      <w:szCs w:val="20"/>
+    </w:rPr>
   </w:style>
   <w:style w:type="paragraph" w:styleId="TJ2">
     <w:name w:val="toc 2"/>
@@ -4891,9 +5968,14 @@
     <w:unhideWhenUsed/>
     <w:rsid w:val="0065753C"/>
     <w:pPr>
-      <w:spacing w:after="100"/>
+      <w:spacing w:after="0"/>
       <w:ind w:left="240"/>
     </w:pPr>
+    <w:rPr>
+      <w:smallCaps/>
+      <w:sz w:val="20"/>
+      <w:szCs w:val="20"/>
+    </w:rPr>
   </w:style>
   <w:style w:type="paragraph" w:styleId="TJ3">
     <w:name w:val="toc 3"/>
@@ -4902,11 +5984,17 @@
     <w:autoRedefine/>
     <w:uiPriority w:val="39"/>
     <w:unhideWhenUsed/>
-    <w:rsid w:val="0065753C"/>
+    <w:rsid w:val="00D4392C"/>
     <w:pPr>
-      <w:spacing w:after="100"/>
+      <w:spacing w:after="0"/>
       <w:ind w:left="480"/>
     </w:pPr>
+    <w:rPr>
+      <w:i/>
+      <w:iCs/>
+      <w:sz w:val="20"/>
+      <w:szCs w:val="20"/>
+    </w:rPr>
   </w:style>
   <w:style w:type="character" w:styleId="Hiperhivatkozs">
     <w:name w:val="Hyperlink"/>
@@ -5005,10 +6093,8 @@
     <w:basedOn w:val="Cmsor2"/>
     <w:link w:val="NormlcmsorChar"/>
     <w:qFormat/>
-    <w:rsid w:val="0035100D"/>
+    <w:rsid w:val="00A315C7"/>
     <w:rPr>
-      <w:b/>
-      <w:color w:val="000000" w:themeColor="text1"/>
       <w:sz w:val="28"/>
     </w:rPr>
   </w:style>
@@ -5016,7 +6102,7 @@
     <w:name w:val="Normál címsor Char"/>
     <w:basedOn w:val="Bekezdsalapbettpusa"/>
     <w:link w:val="Normlcmsor"/>
-    <w:rsid w:val="0035100D"/>
+    <w:rsid w:val="00A315C7"/>
     <w:rPr>
       <w:rFonts w:ascii="Montserrat" w:eastAsiaTheme="majorEastAsia" w:hAnsi="Montserrat" w:cstheme="majorBidi"/>
       <w:b/>
@@ -5079,6 +6165,108 @@
     <w:link w:val="llb"/>
     <w:uiPriority w:val="99"/>
     <w:rsid w:val="00F610D5"/>
+  </w:style>
+  <w:style w:type="paragraph" w:styleId="TJ4">
+    <w:name w:val="toc 4"/>
+    <w:basedOn w:val="Norml"/>
+    <w:next w:val="Norml"/>
+    <w:autoRedefine/>
+    <w:uiPriority w:val="39"/>
+    <w:unhideWhenUsed/>
+    <w:rsid w:val="00DE022E"/>
+    <w:pPr>
+      <w:spacing w:after="0"/>
+      <w:ind w:left="720"/>
+    </w:pPr>
+    <w:rPr>
+      <w:sz w:val="18"/>
+      <w:szCs w:val="18"/>
+    </w:rPr>
+  </w:style>
+  <w:style w:type="paragraph" w:styleId="TJ5">
+    <w:name w:val="toc 5"/>
+    <w:basedOn w:val="Norml"/>
+    <w:next w:val="Norml"/>
+    <w:autoRedefine/>
+    <w:uiPriority w:val="39"/>
+    <w:unhideWhenUsed/>
+    <w:rsid w:val="00DE022E"/>
+    <w:pPr>
+      <w:spacing w:after="0"/>
+      <w:ind w:left="960"/>
+    </w:pPr>
+    <w:rPr>
+      <w:sz w:val="18"/>
+      <w:szCs w:val="18"/>
+    </w:rPr>
+  </w:style>
+  <w:style w:type="paragraph" w:styleId="TJ6">
+    <w:name w:val="toc 6"/>
+    <w:basedOn w:val="Norml"/>
+    <w:next w:val="Norml"/>
+    <w:autoRedefine/>
+    <w:uiPriority w:val="39"/>
+    <w:unhideWhenUsed/>
+    <w:rsid w:val="00DE022E"/>
+    <w:pPr>
+      <w:spacing w:after="0"/>
+      <w:ind w:left="1200"/>
+    </w:pPr>
+    <w:rPr>
+      <w:sz w:val="18"/>
+      <w:szCs w:val="18"/>
+    </w:rPr>
+  </w:style>
+  <w:style w:type="paragraph" w:styleId="TJ7">
+    <w:name w:val="toc 7"/>
+    <w:basedOn w:val="Norml"/>
+    <w:next w:val="Norml"/>
+    <w:autoRedefine/>
+    <w:uiPriority w:val="39"/>
+    <w:unhideWhenUsed/>
+    <w:rsid w:val="00DE022E"/>
+    <w:pPr>
+      <w:spacing w:after="0"/>
+      <w:ind w:left="1440"/>
+    </w:pPr>
+    <w:rPr>
+      <w:sz w:val="18"/>
+      <w:szCs w:val="18"/>
+    </w:rPr>
+  </w:style>
+  <w:style w:type="paragraph" w:styleId="TJ8">
+    <w:name w:val="toc 8"/>
+    <w:basedOn w:val="Norml"/>
+    <w:next w:val="Norml"/>
+    <w:autoRedefine/>
+    <w:uiPriority w:val="39"/>
+    <w:unhideWhenUsed/>
+    <w:rsid w:val="00DE022E"/>
+    <w:pPr>
+      <w:spacing w:after="0"/>
+      <w:ind w:left="1680"/>
+    </w:pPr>
+    <w:rPr>
+      <w:sz w:val="18"/>
+      <w:szCs w:val="18"/>
+    </w:rPr>
+  </w:style>
+  <w:style w:type="paragraph" w:styleId="TJ9">
+    <w:name w:val="toc 9"/>
+    <w:basedOn w:val="Norml"/>
+    <w:next w:val="Norml"/>
+    <w:autoRedefine/>
+    <w:uiPriority w:val="39"/>
+    <w:unhideWhenUsed/>
+    <w:rsid w:val="00DE022E"/>
+    <w:pPr>
+      <w:spacing w:after="0"/>
+      <w:ind w:left="1920"/>
+    </w:pPr>
+    <w:rPr>
+      <w:sz w:val="18"/>
+      <w:szCs w:val="18"/>
+    </w:rPr>
   </w:style>
 </w:styles>
 </file>

</xml_diff>

<commit_message>
Started working on the project documentation
</commit_message>
<xml_diff>
--- a/documentation/documentation.docx
+++ b/documentation/documentation.docx
@@ -1600,6 +1600,9 @@
       <w:bookmarkEnd w:id="9"/>
     </w:p>
     <w:p>
+      <w:pPr>
+        <w:ind w:firstLine="708"/>
+      </w:pPr>
       <w:r>
         <w:rPr>
           <w:rStyle w:val="BekezdsekChar"/>
@@ -1630,16 +1633,28 @@
         <w:rPr>
           <w:rStyle w:val="BekezdsekChar"/>
         </w:rPr>
-        <w:t xml:space="preserve"> keretrendszer felhasználásával, a szerveroldali funkcionalitást PHP-</w:t>
+        <w:t xml:space="preserve"> keretrendszer felhasználásával, a szerveroldali funkcionalitást PHP</w:t>
+      </w:r>
+      <w:r>
+        <w:rPr>
+          <w:rStyle w:val="BekezdsekChar"/>
+        </w:rPr>
+        <w:t xml:space="preserve"> </w:t>
       </w:r>
       <w:proofErr w:type="spellStart"/>
       <w:r>
         <w:rPr>
           <w:rStyle w:val="BekezdsekChar"/>
         </w:rPr>
-        <w:t>val</w:t>
+        <w:t>Laravel</w:t>
       </w:r>
       <w:proofErr w:type="spellEnd"/>
+      <w:r>
+        <w:rPr>
+          <w:rStyle w:val="BekezdsekChar"/>
+        </w:rPr>
+        <w:t xml:space="preserve"> keretrendszer felhasználásával</w:t>
+      </w:r>
       <w:r>
         <w:rPr>
           <w:rStyle w:val="BekezdsekChar"/>
@@ -1685,7 +1700,13 @@
         <w:t xml:space="preserve"> (WPF) </w:t>
       </w:r>
       <w:r>
-        <w:t>keretrendszert fogjuk felhasználni, amelyben a programkód C# nyelven íródik.</w:t>
+        <w:t xml:space="preserve">keretrendszert fogjuk felhasználni, </w:t>
+      </w:r>
+      <w:r>
+        <w:t xml:space="preserve">amely alkalmazás a Microsoft Edge WebView2 felhasználásával hívja be </w:t>
+      </w:r>
+      <w:r>
+        <w:t>a weboldalt az alkalmazáson belül.</w:t>
       </w:r>
     </w:p>
     <w:p/>
@@ -1701,10 +1722,13 @@
     </w:p>
     <w:p>
       <w:pPr>
-        <w:ind w:left="360"/>
-      </w:pPr>
-      <w:r>
-        <w:t>?</w:t>
+        <w:pStyle w:val="Bekezdsek"/>
+      </w:pPr>
+      <w:r>
+        <w:t>A mobil platformon történő felhasználást</w:t>
+      </w:r>
+      <w:r>
+        <w:t xml:space="preserve"> a webes felület reszponzív viselkedésének megvalósításával tervezzük megoldani.</w:t>
       </w:r>
     </w:p>
     <w:p>
@@ -2178,7 +2202,7 @@
           <w:noProof/>
         </w:rPr>
         <w:drawing>
-          <wp:inline distT="0" distB="0" distL="0" distR="0" wp14:anchorId="4FA7022E" wp14:editId="6CCD44C4">
+          <wp:inline distT="0" distB="0" distL="0" distR="0" wp14:anchorId="4FA7022E" wp14:editId="711B7347">
             <wp:extent cx="6016502" cy="1685925"/>
             <wp:effectExtent l="0" t="0" r="3810" b="0"/>
             <wp:docPr id="755683826" name="Kép 1"/>
@@ -2504,6 +2528,2002 @@
     </w:p>
     <w:p>
       <w:pPr>
+        <w:pStyle w:val="Cmsor1"/>
+      </w:pPr>
+      <w:r>
+        <w:lastRenderedPageBreak/>
+        <w:t>2.</w:t>
+      </w:r>
+      <w:r>
+        <w:tab/>
+      </w:r>
+      <w:r>
+        <w:t>Felhasznált technológiák</w:t>
+      </w:r>
+    </w:p>
+    <w:p>
+      <w:pPr>
+        <w:pStyle w:val="Cmsor2"/>
+      </w:pPr>
+      <w:r>
+        <w:rPr>
+          <w:noProof/>
+        </w:rPr>
+        <w:drawing>
+          <wp:anchor distT="0" distB="0" distL="114300" distR="114300" simplePos="0" relativeHeight="251667456" behindDoc="0" locked="0" layoutInCell="1" allowOverlap="1" wp14:anchorId="7352AD3F" wp14:editId="64689756">
+            <wp:simplePos x="0" y="0"/>
+            <wp:positionH relativeFrom="column">
+              <wp:posOffset>4396105</wp:posOffset>
+            </wp:positionH>
+            <wp:positionV relativeFrom="paragraph">
+              <wp:posOffset>302260</wp:posOffset>
+            </wp:positionV>
+            <wp:extent cx="265430" cy="276225"/>
+            <wp:effectExtent l="0" t="0" r="1270" b="9525"/>
+            <wp:wrapSquare wrapText="bothSides"/>
+            <wp:docPr id="2117859153" name="Kép 4" descr="Laravel black logo, tech companies, png | PNGEgg"/>
+            <wp:cNvGraphicFramePr>
+              <a:graphicFrameLocks xmlns:a="http://schemas.openxmlformats.org/drawingml/2006/main" noChangeAspect="1"/>
+            </wp:cNvGraphicFramePr>
+            <a:graphic xmlns:a="http://schemas.openxmlformats.org/drawingml/2006/main">
+              <a:graphicData uri="http://schemas.openxmlformats.org/drawingml/2006/picture">
+                <pic:pic xmlns:pic="http://schemas.openxmlformats.org/drawingml/2006/picture">
+                  <pic:nvPicPr>
+                    <pic:cNvPr id="0" name="Picture 1" descr="Laravel black logo, tech companies, png | PNGEgg"/>
+                    <pic:cNvPicPr>
+                      <a:picLocks noChangeAspect="1" noChangeArrowheads="1"/>
+                    </pic:cNvPicPr>
+                  </pic:nvPicPr>
+                  <pic:blipFill>
+                    <a:blip r:embed="rId15" cstate="print">
+                      <a:extLst>
+                        <a:ext uri="{28A0092B-C50C-407E-A947-70E740481C1C}">
+                          <a14:useLocalDpi xmlns:a14="http://schemas.microsoft.com/office/drawing/2010/main" val="0"/>
+                        </a:ext>
+                      </a:extLst>
+                    </a:blip>
+                    <a:srcRect/>
+                    <a:stretch>
+                      <a:fillRect/>
+                    </a:stretch>
+                  </pic:blipFill>
+                  <pic:spPr bwMode="auto">
+                    <a:xfrm>
+                      <a:off x="0" y="0"/>
+                      <a:ext cx="265430" cy="276225"/>
+                    </a:xfrm>
+                    <a:prstGeom prst="rect">
+                      <a:avLst/>
+                    </a:prstGeom>
+                    <a:noFill/>
+                    <a:ln>
+                      <a:noFill/>
+                    </a:ln>
+                  </pic:spPr>
+                </pic:pic>
+              </a:graphicData>
+            </a:graphic>
+            <wp14:sizeRelH relativeFrom="margin">
+              <wp14:pctWidth>0</wp14:pctWidth>
+            </wp14:sizeRelH>
+            <wp14:sizeRelV relativeFrom="margin">
+              <wp14:pctHeight>0</wp14:pctHeight>
+            </wp14:sizeRelV>
+          </wp:anchor>
+        </w:drawing>
+      </w:r>
+      <w:r>
+        <w:t>2.1</w:t>
+      </w:r>
+      <w:r>
+        <w:tab/>
+      </w:r>
+      <w:r>
+        <w:t>Backend</w:t>
+      </w:r>
+    </w:p>
+    <w:p>
+      <w:pPr>
+        <w:numPr>
+          <w:ilvl w:val="0"/>
+          <w:numId w:val="22"/>
+        </w:numPr>
+      </w:pPr>
+      <w:r>
+        <w:rPr>
+          <w:noProof/>
+        </w:rPr>
+        <w:drawing>
+          <wp:anchor distT="0" distB="0" distL="114300" distR="114300" simplePos="0" relativeHeight="251668480" behindDoc="0" locked="0" layoutInCell="1" allowOverlap="1" wp14:anchorId="20E4974E" wp14:editId="2A0E8DD0">
+            <wp:simplePos x="0" y="0"/>
+            <wp:positionH relativeFrom="margin">
+              <wp:posOffset>1744980</wp:posOffset>
+            </wp:positionH>
+            <wp:positionV relativeFrom="paragraph">
+              <wp:posOffset>258445</wp:posOffset>
+            </wp:positionV>
+            <wp:extent cx="316865" cy="316865"/>
+            <wp:effectExtent l="0" t="0" r="6985" b="0"/>
+            <wp:wrapSquare wrapText="bothSides"/>
+            <wp:docPr id="565974356" name="Kép 5" descr="Php - Free logo icons"/>
+            <wp:cNvGraphicFramePr>
+              <a:graphicFrameLocks xmlns:a="http://schemas.openxmlformats.org/drawingml/2006/main" noChangeAspect="1"/>
+            </wp:cNvGraphicFramePr>
+            <a:graphic xmlns:a="http://schemas.openxmlformats.org/drawingml/2006/main">
+              <a:graphicData uri="http://schemas.openxmlformats.org/drawingml/2006/picture">
+                <pic:pic xmlns:pic="http://schemas.openxmlformats.org/drawingml/2006/picture">
+                  <pic:nvPicPr>
+                    <pic:cNvPr id="0" name="Picture 3" descr="Php - Free logo icons"/>
+                    <pic:cNvPicPr>
+                      <a:picLocks noChangeAspect="1" noChangeArrowheads="1"/>
+                    </pic:cNvPicPr>
+                  </pic:nvPicPr>
+                  <pic:blipFill>
+                    <a:blip r:embed="rId16" cstate="print">
+                      <a:extLst>
+                        <a:ext uri="{28A0092B-C50C-407E-A947-70E740481C1C}">
+                          <a14:useLocalDpi xmlns:a14="http://schemas.microsoft.com/office/drawing/2010/main" val="0"/>
+                        </a:ext>
+                      </a:extLst>
+                    </a:blip>
+                    <a:srcRect/>
+                    <a:stretch>
+                      <a:fillRect/>
+                    </a:stretch>
+                  </pic:blipFill>
+                  <pic:spPr bwMode="auto">
+                    <a:xfrm>
+                      <a:off x="0" y="0"/>
+                      <a:ext cx="316865" cy="316865"/>
+                    </a:xfrm>
+                    <a:prstGeom prst="rect">
+                      <a:avLst/>
+                    </a:prstGeom>
+                    <a:noFill/>
+                    <a:ln>
+                      <a:noFill/>
+                    </a:ln>
+                  </pic:spPr>
+                </pic:pic>
+              </a:graphicData>
+            </a:graphic>
+            <wp14:sizeRelH relativeFrom="margin">
+              <wp14:pctWidth>0</wp14:pctWidth>
+            </wp14:sizeRelH>
+            <wp14:sizeRelV relativeFrom="margin">
+              <wp14:pctHeight>0</wp14:pctHeight>
+            </wp14:sizeRelV>
+          </wp:anchor>
+        </w:drawing>
+      </w:r>
+      <w:r>
+        <w:rPr>
+          <w:b/>
+          <w:bCs/>
+        </w:rPr>
+        <w:t>Keretrendszer:</w:t>
+      </w:r>
+      <w:r>
+        <w:t xml:space="preserve"> </w:t>
+      </w:r>
+      <w:proofErr w:type="spellStart"/>
+      <w:r>
+        <w:t>Laravel</w:t>
+      </w:r>
+      <w:proofErr w:type="spellEnd"/>
+      <w:r>
+        <w:t xml:space="preserve"> 12.53+ PHP webes keretrendszer</w:t>
+      </w:r>
+    </w:p>
+    <w:p>
+      <w:pPr>
+        <w:numPr>
+          <w:ilvl w:val="0"/>
+          <w:numId w:val="22"/>
+        </w:numPr>
+      </w:pPr>
+      <w:r>
+        <w:rPr>
+          <w:noProof/>
+        </w:rPr>
+        <w:drawing>
+          <wp:anchor distT="0" distB="0" distL="114300" distR="114300" simplePos="0" relativeHeight="251669504" behindDoc="0" locked="0" layoutInCell="1" allowOverlap="1" wp14:anchorId="1AAD3C4F" wp14:editId="25344540">
+            <wp:simplePos x="0" y="0"/>
+            <wp:positionH relativeFrom="column">
+              <wp:posOffset>2262505</wp:posOffset>
+            </wp:positionH>
+            <wp:positionV relativeFrom="paragraph">
+              <wp:posOffset>254635</wp:posOffset>
+            </wp:positionV>
+            <wp:extent cx="304800" cy="304800"/>
+            <wp:effectExtent l="0" t="0" r="0" b="0"/>
+            <wp:wrapSquare wrapText="bothSides"/>
+            <wp:docPr id="37692595" name="Kép 6" descr="MySQL Connector | Convertigo Low-Code Platform Integration"/>
+            <wp:cNvGraphicFramePr>
+              <a:graphicFrameLocks xmlns:a="http://schemas.openxmlformats.org/drawingml/2006/main" noChangeAspect="1"/>
+            </wp:cNvGraphicFramePr>
+            <a:graphic xmlns:a="http://schemas.openxmlformats.org/drawingml/2006/main">
+              <a:graphicData uri="http://schemas.openxmlformats.org/drawingml/2006/picture">
+                <pic:pic xmlns:pic="http://schemas.openxmlformats.org/drawingml/2006/picture">
+                  <pic:nvPicPr>
+                    <pic:cNvPr id="0" name="Picture 5" descr="MySQL Connector | Convertigo Low-Code Platform Integration"/>
+                    <pic:cNvPicPr>
+                      <a:picLocks noChangeAspect="1" noChangeArrowheads="1"/>
+                    </pic:cNvPicPr>
+                  </pic:nvPicPr>
+                  <pic:blipFill>
+                    <a:blip r:embed="rId17" cstate="print">
+                      <a:extLst>
+                        <a:ext uri="{28A0092B-C50C-407E-A947-70E740481C1C}">
+                          <a14:useLocalDpi xmlns:a14="http://schemas.microsoft.com/office/drawing/2010/main" val="0"/>
+                        </a:ext>
+                      </a:extLst>
+                    </a:blip>
+                    <a:srcRect/>
+                    <a:stretch>
+                      <a:fillRect/>
+                    </a:stretch>
+                  </pic:blipFill>
+                  <pic:spPr bwMode="auto">
+                    <a:xfrm>
+                      <a:off x="0" y="0"/>
+                      <a:ext cx="304800" cy="304800"/>
+                    </a:xfrm>
+                    <a:prstGeom prst="rect">
+                      <a:avLst/>
+                    </a:prstGeom>
+                    <a:noFill/>
+                    <a:ln>
+                      <a:noFill/>
+                    </a:ln>
+                  </pic:spPr>
+                </pic:pic>
+              </a:graphicData>
+            </a:graphic>
+            <wp14:sizeRelH relativeFrom="margin">
+              <wp14:pctWidth>0</wp14:pctWidth>
+            </wp14:sizeRelH>
+            <wp14:sizeRelV relativeFrom="margin">
+              <wp14:pctHeight>0</wp14:pctHeight>
+            </wp14:sizeRelV>
+          </wp:anchor>
+        </w:drawing>
+      </w:r>
+      <w:r>
+        <w:rPr>
+          <w:b/>
+          <w:bCs/>
+        </w:rPr>
+        <w:t>Nyelv:</w:t>
+      </w:r>
+      <w:r>
+        <w:t xml:space="preserve"> PHP 8.3+</w:t>
+      </w:r>
+    </w:p>
+    <w:p>
+      <w:pPr>
+        <w:numPr>
+          <w:ilvl w:val="0"/>
+          <w:numId w:val="22"/>
+        </w:numPr>
+      </w:pPr>
+      <w:r>
+        <w:rPr>
+          <w:noProof/>
+        </w:rPr>
+        <w:drawing>
+          <wp:anchor distT="0" distB="0" distL="114300" distR="114300" simplePos="0" relativeHeight="251670528" behindDoc="0" locked="0" layoutInCell="1" allowOverlap="1" wp14:anchorId="6AFF0494" wp14:editId="5F2E301E">
+            <wp:simplePos x="0" y="0"/>
+            <wp:positionH relativeFrom="margin">
+              <wp:posOffset>2575560</wp:posOffset>
+            </wp:positionH>
+            <wp:positionV relativeFrom="paragraph">
+              <wp:posOffset>240665</wp:posOffset>
+            </wp:positionV>
+            <wp:extent cx="342900" cy="329565"/>
+            <wp:effectExtent l="0" t="0" r="0" b="0"/>
+            <wp:wrapSquare wrapText="bothSides"/>
+            <wp:docPr id="1755579255" name="Kép 1"/>
+            <wp:cNvGraphicFramePr>
+              <a:graphicFrameLocks xmlns:a="http://schemas.openxmlformats.org/drawingml/2006/main" noChangeAspect="1"/>
+            </wp:cNvGraphicFramePr>
+            <a:graphic xmlns:a="http://schemas.openxmlformats.org/drawingml/2006/main">
+              <a:graphicData uri="http://schemas.openxmlformats.org/drawingml/2006/picture">
+                <pic:pic xmlns:pic="http://schemas.openxmlformats.org/drawingml/2006/picture">
+                  <pic:nvPicPr>
+                    <pic:cNvPr id="1755579255" name=""/>
+                    <pic:cNvPicPr/>
+                  </pic:nvPicPr>
+                  <pic:blipFill>
+                    <a:blip r:embed="rId18" cstate="print">
+                      <a:extLst>
+                        <a:ext uri="{28A0092B-C50C-407E-A947-70E740481C1C}">
+                          <a14:useLocalDpi xmlns:a14="http://schemas.microsoft.com/office/drawing/2010/main" val="0"/>
+                        </a:ext>
+                      </a:extLst>
+                    </a:blip>
+                    <a:stretch>
+                      <a:fillRect/>
+                    </a:stretch>
+                  </pic:blipFill>
+                  <pic:spPr>
+                    <a:xfrm>
+                      <a:off x="0" y="0"/>
+                      <a:ext cx="342900" cy="329565"/>
+                    </a:xfrm>
+                    <a:prstGeom prst="rect">
+                      <a:avLst/>
+                    </a:prstGeom>
+                  </pic:spPr>
+                </pic:pic>
+              </a:graphicData>
+            </a:graphic>
+            <wp14:sizeRelH relativeFrom="margin">
+              <wp14:pctWidth>0</wp14:pctWidth>
+            </wp14:sizeRelH>
+            <wp14:sizeRelV relativeFrom="margin">
+              <wp14:pctHeight>0</wp14:pctHeight>
+            </wp14:sizeRelV>
+          </wp:anchor>
+        </w:drawing>
+      </w:r>
+      <w:r>
+        <w:rPr>
+          <w:b/>
+          <w:bCs/>
+        </w:rPr>
+        <w:t>Adatbázis:</w:t>
+      </w:r>
+      <w:r>
+        <w:t xml:space="preserve"> </w:t>
+      </w:r>
+      <w:proofErr w:type="spellStart"/>
+      <w:r>
+        <w:t>MySQL</w:t>
+      </w:r>
+      <w:proofErr w:type="spellEnd"/>
+      <w:r>
+        <w:t xml:space="preserve"> 8.0+</w:t>
+      </w:r>
+    </w:p>
+    <w:p>
+      <w:pPr>
+        <w:numPr>
+          <w:ilvl w:val="0"/>
+          <w:numId w:val="22"/>
+        </w:numPr>
+      </w:pPr>
+      <w:r>
+        <w:rPr>
+          <w:noProof/>
+        </w:rPr>
+        <w:drawing>
+          <wp:anchor distT="0" distB="0" distL="114300" distR="114300" simplePos="0" relativeHeight="251671552" behindDoc="0" locked="0" layoutInCell="1" allowOverlap="1" wp14:anchorId="159C65A5" wp14:editId="163449A1">
+            <wp:simplePos x="0" y="0"/>
+            <wp:positionH relativeFrom="column">
+              <wp:posOffset>3481705</wp:posOffset>
+            </wp:positionH>
+            <wp:positionV relativeFrom="paragraph">
+              <wp:posOffset>249555</wp:posOffset>
+            </wp:positionV>
+            <wp:extent cx="733425" cy="307340"/>
+            <wp:effectExtent l="0" t="0" r="9525" b="0"/>
+            <wp:wrapSquare wrapText="bothSides"/>
+            <wp:docPr id="1791947911" name="Kép 9"/>
+            <wp:cNvGraphicFramePr>
+              <a:graphicFrameLocks xmlns:a="http://schemas.openxmlformats.org/drawingml/2006/main" noChangeAspect="1"/>
+            </wp:cNvGraphicFramePr>
+            <a:graphic xmlns:a="http://schemas.openxmlformats.org/drawingml/2006/main">
+              <a:graphicData uri="http://schemas.openxmlformats.org/drawingml/2006/picture">
+                <pic:pic xmlns:pic="http://schemas.openxmlformats.org/drawingml/2006/picture">
+                  <pic:nvPicPr>
+                    <pic:cNvPr id="1791947911" name="Kép 1791947911"/>
+                    <pic:cNvPicPr/>
+                  </pic:nvPicPr>
+                  <pic:blipFill>
+                    <a:blip r:embed="rId19" cstate="print">
+                      <a:extLst>
+                        <a:ext uri="{28A0092B-C50C-407E-A947-70E740481C1C}">
+                          <a14:useLocalDpi xmlns:a14="http://schemas.microsoft.com/office/drawing/2010/main" val="0"/>
+                        </a:ext>
+                      </a:extLst>
+                    </a:blip>
+                    <a:stretch>
+                      <a:fillRect/>
+                    </a:stretch>
+                  </pic:blipFill>
+                  <pic:spPr>
+                    <a:xfrm>
+                      <a:off x="0" y="0"/>
+                      <a:ext cx="733425" cy="307340"/>
+                    </a:xfrm>
+                    <a:prstGeom prst="rect">
+                      <a:avLst/>
+                    </a:prstGeom>
+                  </pic:spPr>
+                </pic:pic>
+              </a:graphicData>
+            </a:graphic>
+            <wp14:sizeRelH relativeFrom="margin">
+              <wp14:pctWidth>0</wp14:pctWidth>
+            </wp14:sizeRelH>
+            <wp14:sizeRelV relativeFrom="margin">
+              <wp14:pctHeight>0</wp14:pctHeight>
+            </wp14:sizeRelV>
+          </wp:anchor>
+        </w:drawing>
+      </w:r>
+      <w:r>
+        <w:rPr>
+          <w:b/>
+          <w:bCs/>
+        </w:rPr>
+        <w:t>Hitelesítés:</w:t>
+      </w:r>
+      <w:r>
+        <w:t xml:space="preserve"> </w:t>
+      </w:r>
+      <w:proofErr w:type="spellStart"/>
+      <w:r>
+        <w:t>Laravel</w:t>
+      </w:r>
+      <w:proofErr w:type="spellEnd"/>
+      <w:r>
+        <w:t xml:space="preserve"> </w:t>
+      </w:r>
+      <w:proofErr w:type="spellStart"/>
+      <w:r>
+        <w:t>Sanctum</w:t>
+      </w:r>
+      <w:proofErr w:type="spellEnd"/>
+    </w:p>
+    <w:p>
+      <w:pPr>
+        <w:numPr>
+          <w:ilvl w:val="0"/>
+          <w:numId w:val="22"/>
+        </w:numPr>
+      </w:pPr>
+      <w:r>
+        <w:rPr>
+          <w:b/>
+          <w:bCs/>
+        </w:rPr>
+        <w:t>Bejelentkezés/Regisztráció:</w:t>
+      </w:r>
+      <w:r>
+        <w:t xml:space="preserve"> </w:t>
+      </w:r>
+      <w:proofErr w:type="spellStart"/>
+      <w:r>
+        <w:t>Laravel</w:t>
+      </w:r>
+      <w:proofErr w:type="spellEnd"/>
+      <w:r>
+        <w:t xml:space="preserve"> </w:t>
+      </w:r>
+      <w:proofErr w:type="spellStart"/>
+      <w:r>
+        <w:t>Fortify</w:t>
+      </w:r>
+      <w:proofErr w:type="spellEnd"/>
+    </w:p>
+    <w:p>
+      <w:pPr>
+        <w:pStyle w:val="Cmsor2"/>
+      </w:pPr>
+      <w:r>
+        <w:rPr>
+          <w:noProof/>
+        </w:rPr>
+        <w:drawing>
+          <wp:anchor distT="0" distB="0" distL="114300" distR="114300" simplePos="0" relativeHeight="251672576" behindDoc="0" locked="0" layoutInCell="1" allowOverlap="1" wp14:anchorId="2595CCD0" wp14:editId="6FC03C06">
+            <wp:simplePos x="0" y="0"/>
+            <wp:positionH relativeFrom="column">
+              <wp:posOffset>2252980</wp:posOffset>
+            </wp:positionH>
+            <wp:positionV relativeFrom="paragraph">
+              <wp:posOffset>200025</wp:posOffset>
+            </wp:positionV>
+            <wp:extent cx="381000" cy="381000"/>
+            <wp:effectExtent l="0" t="0" r="0" b="0"/>
+            <wp:wrapSquare wrapText="bothSides"/>
+            <wp:docPr id="1167498585" name="Kép 10" descr="Vue · GitHub"/>
+            <wp:cNvGraphicFramePr>
+              <a:graphicFrameLocks xmlns:a="http://schemas.openxmlformats.org/drawingml/2006/main" noChangeAspect="1"/>
+            </wp:cNvGraphicFramePr>
+            <a:graphic xmlns:a="http://schemas.openxmlformats.org/drawingml/2006/main">
+              <a:graphicData uri="http://schemas.openxmlformats.org/drawingml/2006/picture">
+                <pic:pic xmlns:pic="http://schemas.openxmlformats.org/drawingml/2006/picture">
+                  <pic:nvPicPr>
+                    <pic:cNvPr id="0" name="Picture 17" descr="Vue · GitHub"/>
+                    <pic:cNvPicPr>
+                      <a:picLocks noChangeAspect="1" noChangeArrowheads="1"/>
+                    </pic:cNvPicPr>
+                  </pic:nvPicPr>
+                  <pic:blipFill>
+                    <a:blip r:embed="rId20" cstate="print">
+                      <a:extLst>
+                        <a:ext uri="{28A0092B-C50C-407E-A947-70E740481C1C}">
+                          <a14:useLocalDpi xmlns:a14="http://schemas.microsoft.com/office/drawing/2010/main" val="0"/>
+                        </a:ext>
+                      </a:extLst>
+                    </a:blip>
+                    <a:srcRect/>
+                    <a:stretch>
+                      <a:fillRect/>
+                    </a:stretch>
+                  </pic:blipFill>
+                  <pic:spPr bwMode="auto">
+                    <a:xfrm>
+                      <a:off x="0" y="0"/>
+                      <a:ext cx="381000" cy="381000"/>
+                    </a:xfrm>
+                    <a:prstGeom prst="rect">
+                      <a:avLst/>
+                    </a:prstGeom>
+                    <a:noFill/>
+                    <a:ln>
+                      <a:noFill/>
+                    </a:ln>
+                  </pic:spPr>
+                </pic:pic>
+              </a:graphicData>
+            </a:graphic>
+            <wp14:sizeRelH relativeFrom="margin">
+              <wp14:pctWidth>0</wp14:pctWidth>
+            </wp14:sizeRelH>
+            <wp14:sizeRelV relativeFrom="margin">
+              <wp14:pctHeight>0</wp14:pctHeight>
+            </wp14:sizeRelV>
+          </wp:anchor>
+        </w:drawing>
+      </w:r>
+      <w:r>
+        <w:t>2.2</w:t>
+      </w:r>
+      <w:r>
+        <w:tab/>
+      </w:r>
+      <w:r>
+        <w:t>Frontend</w:t>
+      </w:r>
+    </w:p>
+    <w:p>
+      <w:pPr>
+        <w:numPr>
+          <w:ilvl w:val="0"/>
+          <w:numId w:val="23"/>
+        </w:numPr>
+      </w:pPr>
+      <w:r>
+        <w:rPr>
+          <w:noProof/>
+        </w:rPr>
+        <w:drawing>
+          <wp:anchor distT="0" distB="0" distL="114300" distR="114300" simplePos="0" relativeHeight="251673600" behindDoc="0" locked="0" layoutInCell="1" allowOverlap="1" wp14:anchorId="2874DE89" wp14:editId="4ED07715">
+            <wp:simplePos x="0" y="0"/>
+            <wp:positionH relativeFrom="column">
+              <wp:posOffset>2081530</wp:posOffset>
+            </wp:positionH>
+            <wp:positionV relativeFrom="paragraph">
+              <wp:posOffset>311785</wp:posOffset>
+            </wp:positionV>
+            <wp:extent cx="161925" cy="241935"/>
+            <wp:effectExtent l="0" t="0" r="9525" b="5715"/>
+            <wp:wrapSquare wrapText="bothSides"/>
+            <wp:docPr id="906916610" name="Ábra 12"/>
+            <wp:cNvGraphicFramePr>
+              <a:graphicFrameLocks xmlns:a="http://schemas.openxmlformats.org/drawingml/2006/main" noChangeAspect="1"/>
+            </wp:cNvGraphicFramePr>
+            <a:graphic xmlns:a="http://schemas.openxmlformats.org/drawingml/2006/main">
+              <a:graphicData uri="http://schemas.openxmlformats.org/drawingml/2006/picture">
+                <pic:pic xmlns:pic="http://schemas.openxmlformats.org/drawingml/2006/picture">
+                  <pic:nvPicPr>
+                    <pic:cNvPr id="906916610" name="Ábra 906916610"/>
+                    <pic:cNvPicPr/>
+                  </pic:nvPicPr>
+                  <pic:blipFill>
+                    <a:blip r:embed="rId21">
+                      <a:extLst>
+                        <a:ext uri="{96DAC541-7B7A-43D3-8B79-37D633B846F1}">
+                          <asvg:svgBlip xmlns:asvg="http://schemas.microsoft.com/office/drawing/2016/SVG/main" r:embed="rId22"/>
+                        </a:ext>
+                      </a:extLst>
+                    </a:blip>
+                    <a:stretch>
+                      <a:fillRect/>
+                    </a:stretch>
+                  </pic:blipFill>
+                  <pic:spPr>
+                    <a:xfrm>
+                      <a:off x="0" y="0"/>
+                      <a:ext cx="161925" cy="241935"/>
+                    </a:xfrm>
+                    <a:prstGeom prst="rect">
+                      <a:avLst/>
+                    </a:prstGeom>
+                  </pic:spPr>
+                </pic:pic>
+              </a:graphicData>
+            </a:graphic>
+            <wp14:sizeRelH relativeFrom="margin">
+              <wp14:pctWidth>0</wp14:pctWidth>
+            </wp14:sizeRelH>
+            <wp14:sizeRelV relativeFrom="margin">
+              <wp14:pctHeight>0</wp14:pctHeight>
+            </wp14:sizeRelV>
+          </wp:anchor>
+        </w:drawing>
+      </w:r>
+      <w:r>
+        <w:rPr>
+          <w:b/>
+          <w:bCs/>
+        </w:rPr>
+        <w:t>Keretrendszer:</w:t>
+      </w:r>
+      <w:r>
+        <w:t xml:space="preserve"> </w:t>
+      </w:r>
+      <w:proofErr w:type="spellStart"/>
+      <w:r>
+        <w:t>Vue</w:t>
+      </w:r>
+      <w:proofErr w:type="spellEnd"/>
+      <w:r>
+        <w:t xml:space="preserve"> 3+</w:t>
+      </w:r>
+    </w:p>
+    <w:p>
+      <w:pPr>
+        <w:numPr>
+          <w:ilvl w:val="0"/>
+          <w:numId w:val="23"/>
+        </w:numPr>
+      </w:pPr>
+      <w:r>
+        <w:rPr>
+          <w:b/>
+          <w:bCs/>
+        </w:rPr>
+        <w:t>Állapotkezelés:</w:t>
+      </w:r>
+      <w:r>
+        <w:t xml:space="preserve"> </w:t>
+      </w:r>
+      <w:proofErr w:type="spellStart"/>
+      <w:r>
+        <w:t>Pinia</w:t>
+      </w:r>
+      <w:proofErr w:type="spellEnd"/>
+    </w:p>
+    <w:p>
+      <w:pPr>
+        <w:numPr>
+          <w:ilvl w:val="0"/>
+          <w:numId w:val="23"/>
+        </w:numPr>
+      </w:pPr>
+      <w:r>
+        <w:rPr>
+          <w:noProof/>
+        </w:rPr>
+        <w:drawing>
+          <wp:anchor distT="0" distB="0" distL="114300" distR="114300" simplePos="0" relativeHeight="251674624" behindDoc="0" locked="0" layoutInCell="1" allowOverlap="1" wp14:anchorId="37F509BF" wp14:editId="4513865D">
+            <wp:simplePos x="0" y="0"/>
+            <wp:positionH relativeFrom="column">
+              <wp:posOffset>1710055</wp:posOffset>
+            </wp:positionH>
+            <wp:positionV relativeFrom="paragraph">
+              <wp:posOffset>10795</wp:posOffset>
+            </wp:positionV>
+            <wp:extent cx="221615" cy="219075"/>
+            <wp:effectExtent l="0" t="0" r="6985" b="9525"/>
+            <wp:wrapSquare wrapText="bothSides"/>
+            <wp:docPr id="925046145" name="Ábra 14"/>
+            <wp:cNvGraphicFramePr>
+              <a:graphicFrameLocks xmlns:a="http://schemas.openxmlformats.org/drawingml/2006/main" noChangeAspect="1"/>
+            </wp:cNvGraphicFramePr>
+            <a:graphic xmlns:a="http://schemas.openxmlformats.org/drawingml/2006/main">
+              <a:graphicData uri="http://schemas.openxmlformats.org/drawingml/2006/picture">
+                <pic:pic xmlns:pic="http://schemas.openxmlformats.org/drawingml/2006/picture">
+                  <pic:nvPicPr>
+                    <pic:cNvPr id="925046145" name="Ábra 925046145"/>
+                    <pic:cNvPicPr/>
+                  </pic:nvPicPr>
+                  <pic:blipFill>
+                    <a:blip r:embed="rId23">
+                      <a:extLst>
+                        <a:ext uri="{96DAC541-7B7A-43D3-8B79-37D633B846F1}">
+                          <asvg:svgBlip xmlns:asvg="http://schemas.microsoft.com/office/drawing/2016/SVG/main" r:embed="rId24"/>
+                        </a:ext>
+                      </a:extLst>
+                    </a:blip>
+                    <a:stretch>
+                      <a:fillRect/>
+                    </a:stretch>
+                  </pic:blipFill>
+                  <pic:spPr>
+                    <a:xfrm>
+                      <a:off x="0" y="0"/>
+                      <a:ext cx="221615" cy="219075"/>
+                    </a:xfrm>
+                    <a:prstGeom prst="rect">
+                      <a:avLst/>
+                    </a:prstGeom>
+                  </pic:spPr>
+                </pic:pic>
+              </a:graphicData>
+            </a:graphic>
+            <wp14:sizeRelH relativeFrom="margin">
+              <wp14:pctWidth>0</wp14:pctWidth>
+            </wp14:sizeRelH>
+            <wp14:sizeRelV relativeFrom="margin">
+              <wp14:pctHeight>0</wp14:pctHeight>
+            </wp14:sizeRelV>
+          </wp:anchor>
+        </w:drawing>
+      </w:r>
+      <w:proofErr w:type="spellStart"/>
+      <w:r>
+        <w:rPr>
+          <w:b/>
+          <w:bCs/>
+        </w:rPr>
+        <w:t>Build</w:t>
+      </w:r>
+      <w:proofErr w:type="spellEnd"/>
+      <w:r>
+        <w:rPr>
+          <w:b/>
+          <w:bCs/>
+        </w:rPr>
+        <w:t xml:space="preserve"> </w:t>
+      </w:r>
+      <w:proofErr w:type="spellStart"/>
+      <w:r>
+        <w:rPr>
+          <w:b/>
+          <w:bCs/>
+        </w:rPr>
+        <w:t>Tool</w:t>
+      </w:r>
+      <w:proofErr w:type="spellEnd"/>
+      <w:r>
+        <w:rPr>
+          <w:b/>
+          <w:bCs/>
+        </w:rPr>
+        <w:t>:</w:t>
+      </w:r>
+      <w:r>
+        <w:t xml:space="preserve"> </w:t>
+      </w:r>
+      <w:proofErr w:type="spellStart"/>
+      <w:r>
+        <w:t>Vite</w:t>
+      </w:r>
+      <w:proofErr w:type="spellEnd"/>
+    </w:p>
+    <w:p>
+      <w:pPr>
+        <w:numPr>
+          <w:ilvl w:val="0"/>
+          <w:numId w:val="23"/>
+        </w:numPr>
+      </w:pPr>
+      <w:r>
+        <w:rPr>
+          <w:noProof/>
+        </w:rPr>
+        <w:drawing>
+          <wp:anchor distT="0" distB="0" distL="114300" distR="114300" simplePos="0" relativeHeight="251675648" behindDoc="0" locked="0" layoutInCell="1" allowOverlap="1" wp14:anchorId="6340F703" wp14:editId="5B60C33C">
+            <wp:simplePos x="0" y="0"/>
+            <wp:positionH relativeFrom="column">
+              <wp:posOffset>2767330</wp:posOffset>
+            </wp:positionH>
+            <wp:positionV relativeFrom="paragraph">
+              <wp:posOffset>294005</wp:posOffset>
+            </wp:positionV>
+            <wp:extent cx="452120" cy="276225"/>
+            <wp:effectExtent l="0" t="0" r="5080" b="9525"/>
+            <wp:wrapSquare wrapText="bothSides"/>
+            <wp:docPr id="1967504370" name="Kép 15" descr="What is and how to start with Tailwind CSS"/>
+            <wp:cNvGraphicFramePr>
+              <a:graphicFrameLocks xmlns:a="http://schemas.openxmlformats.org/drawingml/2006/main" noChangeAspect="1"/>
+            </wp:cNvGraphicFramePr>
+            <a:graphic xmlns:a="http://schemas.openxmlformats.org/drawingml/2006/main">
+              <a:graphicData uri="http://schemas.openxmlformats.org/drawingml/2006/picture">
+                <pic:pic xmlns:pic="http://schemas.openxmlformats.org/drawingml/2006/picture">
+                  <pic:nvPicPr>
+                    <pic:cNvPr id="0" name="Picture 29" descr="What is and how to start with Tailwind CSS"/>
+                    <pic:cNvPicPr>
+                      <a:picLocks noChangeAspect="1" noChangeArrowheads="1"/>
+                    </pic:cNvPicPr>
+                  </pic:nvPicPr>
+                  <pic:blipFill>
+                    <a:blip r:embed="rId25" cstate="print">
+                      <a:extLst>
+                        <a:ext uri="{28A0092B-C50C-407E-A947-70E740481C1C}">
+                          <a14:useLocalDpi xmlns:a14="http://schemas.microsoft.com/office/drawing/2010/main" val="0"/>
+                        </a:ext>
+                      </a:extLst>
+                    </a:blip>
+                    <a:srcRect/>
+                    <a:stretch>
+                      <a:fillRect/>
+                    </a:stretch>
+                  </pic:blipFill>
+                  <pic:spPr bwMode="auto">
+                    <a:xfrm>
+                      <a:off x="0" y="0"/>
+                      <a:ext cx="452120" cy="276225"/>
+                    </a:xfrm>
+                    <a:prstGeom prst="rect">
+                      <a:avLst/>
+                    </a:prstGeom>
+                    <a:noFill/>
+                    <a:ln>
+                      <a:noFill/>
+                    </a:ln>
+                  </pic:spPr>
+                </pic:pic>
+              </a:graphicData>
+            </a:graphic>
+            <wp14:sizeRelH relativeFrom="margin">
+              <wp14:pctWidth>0</wp14:pctWidth>
+            </wp14:sizeRelH>
+            <wp14:sizeRelV relativeFrom="margin">
+              <wp14:pctHeight>0</wp14:pctHeight>
+            </wp14:sizeRelV>
+          </wp:anchor>
+        </w:drawing>
+      </w:r>
+      <w:proofErr w:type="spellStart"/>
+      <w:r>
+        <w:rPr>
+          <w:b/>
+          <w:bCs/>
+        </w:rPr>
+        <w:t>Routing</w:t>
+      </w:r>
+      <w:proofErr w:type="spellEnd"/>
+      <w:r>
+        <w:rPr>
+          <w:b/>
+          <w:bCs/>
+        </w:rPr>
+        <w:t>:</w:t>
+      </w:r>
+      <w:r>
+        <w:t xml:space="preserve"> </w:t>
+      </w:r>
+      <w:proofErr w:type="spellStart"/>
+      <w:r>
+        <w:t>Vue</w:t>
+      </w:r>
+      <w:proofErr w:type="spellEnd"/>
+      <w:r>
+        <w:t xml:space="preserve"> Router.</w:t>
+      </w:r>
+    </w:p>
+    <w:p>
+      <w:pPr>
+        <w:numPr>
+          <w:ilvl w:val="0"/>
+          <w:numId w:val="23"/>
+        </w:numPr>
+      </w:pPr>
+      <w:r>
+        <w:rPr>
+          <w:b/>
+          <w:bCs/>
+        </w:rPr>
+        <w:t>Stílus:</w:t>
+      </w:r>
+      <w:r>
+        <w:t xml:space="preserve"> </w:t>
+      </w:r>
+      <w:proofErr w:type="spellStart"/>
+      <w:r>
+        <w:t>Tailwind</w:t>
+      </w:r>
+      <w:proofErr w:type="spellEnd"/>
+      <w:r>
+        <w:t xml:space="preserve"> CSS</w:t>
+      </w:r>
+      <w:r>
+        <w:t xml:space="preserve">, </w:t>
+      </w:r>
+      <w:r>
+        <w:t>Inertia.js</w:t>
+      </w:r>
+    </w:p>
+    <w:p>
+      <w:pPr>
+        <w:pStyle w:val="Cmsor2"/>
+      </w:pPr>
+      <w:r>
+        <w:rPr>
+          <w:noProof/>
+        </w:rPr>
+        <w:drawing>
+          <wp:anchor distT="0" distB="0" distL="114300" distR="114300" simplePos="0" relativeHeight="251676672" behindDoc="0" locked="0" layoutInCell="1" allowOverlap="1" wp14:anchorId="33E83CF9" wp14:editId="7D0CD124">
+            <wp:simplePos x="0" y="0"/>
+            <wp:positionH relativeFrom="column">
+              <wp:posOffset>3262630</wp:posOffset>
+            </wp:positionH>
+            <wp:positionV relativeFrom="paragraph">
+              <wp:posOffset>250190</wp:posOffset>
+            </wp:positionV>
+            <wp:extent cx="295275" cy="295275"/>
+            <wp:effectExtent l="0" t="0" r="9525" b="9525"/>
+            <wp:wrapSquare wrapText="bothSides"/>
+            <wp:docPr id="1303711743" name="Kép 16" descr="Git · GitHub"/>
+            <wp:cNvGraphicFramePr>
+              <a:graphicFrameLocks xmlns:a="http://schemas.openxmlformats.org/drawingml/2006/main" noChangeAspect="1"/>
+            </wp:cNvGraphicFramePr>
+            <a:graphic xmlns:a="http://schemas.openxmlformats.org/drawingml/2006/main">
+              <a:graphicData uri="http://schemas.openxmlformats.org/drawingml/2006/picture">
+                <pic:pic xmlns:pic="http://schemas.openxmlformats.org/drawingml/2006/picture">
+                  <pic:nvPicPr>
+                    <pic:cNvPr id="0" name="Picture 31" descr="Git · GitHub"/>
+                    <pic:cNvPicPr>
+                      <a:picLocks noChangeAspect="1" noChangeArrowheads="1"/>
+                    </pic:cNvPicPr>
+                  </pic:nvPicPr>
+                  <pic:blipFill>
+                    <a:blip r:embed="rId26" cstate="print">
+                      <a:extLst>
+                        <a:ext uri="{28A0092B-C50C-407E-A947-70E740481C1C}">
+                          <a14:useLocalDpi xmlns:a14="http://schemas.microsoft.com/office/drawing/2010/main" val="0"/>
+                        </a:ext>
+                      </a:extLst>
+                    </a:blip>
+                    <a:srcRect/>
+                    <a:stretch>
+                      <a:fillRect/>
+                    </a:stretch>
+                  </pic:blipFill>
+                  <pic:spPr bwMode="auto">
+                    <a:xfrm>
+                      <a:off x="0" y="0"/>
+                      <a:ext cx="295275" cy="295275"/>
+                    </a:xfrm>
+                    <a:prstGeom prst="rect">
+                      <a:avLst/>
+                    </a:prstGeom>
+                    <a:noFill/>
+                    <a:ln>
+                      <a:noFill/>
+                    </a:ln>
+                  </pic:spPr>
+                </pic:pic>
+              </a:graphicData>
+            </a:graphic>
+            <wp14:sizeRelH relativeFrom="margin">
+              <wp14:pctWidth>0</wp14:pctWidth>
+            </wp14:sizeRelH>
+            <wp14:sizeRelV relativeFrom="margin">
+              <wp14:pctHeight>0</wp14:pctHeight>
+            </wp14:sizeRelV>
+          </wp:anchor>
+        </w:drawing>
+      </w:r>
+      <w:r>
+        <w:t>2.3</w:t>
+      </w:r>
+      <w:r>
+        <w:tab/>
+      </w:r>
+      <w:r>
+        <w:t>Infrastruktúra és Egyéb</w:t>
+      </w:r>
+    </w:p>
+    <w:p>
+      <w:pPr>
+        <w:pStyle w:val="Listaszerbekezds"/>
+        <w:numPr>
+          <w:ilvl w:val="0"/>
+          <w:numId w:val="24"/>
+        </w:numPr>
+        <w:jc w:val="both"/>
+      </w:pPr>
+      <w:r>
+        <w:rPr>
+          <w:noProof/>
+        </w:rPr>
+        <w:drawing>
+          <wp:anchor distT="0" distB="0" distL="114300" distR="114300" simplePos="0" relativeHeight="251677696" behindDoc="0" locked="0" layoutInCell="1" allowOverlap="1" wp14:anchorId="79667D00" wp14:editId="15371427">
+            <wp:simplePos x="0" y="0"/>
+            <wp:positionH relativeFrom="margin">
+              <wp:posOffset>2291080</wp:posOffset>
+            </wp:positionH>
+            <wp:positionV relativeFrom="paragraph">
+              <wp:posOffset>257175</wp:posOffset>
+            </wp:positionV>
+            <wp:extent cx="304800" cy="304800"/>
+            <wp:effectExtent l="0" t="0" r="0" b="0"/>
+            <wp:wrapSquare wrapText="bothSides"/>
+            <wp:docPr id="1099175841" name="Kép 17" descr="Docker Hub: Centralized management of Docker images"/>
+            <wp:cNvGraphicFramePr>
+              <a:graphicFrameLocks xmlns:a="http://schemas.openxmlformats.org/drawingml/2006/main" noChangeAspect="1"/>
+            </wp:cNvGraphicFramePr>
+            <a:graphic xmlns:a="http://schemas.openxmlformats.org/drawingml/2006/main">
+              <a:graphicData uri="http://schemas.openxmlformats.org/drawingml/2006/picture">
+                <pic:pic xmlns:pic="http://schemas.openxmlformats.org/drawingml/2006/picture">
+                  <pic:nvPicPr>
+                    <pic:cNvPr id="0" name="Picture 33" descr="Docker Hub: Centralized management of Docker images"/>
+                    <pic:cNvPicPr>
+                      <a:picLocks noChangeAspect="1" noChangeArrowheads="1"/>
+                    </pic:cNvPicPr>
+                  </pic:nvPicPr>
+                  <pic:blipFill>
+                    <a:blip r:embed="rId27" cstate="print">
+                      <a:extLst>
+                        <a:ext uri="{28A0092B-C50C-407E-A947-70E740481C1C}">
+                          <a14:useLocalDpi xmlns:a14="http://schemas.microsoft.com/office/drawing/2010/main" val="0"/>
+                        </a:ext>
+                      </a:extLst>
+                    </a:blip>
+                    <a:srcRect/>
+                    <a:stretch>
+                      <a:fillRect/>
+                    </a:stretch>
+                  </pic:blipFill>
+                  <pic:spPr bwMode="auto">
+                    <a:xfrm>
+                      <a:off x="0" y="0"/>
+                      <a:ext cx="304800" cy="304800"/>
+                    </a:xfrm>
+                    <a:prstGeom prst="rect">
+                      <a:avLst/>
+                    </a:prstGeom>
+                    <a:noFill/>
+                    <a:ln>
+                      <a:noFill/>
+                    </a:ln>
+                  </pic:spPr>
+                </pic:pic>
+              </a:graphicData>
+            </a:graphic>
+            <wp14:sizeRelH relativeFrom="margin">
+              <wp14:pctWidth>0</wp14:pctWidth>
+            </wp14:sizeRelH>
+            <wp14:sizeRelV relativeFrom="margin">
+              <wp14:pctHeight>0</wp14:pctHeight>
+            </wp14:sizeRelV>
+          </wp:anchor>
+        </w:drawing>
+      </w:r>
+      <w:r>
+        <w:rPr>
+          <w:b/>
+          <w:bCs/>
+        </w:rPr>
+        <w:t>Verziókezelés:</w:t>
+      </w:r>
+      <w:r>
+        <w:t xml:space="preserve"> </w:t>
+      </w:r>
+      <w:proofErr w:type="spellStart"/>
+      <w:r>
+        <w:t>Git</w:t>
+      </w:r>
+      <w:proofErr w:type="spellEnd"/>
+      <w:r>
+        <w:t xml:space="preserve">, GitHub, GitHub </w:t>
+      </w:r>
+      <w:proofErr w:type="spellStart"/>
+      <w:r>
+        <w:t>lfs</w:t>
+      </w:r>
+      <w:proofErr w:type="spellEnd"/>
+    </w:p>
+    <w:p>
+      <w:pPr>
+        <w:numPr>
+          <w:ilvl w:val="0"/>
+          <w:numId w:val="24"/>
+        </w:numPr>
+      </w:pPr>
+      <w:r>
+        <w:rPr>
+          <w:noProof/>
+        </w:rPr>
+        <w:drawing>
+          <wp:anchor distT="0" distB="0" distL="114300" distR="114300" simplePos="0" relativeHeight="251679744" behindDoc="0" locked="0" layoutInCell="1" allowOverlap="1" wp14:anchorId="5DB45A11" wp14:editId="73516907">
+            <wp:simplePos x="0" y="0"/>
+            <wp:positionH relativeFrom="column">
+              <wp:posOffset>3815080</wp:posOffset>
+            </wp:positionH>
+            <wp:positionV relativeFrom="paragraph">
+              <wp:posOffset>301625</wp:posOffset>
+            </wp:positionV>
+            <wp:extent cx="276225" cy="276225"/>
+            <wp:effectExtent l="0" t="0" r="9525" b="0"/>
+            <wp:wrapSquare wrapText="bothSides"/>
+            <wp:docPr id="126334962" name="Kép 20" descr="npm - Visual Studio Marketplace"/>
+            <wp:cNvGraphicFramePr>
+              <a:graphicFrameLocks xmlns:a="http://schemas.openxmlformats.org/drawingml/2006/main" noChangeAspect="1"/>
+            </wp:cNvGraphicFramePr>
+            <a:graphic xmlns:a="http://schemas.openxmlformats.org/drawingml/2006/main">
+              <a:graphicData uri="http://schemas.openxmlformats.org/drawingml/2006/picture">
+                <pic:pic xmlns:pic="http://schemas.openxmlformats.org/drawingml/2006/picture">
+                  <pic:nvPicPr>
+                    <pic:cNvPr id="0" name="Picture 39" descr="npm - Visual Studio Marketplace"/>
+                    <pic:cNvPicPr>
+                      <a:picLocks noChangeAspect="1" noChangeArrowheads="1"/>
+                    </pic:cNvPicPr>
+                  </pic:nvPicPr>
+                  <pic:blipFill>
+                    <a:blip r:embed="rId28" cstate="print">
+                      <a:extLst>
+                        <a:ext uri="{28A0092B-C50C-407E-A947-70E740481C1C}">
+                          <a14:useLocalDpi xmlns:a14="http://schemas.microsoft.com/office/drawing/2010/main" val="0"/>
+                        </a:ext>
+                      </a:extLst>
+                    </a:blip>
+                    <a:srcRect/>
+                    <a:stretch>
+                      <a:fillRect/>
+                    </a:stretch>
+                  </pic:blipFill>
+                  <pic:spPr bwMode="auto">
+                    <a:xfrm>
+                      <a:off x="0" y="0"/>
+                      <a:ext cx="276225" cy="276225"/>
+                    </a:xfrm>
+                    <a:prstGeom prst="rect">
+                      <a:avLst/>
+                    </a:prstGeom>
+                    <a:noFill/>
+                    <a:ln>
+                      <a:noFill/>
+                    </a:ln>
+                  </pic:spPr>
+                </pic:pic>
+              </a:graphicData>
+            </a:graphic>
+            <wp14:sizeRelH relativeFrom="margin">
+              <wp14:pctWidth>0</wp14:pctWidth>
+            </wp14:sizeRelH>
+            <wp14:sizeRelV relativeFrom="margin">
+              <wp14:pctHeight>0</wp14:pctHeight>
+            </wp14:sizeRelV>
+          </wp:anchor>
+        </w:drawing>
+      </w:r>
+      <w:r>
+        <w:rPr>
+          <w:noProof/>
+        </w:rPr>
+        <w:drawing>
+          <wp:anchor distT="0" distB="0" distL="114300" distR="114300" simplePos="0" relativeHeight="251678720" behindDoc="0" locked="0" layoutInCell="1" allowOverlap="1" wp14:anchorId="7755C64F" wp14:editId="1D702BEA">
+            <wp:simplePos x="0" y="0"/>
+            <wp:positionH relativeFrom="column">
+              <wp:posOffset>3386455</wp:posOffset>
+            </wp:positionH>
+            <wp:positionV relativeFrom="paragraph">
+              <wp:posOffset>253365</wp:posOffset>
+            </wp:positionV>
+            <wp:extent cx="280035" cy="333375"/>
+            <wp:effectExtent l="0" t="0" r="5715" b="9525"/>
+            <wp:wrapSquare wrapText="bothSides"/>
+            <wp:docPr id="1360352430" name="Kép 18" descr="Composer (software) - Wikipedia"/>
+            <wp:cNvGraphicFramePr>
+              <a:graphicFrameLocks xmlns:a="http://schemas.openxmlformats.org/drawingml/2006/main" noChangeAspect="1"/>
+            </wp:cNvGraphicFramePr>
+            <a:graphic xmlns:a="http://schemas.openxmlformats.org/drawingml/2006/main">
+              <a:graphicData uri="http://schemas.openxmlformats.org/drawingml/2006/picture">
+                <pic:pic xmlns:pic="http://schemas.openxmlformats.org/drawingml/2006/picture">
+                  <pic:nvPicPr>
+                    <pic:cNvPr id="0" name="Picture 35" descr="Composer (software) - Wikipedia"/>
+                    <pic:cNvPicPr>
+                      <a:picLocks noChangeAspect="1" noChangeArrowheads="1"/>
+                    </pic:cNvPicPr>
+                  </pic:nvPicPr>
+                  <pic:blipFill>
+                    <a:blip r:embed="rId29" cstate="print">
+                      <a:extLst>
+                        <a:ext uri="{28A0092B-C50C-407E-A947-70E740481C1C}">
+                          <a14:useLocalDpi xmlns:a14="http://schemas.microsoft.com/office/drawing/2010/main" val="0"/>
+                        </a:ext>
+                      </a:extLst>
+                    </a:blip>
+                    <a:srcRect/>
+                    <a:stretch>
+                      <a:fillRect/>
+                    </a:stretch>
+                  </pic:blipFill>
+                  <pic:spPr bwMode="auto">
+                    <a:xfrm>
+                      <a:off x="0" y="0"/>
+                      <a:ext cx="280035" cy="333375"/>
+                    </a:xfrm>
+                    <a:prstGeom prst="rect">
+                      <a:avLst/>
+                    </a:prstGeom>
+                    <a:noFill/>
+                    <a:ln>
+                      <a:noFill/>
+                    </a:ln>
+                  </pic:spPr>
+                </pic:pic>
+              </a:graphicData>
+            </a:graphic>
+            <wp14:sizeRelH relativeFrom="margin">
+              <wp14:pctWidth>0</wp14:pctWidth>
+            </wp14:sizeRelH>
+            <wp14:sizeRelV relativeFrom="margin">
+              <wp14:pctHeight>0</wp14:pctHeight>
+            </wp14:sizeRelV>
+          </wp:anchor>
+        </w:drawing>
+      </w:r>
+      <w:proofErr w:type="spellStart"/>
+      <w:r>
+        <w:rPr>
+          <w:b/>
+          <w:bCs/>
+        </w:rPr>
+        <w:t>Konténerizáció</w:t>
+      </w:r>
+      <w:proofErr w:type="spellEnd"/>
+      <w:r>
+        <w:rPr>
+          <w:b/>
+          <w:bCs/>
+        </w:rPr>
+        <w:t>:</w:t>
+      </w:r>
+      <w:r>
+        <w:t xml:space="preserve"> Docker</w:t>
+      </w:r>
+    </w:p>
+    <w:p>
+      <w:pPr>
+        <w:numPr>
+          <w:ilvl w:val="0"/>
+          <w:numId w:val="24"/>
+        </w:numPr>
+      </w:pPr>
+      <w:r>
+        <w:rPr>
+          <w:noProof/>
+        </w:rPr>
+        <w:drawing>
+          <wp:anchor distT="0" distB="0" distL="114300" distR="114300" simplePos="0" relativeHeight="251680768" behindDoc="0" locked="0" layoutInCell="1" allowOverlap="1" wp14:anchorId="6228A8D8" wp14:editId="6EF96819">
+            <wp:simplePos x="0" y="0"/>
+            <wp:positionH relativeFrom="column">
+              <wp:posOffset>4443730</wp:posOffset>
+            </wp:positionH>
+            <wp:positionV relativeFrom="paragraph">
+              <wp:posOffset>289560</wp:posOffset>
+            </wp:positionV>
+            <wp:extent cx="906145" cy="333375"/>
+            <wp:effectExtent l="0" t="0" r="8255" b="9525"/>
+            <wp:wrapSquare wrapText="bothSides"/>
+            <wp:docPr id="742881299" name="Kép 21" descr="Introducing Pest 2.0: The Next Generation of PHP Testing - PHP Magazine  Network"/>
+            <wp:cNvGraphicFramePr>
+              <a:graphicFrameLocks xmlns:a="http://schemas.openxmlformats.org/drawingml/2006/main" noChangeAspect="1"/>
+            </wp:cNvGraphicFramePr>
+            <a:graphic xmlns:a="http://schemas.openxmlformats.org/drawingml/2006/main">
+              <a:graphicData uri="http://schemas.openxmlformats.org/drawingml/2006/picture">
+                <pic:pic xmlns:pic="http://schemas.openxmlformats.org/drawingml/2006/picture">
+                  <pic:nvPicPr>
+                    <pic:cNvPr id="0" name="Picture 41" descr="Introducing Pest 2.0: The Next Generation of PHP Testing - PHP Magazine  Network"/>
+                    <pic:cNvPicPr>
+                      <a:picLocks noChangeAspect="1" noChangeArrowheads="1"/>
+                    </pic:cNvPicPr>
+                  </pic:nvPicPr>
+                  <pic:blipFill>
+                    <a:blip r:embed="rId30" cstate="print">
+                      <a:extLst>
+                        <a:ext uri="{28A0092B-C50C-407E-A947-70E740481C1C}">
+                          <a14:useLocalDpi xmlns:a14="http://schemas.microsoft.com/office/drawing/2010/main" val="0"/>
+                        </a:ext>
+                      </a:extLst>
+                    </a:blip>
+                    <a:srcRect/>
+                    <a:stretch>
+                      <a:fillRect/>
+                    </a:stretch>
+                  </pic:blipFill>
+                  <pic:spPr bwMode="auto">
+                    <a:xfrm>
+                      <a:off x="0" y="0"/>
+                      <a:ext cx="906145" cy="333375"/>
+                    </a:xfrm>
+                    <a:prstGeom prst="rect">
+                      <a:avLst/>
+                    </a:prstGeom>
+                    <a:noFill/>
+                    <a:ln>
+                      <a:noFill/>
+                    </a:ln>
+                  </pic:spPr>
+                </pic:pic>
+              </a:graphicData>
+            </a:graphic>
+            <wp14:sizeRelH relativeFrom="margin">
+              <wp14:pctWidth>0</wp14:pctWidth>
+            </wp14:sizeRelH>
+            <wp14:sizeRelV relativeFrom="margin">
+              <wp14:pctHeight>0</wp14:pctHeight>
+            </wp14:sizeRelV>
+          </wp:anchor>
+        </w:drawing>
+      </w:r>
+      <w:r>
+        <w:rPr>
+          <w:b/>
+          <w:bCs/>
+        </w:rPr>
+        <w:t>Csomagkezelők:</w:t>
+      </w:r>
+      <w:r>
+        <w:t xml:space="preserve"> </w:t>
+      </w:r>
+      <w:proofErr w:type="spellStart"/>
+      <w:r>
+        <w:t>Composer</w:t>
+      </w:r>
+      <w:proofErr w:type="spellEnd"/>
+      <w:r>
+        <w:t xml:space="preserve"> (PHP), NPM</w:t>
+      </w:r>
+    </w:p>
+    <w:p>
+      <w:pPr>
+        <w:numPr>
+          <w:ilvl w:val="0"/>
+          <w:numId w:val="24"/>
+        </w:numPr>
+      </w:pPr>
+      <w:r>
+        <w:rPr>
+          <w:b/>
+          <w:bCs/>
+        </w:rPr>
+        <w:t>Tesztelés:</w:t>
+      </w:r>
+      <w:r>
+        <w:t xml:space="preserve"> </w:t>
+      </w:r>
+      <w:r>
+        <w:t xml:space="preserve">Pest (Backend), </w:t>
+      </w:r>
+      <w:r>
+        <w:t>Manuális tesztelés</w:t>
+      </w:r>
+      <w:r>
+        <w:t xml:space="preserve"> (Frontend).</w:t>
+      </w:r>
+      <w:r>
+        <w:t xml:space="preserve"> </w:t>
+      </w:r>
+    </w:p>
+    <w:p>
+      <w:pPr>
+        <w:rPr>
+          <w:i/>
+          <w:iCs/>
+        </w:rPr>
+      </w:pPr>
+      <w:r>
+        <w:rPr>
+          <w:i/>
+          <w:iCs/>
+        </w:rPr>
+        <w:br w:type="page"/>
+      </w:r>
+    </w:p>
+    <w:p>
+      <w:pPr>
+        <w:pStyle w:val="Cmsor1"/>
+      </w:pPr>
+      <w:r>
+        <w:lastRenderedPageBreak/>
+        <w:t>3.</w:t>
+      </w:r>
+      <w:r>
+        <w:tab/>
+      </w:r>
+      <w:r>
+        <w:t>Telepítési útmutató</w:t>
+      </w:r>
+    </w:p>
+    <w:p>
+      <w:pPr>
+        <w:pStyle w:val="Cmsor2"/>
+      </w:pPr>
+      <w:r>
+        <w:t>3.1</w:t>
+      </w:r>
+      <w:r>
+        <w:tab/>
+      </w:r>
+      <w:r>
+        <w:t>Követelmények</w:t>
+      </w:r>
+    </w:p>
+    <w:p>
+      <w:proofErr w:type="spellStart"/>
+      <w:r>
+        <w:t>git</w:t>
+      </w:r>
+      <w:proofErr w:type="spellEnd"/>
+      <w:r>
+        <w:t xml:space="preserve"> 2.51.0 </w:t>
+      </w:r>
+      <w:r>
+        <w:t xml:space="preserve">vagy újabb verzió, </w:t>
+      </w:r>
+      <w:proofErr w:type="spellStart"/>
+      <w:r>
+        <w:t>git-lfs</w:t>
+      </w:r>
+      <w:proofErr w:type="spellEnd"/>
+      <w:r>
+        <w:t xml:space="preserve"> 3.7.0 vagy újabb verzió</w:t>
+      </w:r>
+    </w:p>
+    <w:p>
+      <w:r>
+        <w:t xml:space="preserve">Docker </w:t>
+      </w:r>
+      <w:proofErr w:type="spellStart"/>
+      <w:r>
+        <w:t>desktop</w:t>
+      </w:r>
+      <w:proofErr w:type="spellEnd"/>
+      <w:r>
+        <w:t xml:space="preserve"> 28.3.3 </w:t>
+      </w:r>
+      <w:r>
+        <w:t>vagy újabb verzió</w:t>
+      </w:r>
+    </w:p>
+    <w:p>
+      <w:r>
+        <w:t xml:space="preserve">#Megjegyzés: A legjobb fejlesztési élmény érdekében javasolt a projektet natívan </w:t>
+      </w:r>
+      <w:proofErr w:type="spellStart"/>
+      <w:r>
+        <w:t>linuxon</w:t>
+      </w:r>
+      <w:proofErr w:type="spellEnd"/>
+      <w:r>
+        <w:t xml:space="preserve"> vagy </w:t>
+      </w:r>
+      <w:proofErr w:type="spellStart"/>
+      <w:r>
+        <w:t>windows-on</w:t>
+      </w:r>
+      <w:proofErr w:type="spellEnd"/>
+      <w:r>
+        <w:t xml:space="preserve"> WSL-en belül futtatni.</w:t>
+      </w:r>
+    </w:p>
+    <w:p/>
+    <w:p>
+      <w:pPr>
+        <w:pStyle w:val="Cmsor2"/>
+      </w:pPr>
+      <w:r>
+        <w:t>3.2</w:t>
+      </w:r>
+      <w:r>
+        <w:tab/>
+      </w:r>
+      <w:r>
+        <w:t>Telepítés lépései</w:t>
+      </w:r>
+    </w:p>
+    <w:p>
+      <w:pPr>
+        <w:pStyle w:val="Listaszerbekezds"/>
+        <w:numPr>
+          <w:ilvl w:val="0"/>
+          <w:numId w:val="26"/>
+        </w:numPr>
+      </w:pPr>
+      <w:proofErr w:type="spellStart"/>
+      <w:r>
+        <w:t>Git</w:t>
+      </w:r>
+      <w:proofErr w:type="spellEnd"/>
+      <w:r>
+        <w:t xml:space="preserve"> </w:t>
+      </w:r>
+      <w:proofErr w:type="spellStart"/>
+      <w:r>
+        <w:t>repository</w:t>
+      </w:r>
+      <w:proofErr w:type="spellEnd"/>
+      <w:r>
+        <w:t xml:space="preserve"> klónozása</w:t>
+      </w:r>
+    </w:p>
+    <w:p>
+      <w:pPr>
+        <w:pStyle w:val="Listaszerbekezds"/>
+      </w:pPr>
+      <w:r>
+        <w:t>`</w:t>
+      </w:r>
+      <w:proofErr w:type="spellStart"/>
+      <w:r>
+        <w:rPr>
+          <w:color w:val="0070C0"/>
+        </w:rPr>
+        <w:t>git</w:t>
+      </w:r>
+      <w:proofErr w:type="spellEnd"/>
+      <w:r>
+        <w:rPr>
+          <w:color w:val="0070C0"/>
+        </w:rPr>
+        <w:t xml:space="preserve"> </w:t>
+      </w:r>
+      <w:proofErr w:type="spellStart"/>
+      <w:r>
+        <w:rPr>
+          <w:color w:val="0070C0"/>
+        </w:rPr>
+        <w:t>clone</w:t>
+      </w:r>
+      <w:proofErr w:type="spellEnd"/>
+      <w:r>
+        <w:rPr>
+          <w:color w:val="0070C0"/>
+        </w:rPr>
+        <w:t xml:space="preserve"> https://github.com/Hubblika/MyTunes.git</w:t>
+      </w:r>
+      <w:r>
+        <w:t>`</w:t>
+      </w:r>
+    </w:p>
+    <w:p>
+      <w:pPr>
+        <w:pStyle w:val="Listaszerbekezds"/>
+        <w:numPr>
+          <w:ilvl w:val="0"/>
+          <w:numId w:val="26"/>
+        </w:numPr>
+      </w:pPr>
+      <w:r>
+        <w:t>Navigáció a</w:t>
+      </w:r>
+      <w:r>
+        <w:t xml:space="preserve"> projekt könyvtárába</w:t>
+      </w:r>
+    </w:p>
+    <w:p>
+      <w:pPr>
+        <w:pStyle w:val="Listaszerbekezds"/>
+      </w:pPr>
+      <w:r>
+        <w:t>`</w:t>
+      </w:r>
+      <w:r>
+        <w:rPr>
+          <w:color w:val="0070C0"/>
+        </w:rPr>
+        <w:t xml:space="preserve">cd </w:t>
+      </w:r>
+      <w:proofErr w:type="spellStart"/>
+      <w:r>
+        <w:rPr>
+          <w:color w:val="0070C0"/>
+        </w:rPr>
+        <w:t>MyTunes</w:t>
+      </w:r>
+      <w:proofErr w:type="spellEnd"/>
+      <w:r>
+        <w:t>`</w:t>
+      </w:r>
+    </w:p>
+    <w:p>
+      <w:pPr>
+        <w:pStyle w:val="Listaszerbekezds"/>
+        <w:numPr>
+          <w:ilvl w:val="0"/>
+          <w:numId w:val="26"/>
+        </w:numPr>
+      </w:pPr>
+      <w:r>
+        <w:t xml:space="preserve">Nagy fájlok letöltése a </w:t>
+      </w:r>
+      <w:proofErr w:type="spellStart"/>
+      <w:r>
+        <w:t>git</w:t>
+      </w:r>
+      <w:proofErr w:type="spellEnd"/>
+      <w:r>
+        <w:t xml:space="preserve"> </w:t>
+      </w:r>
+      <w:proofErr w:type="spellStart"/>
+      <w:r>
+        <w:t>lfs</w:t>
+      </w:r>
+      <w:proofErr w:type="spellEnd"/>
+      <w:r>
+        <w:t xml:space="preserve"> </w:t>
+      </w:r>
+      <w:proofErr w:type="spellStart"/>
+      <w:r>
+        <w:t>repo</w:t>
+      </w:r>
+      <w:r>
+        <w:t>sitoryból</w:t>
+      </w:r>
+      <w:proofErr w:type="spellEnd"/>
+    </w:p>
+    <w:p>
+      <w:pPr>
+        <w:pStyle w:val="Listaszerbekezds"/>
+      </w:pPr>
+      <w:r>
+        <w:t>`</w:t>
+      </w:r>
+      <w:proofErr w:type="spellStart"/>
+      <w:r>
+        <w:rPr>
+          <w:color w:val="0070C0"/>
+        </w:rPr>
+        <w:t>git</w:t>
+      </w:r>
+      <w:proofErr w:type="spellEnd"/>
+      <w:r>
+        <w:rPr>
+          <w:color w:val="0070C0"/>
+        </w:rPr>
+        <w:t xml:space="preserve"> </w:t>
+      </w:r>
+      <w:proofErr w:type="spellStart"/>
+      <w:r>
+        <w:rPr>
+          <w:color w:val="0070C0"/>
+        </w:rPr>
+        <w:t>lfs</w:t>
+      </w:r>
+      <w:proofErr w:type="spellEnd"/>
+      <w:r>
+        <w:rPr>
+          <w:color w:val="0070C0"/>
+        </w:rPr>
+        <w:t xml:space="preserve"> </w:t>
+      </w:r>
+      <w:proofErr w:type="spellStart"/>
+      <w:r>
+        <w:rPr>
+          <w:color w:val="0070C0"/>
+        </w:rPr>
+        <w:t>pull</w:t>
+      </w:r>
+      <w:proofErr w:type="spellEnd"/>
+      <w:r>
+        <w:t>`</w:t>
+      </w:r>
+    </w:p>
+    <w:p>
+      <w:pPr>
+        <w:pStyle w:val="Listaszerbekezds"/>
+        <w:numPr>
+          <w:ilvl w:val="0"/>
+          <w:numId w:val="26"/>
+        </w:numPr>
+      </w:pPr>
+      <w:r>
+        <w:t>Navigáció a webes alkalmazás gyökérkönyvtárába</w:t>
+      </w:r>
+    </w:p>
+    <w:p>
+      <w:pPr>
+        <w:pStyle w:val="Listaszerbekezds"/>
+      </w:pPr>
+      <w:r>
+        <w:t>`</w:t>
+      </w:r>
+      <w:r>
+        <w:rPr>
+          <w:color w:val="0070C0"/>
+        </w:rPr>
+        <w:t xml:space="preserve">cd </w:t>
+      </w:r>
+      <w:proofErr w:type="spellStart"/>
+      <w:r>
+        <w:rPr>
+          <w:color w:val="0070C0"/>
+        </w:rPr>
+        <w:t>www</w:t>
+      </w:r>
+      <w:proofErr w:type="spellEnd"/>
+      <w:r>
+        <w:t>`</w:t>
+      </w:r>
+    </w:p>
+    <w:p>
+      <w:pPr>
+        <w:pStyle w:val="Listaszerbekezds"/>
+        <w:numPr>
+          <w:ilvl w:val="0"/>
+          <w:numId w:val="26"/>
+        </w:numPr>
+      </w:pPr>
+      <w:r>
+        <w:t xml:space="preserve">Docker </w:t>
+      </w:r>
+      <w:proofErr w:type="spellStart"/>
+      <w:r>
+        <w:t>engine</w:t>
+      </w:r>
+      <w:proofErr w:type="spellEnd"/>
+      <w:r>
+        <w:t xml:space="preserve"> elindítása</w:t>
+      </w:r>
+    </w:p>
+    <w:p>
+      <w:pPr>
+        <w:pStyle w:val="Listaszerbekezds"/>
+        <w:rPr>
+          <w:color w:val="0070C0"/>
+        </w:rPr>
+      </w:pPr>
+      <w:r>
+        <w:rPr>
+          <w:color w:val="0070C0"/>
+        </w:rPr>
+        <w:t xml:space="preserve">Docker </w:t>
+      </w:r>
+      <w:proofErr w:type="spellStart"/>
+      <w:r>
+        <w:rPr>
+          <w:color w:val="0070C0"/>
+        </w:rPr>
+        <w:t>desktop</w:t>
+      </w:r>
+      <w:proofErr w:type="spellEnd"/>
+      <w:r>
+        <w:rPr>
+          <w:color w:val="0070C0"/>
+        </w:rPr>
+        <w:t xml:space="preserve"> elindítása, vagy </w:t>
+      </w:r>
+      <w:proofErr w:type="spellStart"/>
+      <w:r>
+        <w:rPr>
+          <w:color w:val="0070C0"/>
+        </w:rPr>
+        <w:t>docker</w:t>
+      </w:r>
+      <w:proofErr w:type="spellEnd"/>
+      <w:r>
+        <w:rPr>
+          <w:color w:val="0070C0"/>
+        </w:rPr>
+        <w:t xml:space="preserve"> indítása terminálból</w:t>
+      </w:r>
+    </w:p>
+    <w:p>
+      <w:pPr>
+        <w:pStyle w:val="Listaszerbekezds"/>
+        <w:numPr>
+          <w:ilvl w:val="0"/>
+          <w:numId w:val="26"/>
+        </w:numPr>
+      </w:pPr>
+      <w:r>
+        <w:t>Docker konténer felépítése és futtatása</w:t>
+      </w:r>
+    </w:p>
+    <w:p>
+      <w:pPr>
+        <w:pStyle w:val="Listaszerbekezds"/>
+      </w:pPr>
+      <w:r>
+        <w:t>`</w:t>
+      </w:r>
+      <w:proofErr w:type="spellStart"/>
+      <w:r>
+        <w:rPr>
+          <w:color w:val="0070C0"/>
+        </w:rPr>
+        <w:t>docker</w:t>
+      </w:r>
+      <w:proofErr w:type="spellEnd"/>
+      <w:r>
+        <w:rPr>
+          <w:color w:val="0070C0"/>
+        </w:rPr>
+        <w:t xml:space="preserve"> </w:t>
+      </w:r>
+      <w:proofErr w:type="spellStart"/>
+      <w:r>
+        <w:rPr>
+          <w:color w:val="0070C0"/>
+        </w:rPr>
+        <w:t>compose</w:t>
+      </w:r>
+      <w:proofErr w:type="spellEnd"/>
+      <w:r>
+        <w:rPr>
+          <w:color w:val="0070C0"/>
+        </w:rPr>
+        <w:t xml:space="preserve"> </w:t>
+      </w:r>
+      <w:proofErr w:type="spellStart"/>
+      <w:r>
+        <w:rPr>
+          <w:color w:val="0070C0"/>
+        </w:rPr>
+        <w:t>up</w:t>
+      </w:r>
+      <w:proofErr w:type="spellEnd"/>
+      <w:r>
+        <w:rPr>
+          <w:color w:val="0070C0"/>
+        </w:rPr>
+        <w:t xml:space="preserve"> </w:t>
+      </w:r>
+      <w:r>
+        <w:rPr>
+          <w:color w:val="0070C0"/>
+        </w:rPr>
+        <w:t>--</w:t>
+      </w:r>
+      <w:proofErr w:type="spellStart"/>
+      <w:r>
+        <w:rPr>
+          <w:color w:val="0070C0"/>
+        </w:rPr>
+        <w:t>build</w:t>
+      </w:r>
+      <w:proofErr w:type="spellEnd"/>
+      <w:r>
+        <w:rPr>
+          <w:color w:val="0070C0"/>
+        </w:rPr>
+        <w:t>`</w:t>
+      </w:r>
+    </w:p>
+    <w:p>
+      <w:pPr>
+        <w:pStyle w:val="Listaszerbekezds"/>
+      </w:pPr>
+    </w:p>
+    <w:p>
+      <w:pPr>
+        <w:rPr>
+          <w:rFonts w:ascii="Montserrat" w:eastAsiaTheme="majorEastAsia" w:hAnsi="Montserrat" w:cstheme="majorBidi"/>
+          <w:b/>
+          <w:color w:val="000000" w:themeColor="text1"/>
+          <w:sz w:val="32"/>
+          <w:szCs w:val="32"/>
+        </w:rPr>
+      </w:pPr>
+      <w:r>
+        <w:br w:type="page"/>
+      </w:r>
+    </w:p>
+    <w:p>
+      <w:pPr>
+        <w:pStyle w:val="Cmsor2"/>
+      </w:pPr>
+      <w:r>
+        <w:lastRenderedPageBreak/>
+        <w:t>3.3</w:t>
+      </w:r>
+      <w:r>
+        <w:tab/>
+      </w:r>
+      <w:r>
+        <w:t>Megtekintés</w:t>
+      </w:r>
+    </w:p>
+    <w:p>
+      <w:r>
+        <w:t>A konténer indítása után a weboldal megtekinthető a `localhost:8000</w:t>
+      </w:r>
+      <w:r>
+        <w:t>`</w:t>
+      </w:r>
+      <w:r>
+        <w:t xml:space="preserve">-es webcímen </w:t>
+      </w:r>
+    </w:p>
+    <w:p>
+      <w:r>
+        <w:drawing>
+          <wp:inline distT="0" distB="0" distL="0" distR="0" wp14:anchorId="39CA1F88" wp14:editId="2EBFB48E">
+            <wp:extent cx="5760720" cy="3093720"/>
+            <wp:effectExtent l="0" t="0" r="0" b="0"/>
+            <wp:docPr id="509289132" name="Kép 1"/>
+            <wp:cNvGraphicFramePr>
+              <a:graphicFrameLocks xmlns:a="http://schemas.openxmlformats.org/drawingml/2006/main" noChangeAspect="1"/>
+            </wp:cNvGraphicFramePr>
+            <a:graphic xmlns:a="http://schemas.openxmlformats.org/drawingml/2006/main">
+              <a:graphicData uri="http://schemas.openxmlformats.org/drawingml/2006/picture">
+                <pic:pic xmlns:pic="http://schemas.openxmlformats.org/drawingml/2006/picture">
+                  <pic:nvPicPr>
+                    <pic:cNvPr id="509289132" name=""/>
+                    <pic:cNvPicPr/>
+                  </pic:nvPicPr>
+                  <pic:blipFill>
+                    <a:blip r:embed="rId31"/>
+                    <a:stretch>
+                      <a:fillRect/>
+                    </a:stretch>
+                  </pic:blipFill>
+                  <pic:spPr>
+                    <a:xfrm>
+                      <a:off x="0" y="0"/>
+                      <a:ext cx="5760720" cy="3093720"/>
+                    </a:xfrm>
+                    <a:prstGeom prst="rect">
+                      <a:avLst/>
+                    </a:prstGeom>
+                  </pic:spPr>
+                </pic:pic>
+              </a:graphicData>
+            </a:graphic>
+          </wp:inline>
+        </w:drawing>
+      </w:r>
+      <w:r>
+        <w:t>Az elfelejtett jelszó e-maileket a `localhost:8025`-ös webcímen lehet megtekinteni.</w:t>
+      </w:r>
+    </w:p>
+    <w:p>
+      <w:r>
+        <w:drawing>
+          <wp:inline distT="0" distB="0" distL="0" distR="0" wp14:anchorId="439ABD1B" wp14:editId="1B6BDB40">
+            <wp:extent cx="5760720" cy="3091815"/>
+            <wp:effectExtent l="0" t="0" r="0" b="0"/>
+            <wp:docPr id="71190272" name="Kép 1"/>
+            <wp:cNvGraphicFramePr>
+              <a:graphicFrameLocks xmlns:a="http://schemas.openxmlformats.org/drawingml/2006/main" noChangeAspect="1"/>
+            </wp:cNvGraphicFramePr>
+            <a:graphic xmlns:a="http://schemas.openxmlformats.org/drawingml/2006/main">
+              <a:graphicData uri="http://schemas.openxmlformats.org/drawingml/2006/picture">
+                <pic:pic xmlns:pic="http://schemas.openxmlformats.org/drawingml/2006/picture">
+                  <pic:nvPicPr>
+                    <pic:cNvPr id="71190272" name=""/>
+                    <pic:cNvPicPr/>
+                  </pic:nvPicPr>
+                  <pic:blipFill>
+                    <a:blip r:embed="rId32"/>
+                    <a:stretch>
+                      <a:fillRect/>
+                    </a:stretch>
+                  </pic:blipFill>
+                  <pic:spPr>
+                    <a:xfrm>
+                      <a:off x="0" y="0"/>
+                      <a:ext cx="5760720" cy="3091815"/>
+                    </a:xfrm>
+                    <a:prstGeom prst="rect">
+                      <a:avLst/>
+                    </a:prstGeom>
+                  </pic:spPr>
+                </pic:pic>
+              </a:graphicData>
+            </a:graphic>
+          </wp:inline>
+        </w:drawing>
+      </w:r>
+    </w:p>
+    <w:p>
+      <w:r>
+        <w:br w:type="page"/>
+      </w:r>
+    </w:p>
+    <w:p/>
+    <w:p>
+      <w:pPr>
         <w:pStyle w:val="brajegyzk"/>
         <w:tabs>
           <w:tab w:val="right" w:leader="dot" w:pos="9062"/>
@@ -2517,7 +4537,6 @@
           <w:i/>
           <w:iCs/>
         </w:rPr>
-        <w:lastRenderedPageBreak/>
         <w:fldChar w:fldCharType="begin"/>
       </w:r>
       <w:r>
@@ -2745,9 +4764,9 @@
       </w:r>
     </w:p>
     <w:sectPr>
-      <w:headerReference w:type="even" r:id="rId15"/>
-      <w:footerReference w:type="even" r:id="rId16"/>
-      <w:footerReference w:type="default" r:id="rId17"/>
+      <w:headerReference w:type="even" r:id="rId33"/>
+      <w:footerReference w:type="even" r:id="rId34"/>
+      <w:footerReference w:type="default" r:id="rId35"/>
       <w:pgSz w:w="11906" w:h="16838"/>
       <w:pgMar w:top="1417" w:right="1417" w:bottom="1417" w:left="1417" w:header="708" w:footer="708" w:gutter="0"/>
       <w:cols w:space="708"/>
@@ -3240,6 +5259,92 @@
     </w:lvl>
   </w:abstractNum>
   <w:abstractNum w:abstractNumId="3" w15:restartNumberingAfterBreak="0">
+    <w:nsid w:val="0C7E7D9E"/>
+    <w:multiLevelType w:val="hybridMultilevel"/>
+    <w:tmpl w:val="3AAEB7FE"/>
+    <w:lvl w:ilvl="0" w:tplc="040E000F">
+      <w:start w:val="1"/>
+      <w:numFmt w:val="decimal"/>
+      <w:lvlText w:val="%1."/>
+      <w:lvlJc w:val="left"/>
+      <w:pPr>
+        <w:ind w:left="720" w:hanging="360"/>
+      </w:pPr>
+    </w:lvl>
+    <w:lvl w:ilvl="1" w:tplc="040E0019" w:tentative="1">
+      <w:start w:val="1"/>
+      <w:numFmt w:val="lowerLetter"/>
+      <w:lvlText w:val="%2."/>
+      <w:lvlJc w:val="left"/>
+      <w:pPr>
+        <w:ind w:left="1440" w:hanging="360"/>
+      </w:pPr>
+    </w:lvl>
+    <w:lvl w:ilvl="2" w:tplc="040E001B" w:tentative="1">
+      <w:start w:val="1"/>
+      <w:numFmt w:val="lowerRoman"/>
+      <w:lvlText w:val="%3."/>
+      <w:lvlJc w:val="right"/>
+      <w:pPr>
+        <w:ind w:left="2160" w:hanging="180"/>
+      </w:pPr>
+    </w:lvl>
+    <w:lvl w:ilvl="3" w:tplc="040E000F" w:tentative="1">
+      <w:start w:val="1"/>
+      <w:numFmt w:val="decimal"/>
+      <w:lvlText w:val="%4."/>
+      <w:lvlJc w:val="left"/>
+      <w:pPr>
+        <w:ind w:left="2880" w:hanging="360"/>
+      </w:pPr>
+    </w:lvl>
+    <w:lvl w:ilvl="4" w:tplc="040E0019" w:tentative="1">
+      <w:start w:val="1"/>
+      <w:numFmt w:val="lowerLetter"/>
+      <w:lvlText w:val="%5."/>
+      <w:lvlJc w:val="left"/>
+      <w:pPr>
+        <w:ind w:left="3600" w:hanging="360"/>
+      </w:pPr>
+    </w:lvl>
+    <w:lvl w:ilvl="5" w:tplc="040E001B" w:tentative="1">
+      <w:start w:val="1"/>
+      <w:numFmt w:val="lowerRoman"/>
+      <w:lvlText w:val="%6."/>
+      <w:lvlJc w:val="right"/>
+      <w:pPr>
+        <w:ind w:left="4320" w:hanging="180"/>
+      </w:pPr>
+    </w:lvl>
+    <w:lvl w:ilvl="6" w:tplc="040E000F" w:tentative="1">
+      <w:start w:val="1"/>
+      <w:numFmt w:val="decimal"/>
+      <w:lvlText w:val="%7."/>
+      <w:lvlJc w:val="left"/>
+      <w:pPr>
+        <w:ind w:left="5040" w:hanging="360"/>
+      </w:pPr>
+    </w:lvl>
+    <w:lvl w:ilvl="7" w:tplc="040E0019" w:tentative="1">
+      <w:start w:val="1"/>
+      <w:numFmt w:val="lowerLetter"/>
+      <w:lvlText w:val="%8."/>
+      <w:lvlJc w:val="left"/>
+      <w:pPr>
+        <w:ind w:left="5760" w:hanging="360"/>
+      </w:pPr>
+    </w:lvl>
+    <w:lvl w:ilvl="8" w:tplc="040E001B" w:tentative="1">
+      <w:start w:val="1"/>
+      <w:numFmt w:val="lowerRoman"/>
+      <w:lvlText w:val="%9."/>
+      <w:lvlJc w:val="right"/>
+      <w:pPr>
+        <w:ind w:left="6480" w:hanging="180"/>
+      </w:pPr>
+    </w:lvl>
+  </w:abstractNum>
+  <w:abstractNum w:abstractNumId="4" w15:restartNumberingAfterBreak="0">
     <w:nsid w:val="0F7B2163"/>
     <w:multiLevelType w:val="multilevel"/>
     <w:tmpl w:val="00647290"/>
@@ -3360,7 +5465,7 @@
       </w:rPr>
     </w:lvl>
   </w:abstractNum>
-  <w:abstractNum w:abstractNumId="4" w15:restartNumberingAfterBreak="0">
+  <w:abstractNum w:abstractNumId="5" w15:restartNumberingAfterBreak="0">
     <w:nsid w:val="144F3E1D"/>
     <w:multiLevelType w:val="hybridMultilevel"/>
     <w:tmpl w:val="5B38C960"/>
@@ -3446,7 +5551,7 @@
       </w:pPr>
     </w:lvl>
   </w:abstractNum>
-  <w:abstractNum w:abstractNumId="5" w15:restartNumberingAfterBreak="0">
+  <w:abstractNum w:abstractNumId="6" w15:restartNumberingAfterBreak="0">
     <w:nsid w:val="165F016B"/>
     <w:multiLevelType w:val="hybridMultilevel"/>
     <w:tmpl w:val="05ACE2DA"/>
@@ -3532,7 +5637,7 @@
       </w:pPr>
     </w:lvl>
   </w:abstractNum>
-  <w:abstractNum w:abstractNumId="6" w15:restartNumberingAfterBreak="0">
+  <w:abstractNum w:abstractNumId="7" w15:restartNumberingAfterBreak="0">
     <w:nsid w:val="18203FAC"/>
     <w:multiLevelType w:val="multilevel"/>
     <w:tmpl w:val="38B018D0"/>
@@ -3653,7 +5758,7 @@
       </w:rPr>
     </w:lvl>
   </w:abstractNum>
-  <w:abstractNum w:abstractNumId="7" w15:restartNumberingAfterBreak="0">
+  <w:abstractNum w:abstractNumId="8" w15:restartNumberingAfterBreak="0">
     <w:nsid w:val="206204E0"/>
     <w:multiLevelType w:val="multilevel"/>
     <w:tmpl w:val="38B018D0"/>
@@ -3774,7 +5879,7 @@
       </w:rPr>
     </w:lvl>
   </w:abstractNum>
-  <w:abstractNum w:abstractNumId="8" w15:restartNumberingAfterBreak="0">
+  <w:abstractNum w:abstractNumId="9" w15:restartNumberingAfterBreak="0">
     <w:nsid w:val="2C230258"/>
     <w:multiLevelType w:val="hybridMultilevel"/>
     <w:tmpl w:val="2856F778"/>
@@ -3860,7 +5965,7 @@
       </w:pPr>
     </w:lvl>
   </w:abstractNum>
-  <w:abstractNum w:abstractNumId="9" w15:restartNumberingAfterBreak="0">
+  <w:abstractNum w:abstractNumId="10" w15:restartNumberingAfterBreak="0">
     <w:nsid w:val="2FD66730"/>
     <w:multiLevelType w:val="hybridMultilevel"/>
     <w:tmpl w:val="E48EB5CE"/>
@@ -3949,7 +6054,7 @@
       </w:pPr>
     </w:lvl>
   </w:abstractNum>
-  <w:abstractNum w:abstractNumId="10" w15:restartNumberingAfterBreak="0">
+  <w:abstractNum w:abstractNumId="11" w15:restartNumberingAfterBreak="0">
     <w:nsid w:val="333B1F69"/>
     <w:multiLevelType w:val="hybridMultilevel"/>
     <w:tmpl w:val="55646E1A"/>
@@ -4035,7 +6140,418 @@
       </w:pPr>
     </w:lvl>
   </w:abstractNum>
-  <w:abstractNum w:abstractNumId="11" w15:restartNumberingAfterBreak="0">
+  <w:abstractNum w:abstractNumId="12" w15:restartNumberingAfterBreak="0">
+    <w:nsid w:val="33DB2205"/>
+    <w:multiLevelType w:val="multilevel"/>
+    <w:tmpl w:val="A67EC198"/>
+    <w:lvl w:ilvl="0">
+      <w:start w:val="1"/>
+      <w:numFmt w:val="bullet"/>
+      <w:lvlText w:val=""/>
+      <w:lvlJc w:val="left"/>
+      <w:pPr>
+        <w:tabs>
+          <w:tab w:val="num" w:pos="720"/>
+        </w:tabs>
+        <w:ind w:left="720" w:hanging="360"/>
+      </w:pPr>
+      <w:rPr>
+        <w:rFonts w:ascii="Symbol" w:hAnsi="Symbol" w:hint="default"/>
+        <w:sz w:val="20"/>
+      </w:rPr>
+    </w:lvl>
+    <w:lvl w:ilvl="1" w:tentative="1">
+      <w:start w:val="1"/>
+      <w:numFmt w:val="bullet"/>
+      <w:lvlText w:val="o"/>
+      <w:lvlJc w:val="left"/>
+      <w:pPr>
+        <w:tabs>
+          <w:tab w:val="num" w:pos="1440"/>
+        </w:tabs>
+        <w:ind w:left="1440" w:hanging="360"/>
+      </w:pPr>
+      <w:rPr>
+        <w:rFonts w:ascii="Courier New" w:hAnsi="Courier New" w:hint="default"/>
+        <w:sz w:val="20"/>
+      </w:rPr>
+    </w:lvl>
+    <w:lvl w:ilvl="2" w:tentative="1">
+      <w:start w:val="1"/>
+      <w:numFmt w:val="bullet"/>
+      <w:lvlText w:val=""/>
+      <w:lvlJc w:val="left"/>
+      <w:pPr>
+        <w:tabs>
+          <w:tab w:val="num" w:pos="2160"/>
+        </w:tabs>
+        <w:ind w:left="2160" w:hanging="360"/>
+      </w:pPr>
+      <w:rPr>
+        <w:rFonts w:ascii="Wingdings" w:hAnsi="Wingdings" w:hint="default"/>
+        <w:sz w:val="20"/>
+      </w:rPr>
+    </w:lvl>
+    <w:lvl w:ilvl="3" w:tentative="1">
+      <w:start w:val="1"/>
+      <w:numFmt w:val="bullet"/>
+      <w:lvlText w:val=""/>
+      <w:lvlJc w:val="left"/>
+      <w:pPr>
+        <w:tabs>
+          <w:tab w:val="num" w:pos="2880"/>
+        </w:tabs>
+        <w:ind w:left="2880" w:hanging="360"/>
+      </w:pPr>
+      <w:rPr>
+        <w:rFonts w:ascii="Wingdings" w:hAnsi="Wingdings" w:hint="default"/>
+        <w:sz w:val="20"/>
+      </w:rPr>
+    </w:lvl>
+    <w:lvl w:ilvl="4" w:tentative="1">
+      <w:start w:val="1"/>
+      <w:numFmt w:val="bullet"/>
+      <w:lvlText w:val=""/>
+      <w:lvlJc w:val="left"/>
+      <w:pPr>
+        <w:tabs>
+          <w:tab w:val="num" w:pos="3600"/>
+        </w:tabs>
+        <w:ind w:left="3600" w:hanging="360"/>
+      </w:pPr>
+      <w:rPr>
+        <w:rFonts w:ascii="Wingdings" w:hAnsi="Wingdings" w:hint="default"/>
+        <w:sz w:val="20"/>
+      </w:rPr>
+    </w:lvl>
+    <w:lvl w:ilvl="5" w:tentative="1">
+      <w:start w:val="1"/>
+      <w:numFmt w:val="bullet"/>
+      <w:lvlText w:val=""/>
+      <w:lvlJc w:val="left"/>
+      <w:pPr>
+        <w:tabs>
+          <w:tab w:val="num" w:pos="4320"/>
+        </w:tabs>
+        <w:ind w:left="4320" w:hanging="360"/>
+      </w:pPr>
+      <w:rPr>
+        <w:rFonts w:ascii="Wingdings" w:hAnsi="Wingdings" w:hint="default"/>
+        <w:sz w:val="20"/>
+      </w:rPr>
+    </w:lvl>
+    <w:lvl w:ilvl="6" w:tentative="1">
+      <w:start w:val="1"/>
+      <w:numFmt w:val="bullet"/>
+      <w:lvlText w:val=""/>
+      <w:lvlJc w:val="left"/>
+      <w:pPr>
+        <w:tabs>
+          <w:tab w:val="num" w:pos="5040"/>
+        </w:tabs>
+        <w:ind w:left="5040" w:hanging="360"/>
+      </w:pPr>
+      <w:rPr>
+        <w:rFonts w:ascii="Wingdings" w:hAnsi="Wingdings" w:hint="default"/>
+        <w:sz w:val="20"/>
+      </w:rPr>
+    </w:lvl>
+    <w:lvl w:ilvl="7" w:tentative="1">
+      <w:start w:val="1"/>
+      <w:numFmt w:val="bullet"/>
+      <w:lvlText w:val=""/>
+      <w:lvlJc w:val="left"/>
+      <w:pPr>
+        <w:tabs>
+          <w:tab w:val="num" w:pos="5760"/>
+        </w:tabs>
+        <w:ind w:left="5760" w:hanging="360"/>
+      </w:pPr>
+      <w:rPr>
+        <w:rFonts w:ascii="Wingdings" w:hAnsi="Wingdings" w:hint="default"/>
+        <w:sz w:val="20"/>
+      </w:rPr>
+    </w:lvl>
+    <w:lvl w:ilvl="8" w:tentative="1">
+      <w:start w:val="1"/>
+      <w:numFmt w:val="bullet"/>
+      <w:lvlText w:val=""/>
+      <w:lvlJc w:val="left"/>
+      <w:pPr>
+        <w:tabs>
+          <w:tab w:val="num" w:pos="6480"/>
+        </w:tabs>
+        <w:ind w:left="6480" w:hanging="360"/>
+      </w:pPr>
+      <w:rPr>
+        <w:rFonts w:ascii="Wingdings" w:hAnsi="Wingdings" w:hint="default"/>
+        <w:sz w:val="20"/>
+      </w:rPr>
+    </w:lvl>
+  </w:abstractNum>
+  <w:abstractNum w:abstractNumId="13" w15:restartNumberingAfterBreak="0">
+    <w:nsid w:val="348627D8"/>
+    <w:multiLevelType w:val="hybridMultilevel"/>
+    <w:tmpl w:val="848EAB26"/>
+    <w:lvl w:ilvl="0" w:tplc="040E0001">
+      <w:start w:val="1"/>
+      <w:numFmt w:val="bullet"/>
+      <w:lvlText w:val=""/>
+      <w:lvlJc w:val="left"/>
+      <w:pPr>
+        <w:ind w:left="720" w:hanging="360"/>
+      </w:pPr>
+      <w:rPr>
+        <w:rFonts w:ascii="Symbol" w:hAnsi="Symbol" w:hint="default"/>
+      </w:rPr>
+    </w:lvl>
+    <w:lvl w:ilvl="1" w:tplc="040E0003" w:tentative="1">
+      <w:start w:val="1"/>
+      <w:numFmt w:val="bullet"/>
+      <w:lvlText w:val="o"/>
+      <w:lvlJc w:val="left"/>
+      <w:pPr>
+        <w:ind w:left="1440" w:hanging="360"/>
+      </w:pPr>
+      <w:rPr>
+        <w:rFonts w:ascii="Courier New" w:hAnsi="Courier New" w:cs="Courier New" w:hint="default"/>
+      </w:rPr>
+    </w:lvl>
+    <w:lvl w:ilvl="2" w:tplc="040E0005" w:tentative="1">
+      <w:start w:val="1"/>
+      <w:numFmt w:val="bullet"/>
+      <w:lvlText w:val=""/>
+      <w:lvlJc w:val="left"/>
+      <w:pPr>
+        <w:ind w:left="2160" w:hanging="360"/>
+      </w:pPr>
+      <w:rPr>
+        <w:rFonts w:ascii="Wingdings" w:hAnsi="Wingdings" w:hint="default"/>
+      </w:rPr>
+    </w:lvl>
+    <w:lvl w:ilvl="3" w:tplc="040E0001" w:tentative="1">
+      <w:start w:val="1"/>
+      <w:numFmt w:val="bullet"/>
+      <w:lvlText w:val=""/>
+      <w:lvlJc w:val="left"/>
+      <w:pPr>
+        <w:ind w:left="2880" w:hanging="360"/>
+      </w:pPr>
+      <w:rPr>
+        <w:rFonts w:ascii="Symbol" w:hAnsi="Symbol" w:hint="default"/>
+      </w:rPr>
+    </w:lvl>
+    <w:lvl w:ilvl="4" w:tplc="040E0003" w:tentative="1">
+      <w:start w:val="1"/>
+      <w:numFmt w:val="bullet"/>
+      <w:lvlText w:val="o"/>
+      <w:lvlJc w:val="left"/>
+      <w:pPr>
+        <w:ind w:left="3600" w:hanging="360"/>
+      </w:pPr>
+      <w:rPr>
+        <w:rFonts w:ascii="Courier New" w:hAnsi="Courier New" w:cs="Courier New" w:hint="default"/>
+      </w:rPr>
+    </w:lvl>
+    <w:lvl w:ilvl="5" w:tplc="040E0005" w:tentative="1">
+      <w:start w:val="1"/>
+      <w:numFmt w:val="bullet"/>
+      <w:lvlText w:val=""/>
+      <w:lvlJc w:val="left"/>
+      <w:pPr>
+        <w:ind w:left="4320" w:hanging="360"/>
+      </w:pPr>
+      <w:rPr>
+        <w:rFonts w:ascii="Wingdings" w:hAnsi="Wingdings" w:hint="default"/>
+      </w:rPr>
+    </w:lvl>
+    <w:lvl w:ilvl="6" w:tplc="040E0001" w:tentative="1">
+      <w:start w:val="1"/>
+      <w:numFmt w:val="bullet"/>
+      <w:lvlText w:val=""/>
+      <w:lvlJc w:val="left"/>
+      <w:pPr>
+        <w:ind w:left="5040" w:hanging="360"/>
+      </w:pPr>
+      <w:rPr>
+        <w:rFonts w:ascii="Symbol" w:hAnsi="Symbol" w:hint="default"/>
+      </w:rPr>
+    </w:lvl>
+    <w:lvl w:ilvl="7" w:tplc="040E0003" w:tentative="1">
+      <w:start w:val="1"/>
+      <w:numFmt w:val="bullet"/>
+      <w:lvlText w:val="o"/>
+      <w:lvlJc w:val="left"/>
+      <w:pPr>
+        <w:ind w:left="5760" w:hanging="360"/>
+      </w:pPr>
+      <w:rPr>
+        <w:rFonts w:ascii="Courier New" w:hAnsi="Courier New" w:cs="Courier New" w:hint="default"/>
+      </w:rPr>
+    </w:lvl>
+    <w:lvl w:ilvl="8" w:tplc="040E0005" w:tentative="1">
+      <w:start w:val="1"/>
+      <w:numFmt w:val="bullet"/>
+      <w:lvlText w:val=""/>
+      <w:lvlJc w:val="left"/>
+      <w:pPr>
+        <w:ind w:left="6480" w:hanging="360"/>
+      </w:pPr>
+      <w:rPr>
+        <w:rFonts w:ascii="Wingdings" w:hAnsi="Wingdings" w:hint="default"/>
+      </w:rPr>
+    </w:lvl>
+  </w:abstractNum>
+  <w:abstractNum w:abstractNumId="14" w15:restartNumberingAfterBreak="0">
+    <w:nsid w:val="34DE5A3A"/>
+    <w:multiLevelType w:val="multilevel"/>
+    <w:tmpl w:val="74D2F5B4"/>
+    <w:lvl w:ilvl="0">
+      <w:start w:val="1"/>
+      <w:numFmt w:val="bullet"/>
+      <w:lvlText w:val=""/>
+      <w:lvlJc w:val="left"/>
+      <w:pPr>
+        <w:tabs>
+          <w:tab w:val="num" w:pos="720"/>
+        </w:tabs>
+        <w:ind w:left="720" w:hanging="360"/>
+      </w:pPr>
+      <w:rPr>
+        <w:rFonts w:ascii="Symbol" w:hAnsi="Symbol" w:hint="default"/>
+        <w:sz w:val="20"/>
+      </w:rPr>
+    </w:lvl>
+    <w:lvl w:ilvl="1" w:tentative="1">
+      <w:start w:val="1"/>
+      <w:numFmt w:val="bullet"/>
+      <w:lvlText w:val="o"/>
+      <w:lvlJc w:val="left"/>
+      <w:pPr>
+        <w:tabs>
+          <w:tab w:val="num" w:pos="1440"/>
+        </w:tabs>
+        <w:ind w:left="1440" w:hanging="360"/>
+      </w:pPr>
+      <w:rPr>
+        <w:rFonts w:ascii="Courier New" w:hAnsi="Courier New" w:hint="default"/>
+        <w:sz w:val="20"/>
+      </w:rPr>
+    </w:lvl>
+    <w:lvl w:ilvl="2" w:tentative="1">
+      <w:start w:val="1"/>
+      <w:numFmt w:val="bullet"/>
+      <w:lvlText w:val=""/>
+      <w:lvlJc w:val="left"/>
+      <w:pPr>
+        <w:tabs>
+          <w:tab w:val="num" w:pos="2160"/>
+        </w:tabs>
+        <w:ind w:left="2160" w:hanging="360"/>
+      </w:pPr>
+      <w:rPr>
+        <w:rFonts w:ascii="Wingdings" w:hAnsi="Wingdings" w:hint="default"/>
+        <w:sz w:val="20"/>
+      </w:rPr>
+    </w:lvl>
+    <w:lvl w:ilvl="3" w:tentative="1">
+      <w:start w:val="1"/>
+      <w:numFmt w:val="bullet"/>
+      <w:lvlText w:val=""/>
+      <w:lvlJc w:val="left"/>
+      <w:pPr>
+        <w:tabs>
+          <w:tab w:val="num" w:pos="2880"/>
+        </w:tabs>
+        <w:ind w:left="2880" w:hanging="360"/>
+      </w:pPr>
+      <w:rPr>
+        <w:rFonts w:ascii="Wingdings" w:hAnsi="Wingdings" w:hint="default"/>
+        <w:sz w:val="20"/>
+      </w:rPr>
+    </w:lvl>
+    <w:lvl w:ilvl="4" w:tentative="1">
+      <w:start w:val="1"/>
+      <w:numFmt w:val="bullet"/>
+      <w:lvlText w:val=""/>
+      <w:lvlJc w:val="left"/>
+      <w:pPr>
+        <w:tabs>
+          <w:tab w:val="num" w:pos="3600"/>
+        </w:tabs>
+        <w:ind w:left="3600" w:hanging="360"/>
+      </w:pPr>
+      <w:rPr>
+        <w:rFonts w:ascii="Wingdings" w:hAnsi="Wingdings" w:hint="default"/>
+        <w:sz w:val="20"/>
+      </w:rPr>
+    </w:lvl>
+    <w:lvl w:ilvl="5" w:tentative="1">
+      <w:start w:val="1"/>
+      <w:numFmt w:val="bullet"/>
+      <w:lvlText w:val=""/>
+      <w:lvlJc w:val="left"/>
+      <w:pPr>
+        <w:tabs>
+          <w:tab w:val="num" w:pos="4320"/>
+        </w:tabs>
+        <w:ind w:left="4320" w:hanging="360"/>
+      </w:pPr>
+      <w:rPr>
+        <w:rFonts w:ascii="Wingdings" w:hAnsi="Wingdings" w:hint="default"/>
+        <w:sz w:val="20"/>
+      </w:rPr>
+    </w:lvl>
+    <w:lvl w:ilvl="6" w:tentative="1">
+      <w:start w:val="1"/>
+      <w:numFmt w:val="bullet"/>
+      <w:lvlText w:val=""/>
+      <w:lvlJc w:val="left"/>
+      <w:pPr>
+        <w:tabs>
+          <w:tab w:val="num" w:pos="5040"/>
+        </w:tabs>
+        <w:ind w:left="5040" w:hanging="360"/>
+      </w:pPr>
+      <w:rPr>
+        <w:rFonts w:ascii="Wingdings" w:hAnsi="Wingdings" w:hint="default"/>
+        <w:sz w:val="20"/>
+      </w:rPr>
+    </w:lvl>
+    <w:lvl w:ilvl="7" w:tentative="1">
+      <w:start w:val="1"/>
+      <w:numFmt w:val="bullet"/>
+      <w:lvlText w:val=""/>
+      <w:lvlJc w:val="left"/>
+      <w:pPr>
+        <w:tabs>
+          <w:tab w:val="num" w:pos="5760"/>
+        </w:tabs>
+        <w:ind w:left="5760" w:hanging="360"/>
+      </w:pPr>
+      <w:rPr>
+        <w:rFonts w:ascii="Wingdings" w:hAnsi="Wingdings" w:hint="default"/>
+        <w:sz w:val="20"/>
+      </w:rPr>
+    </w:lvl>
+    <w:lvl w:ilvl="8" w:tentative="1">
+      <w:start w:val="1"/>
+      <w:numFmt w:val="bullet"/>
+      <w:lvlText w:val=""/>
+      <w:lvlJc w:val="left"/>
+      <w:pPr>
+        <w:tabs>
+          <w:tab w:val="num" w:pos="6480"/>
+        </w:tabs>
+        <w:ind w:left="6480" w:hanging="360"/>
+      </w:pPr>
+      <w:rPr>
+        <w:rFonts w:ascii="Wingdings" w:hAnsi="Wingdings" w:hint="default"/>
+        <w:sz w:val="20"/>
+      </w:rPr>
+    </w:lvl>
+  </w:abstractNum>
+  <w:abstractNum w:abstractNumId="15" w15:restartNumberingAfterBreak="0">
     <w:nsid w:val="3B283F30"/>
     <w:multiLevelType w:val="multilevel"/>
     <w:tmpl w:val="A9606782"/>
@@ -4148,7 +6664,7 @@
       </w:rPr>
     </w:lvl>
   </w:abstractNum>
-  <w:abstractNum w:abstractNumId="12" w15:restartNumberingAfterBreak="0">
+  <w:abstractNum w:abstractNumId="16" w15:restartNumberingAfterBreak="0">
     <w:nsid w:val="46EC213D"/>
     <w:multiLevelType w:val="hybridMultilevel"/>
     <w:tmpl w:val="D542C52C"/>
@@ -4237,7 +6753,7 @@
       </w:pPr>
     </w:lvl>
   </w:abstractNum>
-  <w:abstractNum w:abstractNumId="13" w15:restartNumberingAfterBreak="0">
+  <w:abstractNum w:abstractNumId="17" w15:restartNumberingAfterBreak="0">
     <w:nsid w:val="522D4035"/>
     <w:multiLevelType w:val="multilevel"/>
     <w:tmpl w:val="A9606782"/>
@@ -4350,7 +6866,7 @@
       </w:rPr>
     </w:lvl>
   </w:abstractNum>
-  <w:abstractNum w:abstractNumId="14" w15:restartNumberingAfterBreak="0">
+  <w:abstractNum w:abstractNumId="18" w15:restartNumberingAfterBreak="0">
     <w:nsid w:val="53175545"/>
     <w:multiLevelType w:val="multilevel"/>
     <w:tmpl w:val="38B018D0"/>
@@ -4471,7 +6987,7 @@
       </w:rPr>
     </w:lvl>
   </w:abstractNum>
-  <w:abstractNum w:abstractNumId="15" w15:restartNumberingAfterBreak="0">
+  <w:abstractNum w:abstractNumId="19" w15:restartNumberingAfterBreak="0">
     <w:nsid w:val="5511323B"/>
     <w:multiLevelType w:val="hybridMultilevel"/>
     <w:tmpl w:val="983A6960"/>
@@ -4557,7 +7073,7 @@
       </w:pPr>
     </w:lvl>
   </w:abstractNum>
-  <w:abstractNum w:abstractNumId="16" w15:restartNumberingAfterBreak="0">
+  <w:abstractNum w:abstractNumId="20" w15:restartNumberingAfterBreak="0">
     <w:nsid w:val="5DEE3724"/>
     <w:multiLevelType w:val="hybridMultilevel"/>
     <w:tmpl w:val="4210BBF8"/>
@@ -4646,7 +7162,7 @@
       </w:pPr>
     </w:lvl>
   </w:abstractNum>
-  <w:abstractNum w:abstractNumId="17" w15:restartNumberingAfterBreak="0">
+  <w:abstractNum w:abstractNumId="21" w15:restartNumberingAfterBreak="0">
     <w:nsid w:val="5F1446AE"/>
     <w:multiLevelType w:val="hybridMultilevel"/>
     <w:tmpl w:val="6AEC6C7C"/>
@@ -4735,7 +7251,7 @@
       </w:pPr>
     </w:lvl>
   </w:abstractNum>
-  <w:abstractNum w:abstractNumId="18" w15:restartNumberingAfterBreak="0">
+  <w:abstractNum w:abstractNumId="22" w15:restartNumberingAfterBreak="0">
     <w:nsid w:val="69EA7AEF"/>
     <w:multiLevelType w:val="hybridMultilevel"/>
     <w:tmpl w:val="0D722DFC"/>
@@ -4821,7 +7337,7 @@
       </w:pPr>
     </w:lvl>
   </w:abstractNum>
-  <w:abstractNum w:abstractNumId="19" w15:restartNumberingAfterBreak="0">
+  <w:abstractNum w:abstractNumId="23" w15:restartNumberingAfterBreak="0">
     <w:nsid w:val="71DD7A9F"/>
     <w:multiLevelType w:val="hybridMultilevel"/>
     <w:tmpl w:val="F43C4814"/>
@@ -4905,67 +7421,347 @@
       <w:pPr>
         <w:ind w:left="6840" w:hanging="180"/>
       </w:pPr>
+    </w:lvl>
+  </w:abstractNum>
+  <w:abstractNum w:abstractNumId="24" w15:restartNumberingAfterBreak="0">
+    <w:nsid w:val="72E63053"/>
+    <w:multiLevelType w:val="multilevel"/>
+    <w:tmpl w:val="264ED97A"/>
+    <w:lvl w:ilvl="0">
+      <w:start w:val="1"/>
+      <w:numFmt w:val="bullet"/>
+      <w:lvlText w:val=""/>
+      <w:lvlJc w:val="left"/>
+      <w:pPr>
+        <w:tabs>
+          <w:tab w:val="num" w:pos="720"/>
+        </w:tabs>
+        <w:ind w:left="720" w:hanging="360"/>
+      </w:pPr>
+      <w:rPr>
+        <w:rFonts w:ascii="Symbol" w:hAnsi="Symbol" w:hint="default"/>
+        <w:sz w:val="20"/>
+      </w:rPr>
+    </w:lvl>
+    <w:lvl w:ilvl="1" w:tentative="1">
+      <w:start w:val="1"/>
+      <w:numFmt w:val="bullet"/>
+      <w:lvlText w:val="o"/>
+      <w:lvlJc w:val="left"/>
+      <w:pPr>
+        <w:tabs>
+          <w:tab w:val="num" w:pos="1440"/>
+        </w:tabs>
+        <w:ind w:left="1440" w:hanging="360"/>
+      </w:pPr>
+      <w:rPr>
+        <w:rFonts w:ascii="Courier New" w:hAnsi="Courier New" w:hint="default"/>
+        <w:sz w:val="20"/>
+      </w:rPr>
+    </w:lvl>
+    <w:lvl w:ilvl="2" w:tentative="1">
+      <w:start w:val="1"/>
+      <w:numFmt w:val="bullet"/>
+      <w:lvlText w:val=""/>
+      <w:lvlJc w:val="left"/>
+      <w:pPr>
+        <w:tabs>
+          <w:tab w:val="num" w:pos="2160"/>
+        </w:tabs>
+        <w:ind w:left="2160" w:hanging="360"/>
+      </w:pPr>
+      <w:rPr>
+        <w:rFonts w:ascii="Wingdings" w:hAnsi="Wingdings" w:hint="default"/>
+        <w:sz w:val="20"/>
+      </w:rPr>
+    </w:lvl>
+    <w:lvl w:ilvl="3" w:tentative="1">
+      <w:start w:val="1"/>
+      <w:numFmt w:val="bullet"/>
+      <w:lvlText w:val=""/>
+      <w:lvlJc w:val="left"/>
+      <w:pPr>
+        <w:tabs>
+          <w:tab w:val="num" w:pos="2880"/>
+        </w:tabs>
+        <w:ind w:left="2880" w:hanging="360"/>
+      </w:pPr>
+      <w:rPr>
+        <w:rFonts w:ascii="Wingdings" w:hAnsi="Wingdings" w:hint="default"/>
+        <w:sz w:val="20"/>
+      </w:rPr>
+    </w:lvl>
+    <w:lvl w:ilvl="4" w:tentative="1">
+      <w:start w:val="1"/>
+      <w:numFmt w:val="bullet"/>
+      <w:lvlText w:val=""/>
+      <w:lvlJc w:val="left"/>
+      <w:pPr>
+        <w:tabs>
+          <w:tab w:val="num" w:pos="3600"/>
+        </w:tabs>
+        <w:ind w:left="3600" w:hanging="360"/>
+      </w:pPr>
+      <w:rPr>
+        <w:rFonts w:ascii="Wingdings" w:hAnsi="Wingdings" w:hint="default"/>
+        <w:sz w:val="20"/>
+      </w:rPr>
+    </w:lvl>
+    <w:lvl w:ilvl="5" w:tentative="1">
+      <w:start w:val="1"/>
+      <w:numFmt w:val="bullet"/>
+      <w:lvlText w:val=""/>
+      <w:lvlJc w:val="left"/>
+      <w:pPr>
+        <w:tabs>
+          <w:tab w:val="num" w:pos="4320"/>
+        </w:tabs>
+        <w:ind w:left="4320" w:hanging="360"/>
+      </w:pPr>
+      <w:rPr>
+        <w:rFonts w:ascii="Wingdings" w:hAnsi="Wingdings" w:hint="default"/>
+        <w:sz w:val="20"/>
+      </w:rPr>
+    </w:lvl>
+    <w:lvl w:ilvl="6" w:tentative="1">
+      <w:start w:val="1"/>
+      <w:numFmt w:val="bullet"/>
+      <w:lvlText w:val=""/>
+      <w:lvlJc w:val="left"/>
+      <w:pPr>
+        <w:tabs>
+          <w:tab w:val="num" w:pos="5040"/>
+        </w:tabs>
+        <w:ind w:left="5040" w:hanging="360"/>
+      </w:pPr>
+      <w:rPr>
+        <w:rFonts w:ascii="Wingdings" w:hAnsi="Wingdings" w:hint="default"/>
+        <w:sz w:val="20"/>
+      </w:rPr>
+    </w:lvl>
+    <w:lvl w:ilvl="7" w:tentative="1">
+      <w:start w:val="1"/>
+      <w:numFmt w:val="bullet"/>
+      <w:lvlText w:val=""/>
+      <w:lvlJc w:val="left"/>
+      <w:pPr>
+        <w:tabs>
+          <w:tab w:val="num" w:pos="5760"/>
+        </w:tabs>
+        <w:ind w:left="5760" w:hanging="360"/>
+      </w:pPr>
+      <w:rPr>
+        <w:rFonts w:ascii="Wingdings" w:hAnsi="Wingdings" w:hint="default"/>
+        <w:sz w:val="20"/>
+      </w:rPr>
+    </w:lvl>
+    <w:lvl w:ilvl="8" w:tentative="1">
+      <w:start w:val="1"/>
+      <w:numFmt w:val="bullet"/>
+      <w:lvlText w:val=""/>
+      <w:lvlJc w:val="left"/>
+      <w:pPr>
+        <w:tabs>
+          <w:tab w:val="num" w:pos="6480"/>
+        </w:tabs>
+        <w:ind w:left="6480" w:hanging="360"/>
+      </w:pPr>
+      <w:rPr>
+        <w:rFonts w:ascii="Wingdings" w:hAnsi="Wingdings" w:hint="default"/>
+        <w:sz w:val="20"/>
+      </w:rPr>
+    </w:lvl>
+  </w:abstractNum>
+  <w:abstractNum w:abstractNumId="25" w15:restartNumberingAfterBreak="0">
+    <w:nsid w:val="72EA4688"/>
+    <w:multiLevelType w:val="hybridMultilevel"/>
+    <w:tmpl w:val="397827E6"/>
+    <w:lvl w:ilvl="0" w:tplc="040E0001">
+      <w:start w:val="1"/>
+      <w:numFmt w:val="bullet"/>
+      <w:lvlText w:val=""/>
+      <w:lvlJc w:val="left"/>
+      <w:pPr>
+        <w:ind w:left="720" w:hanging="360"/>
+      </w:pPr>
+      <w:rPr>
+        <w:rFonts w:ascii="Symbol" w:hAnsi="Symbol" w:hint="default"/>
+      </w:rPr>
+    </w:lvl>
+    <w:lvl w:ilvl="1" w:tplc="040E0003" w:tentative="1">
+      <w:start w:val="1"/>
+      <w:numFmt w:val="bullet"/>
+      <w:lvlText w:val="o"/>
+      <w:lvlJc w:val="left"/>
+      <w:pPr>
+        <w:ind w:left="1440" w:hanging="360"/>
+      </w:pPr>
+      <w:rPr>
+        <w:rFonts w:ascii="Courier New" w:hAnsi="Courier New" w:cs="Courier New" w:hint="default"/>
+      </w:rPr>
+    </w:lvl>
+    <w:lvl w:ilvl="2" w:tplc="040E0005" w:tentative="1">
+      <w:start w:val="1"/>
+      <w:numFmt w:val="bullet"/>
+      <w:lvlText w:val=""/>
+      <w:lvlJc w:val="left"/>
+      <w:pPr>
+        <w:ind w:left="2160" w:hanging="360"/>
+      </w:pPr>
+      <w:rPr>
+        <w:rFonts w:ascii="Wingdings" w:hAnsi="Wingdings" w:hint="default"/>
+      </w:rPr>
+    </w:lvl>
+    <w:lvl w:ilvl="3" w:tplc="040E0001" w:tentative="1">
+      <w:start w:val="1"/>
+      <w:numFmt w:val="bullet"/>
+      <w:lvlText w:val=""/>
+      <w:lvlJc w:val="left"/>
+      <w:pPr>
+        <w:ind w:left="2880" w:hanging="360"/>
+      </w:pPr>
+      <w:rPr>
+        <w:rFonts w:ascii="Symbol" w:hAnsi="Symbol" w:hint="default"/>
+      </w:rPr>
+    </w:lvl>
+    <w:lvl w:ilvl="4" w:tplc="040E0003" w:tentative="1">
+      <w:start w:val="1"/>
+      <w:numFmt w:val="bullet"/>
+      <w:lvlText w:val="o"/>
+      <w:lvlJc w:val="left"/>
+      <w:pPr>
+        <w:ind w:left="3600" w:hanging="360"/>
+      </w:pPr>
+      <w:rPr>
+        <w:rFonts w:ascii="Courier New" w:hAnsi="Courier New" w:cs="Courier New" w:hint="default"/>
+      </w:rPr>
+    </w:lvl>
+    <w:lvl w:ilvl="5" w:tplc="040E0005" w:tentative="1">
+      <w:start w:val="1"/>
+      <w:numFmt w:val="bullet"/>
+      <w:lvlText w:val=""/>
+      <w:lvlJc w:val="left"/>
+      <w:pPr>
+        <w:ind w:left="4320" w:hanging="360"/>
+      </w:pPr>
+      <w:rPr>
+        <w:rFonts w:ascii="Wingdings" w:hAnsi="Wingdings" w:hint="default"/>
+      </w:rPr>
+    </w:lvl>
+    <w:lvl w:ilvl="6" w:tplc="040E0001" w:tentative="1">
+      <w:start w:val="1"/>
+      <w:numFmt w:val="bullet"/>
+      <w:lvlText w:val=""/>
+      <w:lvlJc w:val="left"/>
+      <w:pPr>
+        <w:ind w:left="5040" w:hanging="360"/>
+      </w:pPr>
+      <w:rPr>
+        <w:rFonts w:ascii="Symbol" w:hAnsi="Symbol" w:hint="default"/>
+      </w:rPr>
+    </w:lvl>
+    <w:lvl w:ilvl="7" w:tplc="040E0003" w:tentative="1">
+      <w:start w:val="1"/>
+      <w:numFmt w:val="bullet"/>
+      <w:lvlText w:val="o"/>
+      <w:lvlJc w:val="left"/>
+      <w:pPr>
+        <w:ind w:left="5760" w:hanging="360"/>
+      </w:pPr>
+      <w:rPr>
+        <w:rFonts w:ascii="Courier New" w:hAnsi="Courier New" w:cs="Courier New" w:hint="default"/>
+      </w:rPr>
+    </w:lvl>
+    <w:lvl w:ilvl="8" w:tplc="040E0005" w:tentative="1">
+      <w:start w:val="1"/>
+      <w:numFmt w:val="bullet"/>
+      <w:lvlText w:val=""/>
+      <w:lvlJc w:val="left"/>
+      <w:pPr>
+        <w:ind w:left="6480" w:hanging="360"/>
+      </w:pPr>
+      <w:rPr>
+        <w:rFonts w:ascii="Wingdings" w:hAnsi="Wingdings" w:hint="default"/>
+      </w:rPr>
     </w:lvl>
   </w:abstractNum>
   <w:num w:numId="1" w16cid:durableId="950480417">
     <w:abstractNumId w:val="2"/>
   </w:num>
   <w:num w:numId="2" w16cid:durableId="1294484620">
+    <w:abstractNumId w:val="22"/>
+  </w:num>
+  <w:num w:numId="3" w16cid:durableId="109859399">
     <w:abstractNumId w:val="18"/>
   </w:num>
-  <w:num w:numId="3" w16cid:durableId="109859399">
-    <w:abstractNumId w:val="14"/>
-  </w:num>
   <w:num w:numId="4" w16cid:durableId="2064984734">
-    <w:abstractNumId w:val="7"/>
+    <w:abstractNumId w:val="8"/>
   </w:num>
   <w:num w:numId="5" w16cid:durableId="775255097">
-    <w:abstractNumId w:val="11"/>
+    <w:abstractNumId w:val="15"/>
   </w:num>
   <w:num w:numId="6" w16cid:durableId="1162816396">
-    <w:abstractNumId w:val="13"/>
+    <w:abstractNumId w:val="17"/>
   </w:num>
   <w:num w:numId="7" w16cid:durableId="160434847">
-    <w:abstractNumId w:val="8"/>
+    <w:abstractNumId w:val="9"/>
   </w:num>
   <w:num w:numId="8" w16cid:durableId="1628196365">
     <w:abstractNumId w:val="1"/>
   </w:num>
   <w:num w:numId="9" w16cid:durableId="904877455">
-    <w:abstractNumId w:val="4"/>
+    <w:abstractNumId w:val="5"/>
   </w:num>
   <w:num w:numId="10" w16cid:durableId="1459451361">
-    <w:abstractNumId w:val="5"/>
+    <w:abstractNumId w:val="6"/>
   </w:num>
   <w:num w:numId="11" w16cid:durableId="1404989224">
-    <w:abstractNumId w:val="10"/>
+    <w:abstractNumId w:val="11"/>
   </w:num>
   <w:num w:numId="12" w16cid:durableId="1305815945">
+    <w:abstractNumId w:val="23"/>
+  </w:num>
+  <w:num w:numId="13" w16cid:durableId="1380935091">
     <w:abstractNumId w:val="19"/>
   </w:num>
-  <w:num w:numId="13" w16cid:durableId="1380935091">
-    <w:abstractNumId w:val="15"/>
-  </w:num>
   <w:num w:numId="14" w16cid:durableId="2098594617">
-    <w:abstractNumId w:val="17"/>
+    <w:abstractNumId w:val="21"/>
   </w:num>
   <w:num w:numId="15" w16cid:durableId="452945306">
     <w:abstractNumId w:val="0"/>
   </w:num>
   <w:num w:numId="16" w16cid:durableId="94179773">
-    <w:abstractNumId w:val="9"/>
+    <w:abstractNumId w:val="10"/>
   </w:num>
   <w:num w:numId="17" w16cid:durableId="1961378457">
-    <w:abstractNumId w:val="6"/>
+    <w:abstractNumId w:val="7"/>
   </w:num>
   <w:num w:numId="18" w16cid:durableId="2112433967">
-    <w:abstractNumId w:val="3"/>
+    <w:abstractNumId w:val="4"/>
   </w:num>
   <w:num w:numId="19" w16cid:durableId="250357141">
+    <w:abstractNumId w:val="16"/>
+  </w:num>
+  <w:num w:numId="20" w16cid:durableId="1053311693">
+    <w:abstractNumId w:val="20"/>
+  </w:num>
+  <w:num w:numId="21" w16cid:durableId="147209968">
+    <w:abstractNumId w:val="13"/>
+  </w:num>
+  <w:num w:numId="22" w16cid:durableId="1795249265">
+    <w:abstractNumId w:val="24"/>
+  </w:num>
+  <w:num w:numId="23" w16cid:durableId="1247688945">
+    <w:abstractNumId w:val="14"/>
+  </w:num>
+  <w:num w:numId="24" w16cid:durableId="1256206590">
     <w:abstractNumId w:val="12"/>
   </w:num>
-  <w:num w:numId="20" w16cid:durableId="1053311693">
-    <w:abstractNumId w:val="16"/>
+  <w:num w:numId="25" w16cid:durableId="1183858404">
+    <w:abstractNumId w:val="25"/>
+  </w:num>
+  <w:num w:numId="26" w16cid:durableId="80956744">
+    <w:abstractNumId w:val="3"/>
   </w:num>
 </w:numbering>
 </file>
@@ -6268,6 +9064,18 @@
       <w:szCs w:val="18"/>
     </w:rPr>
   </w:style>
+  <w:style w:type="character" w:styleId="Feloldatlanmegemlts">
+    <w:name w:val="Unresolved Mention"/>
+    <w:basedOn w:val="Bekezdsalapbettpusa"/>
+    <w:uiPriority w:val="99"/>
+    <w:semiHidden/>
+    <w:unhideWhenUsed/>
+    <w:rsid w:val="002003AA"/>
+    <w:rPr>
+      <w:color w:val="605E5C"/>
+      <w:shd w:val="clear" w:color="auto" w:fill="E1DFDD"/>
+    </w:rPr>
+  </w:style>
 </w:styles>
 </file>
 

</xml_diff>